<commit_message>
fix(examenes): corregir crash de migracion legacy por acceso fragil a sqlite rows
</commit_message>
<xml_diff>
--- a/examenes_medicos_templates/FORMATO EXAMEN DE ORINA.docx
+++ b/examenes_medicos_templates/FORMATO EXAMEN DE ORINA.docx
@@ -190,8 +190,20 @@
                                 <w:b/>
                                 <w:lang w:val="es-MX"/>
                               </w:rPr>
-                              <w:t>EXAMEN GENERAL DE ORINA</w:t>
-                            </w:r>
+                              <w:t xml:space="preserve">EXAMEN GENERAL DE ORINA
+</w:t>
+                            </w:r>
+                          </w:p>
+                          <w:p>
+                            <w:pPr>
+                              <w:jc w:val="center"/>
+                              <w:spacing w:before="120" w:after="120"/>
+                              <w:rPr>
+                                <w:rFonts w:ascii="ADLaM Display" w:hAnsi="ADLaM Display" w:cs="ADLaM Display"/>
+                                <w:sz w:val="10"/>
+                                <w:szCs w:val="10"/>
+                              </w:rPr>
+                            </w:pPr>
                           </w:p>
                         </w:txbxContent>
                       </wps:txbx>
@@ -238,8 +250,20 @@
                           <w:b/>
                           <w:lang w:val="es-MX"/>
                         </w:rPr>
-                        <w:t>EXAMEN GENERAL DE ORINA</w:t>
-                      </w:r>
+                        <w:t xml:space="preserve">EXAMEN GENERAL DE ORINA
+</w:t>
+                      </w:r>
+                    </w:p>
+                    <w:p>
+                      <w:pPr>
+                        <w:jc w:val="center"/>
+                        <w:spacing w:before="120" w:after="120"/>
+                        <w:rPr>
+                          <w:rFonts w:ascii="ADLaM Display" w:hAnsi="ADLaM Display" w:cs="ADLaM Display"/>
+                          <w:sz w:val="10"/>
+                          <w:szCs w:val="10"/>
+                        </w:rPr>
+                      </w:pPr>
                     </w:p>
                   </w:txbxContent>
                 </v:textbox>
@@ -1363,7 +1387,7 @@
                                 <w:sz w:val="48"/>
                                 <w:szCs w:val="48"/>
                               </w:rPr>
-                              <w:t>Laboratorio Clinico</w:t>
+                              <w:t xml:space="preserve">Laboratorio Clinico</w:t>
                             </w:r>
                           </w:p>
                         </w:txbxContent>
@@ -1403,7 +1427,7 @@
                           <w:sz w:val="48"/>
                           <w:szCs w:val="48"/>
                         </w:rPr>
-                        <w:t>Laboratorio Clinico</w:t>
+                        <w:t xml:space="preserve">Laboratorio Clinico</w:t>
                       </w:r>
                     </w:p>
                   </w:txbxContent>
@@ -3211,6 +3235,39 @@
                           <w:p>
                             <w:pPr>
                               <w:jc w:val="both"/>
+                              <w:spacing w:before="100" w:after="100"/>
+                              <w:rPr>
+                                <w:rFonts w:ascii="ADLaM Display" w:hAnsi="ADLaM Display" w:cs="ADLaM Display"/>
+                                <w:sz w:val="12"/>
+                                <w:szCs w:val="12"/>
+                              </w:rPr>
+                            </w:pPr>
+                          </w:p>
+                          <w:p>
+                            <w:pPr>
+                              <w:jc w:val="both"/>
+                              <w:spacing w:before="100" w:after="100"/>
+                              <w:rPr>
+                                <w:rFonts w:ascii="ADLaM Display" w:hAnsi="ADLaM Display" w:cs="ADLaM Display"/>
+                                <w:sz w:val="12"/>
+                                <w:szCs w:val="12"/>
+                              </w:rPr>
+                            </w:pPr>
+                          </w:p>
+                          <w:p>
+                            <w:pPr>
+                              <w:jc w:val="both"/>
+                              <w:spacing w:before="100" w:after="100"/>
+                              <w:rPr>
+                                <w:rFonts w:ascii="ADLaM Display" w:hAnsi="ADLaM Display" w:cs="ADLaM Display"/>
+                                <w:sz w:val="12"/>
+                                <w:szCs w:val="12"/>
+                              </w:rPr>
+                            </w:pPr>
+                          </w:p>
+                          <w:p>
+                            <w:pPr>
+                              <w:jc w:val="both"/>
                               <w:rPr>
                                 <w:rFonts w:ascii="ADLaM Display" w:hAnsi="ADLaM Display" w:cs="ADLaM Display"/>
                                 <w:b/>
@@ -3603,6 +3660,39 @@
               <v:shape w14:anchorId="066C1612" id="_x0000_s1038" type="#_x0000_t202" style="position:absolute;margin-left:-310.5pt;margin-top:6.65pt;width:137.25pt;height:395.25pt;z-index:251693056;visibility:visible;mso-wrap-style:square;mso-width-percent:0;mso-height-percent:0;mso-wrap-distance-left:9pt;mso-wrap-distance-top:3.6pt;mso-wrap-distance-right:9pt;mso-wrap-distance-bottom:3.6pt;mso-position-horizontal:absolute;mso-position-horizontal-relative:text;mso-position-vertical:absolute;mso-position-vertical-relative:text;mso-width-percent:0;mso-height-percent:0;mso-width-relative:margin;mso-height-relative:margin;v-text-anchor:top" o:gfxdata="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" fillcolor="white [3212]" strokecolor="white [3212]">
                 <v:textbox>
                   <w:txbxContent>
+                    <w:p>
+                      <w:pPr>
+                        <w:jc w:val="both"/>
+                        <w:spacing w:before="100" w:after="100"/>
+                        <w:rPr>
+                          <w:rFonts w:ascii="ADLaM Display" w:hAnsi="ADLaM Display" w:cs="ADLaM Display"/>
+                          <w:sz w:val="12"/>
+                          <w:szCs w:val="12"/>
+                        </w:rPr>
+                      </w:pPr>
+                    </w:p>
+                    <w:p>
+                      <w:pPr>
+                        <w:jc w:val="both"/>
+                        <w:spacing w:before="100" w:after="100"/>
+                        <w:rPr>
+                          <w:rFonts w:ascii="ADLaM Display" w:hAnsi="ADLaM Display" w:cs="ADLaM Display"/>
+                          <w:sz w:val="12"/>
+                          <w:szCs w:val="12"/>
+                        </w:rPr>
+                      </w:pPr>
+                    </w:p>
+                    <w:p>
+                      <w:pPr>
+                        <w:jc w:val="both"/>
+                        <w:spacing w:before="100" w:after="100"/>
+                        <w:rPr>
+                          <w:rFonts w:ascii="ADLaM Display" w:hAnsi="ADLaM Display" w:cs="ADLaM Display"/>
+                          <w:sz w:val="12"/>
+                          <w:szCs w:val="12"/>
+                        </w:rPr>
+                      </w:pPr>
+                    </w:p>
                     <w:p>
                       <w:pPr>
                         <w:jc w:val="both"/>

</xml_diff>

<commit_message>
fix(examenes): corregir layout real de orina y agregar eliminar admin en historial
</commit_message>
<xml_diff>
--- a/examenes_medicos_templates/FORMATO EXAMEN DE ORINA.docx
+++ b/examenes_medicos_templates/FORMATO EXAMEN DE ORINA.docx
@@ -94,7 +94,7 @@
                 <v:stroke joinstyle="miter"/>
                 <v:path gradientshapeok="t" o:connecttype="rect"/>
               </v:shapetype>
-              <v:shape id="Cuadro de texto 2" o:spid="_x0000_s1026" type="#_x0000_t202" style="position:absolute;margin-left:374.2pt;margin-top:213pt;width:218.25pt;height:237pt;z-index:251744256;visibility:visible;mso-wrap-style:square;mso-width-percent:0;mso-height-percent:0;mso-wrap-distance-left:9pt;mso-wrap-distance-top:3.6pt;mso-wrap-distance-right:9pt;mso-wrap-distance-bottom:3.6pt;mso-position-horizontal:absolute;mso-position-horizontal-relative:text;mso-position-vertical:absolute;mso-position-vertical-relative:text;mso-width-percent:0;mso-height-percent:0;mso-width-relative:margin;mso-height-relative:margin;v-text-anchor:top" o:gfxdata="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" fillcolor="white [3212]" strokecolor="white [3212]">
+              <v:shape id="Cuadro de texto 2" o:spid="_x0000_s1026" type="#_x0000_t202" style="position:absolute;margin-left:148.5pt;margin-top:213pt;width:301.5pt;height:237pt;z-index:251744256;visibility:visible;mso-wrap-style:square;mso-width-percent:0;mso-height-percent:0;mso-wrap-distance-left:9pt;mso-wrap-distance-top:3.6pt;mso-wrap-distance-right:9pt;mso-wrap-distance-bottom:3.6pt;mso-position-horizontal:absolute;mso-position-horizontal-relative:text;mso-position-vertical:absolute;mso-position-vertical-relative:text;mso-width-percent:0;mso-height-percent:0;mso-width-relative:margin;mso-height-relative:margin;v-text-anchor:top" o:gfxdata="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" fillcolor="white [3212]" strokecolor="white [3212]">
                 <v:textbox>
                   <w:txbxContent>
                     <w:p>
@@ -182,28 +182,8 @@
                                 <w:b/>
                                 <w:lang w:val="es-MX"/>
                               </w:rPr>
-                              <w:t xml:space="preserve">                     </w:t>
-                            </w:r>
-                            <w:r>
-                              <w:rPr>
-                                <w:rFonts w:ascii="ADLaM Display" w:hAnsi="ADLaM Display" w:cs="ADLaM Display"/>
-                                <w:b/>
-                                <w:lang w:val="es-MX"/>
-                              </w:rPr>
-                              <w:t xml:space="preserve">EXAMEN GENERAL DE ORINA
-</w:t>
-                            </w:r>
-                          </w:p>
-                          <w:p>
-                            <w:pPr>
-                              <w:jc w:val="center"/>
-                              <w:spacing w:before="120" w:after="120"/>
-                              <w:rPr>
-                                <w:rFonts w:ascii="ADLaM Display" w:hAnsi="ADLaM Display" w:cs="ADLaM Display"/>
-                                <w:sz w:val="10"/>
-                                <w:szCs w:val="10"/>
-                              </w:rPr>
-                            </w:pPr>
+                              <w:t>1234567EXAMEN GENERAL DE ORINA</w:t>
+                            </w:r>
                           </w:p>
                         </w:txbxContent>
                       </wps:txbx>
@@ -242,28 +222,8 @@
                           <w:b/>
                           <w:lang w:val="es-MX"/>
                         </w:rPr>
-                        <w:t xml:space="preserve">                     </w:t>
-                      </w:r>
-                      <w:r>
-                        <w:rPr>
-                          <w:rFonts w:ascii="ADLaM Display" w:hAnsi="ADLaM Display" w:cs="ADLaM Display"/>
-                          <w:b/>
-                          <w:lang w:val="es-MX"/>
-                        </w:rPr>
-                        <w:t xml:space="preserve">EXAMEN GENERAL DE ORINA
-</w:t>
-                      </w:r>
-                    </w:p>
-                    <w:p>
-                      <w:pPr>
-                        <w:jc w:val="center"/>
-                        <w:spacing w:before="120" w:after="120"/>
-                        <w:rPr>
-                          <w:rFonts w:ascii="ADLaM Display" w:hAnsi="ADLaM Display" w:cs="ADLaM Display"/>
-                          <w:sz w:val="10"/>
-                          <w:szCs w:val="10"/>
-                        </w:rPr>
-                      </w:pPr>
+                        <w:t>1234567EXAMEN GENERAL DE ORINA</w:t>
+                      </w:r>
                     </w:p>
                   </w:txbxContent>
                 </v:textbox>
@@ -1289,7 +1249,7 @@
           </mc:Choice>
           <mc:Fallback>
             <w:pict>
-              <v:shape w14:anchorId="0275604D" id="_x0000_s1033" type="#_x0000_t202" style="position:absolute;margin-left:179.25pt;margin-top:72.75pt;width:414pt;height:28.5pt;z-index:251619328;visibility:visible;mso-wrap-style:square;mso-width-percent:0;mso-height-percent:0;mso-wrap-distance-left:9pt;mso-wrap-distance-top:3.6pt;mso-wrap-distance-right:9pt;mso-wrap-distance-bottom:3.6pt;mso-position-horizontal:absolute;mso-position-horizontal-relative:text;mso-position-vertical:absolute;mso-position-vertical-relative:text;mso-width-percent:0;mso-height-percent:0;mso-width-relative:margin;mso-height-relative:margin;v-text-anchor:top" o:gfxdata="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" fillcolor="#006" strokecolor="#006">
+              <v:shape w14:anchorId="0275604D" id="_x0000_s1033" type="#_x0000_t202" style="position:absolute;margin-left:179.25pt;margin-top:72.75pt;width:450pt;height:28.5pt;z-index:251619328;visibility:visible;mso-wrap-style:square;mso-width-percent:0;mso-height-percent:0;mso-wrap-distance-left:9pt;mso-wrap-distance-top:3.6pt;mso-wrap-distance-right:9pt;mso-wrap-distance-bottom:3.6pt;mso-position-horizontal:absolute;mso-position-horizontal-relative:text;mso-position-vertical:absolute;mso-position-vertical-relative:text;mso-width-percent:0;mso-height-percent:0;mso-width-relative:margin;mso-height-relative:margin;v-text-anchor:top" o:gfxdata="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" fillcolor="#006" strokecolor="#006">
                 <v:textbox>
                   <w:txbxContent>
                     <w:p>
@@ -3235,39 +3195,6 @@
                           <w:p>
                             <w:pPr>
                               <w:jc w:val="both"/>
-                              <w:spacing w:before="100" w:after="100"/>
-                              <w:rPr>
-                                <w:rFonts w:ascii="ADLaM Display" w:hAnsi="ADLaM Display" w:cs="ADLaM Display"/>
-                                <w:sz w:val="12"/>
-                                <w:szCs w:val="12"/>
-                              </w:rPr>
-                            </w:pPr>
-                          </w:p>
-                          <w:p>
-                            <w:pPr>
-                              <w:jc w:val="both"/>
-                              <w:spacing w:before="100" w:after="100"/>
-                              <w:rPr>
-                                <w:rFonts w:ascii="ADLaM Display" w:hAnsi="ADLaM Display" w:cs="ADLaM Display"/>
-                                <w:sz w:val="12"/>
-                                <w:szCs w:val="12"/>
-                              </w:rPr>
-                            </w:pPr>
-                          </w:p>
-                          <w:p>
-                            <w:pPr>
-                              <w:jc w:val="both"/>
-                              <w:spacing w:before="100" w:after="100"/>
-                              <w:rPr>
-                                <w:rFonts w:ascii="ADLaM Display" w:hAnsi="ADLaM Display" w:cs="ADLaM Display"/>
-                                <w:sz w:val="12"/>
-                                <w:szCs w:val="12"/>
-                              </w:rPr>
-                            </w:pPr>
-                          </w:p>
-                          <w:p>
-                            <w:pPr>
-                              <w:jc w:val="both"/>
                               <w:rPr>
                                 <w:rFonts w:ascii="ADLaM Display" w:hAnsi="ADLaM Display" w:cs="ADLaM Display"/>
                                 <w:b/>
@@ -3660,39 +3587,6 @@
               <v:shape w14:anchorId="066C1612" id="_x0000_s1038" type="#_x0000_t202" style="position:absolute;margin-left:-310.5pt;margin-top:6.65pt;width:137.25pt;height:395.25pt;z-index:251693056;visibility:visible;mso-wrap-style:square;mso-width-percent:0;mso-height-percent:0;mso-wrap-distance-left:9pt;mso-wrap-distance-top:3.6pt;mso-wrap-distance-right:9pt;mso-wrap-distance-bottom:3.6pt;mso-position-horizontal:absolute;mso-position-horizontal-relative:text;mso-position-vertical:absolute;mso-position-vertical-relative:text;mso-width-percent:0;mso-height-percent:0;mso-width-relative:margin;mso-height-relative:margin;v-text-anchor:top" o:gfxdata="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" fillcolor="white [3212]" strokecolor="white [3212]">
                 <v:textbox>
                   <w:txbxContent>
-                    <w:p>
-                      <w:pPr>
-                        <w:jc w:val="both"/>
-                        <w:spacing w:before="100" w:after="100"/>
-                        <w:rPr>
-                          <w:rFonts w:ascii="ADLaM Display" w:hAnsi="ADLaM Display" w:cs="ADLaM Display"/>
-                          <w:sz w:val="12"/>
-                          <w:szCs w:val="12"/>
-                        </w:rPr>
-                      </w:pPr>
-                    </w:p>
-                    <w:p>
-                      <w:pPr>
-                        <w:jc w:val="both"/>
-                        <w:spacing w:before="100" w:after="100"/>
-                        <w:rPr>
-                          <w:rFonts w:ascii="ADLaM Display" w:hAnsi="ADLaM Display" w:cs="ADLaM Display"/>
-                          <w:sz w:val="12"/>
-                          <w:szCs w:val="12"/>
-                        </w:rPr>
-                      </w:pPr>
-                    </w:p>
-                    <w:p>
-                      <w:pPr>
-                        <w:jc w:val="both"/>
-                        <w:spacing w:before="100" w:after="100"/>
-                        <w:rPr>
-                          <w:rFonts w:ascii="ADLaM Display" w:hAnsi="ADLaM Display" w:cs="ADLaM Display"/>
-                          <w:sz w:val="12"/>
-                          <w:szCs w:val="12"/>
-                        </w:rPr>
-                      </w:pPr>
-                    </w:p>
                     <w:p>
                       <w:pPr>
                         <w:jc w:val="both"/>
@@ -4506,7 +4400,7 @@
           </mc:Choice>
           <mc:Fallback>
             <w:pict>
-              <v:shape w14:anchorId="30575371" id="_x0000_s1040" type="#_x0000_t202" style="position:absolute;margin-left:0;margin-top:65.9pt;width:594pt;height:34.5pt;z-index:251751424;visibility:visible;mso-wrap-style:square;mso-width-percent:0;mso-height-percent:0;mso-wrap-distance-left:9pt;mso-wrap-distance-top:3.6pt;mso-wrap-distance-right:9pt;mso-wrap-distance-bottom:3.6pt;mso-position-horizontal:left;mso-position-horizontal-relative:margin;mso-position-vertical:absolute;mso-position-vertical-relative:text;mso-width-percent:0;mso-height-percent:0;mso-width-relative:margin;mso-height-relative:margin;v-text-anchor:top" o:gfxdata="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" stroked="f">
+              <v:shape w14:anchorId="30575371" id="_x0000_s1040" type="#_x0000_t202" style="position:absolute;margin-left:0;margin-top:340pt;width:594pt;height:34.5pt;z-index:251751424;visibility:visible;mso-wrap-style:square;mso-width-percent:0;mso-height-percent:0;mso-wrap-distance-left:9pt;mso-wrap-distance-top:3.6pt;mso-wrap-distance-right:9pt;mso-wrap-distance-bottom:3.6pt;mso-position-horizontal:left;mso-position-horizontal-relative:margin;mso-position-vertical:absolute;mso-position-vertical-relative:text;mso-width-percent:0;mso-height-percent:0;mso-width-relative:margin;mso-height-relative:margin;v-text-anchor:top" o:gfxdata="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" stroked="f">
                 <v:textbox>
                   <w:txbxContent>
                     <w:p>
@@ -4540,7 +4434,7 @@
                   <wp:align>left</wp:align>
                 </wp:positionH>
                 <wp:positionV relativeFrom="paragraph">
-                  <wp:posOffset>208280</wp:posOffset>
+                  <wp:posOffset>3000000</wp:posOffset>
                 </wp:positionV>
                 <wp:extent cx="7610475" cy="638175"/>
                 <wp:effectExtent l="0" t="0" r="28575" b="28575"/>
@@ -4603,7 +4497,7 @@
           </mc:Choice>
           <mc:Fallback>
             <w:pict>
-              <v:shape w14:anchorId="2FFA668D" id="_x0000_s1041" type="#_x0000_t202" style="position:absolute;margin-left:0;margin-top:16.4pt;width:599.25pt;height:50.25pt;z-index:251749376;visibility:visible;mso-wrap-style:square;mso-width-percent:0;mso-height-percent:0;mso-wrap-distance-left:9pt;mso-wrap-distance-top:3.6pt;mso-wrap-distance-right:9pt;mso-wrap-distance-bottom:3.6pt;mso-position-horizontal:left;mso-position-horizontal-relative:margin;mso-position-vertical:absolute;mso-position-vertical-relative:text;mso-width-percent:0;mso-height-percent:0;mso-width-relative:margin;mso-height-relative:margin;v-text-anchor:top" o:gfxdata="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" fillcolor="#006">
+              <v:shape w14:anchorId="2FFA668D" id="_x0000_s1041" type="#_x0000_t202" style="position:absolute;margin-left:0;margin-top:355pt;width:599.25pt;height:50.25pt;z-index:251749376;visibility:visible;mso-wrap-style:square;mso-width-percent:0;mso-height-percent:0;mso-wrap-distance-left:9pt;mso-wrap-distance-top:3.6pt;mso-wrap-distance-right:9pt;mso-wrap-distance-bottom:3.6pt;mso-position-horizontal:left;mso-position-horizontal-relative:margin;mso-position-vertical:absolute;mso-position-vertical-relative:text;mso-width-percent:0;mso-height-percent:0;mso-width-relative:margin;mso-height-relative:margin;v-text-anchor:top" o:gfxdata="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" fillcolor="#006">
                 <v:textbox>
                   <w:txbxContent>
                     <w:p>

</xml_diff>

<commit_message>
fix(examenes): afinar layout final de orina y validar eliminar admin en historial
</commit_message>
<xml_diff>
--- a/examenes_medicos_templates/FORMATO EXAMEN DE ORINA.docx
+++ b/examenes_medicos_templates/FORMATO EXAMEN DE ORINA.docx
@@ -94,7 +94,7 @@
                 <v:stroke joinstyle="miter"/>
                 <v:path gradientshapeok="t" o:connecttype="rect"/>
               </v:shapetype>
-              <v:shape id="Cuadro de texto 2" o:spid="_x0000_s1026" type="#_x0000_t202" style="position:absolute;margin-left:148.5pt;margin-top:213pt;width:301.5pt;height:237pt;z-index:251744256;visibility:visible;mso-wrap-style:square;mso-width-percent:0;mso-height-percent:0;mso-wrap-distance-left:9pt;mso-wrap-distance-top:3.6pt;mso-wrap-distance-right:9pt;mso-wrap-distance-bottom:3.6pt;mso-position-horizontal:absolute;mso-position-horizontal-relative:text;mso-position-vertical:absolute;mso-position-vertical-relative:text;mso-width-percent:0;mso-height-percent:0;mso-width-relative:margin;mso-height-relative:margin;v-text-anchor:top" o:gfxdata="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" fillcolor="white [3212]" strokecolor="white [3212]">
+              <v:shape id="Cuadro de texto 2" o:spid="_x0000_s1026" type="#_x0000_t202" style="position:absolute;margin-left:100pt;margin-top:213pt;width:460pt;height:237pt;z-index:251744256;visibility:visible;mso-wrap-style:square;mso-width-percent:0;mso-height-percent:0;mso-wrap-distance-left:9pt;mso-wrap-distance-top:3.6pt;mso-wrap-distance-right:9pt;mso-wrap-distance-bottom:3.6pt;mso-position-horizontal:absolute;mso-position-horizontal-relative:text;mso-position-vertical:absolute;mso-position-vertical-relative:text;mso-width-percent:0;mso-height-percent:0;mso-width-relative:margin;mso-height-relative:margin;v-text-anchor:top" o:gfxdata="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" fillcolor="white [3212]" strokecolor="white [3212]">
                 <v:textbox>
                   <w:txbxContent>
                     <w:p>
@@ -182,7 +182,7 @@
                                 <w:b/>
                                 <w:lang w:val="es-MX"/>
                               </w:rPr>
-                              <w:t>1234567EXAMEN GENERAL DE ORINA</w:t>
+                              <w:t>                                                                                EXAMEN GENERAL DE ORINA</w:t>
                             </w:r>
                           </w:p>
                         </w:txbxContent>
@@ -222,7 +222,7 @@
                           <w:b/>
                           <w:lang w:val="es-MX"/>
                         </w:rPr>
-                        <w:t>1234567EXAMEN GENERAL DE ORINA</w:t>
+                        <w:t>                                                                                EXAMEN GENERAL DE ORINA</w:t>
                       </w:r>
                     </w:p>
                   </w:txbxContent>
@@ -1933,7 +1933,7 @@
           </mc:Choice>
           <mc:Fallback>
             <w:pict>
-              <v:shape w14:anchorId="6B6860FB" id="_x0000_s1036" type="#_x0000_t202" style="position:absolute;margin-left:281.25pt;margin-top:227.75pt;width:138.75pt;height:396pt;z-index:251727872;visibility:visible;mso-wrap-style:square;mso-width-percent:0;mso-height-percent:0;mso-wrap-distance-left:9pt;mso-wrap-distance-top:3.6pt;mso-wrap-distance-right:9pt;mso-wrap-distance-bottom:3.6pt;mso-position-horizontal:absolute;mso-position-horizontal-relative:text;mso-position-vertical:absolute;mso-position-vertical-relative:text;mso-width-percent:0;mso-height-percent:0;mso-width-relative:margin;mso-height-relative:margin;v-text-anchor:top" o:gfxdata="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" fillcolor="white [3212]" strokecolor="white [3212]">
+              <v:shape w14:anchorId="6B6860FB" id="_x0000_s1036" type="#_x0000_t202" style="position:absolute;margin-left:281.25pt;margin-top:285pt;width:138.75pt;height:396pt;z-index:251727872;visibility:visible;mso-wrap-style:square;mso-width-percent:0;mso-height-percent:0;mso-wrap-distance-left:9pt;mso-wrap-distance-top:3.6pt;mso-wrap-distance-right:9pt;mso-wrap-distance-bottom:3.6pt;mso-position-horizontal:absolute;mso-position-horizontal-relative:text;mso-position-vertical:absolute;mso-position-vertical-relative:text;mso-width-percent:0;mso-height-percent:0;mso-width-relative:margin;mso-height-relative:margin;v-text-anchor:top" o:gfxdata="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" fillcolor="white [3212]" strokecolor="white [3212]">
                 <v:textbox>
                   <w:txbxContent>
                     <w:p>
@@ -2747,7 +2747,7 @@
           </mc:Choice>
           <mc:Fallback>
             <w:pict>
-              <v:shape w14:anchorId="208A1A8F" id="_x0000_s1037" type="#_x0000_t202" style="position:absolute;margin-left:138pt;margin-top:226.25pt;width:142.5pt;height:401.25pt;z-index:251712512;visibility:visible;mso-wrap-style:square;mso-width-percent:0;mso-height-percent:0;mso-wrap-distance-left:9pt;mso-wrap-distance-top:3.6pt;mso-wrap-distance-right:9pt;mso-wrap-distance-bottom:3.6pt;mso-position-horizontal:absolute;mso-position-horizontal-relative:text;mso-position-vertical:absolute;mso-position-vertical-relative:text;mso-width-percent:0;mso-height-percent:0;mso-width-relative:margin;mso-height-relative:margin;v-text-anchor:top" o:gfxdata="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" fillcolor="white [3212]" strokecolor="white [3212]">
+              <v:shape w14:anchorId="208A1A8F" id="_x0000_s1037" type="#_x0000_t202" style="position:absolute;margin-left:138pt;margin-top:285pt;width:142.5pt;height:401.25pt;z-index:251712512;visibility:visible;mso-wrap-style:square;mso-width-percent:0;mso-height-percent:0;mso-wrap-distance-left:9pt;mso-wrap-distance-top:3.6pt;mso-wrap-distance-right:9pt;mso-wrap-distance-bottom:3.6pt;mso-position-horizontal:absolute;mso-position-horizontal-relative:text;mso-position-vertical:absolute;mso-position-vertical-relative:text;mso-width-percent:0;mso-height-percent:0;mso-width-relative:margin;mso-height-relative:margin;v-text-anchor:top" o:gfxdata="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" fillcolor="white [3212]" strokecolor="white [3212]">
                 <v:textbox>
                   <w:txbxContent>
                     <w:p>

</xml_diff>

<commit_message>
fix(examenes): normalizar decimales y sexo mostrado en examen de sangre
</commit_message>
<xml_diff>
--- a/examenes_medicos_templates/FORMATO EXAMEN DE ORINA.docx
+++ b/examenes_medicos_templates/FORMATO EXAMEN DE ORINA.docx
@@ -182,7 +182,7 @@
                                 <w:b/>
                                 <w:lang w:val="es-MX"/>
                               </w:rPr>
-                              <w:t>                                                                                EXAMEN GENERAL DE ORINA</w:t>
+                              <w:t>EXAMEN GENERAL DE ORINA</w:t>
                             </w:r>
                           </w:p>
                         </w:txbxContent>
@@ -1006,7 +1006,7 @@
                                     <pic:cNvPicPr/>
                                   </pic:nvPicPr>
                                   <pic:blipFill>
-                                    <a:blip r:embed="rId5">
+                                    <a:blip r:embed="rId6">
                                       <a:extLst>
                                         <a:ext uri="{28A0092B-C50C-407E-A947-70E740481C1C}">
                                           <a14:useLocalDpi xmlns:a14="http://schemas.microsoft.com/office/drawing/2010/main" val="0"/>
@@ -1347,7 +1347,7 @@
                                 <w:sz w:val="48"/>
                                 <w:szCs w:val="48"/>
                               </w:rPr>
-                              <w:t xml:space="preserve">Laboratorio Clinico</w:t>
+                              <w:t>Laboratorio Clinico</w:t>
                             </w:r>
                           </w:p>
                         </w:txbxContent>
@@ -2617,7 +2617,7 @@
                                 <w:b/>
                                 <w:lang w:val="es-MX"/>
                               </w:rPr>
-                              <w:t>{leucocitos}</w:t>
+                              <w:t>5/C</w:t>
                             </w:r>
                           </w:p>
                           <w:p>
@@ -2747,7 +2747,11 @@
           </mc:Choice>
           <mc:Fallback>
             <w:pict>
-              <v:shape w14:anchorId="208A1A8F" id="_x0000_s1037" type="#_x0000_t202" style="position:absolute;margin-left:138pt;margin-top:285pt;width:142.5pt;height:401.25pt;z-index:251712512;visibility:visible;mso-wrap-style:square;mso-width-percent:0;mso-height-percent:0;mso-wrap-distance-left:9pt;mso-wrap-distance-top:3.6pt;mso-wrap-distance-right:9pt;mso-wrap-distance-bottom:3.6pt;mso-position-horizontal:absolute;mso-position-horizontal-relative:text;mso-position-vertical:absolute;mso-position-vertical-relative:text;mso-width-percent:0;mso-height-percent:0;mso-width-relative:margin;mso-height-relative:margin;v-text-anchor:top" o:gfxdata="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" fillcolor="white [3212]" strokecolor="white [3212]">
+              <v:shapetype w14:anchorId="208A1A8F" id="_x0000_t202" coordsize="21600,21600" o:spt="202" path="m,l,21600r21600,l21600,xe">
+                <v:stroke joinstyle="miter"/>
+                <v:path gradientshapeok="t" o:connecttype="rect"/>
+              </v:shapetype>
+              <v:shape id="_x0000_s1037" type="#_x0000_t202" style="position:absolute;margin-left:138pt;margin-top:226.25pt;width:142.5pt;height:401.25pt;z-index:251712512;visibility:visible;mso-wrap-style:square;mso-width-percent:0;mso-height-percent:0;mso-wrap-distance-left:9pt;mso-wrap-distance-top:3.6pt;mso-wrap-distance-right:9pt;mso-wrap-distance-bottom:3.6pt;mso-position-horizontal:absolute;mso-position-horizontal-relative:text;mso-position-vertical:absolute;mso-position-vertical-relative:text;mso-width-percent:0;mso-height-percent:0;mso-width-relative:margin;mso-height-relative:margin;v-text-anchor:top" o:gfxdata="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" fillcolor="white [3212]" strokecolor="white [3212]">
                 <v:textbox>
                   <w:txbxContent>
                     <w:p>
@@ -3012,7 +3016,7 @@
                           <w:b/>
                           <w:lang w:val="es-MX"/>
                         </w:rPr>
-                        <w:t>{leucocitos}</w:t>
+                        <w:t>5/C</w:t>
                       </w:r>
                     </w:p>
                     <w:p>
@@ -4128,7 +4132,7 @@
                                           <pic:cNvPicPr/>
                                         </pic:nvPicPr>
                                         <pic:blipFill>
-                                          <a:blip r:embed="rId6"/>
+                                          <a:blip r:embed="rId7"/>
                                           <a:stretch>
                                             <a:fillRect/>
                                           </a:stretch>
@@ -4198,7 +4202,7 @@
                                     <pic:cNvPicPr/>
                                   </pic:nvPicPr>
                                   <pic:blipFill>
-                                    <a:blip r:embed="rId6"/>
+                                    <a:blip r:embed="rId8"/>
                                     <a:stretch>
                                       <a:fillRect/>
                                     </a:stretch>
@@ -4930,6 +4934,7 @@
   <w:style w:type="character" w:default="1" w:styleId="Fuentedeprrafopredeter">
     <w:name w:val="Default Paragraph Font"/>
     <w:uiPriority w:val="1"/>
+    <w:semiHidden/>
     <w:unhideWhenUsed/>
   </w:style>
   <w:style w:type="table" w:default="1" w:styleId="Tablanormal">

</xml_diff>

<commit_message>
fix(examenes): corregir tipografia y maquetacion real del examen de orina
</commit_message>
<xml_diff>
--- a/examenes_medicos_templates/FORMATO EXAMEN DE ORINA.docx
+++ b/examenes_medicos_templates/FORMATO EXAMEN DE ORINA.docx
@@ -182,7 +182,7 @@
                                 <w:b/>
                                 <w:lang w:val="es-MX"/>
                               </w:rPr>
-                              <w:t>EXAMEN GENERAL DE ORINA</w:t>
+                              <w:t>      EXAMEN GENERAL DE ORINA</w:t>
                             </w:r>
                           </w:p>
                         </w:txbxContent>
@@ -222,7 +222,7 @@
                           <w:b/>
                           <w:lang w:val="es-MX"/>
                         </w:rPr>
-                        <w:t>                                                                                EXAMEN GENERAL DE ORINA</w:t>
+                        <w:t>      EXAMEN GENERAL DE ORINA</w:t>
                       </w:r>
                     </w:p>
                   </w:txbxContent>
@@ -2751,7 +2751,7 @@
                 <v:stroke joinstyle="miter"/>
                 <v:path gradientshapeok="t" o:connecttype="rect"/>
               </v:shapetype>
-              <v:shape id="_x0000_s1037" type="#_x0000_t202" style="position:absolute;margin-left:138pt;margin-top:226.25pt;width:142.5pt;height:401.25pt;z-index:251712512;visibility:visible;mso-wrap-style:square;mso-width-percent:0;mso-height-percent:0;mso-wrap-distance-left:9pt;mso-wrap-distance-top:3.6pt;mso-wrap-distance-right:9pt;mso-wrap-distance-bottom:3.6pt;mso-position-horizontal:absolute;mso-position-horizontal-relative:text;mso-position-vertical:absolute;mso-position-vertical-relative:text;mso-width-percent:0;mso-height-percent:0;mso-width-relative:margin;mso-height-relative:margin;v-text-anchor:top" o:gfxdata="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" fillcolor="white [3212]" strokecolor="white [3212]">
+              <v:shape id="_x0000_s1037" type="#_x0000_t202" style="position:absolute;margin-left:138pt;margin-top:285pt;width:142.5pt;height:401.25pt;z-index:251712512;visibility:visible;mso-wrap-style:square;mso-width-percent:0;mso-height-percent:0;mso-wrap-distance-left:9pt;mso-wrap-distance-top:3.6pt;mso-wrap-distance-right:9pt;mso-wrap-distance-bottom:3.6pt;mso-position-horizontal:absolute;mso-position-horizontal-relative:text;mso-position-vertical:absolute;mso-position-vertical-relative:text;mso-width-percent:0;mso-height-percent:0;mso-width-relative:margin;mso-height-relative:margin;v-text-anchor:top" o:gfxdata="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" fillcolor="white [3212]" strokecolor="white [3212]">
                 <v:textbox>
                   <w:txbxContent>
                     <w:p>

</xml_diff>

<commit_message>
fix(examenes): pulir encabezado y bloque inferior del examen de orina
</commit_message>
<xml_diff>
--- a/examenes_medicos_templates/FORMATO EXAMEN DE ORINA.docx
+++ b/examenes_medicos_templates/FORMATO EXAMEN DE ORINA.docx
@@ -78,7 +78,7 @@
           </w:tcPr>
           <w:p>
             <w:pPr>
-              <w:spacing w:after="0" w:before="0" w:line="240" w:lineRule="auto"/>
+              <w:spacing w:after="120" w:before="0" w:line="240" w:lineRule="auto"/>
               <w:jc w:val="left"/>
             </w:pPr>
             <w:r>
@@ -88,12 +88,27 @@
                 <w:color w:val="FFFFFF"/>
                 <w:sz w:val="28"/>
               </w:rPr>
-              <w:t>Laboratorio Clinico</w:t>
+              <w:t xml:space="preserve">Laboratorio Clinico</w:t>
             </w:r>
           </w:p>
           <w:p>
             <w:pPr>
-              <w:spacing w:after="0" w:before="0" w:line="240" w:lineRule="auto"/>
+              <w:spacing w:after="160" w:before="80" w:line="240" w:lineRule="auto"/>
+              <w:jc w:val="center"/>
+            </w:pPr>
+            <w:r>
+              <w:rPr>
+                <w:rFonts w:ascii="Arial" w:hAnsi="Arial"/>
+                <w:b/>
+                <w:color w:val="FFFFFF"/>
+                <w:sz w:val="17"/>
+              </w:rPr>
+              <w:t>Calidad en los exámenes, calidez en el trato a precios justos</w:t>
+            </w:r>
+          </w:p>
+          <w:p>
+            <w:pPr>
+              <w:spacing w:after="0" w:before="80" w:line="240" w:lineRule="auto"/>
               <w:jc w:val="right"/>
             </w:pPr>
             <w:r>
@@ -106,25 +121,19 @@
               <w:t>www.3cglab.com.mx   T 81.8361.8350 / 81.8679.6597</w:t>
             </w:r>
           </w:p>
-          <w:p>
-            <w:pPr>
-              <w:spacing w:after="0" w:before="0" w:line="240" w:lineRule="auto"/>
-              <w:jc w:val="center"/>
-            </w:pPr>
-            <w:r>
-              <w:rPr>
-                <w:rFonts w:ascii="Arial" w:hAnsi="Arial"/>
-                <w:b/>
-                <w:color w:val="FFFFFF"/>
-                <w:sz w:val="17"/>
-              </w:rPr>
-              <w:t>Calidad en los exámenes, calidez en el trato a precios justos</w:t>
-            </w:r>
-          </w:p>
         </w:tc>
       </w:tr>
     </w:tbl>
-    <w:p/>
+    <w:p>
+      <w:pPr>
+        <w:spacing w:after="120" w:before="120" w:line="240" w:lineRule="auto"/>
+      </w:pPr>
+    </w:p>
+    <w:p>
+      <w:pPr>
+        <w:spacing w:after="120" w:before="0" w:line="240" w:lineRule="auto"/>
+      </w:pPr>
+    </w:p>
     <w:tbl>
       <w:tblPr>
         <w:tblW w:type="auto" w:w="0"/>
@@ -286,10 +295,19 @@
         </w:tc>
       </w:tr>
     </w:tbl>
-    <w:p/>
     <w:p>
       <w:pPr>
-        <w:spacing w:after="0" w:before="0" w:line="240" w:lineRule="auto"/>
+        <w:spacing w:after="120" w:before="160" w:line="240" w:lineRule="auto"/>
+      </w:pPr>
+    </w:p>
+    <w:p>
+      <w:pPr>
+        <w:spacing w:after="120" w:before="0" w:line="240" w:lineRule="auto"/>
+      </w:pPr>
+    </w:p>
+    <w:p>
+      <w:pPr>
+        <w:spacing w:after="120" w:before="0" w:line="240" w:lineRule="auto"/>
         <w:jc w:val="center"/>
       </w:pPr>
       <w:r>
@@ -301,7 +319,11 @@
         <w:t>EXAMEN GENERAL DE ORINA</w:t>
       </w:r>
     </w:p>
-    <w:p/>
+    <w:p>
+      <w:pPr>
+        <w:spacing w:after="120" w:before="0" w:line="240" w:lineRule="auto"/>
+      </w:pPr>
+    </w:p>
     <w:tbl>
       <w:tblPr>
         <w:tblW w:type="auto" w:w="0"/>
@@ -1795,7 +1817,7 @@
     </w:tbl>
     <w:p>
       <w:pPr>
-        <w:spacing w:after="0" w:before="0" w:line="240" w:lineRule="auto"/>
+        <w:spacing w:after="0" w:before="220" w:line="240" w:lineRule="auto"/>
         <w:jc w:val="right"/>
       </w:pPr>
       <w:r>

</xml_diff>

<commit_message>
refactor(orina): rebuild urinalysis DOCX template from scratch using structured 3-column table
- Removed dependency on broken legacy DOCX layout (block-based structure)
- Rebuilt template with single unified table: PARAMETRO / RESULTADO / REFERENCIA
- Enforced strict row order for all urinalysis parameters
- Implemented dynamic placeholders per cell (resultado/referencia)
- Eliminated layout issues: spacing gaps, misalignment, floating sections
- Standardized typography and compact clinical formatting
- Ensured PDF export integrity (no column break or structure loss)

Result: output now matches professional clinical document layout instead of fragmented text blocks
</commit_message>
<xml_diff>
--- a/examenes_medicos_templates/FORMATO EXAMEN DE ORINA.docx
+++ b/examenes_medicos_templates/FORMATO EXAMEN DE ORINA.docx
@@ -4,35 +4,46 @@
   <w:body>
     <w:tbl>
       <w:tblPr>
-        <w:tblW w:type="auto" w:w="0"/>
+        <w:tblW w:type="dxa" w:w="12241"/>
         <w:jc w:val="center"/>
         <w:tblLayout w:type="fixed"/>
         <w:tblLook w:firstColumn="1" w:firstRow="1" w:lastColumn="0" w:lastRow="0" w:noHBand="0" w:noVBand="1" w:val="04A0"/>
+        <w:tblBorders>
+          <w:top w:val="nil"/>
+          <w:left w:val="nil"/>
+          <w:bottom w:val="nil"/>
+          <w:right w:val="nil"/>
+          <w:insideH w:val="nil"/>
+          <w:insideV w:val="nil"/>
+        </w:tblBorders>
       </w:tblPr>
       <w:tblGrid>
-        <w:gridCol w:w="1134"/>
-        <w:gridCol w:w="10035"/>
+        <w:gridCol w:w="1445"/>
+        <w:gridCol w:w="4791"/>
+        <w:gridCol w:w="6004"/>
       </w:tblGrid>
       <w:tr>
         <w:tc>
           <w:tcPr>
-            <w:tcW w:type="dxa" w:w="5751"/>
-            <w:shd w:val="clear" w:fill="001A99"/>
+            <w:tcW w:type="dxa" w:w="1446"/>
+            <w:shd w:val="clear" w:fill="000066"/>
+            <w:vAlign w:val="center"/>
             <w:tcMar>
-              <w:top w:w="18" w:type="dxa"/>
-              <w:start w:w="26" w:type="dxa"/>
-              <w:bottom w:w="18" w:type="dxa"/>
-              <w:end w:w="26" w:type="dxa"/>
+              <w:top w:type="dxa" w:w="340"/>
+              <w:start w:type="dxa" w:w="100"/>
+              <w:bottom w:type="dxa" w:w="330"/>
+              <w:end w:type="dxa" w:w="100"/>
             </w:tcMar>
           </w:tcPr>
           <w:p>
             <w:pPr>
+              <w:spacing w:before="0" w:after="0"/>
               <w:jc w:val="center"/>
             </w:pPr>
             <w:r>
               <w:drawing>
                 <wp:inline xmlns:a="http://schemas.openxmlformats.org/drawingml/2006/main" xmlns:pic="http://schemas.openxmlformats.org/drawingml/2006/picture">
-                  <wp:extent cx="486000" cy="486000"/>
+                  <wp:extent cx="630000" cy="630000"/>
                   <wp:docPr id="1" name="Picture 1"/>
                   <wp:cNvGraphicFramePr>
                     <a:graphicFrameLocks noChangeAspect="1"/>
@@ -41,7 +52,7 @@
                     <a:graphicData uri="http://schemas.openxmlformats.org/drawingml/2006/picture">
                       <pic:pic>
                         <pic:nvPicPr>
-                          <pic:cNvPr id="0" name="image1.png"/>
+                          <pic:cNvPr id="0" name="logo.png"/>
                           <pic:cNvPicPr/>
                         </pic:nvPicPr>
                         <pic:blipFill>
@@ -53,7 +64,7 @@
                         <pic:spPr>
                           <a:xfrm>
                             <a:off x="0" y="0"/>
-                            <a:ext cx="486000" cy="486000"/>
+                            <a:ext cx="630000" cy="630000"/>
                           </a:xfrm>
                           <a:prstGeom prst="rect"/>
                         </pic:spPr>
@@ -67,13 +78,14 @@
         </w:tc>
         <w:tc>
           <w:tcPr>
-            <w:tcW w:type="dxa" w:w="5751"/>
-            <w:shd w:val="clear" w:fill="001A99"/>
+            <w:tcW w:type="dxa" w:w="4791"/>
+            <w:shd w:val="clear" w:fill="000066"/>
+            <w:vAlign w:val="center"/>
             <w:tcMar>
-              <w:top w:w="18" w:type="dxa"/>
-              <w:start w:w="26" w:type="dxa"/>
-              <w:bottom w:w="18" w:type="dxa"/>
-              <w:end w:w="26" w:type="dxa"/>
+              <w:top w:type="dxa" w:w="340"/>
+              <w:start w:type="dxa" w:w="100"/>
+              <w:bottom w:type="dxa" w:w="330"/>
+              <w:end w:type="dxa" w:w="100"/>
             </w:tcMar>
           </w:tcPr>
           <w:p>
@@ -83,69 +95,42 @@
             </w:pPr>
             <w:r>
               <w:rPr>
-                <w:rFonts w:ascii="ADLaM Display" w:hAnsi="ADLaM Display" w:cs="ADLaM Display"/>
+                <w:rFonts w:ascii="Calibri" w:hAnsi="Calibri" w:cs="Calibri" w:eastAsia="Calibri"/>
                 <w:b/>
                 <w:color w:val="FFFFFF"/>
-                <w:sz w:val="33"/>
+                <w:sz w:val="40"/>
               </w:rPr>
               <w:t>Laboratorio Clinico</w:t>
             </w:r>
           </w:p>
+        </w:tc>
+        <w:tc>
+          <w:tcPr>
+            <w:tcW w:type="dxa" w:w="6004"/>
+            <w:shd w:val="clear" w:fill="000066"/>
+            <w:vAlign w:val="center"/>
+            <w:tcMar>
+              <w:top w:type="dxa" w:w="340"/>
+              <w:start w:type="dxa" w:w="100"/>
+              <w:bottom w:type="dxa" w:w="330"/>
+              <w:end w:type="dxa" w:w="100"/>
+            </w:tcMar>
+          </w:tcPr>
           <w:p>
             <w:pPr>
-              <w:spacing w:after="0"/>
-              <w:jc w:val="center"/>
-            </w:pPr>
-            <w:r>
-              <w:rPr>
-                <w:rFonts w:ascii="ADLaM Display" w:hAnsi="ADLaM Display" w:cs="ADLaM Display"/>
-                <w:b/>
-                <w:color w:val="FFFFFF"/>
-                <w:sz w:val="19"/>
-              </w:rPr>
-              <w:t>Calidad en los exámenes, calidez en el trato a precios justos</w:t>
-            </w:r>
-          </w:p>
-          <w:p>
-            <w:pPr>
-              <w:spacing w:after="0"/>
+              <w:spacing w:after="140"/>
               <w:jc w:val="right"/>
             </w:pPr>
             <w:r>
               <w:rPr>
-                <w:rFonts w:ascii="ADLaM Display" w:hAnsi="ADLaM Display" w:cs="ADLaM Display"/>
-                <w:b/>
+                <w:rFonts w:ascii="Calibri" w:hAnsi="Calibri" w:cs="Calibri" w:eastAsia="Calibri"/>
+                <w:b w:val="0"/>
                 <w:color w:val="FFFFFF"/>
-                <w:sz w:val="18"/>
+                <w:sz w:val="17"/>
               </w:rPr>
-              <w:t>www.3cglab.com.mx   T 81.8361.8350 / 81.8679.6597</w:t>
+              <w:t>www.3cglab.com.mx    T 81.8361.8350 / 81.8679.6597</w:t>
             </w:r>
           </w:p>
-        </w:tc>
-      </w:tr>
-    </w:tbl>
-    <w:tbl>
-      <w:tblPr>
-        <w:tblW w:type="auto" w:w="0"/>
-        <w:jc w:val="center"/>
-        <w:tblLayout w:type="fixed"/>
-        <w:tblLook w:firstColumn="1" w:firstRow="1" w:lastColumn="0" w:lastRow="0" w:noHBand="0" w:noVBand="1" w:val="04A0"/>
-      </w:tblPr>
-      <w:tblGrid>
-        <w:gridCol w:w="6236"/>
-        <w:gridCol w:w="4195"/>
-      </w:tblGrid>
-      <w:tr>
-        <w:tc>
-          <w:tcPr>
-            <w:tcW w:type="dxa" w:w="5751"/>
-            <w:tcMar>
-              <w:top w:w="6" w:type="dxa"/>
-              <w:start w:w="12" w:type="dxa"/>
-              <w:bottom w:w="6" w:type="dxa"/>
-              <w:end w:w="12" w:type="dxa"/>
-            </w:tcMar>
-          </w:tcPr>
           <w:p>
             <w:pPr>
               <w:spacing w:before="0" w:after="0"/>
@@ -153,9 +138,67 @@
             </w:pPr>
             <w:r>
               <w:rPr>
-                <w:rFonts w:ascii="ADLaM Display" w:hAnsi="ADLaM Display" w:cs="ADLaM Display"/>
+                <w:rFonts w:ascii="Calibri" w:hAnsi="Calibri" w:cs="Calibri" w:eastAsia="Calibri"/>
+                <w:b w:val="0"/>
+                <w:color w:val="FFFFFF"/>
+                <w:sz w:val="24"/>
+              </w:rPr>
+              <w:t>Calidad en los exámenes, calidez en el trato a precios justos</w:t>
+            </w:r>
+          </w:p>
+        </w:tc>
+      </w:tr>
+    </w:tbl>
+    <w:p>
+      <w:pPr>
+        <w:spacing w:after="280"/>
+      </w:pPr>
+    </w:p>
+    <w:tbl>
+      <w:tblPr>
+        <w:tblW w:type="dxa" w:w="12241"/>
+        <w:jc w:val="center"/>
+        <w:tblLayout w:type="fixed"/>
+        <w:tblLook w:firstColumn="1" w:firstRow="1" w:lastColumn="0" w:lastRow="0" w:noHBand="0" w:noVBand="1" w:val="04A0"/>
+        <w:tblBorders>
+          <w:top w:val="nil"/>
+          <w:left w:val="nil"/>
+          <w:bottom w:val="nil"/>
+          <w:right w:val="nil"/>
+          <w:insideH w:val="nil"/>
+          <w:insideV w:val="nil"/>
+        </w:tblBorders>
+      </w:tblPr>
+      <w:tblGrid>
+        <w:gridCol w:w="5811"/>
+        <w:gridCol w:w="6429"/>
+      </w:tblGrid>
+      <w:tr>
+        <w:trPr>
+          <w:trHeight w:hRule="exact" w:val="215"/>
+        </w:trPr>
+        <w:tc>
+          <w:tcPr>
+            <w:tcW w:type="dxa" w:w="5811"/>
+            <w:vAlign w:val="center"/>
+            <w:tcMar>
+              <w:top w:type="dxa" w:w="0"/>
+              <w:start w:type="dxa" w:w="120"/>
+              <w:bottom w:type="dxa" w:w="0"/>
+              <w:end w:type="dxa" w:w="120"/>
+            </w:tcMar>
+          </w:tcPr>
+          <w:p>
+            <w:pPr>
+              <w:spacing w:before="0" w:after="0" w:line="240" w:lineRule="auto"/>
+              <w:jc w:val="left"/>
+            </w:pPr>
+            <w:r>
+              <w:rPr>
+                <w:rFonts w:ascii="Calibri" w:hAnsi="Calibri" w:cs="Calibri" w:eastAsia="Calibri"/>
                 <w:b/>
-                <w:sz w:val="22"/>
+                <w:sz w:val="20"/>
+                <w:u w:val="none"/>
               </w:rPr>
               <w:t>PACIENTE: {paciente_nombre_completo}</w:t>
             </w:r>
@@ -163,24 +206,26 @@
         </w:tc>
         <w:tc>
           <w:tcPr>
-            <w:tcW w:type="dxa" w:w="5751"/>
+            <w:tcW w:type="dxa" w:w="6429"/>
+            <w:vAlign w:val="center"/>
             <w:tcMar>
-              <w:top w:w="6" w:type="dxa"/>
-              <w:start w:w="12" w:type="dxa"/>
-              <w:bottom w:w="6" w:type="dxa"/>
-              <w:end w:w="12" w:type="dxa"/>
+              <w:top w:type="dxa" w:w="0"/>
+              <w:start w:type="dxa" w:w="120"/>
+              <w:bottom w:type="dxa" w:w="0"/>
+              <w:end w:type="dxa" w:w="120"/>
             </w:tcMar>
           </w:tcPr>
           <w:p>
             <w:pPr>
-              <w:spacing w:before="0" w:after="0"/>
+              <w:spacing w:before="0" w:after="0" w:line="240" w:lineRule="auto"/>
               <w:jc w:val="left"/>
             </w:pPr>
             <w:r>
               <w:rPr>
-                <w:rFonts w:ascii="ADLaM Display" w:hAnsi="ADLaM Display" w:cs="ADLaM Display"/>
+                <w:rFonts w:ascii="Calibri" w:hAnsi="Calibri" w:cs="Calibri" w:eastAsia="Calibri"/>
                 <w:b/>
-                <w:sz w:val="22"/>
+                <w:sz w:val="20"/>
+                <w:u w:val="none"/>
               </w:rPr>
               <w:t>EDAD: {edad}</w:t>
             </w:r>
@@ -188,26 +233,31 @@
         </w:tc>
       </w:tr>
       <w:tr>
+        <w:trPr>
+          <w:trHeight w:hRule="exact" w:val="215"/>
+        </w:trPr>
         <w:tc>
           <w:tcPr>
-            <w:tcW w:type="dxa" w:w="5751"/>
+            <w:tcW w:type="dxa" w:w="5811"/>
+            <w:vAlign w:val="center"/>
             <w:tcMar>
-              <w:top w:w="6" w:type="dxa"/>
-              <w:start w:w="12" w:type="dxa"/>
-              <w:bottom w:w="6" w:type="dxa"/>
-              <w:end w:w="12" w:type="dxa"/>
+              <w:top w:type="dxa" w:w="0"/>
+              <w:start w:type="dxa" w:w="120"/>
+              <w:bottom w:type="dxa" w:w="0"/>
+              <w:end w:type="dxa" w:w="120"/>
             </w:tcMar>
           </w:tcPr>
           <w:p>
             <w:pPr>
-              <w:spacing w:before="0" w:after="0"/>
+              <w:spacing w:before="0" w:after="0" w:line="240" w:lineRule="auto"/>
               <w:jc w:val="left"/>
             </w:pPr>
             <w:r>
               <w:rPr>
-                <w:rFonts w:ascii="ADLaM Display" w:hAnsi="ADLaM Display" w:cs="ADLaM Display"/>
+                <w:rFonts w:ascii="Calibri" w:hAnsi="Calibri" w:cs="Calibri" w:eastAsia="Calibri"/>
                 <w:b/>
-                <w:sz w:val="22"/>
+                <w:sz w:val="20"/>
+                <w:u w:val="none"/>
               </w:rPr>
               <w:t>MEDICO: A quien Corresponda</w:t>
             </w:r>
@@ -215,24 +265,26 @@
         </w:tc>
         <w:tc>
           <w:tcPr>
-            <w:tcW w:type="dxa" w:w="5751"/>
+            <w:tcW w:type="dxa" w:w="6429"/>
+            <w:vAlign w:val="center"/>
             <w:tcMar>
-              <w:top w:w="6" w:type="dxa"/>
-              <w:start w:w="12" w:type="dxa"/>
-              <w:bottom w:w="6" w:type="dxa"/>
-              <w:end w:w="12" w:type="dxa"/>
+              <w:top w:type="dxa" w:w="0"/>
+              <w:start w:type="dxa" w:w="120"/>
+              <w:bottom w:type="dxa" w:w="0"/>
+              <w:end w:type="dxa" w:w="120"/>
             </w:tcMar>
           </w:tcPr>
           <w:p>
             <w:pPr>
-              <w:spacing w:before="0" w:after="0"/>
+              <w:spacing w:before="0" w:after="0" w:line="240" w:lineRule="auto"/>
               <w:jc w:val="left"/>
             </w:pPr>
             <w:r>
               <w:rPr>
-                <w:rFonts w:ascii="ADLaM Display" w:hAnsi="ADLaM Display" w:cs="ADLaM Display"/>
+                <w:rFonts w:ascii="Calibri" w:hAnsi="Calibri" w:cs="Calibri" w:eastAsia="Calibri"/>
                 <w:b/>
-                <w:sz w:val="22"/>
+                <w:sz w:val="20"/>
+                <w:u w:val="none"/>
               </w:rPr>
               <w:t>SEXO: {sexo}</w:t>
             </w:r>
@@ -240,26 +292,31 @@
         </w:tc>
       </w:tr>
       <w:tr>
+        <w:trPr>
+          <w:trHeight w:hRule="exact" w:val="215"/>
+        </w:trPr>
         <w:tc>
           <w:tcPr>
-            <w:tcW w:type="dxa" w:w="5751"/>
+            <w:tcW w:type="dxa" w:w="5811"/>
+            <w:vAlign w:val="center"/>
             <w:tcMar>
-              <w:top w:w="6" w:type="dxa"/>
-              <w:start w:w="12" w:type="dxa"/>
-              <w:bottom w:w="6" w:type="dxa"/>
-              <w:end w:w="12" w:type="dxa"/>
+              <w:top w:type="dxa" w:w="0"/>
+              <w:start w:type="dxa" w:w="120"/>
+              <w:bottom w:type="dxa" w:w="0"/>
+              <w:end w:type="dxa" w:w="120"/>
             </w:tcMar>
           </w:tcPr>
           <w:p>
             <w:pPr>
-              <w:spacing w:before="0" w:after="0"/>
+              <w:spacing w:before="0" w:after="0" w:line="240" w:lineRule="auto"/>
               <w:jc w:val="left"/>
             </w:pPr>
             <w:r>
               <w:rPr>
-                <w:rFonts w:ascii="ADLaM Display" w:hAnsi="ADLaM Display" w:cs="ADLaM Display"/>
+                <w:rFonts w:ascii="Calibri" w:hAnsi="Calibri" w:cs="Calibri" w:eastAsia="Calibri"/>
                 <w:b/>
-                <w:sz w:val="22"/>
+                <w:sz w:val="20"/>
+                <w:u w:val="none"/>
               </w:rPr>
               <w:t>FECHA: {fecha_estudio}</w:t>
             </w:r>
@@ -267,24 +324,26 @@
         </w:tc>
         <w:tc>
           <w:tcPr>
-            <w:tcW w:type="dxa" w:w="5751"/>
+            <w:tcW w:type="dxa" w:w="6429"/>
+            <w:vAlign w:val="center"/>
             <w:tcMar>
-              <w:top w:w="6" w:type="dxa"/>
-              <w:start w:w="12" w:type="dxa"/>
-              <w:bottom w:w="6" w:type="dxa"/>
-              <w:end w:w="12" w:type="dxa"/>
+              <w:top w:type="dxa" w:w="0"/>
+              <w:start w:type="dxa" w:w="120"/>
+              <w:bottom w:type="dxa" w:w="0"/>
+              <w:end w:type="dxa" w:w="120"/>
             </w:tcMar>
           </w:tcPr>
           <w:p>
             <w:pPr>
-              <w:spacing w:before="0" w:after="0"/>
+              <w:spacing w:before="0" w:after="0" w:line="240" w:lineRule="auto"/>
               <w:jc w:val="left"/>
             </w:pPr>
             <w:r>
               <w:rPr>
-                <w:rFonts w:ascii="ADLaM Display" w:hAnsi="ADLaM Display" w:cs="ADLaM Display"/>
+                <w:rFonts w:ascii="Calibri" w:hAnsi="Calibri" w:cs="Calibri" w:eastAsia="Calibri"/>
                 <w:b/>
-                <w:sz w:val="22"/>
+                <w:sz w:val="20"/>
+                <w:u w:val="none"/>
               </w:rPr>
               <w:t>FOLIO: {folio}</w:t>
             </w:r>
@@ -294,51 +353,63 @@
     </w:tbl>
     <w:p>
       <w:pPr>
-        <w:spacing w:before="100" w:after="100"/>
+        <w:spacing w:before="780" w:after="440"/>
         <w:jc w:val="center"/>
       </w:pPr>
       <w:r>
         <w:rPr>
-          <w:rFonts w:ascii="ADLaM Display" w:hAnsi="ADLaM Display" w:cs="ADLaM Display"/>
+          <w:rFonts w:ascii="Calibri" w:hAnsi="Calibri" w:cs="Calibri" w:eastAsia="Calibri"/>
           <w:b/>
-          <w:sz w:val="23"/>
+          <w:sz w:val="20"/>
         </w:rPr>
         <w:t>EXAMEN GENERAL DE ORINA</w:t>
       </w:r>
     </w:p>
     <w:tbl>
       <w:tblPr>
-        <w:tblW w:type="auto" w:w="0"/>
+        <w:tblW w:type="dxa" w:w="12241"/>
         <w:jc w:val="center"/>
         <w:tblLayout w:type="fixed"/>
         <w:tblLook w:firstColumn="1" w:firstRow="1" w:lastColumn="0" w:lastRow="0" w:noHBand="0" w:noVBand="1" w:val="04A0"/>
+        <w:tblBorders>
+          <w:top w:val="nil"/>
+          <w:left w:val="nil"/>
+          <w:bottom w:val="nil"/>
+          <w:right w:val="nil"/>
+          <w:insideH w:val="nil"/>
+          <w:insideV w:val="nil"/>
+        </w:tblBorders>
       </w:tblPr>
       <w:tblGrid>
-        <w:gridCol w:w="2721"/>
-        <w:gridCol w:w="2665"/>
-        <w:gridCol w:w="5046"/>
+        <w:gridCol w:w="2693"/>
+        <w:gridCol w:w="2749"/>
+        <w:gridCol w:w="6798"/>
       </w:tblGrid>
       <w:tr>
+        <w:trPr>
+          <w:trHeight w:hRule="exact" w:val="207"/>
+        </w:trPr>
         <w:tc>
           <w:tcPr>
-            <w:tcW w:type="dxa" w:w="3834"/>
+            <w:tcW w:type="dxa" w:w="2693"/>
+            <w:vAlign w:val="center"/>
             <w:tcMar>
-              <w:top w:w="2" w:type="dxa"/>
-              <w:start w:w="10" w:type="dxa"/>
-              <w:bottom w:w="2" w:type="dxa"/>
-              <w:end w:w="10" w:type="dxa"/>
+              <w:top w:type="dxa" w:w="0"/>
+              <w:start w:type="dxa" w:w="118"/>
+              <w:bottom w:type="dxa" w:w="0"/>
+              <w:end w:type="dxa" w:w="118"/>
             </w:tcMar>
           </w:tcPr>
           <w:p>
             <w:pPr>
-              <w:spacing w:after="20"/>
+              <w:spacing w:before="0" w:after="0" w:line="240" w:lineRule="auto"/>
               <w:jc w:val="left"/>
             </w:pPr>
             <w:r>
               <w:rPr>
-                <w:rFonts w:ascii="ADLaM Display" w:hAnsi="ADLaM Display" w:cs="ADLaM Display"/>
+                <w:rFonts w:ascii="Calibri" w:hAnsi="Calibri" w:cs="Calibri" w:eastAsia="Calibri"/>
                 <w:b/>
-                <w:sz w:val="21"/>
+                <w:sz w:val="20"/>
                 <w:u w:val="single"/>
               </w:rPr>
               <w:t>PARAMETRO</w:t>
@@ -347,24 +418,25 @@
         </w:tc>
         <w:tc>
           <w:tcPr>
-            <w:tcW w:type="dxa" w:w="3834"/>
+            <w:tcW w:type="dxa" w:w="2750"/>
+            <w:vAlign w:val="center"/>
             <w:tcMar>
-              <w:top w:w="2" w:type="dxa"/>
-              <w:start w:w="10" w:type="dxa"/>
-              <w:bottom w:w="2" w:type="dxa"/>
-              <w:end w:w="10" w:type="dxa"/>
+              <w:top w:type="dxa" w:w="0"/>
+              <w:start w:type="dxa" w:w="118"/>
+              <w:bottom w:type="dxa" w:w="0"/>
+              <w:end w:type="dxa" w:w="118"/>
             </w:tcMar>
           </w:tcPr>
           <w:p>
             <w:pPr>
-              <w:spacing w:after="20"/>
+              <w:spacing w:before="0" w:after="0" w:line="240" w:lineRule="auto"/>
               <w:jc w:val="left"/>
             </w:pPr>
             <w:r>
               <w:rPr>
-                <w:rFonts w:ascii="ADLaM Display" w:hAnsi="ADLaM Display" w:cs="ADLaM Display"/>
+                <w:rFonts w:ascii="Calibri" w:hAnsi="Calibri" w:cs="Calibri" w:eastAsia="Calibri"/>
                 <w:b/>
-                <w:sz w:val="21"/>
+                <w:sz w:val="20"/>
                 <w:u w:val="single"/>
               </w:rPr>
               <w:t>RESULTADO</w:t>
@@ -373,24 +445,25 @@
         </w:tc>
         <w:tc>
           <w:tcPr>
-            <w:tcW w:type="dxa" w:w="3834"/>
+            <w:tcW w:type="dxa" w:w="6797"/>
+            <w:vAlign w:val="center"/>
             <w:tcMar>
-              <w:top w:w="2" w:type="dxa"/>
-              <w:start w:w="10" w:type="dxa"/>
-              <w:bottom w:w="2" w:type="dxa"/>
-              <w:end w:w="10" w:type="dxa"/>
+              <w:top w:type="dxa" w:w="0"/>
+              <w:start w:type="dxa" w:w="118"/>
+              <w:bottom w:type="dxa" w:w="0"/>
+              <w:end w:type="dxa" w:w="118"/>
             </w:tcMar>
           </w:tcPr>
           <w:p>
             <w:pPr>
-              <w:spacing w:after="20"/>
+              <w:spacing w:before="0" w:after="0" w:line="240" w:lineRule="auto"/>
               <w:jc w:val="left"/>
             </w:pPr>
             <w:r>
               <w:rPr>
-                <w:rFonts w:ascii="ADLaM Display" w:hAnsi="ADLaM Display" w:cs="ADLaM Display"/>
+                <w:rFonts w:ascii="Calibri" w:hAnsi="Calibri" w:cs="Calibri" w:eastAsia="Calibri"/>
                 <w:b/>
-                <w:sz w:val="21"/>
+                <w:sz w:val="20"/>
                 <w:u w:val="single"/>
               </w:rPr>
               <w:t>REFERENCIA</w:t>
@@ -399,26 +472,31 @@
         </w:tc>
       </w:tr>
       <w:tr>
+        <w:trPr>
+          <w:trHeight w:hRule="exact" w:val="207"/>
+        </w:trPr>
         <w:tc>
           <w:tcPr>
-            <w:tcW w:type="dxa" w:w="3834"/>
+            <w:tcW w:type="dxa" w:w="2693"/>
+            <w:vAlign w:val="center"/>
             <w:tcMar>
-              <w:top w:w="2" w:type="dxa"/>
-              <w:start w:w="10" w:type="dxa"/>
-              <w:bottom w:w="2" w:type="dxa"/>
-              <w:end w:w="10" w:type="dxa"/>
+              <w:top w:type="dxa" w:w="0"/>
+              <w:start w:type="dxa" w:w="118"/>
+              <w:bottom w:type="dxa" w:w="0"/>
+              <w:end w:type="dxa" w:w="118"/>
             </w:tcMar>
           </w:tcPr>
           <w:p>
             <w:pPr>
-              <w:spacing w:after="0" w:before="0"/>
+              <w:spacing w:before="0" w:after="0" w:line="240" w:lineRule="auto"/>
               <w:jc w:val="left"/>
             </w:pPr>
             <w:r>
               <w:rPr>
-                <w:rFonts w:ascii="ADLaM Display" w:hAnsi="ADLaM Display" w:cs="ADLaM Display"/>
+                <w:rFonts w:ascii="Calibri" w:hAnsi="Calibri" w:cs="Calibri" w:eastAsia="Calibri"/>
                 <w:b/>
-                <w:sz w:val="21"/>
+                <w:sz w:val="20"/>
+                <w:u w:val="none"/>
               </w:rPr>
               <w:t>ASPECTO</w:t>
             </w:r>
@@ -426,76 +504,85 @@
         </w:tc>
         <w:tc>
           <w:tcPr>
-            <w:tcW w:type="dxa" w:w="3834"/>
+            <w:tcW w:type="dxa" w:w="2750"/>
+            <w:vAlign w:val="center"/>
             <w:tcMar>
-              <w:top w:w="2" w:type="dxa"/>
-              <w:start w:w="10" w:type="dxa"/>
-              <w:bottom w:w="2" w:type="dxa"/>
-              <w:end w:w="10" w:type="dxa"/>
+              <w:top w:type="dxa" w:w="0"/>
+              <w:start w:type="dxa" w:w="118"/>
+              <w:bottom w:type="dxa" w:w="0"/>
+              <w:end w:type="dxa" w:w="118"/>
             </w:tcMar>
           </w:tcPr>
           <w:p>
             <w:pPr>
-              <w:spacing w:after="0" w:before="0"/>
+              <w:spacing w:before="0" w:after="0" w:line="240" w:lineRule="auto"/>
               <w:jc w:val="left"/>
             </w:pPr>
             <w:r>
               <w:rPr>
-                <w:rFonts w:ascii="ADLaM Display" w:hAnsi="ADLaM Display" w:cs="ADLaM Display"/>
+                <w:rFonts w:ascii="Calibri" w:hAnsi="Calibri" w:cs="Calibri" w:eastAsia="Calibri"/>
                 <w:b/>
-                <w:sz w:val="21"/>
+                <w:sz w:val="20"/>
+                <w:u w:val="none"/>
               </w:rPr>
-              <w:t>{aspecto}</w:t>
+              <w:t>{aspecto_resultado}</w:t>
             </w:r>
           </w:p>
         </w:tc>
         <w:tc>
           <w:tcPr>
-            <w:tcW w:type="dxa" w:w="3834"/>
+            <w:tcW w:type="dxa" w:w="6797"/>
+            <w:vAlign w:val="center"/>
             <w:tcMar>
-              <w:top w:w="2" w:type="dxa"/>
-              <w:start w:w="10" w:type="dxa"/>
-              <w:bottom w:w="2" w:type="dxa"/>
-              <w:end w:w="10" w:type="dxa"/>
+              <w:top w:type="dxa" w:w="0"/>
+              <w:start w:type="dxa" w:w="118"/>
+              <w:bottom w:type="dxa" w:w="0"/>
+              <w:end w:type="dxa" w:w="118"/>
             </w:tcMar>
           </w:tcPr>
           <w:p>
             <w:pPr>
-              <w:spacing w:after="0" w:before="0"/>
+              <w:spacing w:before="0" w:after="0" w:line="240" w:lineRule="auto"/>
               <w:jc w:val="left"/>
             </w:pPr>
             <w:r>
               <w:rPr>
-                <w:rFonts w:ascii="ADLaM Display" w:hAnsi="ADLaM Display" w:cs="ADLaM Display"/>
+                <w:rFonts w:ascii="Calibri" w:hAnsi="Calibri" w:cs="Calibri" w:eastAsia="Calibri"/>
                 <w:b/>
-                <w:sz w:val="21"/>
+                <w:sz w:val="20"/>
+                <w:u w:val="none"/>
               </w:rPr>
-              <w:t>CLARO</w:t>
+              <w:t>{aspecto_referencia}</w:t>
             </w:r>
           </w:p>
         </w:tc>
       </w:tr>
       <w:tr>
+        <w:trPr>
+          <w:trHeight w:hRule="exact" w:val="207"/>
+        </w:trPr>
         <w:tc>
           <w:tcPr>
-            <w:tcW w:type="dxa" w:w="3834"/>
+            <w:tcW w:type="dxa" w:w="2693"/>
+            <w:vAlign w:val="center"/>
             <w:tcMar>
-              <w:top w:w="2" w:type="dxa"/>
-              <w:start w:w="10" w:type="dxa"/>
-              <w:bottom w:w="2" w:type="dxa"/>
-              <w:end w:w="10" w:type="dxa"/>
+              <w:top w:type="dxa" w:w="0"/>
+              <w:start w:type="dxa" w:w="118"/>
+              <w:bottom w:type="dxa" w:w="0"/>
+              <w:end w:type="dxa" w:w="118"/>
             </w:tcMar>
           </w:tcPr>
           <w:p>
             <w:pPr>
-              <w:spacing w:after="0" w:before="0"/>
+              <w:spacing w:before="0" w:after="0" w:line="240" w:lineRule="auto"/>
               <w:jc w:val="left"/>
             </w:pPr>
             <w:r>
               <w:rPr>
-                <w:rFonts w:ascii="ADLaM Display" w:hAnsi="ADLaM Display" w:cs="ADLaM Display"/>
+                <w:rFonts w:ascii="Calibri" w:hAnsi="Calibri" w:cs="Calibri" w:eastAsia="Calibri"/>
                 <w:b/>
-                <w:sz w:val="21"/>
+                <w:sz w:val="20"/>
+                <w:u w:val="none"/>
               </w:rPr>
               <w:t>COLOR</w:t>
             </w:r>
@@ -503,75 +590,85 @@
         </w:tc>
         <w:tc>
           <w:tcPr>
-            <w:tcW w:type="dxa" w:w="3834"/>
+            <w:tcW w:type="dxa" w:w="2750"/>
+            <w:vAlign w:val="center"/>
             <w:tcMar>
-              <w:top w:w="2" w:type="dxa"/>
-              <w:start w:w="10" w:type="dxa"/>
-              <w:bottom w:w="2" w:type="dxa"/>
-              <w:end w:w="10" w:type="dxa"/>
+              <w:top w:type="dxa" w:w="0"/>
+              <w:start w:type="dxa" w:w="118"/>
+              <w:bottom w:type="dxa" w:w="0"/>
+              <w:end w:type="dxa" w:w="118"/>
             </w:tcMar>
           </w:tcPr>
           <w:p>
             <w:pPr>
-              <w:spacing w:after="0" w:before="0"/>
+              <w:spacing w:before="0" w:after="0" w:line="240" w:lineRule="auto"/>
               <w:jc w:val="left"/>
             </w:pPr>
             <w:r>
               <w:rPr>
-                <w:rFonts w:ascii="ADLaM Display" w:hAnsi="ADLaM Display" w:cs="ADLaM Display"/>
+                <w:rFonts w:ascii="Calibri" w:hAnsi="Calibri" w:cs="Calibri" w:eastAsia="Calibri"/>
                 <w:b/>
-                <w:sz w:val="21"/>
+                <w:sz w:val="20"/>
+                <w:u w:val="none"/>
               </w:rPr>
-              <w:t>{color}</w:t>
+              <w:t>{color_resultado}</w:t>
             </w:r>
           </w:p>
         </w:tc>
         <w:tc>
           <w:tcPr>
-            <w:tcW w:type="dxa" w:w="3834"/>
+            <w:tcW w:type="dxa" w:w="6797"/>
+            <w:vAlign w:val="center"/>
             <w:tcMar>
-              <w:top w:w="2" w:type="dxa"/>
-              <w:start w:w="10" w:type="dxa"/>
-              <w:bottom w:w="2" w:type="dxa"/>
-              <w:end w:w="10" w:type="dxa"/>
+              <w:top w:type="dxa" w:w="0"/>
+              <w:start w:type="dxa" w:w="118"/>
+              <w:bottom w:type="dxa" w:w="0"/>
+              <w:end w:type="dxa" w:w="118"/>
             </w:tcMar>
           </w:tcPr>
           <w:p>
             <w:pPr>
-              <w:spacing w:after="0" w:before="0"/>
+              <w:spacing w:before="0" w:after="0" w:line="240" w:lineRule="auto"/>
               <w:jc w:val="left"/>
             </w:pPr>
             <w:r>
               <w:rPr>
-                <w:rFonts w:ascii="ADLaM Display" w:hAnsi="ADLaM Display" w:cs="ADLaM Display"/>
+                <w:rFonts w:ascii="Calibri" w:hAnsi="Calibri" w:cs="Calibri" w:eastAsia="Calibri"/>
                 <w:b/>
-                <w:sz w:val="21"/>
+                <w:sz w:val="20"/>
+                <w:u w:val="none"/>
               </w:rPr>
+              <w:t>{color_referencia}</w:t>
             </w:r>
           </w:p>
         </w:tc>
       </w:tr>
       <w:tr>
+        <w:trPr>
+          <w:trHeight w:hRule="exact" w:val="207"/>
+        </w:trPr>
         <w:tc>
           <w:tcPr>
-            <w:tcW w:type="dxa" w:w="3834"/>
+            <w:tcW w:type="dxa" w:w="2693"/>
+            <w:vAlign w:val="center"/>
             <w:tcMar>
-              <w:top w:w="2" w:type="dxa"/>
-              <w:start w:w="10" w:type="dxa"/>
-              <w:bottom w:w="2" w:type="dxa"/>
-              <w:end w:w="10" w:type="dxa"/>
+              <w:top w:type="dxa" w:w="0"/>
+              <w:start w:type="dxa" w:w="118"/>
+              <w:bottom w:type="dxa" w:w="0"/>
+              <w:end w:type="dxa" w:w="118"/>
             </w:tcMar>
           </w:tcPr>
           <w:p>
             <w:pPr>
-              <w:spacing w:after="0" w:before="0"/>
+              <w:spacing w:before="0" w:after="0" w:line="240" w:lineRule="auto"/>
               <w:jc w:val="left"/>
             </w:pPr>
             <w:r>
               <w:rPr>
-                <w:rFonts w:ascii="ADLaM Display" w:hAnsi="ADLaM Display" w:cs="ADLaM Display"/>
+                <w:rFonts w:ascii="Calibri" w:hAnsi="Calibri" w:cs="Calibri" w:eastAsia="Calibri"/>
                 <w:b/>
-                <w:sz w:val="21"/>
+                <w:sz w:val="20"/>
+                <w:u w:val="none"/>
               </w:rPr>
               <w:t>DENSIDAD</w:t>
             </w:r>
@@ -579,76 +676,85 @@
         </w:tc>
         <w:tc>
           <w:tcPr>
-            <w:tcW w:type="dxa" w:w="3834"/>
+            <w:tcW w:type="dxa" w:w="2750"/>
+            <w:vAlign w:val="center"/>
             <w:tcMar>
-              <w:top w:w="2" w:type="dxa"/>
-              <w:start w:w="10" w:type="dxa"/>
-              <w:bottom w:w="2" w:type="dxa"/>
-              <w:end w:w="10" w:type="dxa"/>
+              <w:top w:type="dxa" w:w="0"/>
+              <w:start w:type="dxa" w:w="118"/>
+              <w:bottom w:type="dxa" w:w="0"/>
+              <w:end w:type="dxa" w:w="118"/>
             </w:tcMar>
           </w:tcPr>
           <w:p>
             <w:pPr>
-              <w:spacing w:after="0" w:before="0"/>
+              <w:spacing w:before="0" w:after="0" w:line="240" w:lineRule="auto"/>
               <w:jc w:val="left"/>
             </w:pPr>
             <w:r>
               <w:rPr>
-                <w:rFonts w:ascii="ADLaM Display" w:hAnsi="ADLaM Display" w:cs="ADLaM Display"/>
+                <w:rFonts w:ascii="Calibri" w:hAnsi="Calibri" w:cs="Calibri" w:eastAsia="Calibri"/>
                 <w:b/>
-                <w:sz w:val="21"/>
+                <w:sz w:val="20"/>
+                <w:u w:val="none"/>
               </w:rPr>
-              <w:t>{densidad}</w:t>
+              <w:t>{densidad_resultado}</w:t>
             </w:r>
           </w:p>
         </w:tc>
         <w:tc>
           <w:tcPr>
-            <w:tcW w:type="dxa" w:w="3834"/>
+            <w:tcW w:type="dxa" w:w="6797"/>
+            <w:vAlign w:val="center"/>
             <w:tcMar>
-              <w:top w:w="2" w:type="dxa"/>
-              <w:start w:w="10" w:type="dxa"/>
-              <w:bottom w:w="2" w:type="dxa"/>
-              <w:end w:w="10" w:type="dxa"/>
+              <w:top w:type="dxa" w:w="0"/>
+              <w:start w:type="dxa" w:w="118"/>
+              <w:bottom w:type="dxa" w:w="0"/>
+              <w:end w:type="dxa" w:w="118"/>
             </w:tcMar>
           </w:tcPr>
           <w:p>
             <w:pPr>
-              <w:spacing w:after="0" w:before="0"/>
+              <w:spacing w:before="0" w:after="0" w:line="240" w:lineRule="auto"/>
               <w:jc w:val="left"/>
             </w:pPr>
             <w:r>
               <w:rPr>
-                <w:rFonts w:ascii="ADLaM Display" w:hAnsi="ADLaM Display" w:cs="ADLaM Display"/>
+                <w:rFonts w:ascii="Calibri" w:hAnsi="Calibri" w:cs="Calibri" w:eastAsia="Calibri"/>
                 <w:b/>
-                <w:sz w:val="21"/>
+                <w:sz w:val="20"/>
+                <w:u w:val="none"/>
               </w:rPr>
-              <w:t>1.002 a 1.030</w:t>
+              <w:t>{densidad_referencia}</w:t>
             </w:r>
           </w:p>
         </w:tc>
       </w:tr>
       <w:tr>
+        <w:trPr>
+          <w:trHeight w:hRule="exact" w:val="207"/>
+        </w:trPr>
         <w:tc>
           <w:tcPr>
-            <w:tcW w:type="dxa" w:w="3834"/>
+            <w:tcW w:type="dxa" w:w="2693"/>
+            <w:vAlign w:val="center"/>
             <w:tcMar>
-              <w:top w:w="2" w:type="dxa"/>
-              <w:start w:w="10" w:type="dxa"/>
-              <w:bottom w:w="2" w:type="dxa"/>
-              <w:end w:w="10" w:type="dxa"/>
+              <w:top w:type="dxa" w:w="0"/>
+              <w:start w:type="dxa" w:w="118"/>
+              <w:bottom w:type="dxa" w:w="0"/>
+              <w:end w:type="dxa" w:w="118"/>
             </w:tcMar>
           </w:tcPr>
           <w:p>
             <w:pPr>
-              <w:spacing w:after="0" w:before="0"/>
+              <w:spacing w:before="0" w:after="0" w:line="240" w:lineRule="auto"/>
               <w:jc w:val="left"/>
             </w:pPr>
             <w:r>
               <w:rPr>
-                <w:rFonts w:ascii="ADLaM Display" w:hAnsi="ADLaM Display" w:cs="ADLaM Display"/>
+                <w:rFonts w:ascii="Calibri" w:hAnsi="Calibri" w:cs="Calibri" w:eastAsia="Calibri"/>
                 <w:b/>
-                <w:sz w:val="21"/>
+                <w:sz w:val="20"/>
+                <w:u w:val="none"/>
               </w:rPr>
               <w:t>PH EN ORINA</w:t>
             </w:r>
@@ -656,76 +762,85 @@
         </w:tc>
         <w:tc>
           <w:tcPr>
-            <w:tcW w:type="dxa" w:w="3834"/>
+            <w:tcW w:type="dxa" w:w="2750"/>
+            <w:vAlign w:val="center"/>
             <w:tcMar>
-              <w:top w:w="2" w:type="dxa"/>
-              <w:start w:w="10" w:type="dxa"/>
-              <w:bottom w:w="2" w:type="dxa"/>
-              <w:end w:w="10" w:type="dxa"/>
+              <w:top w:type="dxa" w:w="0"/>
+              <w:start w:type="dxa" w:w="118"/>
+              <w:bottom w:type="dxa" w:w="0"/>
+              <w:end w:type="dxa" w:w="118"/>
             </w:tcMar>
           </w:tcPr>
           <w:p>
             <w:pPr>
-              <w:spacing w:after="0" w:before="0"/>
+              <w:spacing w:before="0" w:after="0" w:line="240" w:lineRule="auto"/>
               <w:jc w:val="left"/>
             </w:pPr>
             <w:r>
               <w:rPr>
-                <w:rFonts w:ascii="ADLaM Display" w:hAnsi="ADLaM Display" w:cs="ADLaM Display"/>
+                <w:rFonts w:ascii="Calibri" w:hAnsi="Calibri" w:cs="Calibri" w:eastAsia="Calibri"/>
                 <w:b/>
-                <w:sz w:val="21"/>
+                <w:sz w:val="20"/>
+                <w:u w:val="none"/>
               </w:rPr>
-              <w:t>{ph_orina}</w:t>
+              <w:t>{ph_orina_resultado}</w:t>
             </w:r>
           </w:p>
         </w:tc>
         <w:tc>
           <w:tcPr>
-            <w:tcW w:type="dxa" w:w="3834"/>
+            <w:tcW w:type="dxa" w:w="6797"/>
+            <w:vAlign w:val="center"/>
             <w:tcMar>
-              <w:top w:w="2" w:type="dxa"/>
-              <w:start w:w="10" w:type="dxa"/>
-              <w:bottom w:w="2" w:type="dxa"/>
-              <w:end w:w="10" w:type="dxa"/>
+              <w:top w:type="dxa" w:w="0"/>
+              <w:start w:type="dxa" w:w="118"/>
+              <w:bottom w:type="dxa" w:w="0"/>
+              <w:end w:type="dxa" w:w="118"/>
             </w:tcMar>
           </w:tcPr>
           <w:p>
             <w:pPr>
-              <w:spacing w:after="0" w:before="0"/>
+              <w:spacing w:before="0" w:after="0" w:line="240" w:lineRule="auto"/>
               <w:jc w:val="left"/>
             </w:pPr>
             <w:r>
               <w:rPr>
-                <w:rFonts w:ascii="ADLaM Display" w:hAnsi="ADLaM Display" w:cs="ADLaM Display"/>
+                <w:rFonts w:ascii="Calibri" w:hAnsi="Calibri" w:cs="Calibri" w:eastAsia="Calibri"/>
                 <w:b/>
-                <w:sz w:val="21"/>
+                <w:sz w:val="20"/>
+                <w:u w:val="none"/>
               </w:rPr>
-              <w:t>ACIDO (4.5-8.0)</w:t>
+              <w:t>{ph_orina_referencia}</w:t>
             </w:r>
           </w:p>
         </w:tc>
       </w:tr>
       <w:tr>
+        <w:trPr>
+          <w:trHeight w:hRule="exact" w:val="207"/>
+        </w:trPr>
         <w:tc>
           <w:tcPr>
-            <w:tcW w:type="dxa" w:w="3834"/>
+            <w:tcW w:type="dxa" w:w="2693"/>
+            <w:vAlign w:val="center"/>
             <w:tcMar>
-              <w:top w:w="2" w:type="dxa"/>
-              <w:start w:w="10" w:type="dxa"/>
-              <w:bottom w:w="2" w:type="dxa"/>
-              <w:end w:w="10" w:type="dxa"/>
+              <w:top w:type="dxa" w:w="0"/>
+              <w:start w:type="dxa" w:w="118"/>
+              <w:bottom w:type="dxa" w:w="0"/>
+              <w:end w:type="dxa" w:w="118"/>
             </w:tcMar>
           </w:tcPr>
           <w:p>
             <w:pPr>
-              <w:spacing w:after="0" w:before="0"/>
+              <w:spacing w:before="0" w:after="0" w:line="240" w:lineRule="auto"/>
               <w:jc w:val="left"/>
             </w:pPr>
             <w:r>
               <w:rPr>
-                <w:rFonts w:ascii="ADLaM Display" w:hAnsi="ADLaM Display" w:cs="ADLaM Display"/>
+                <w:rFonts w:ascii="Calibri" w:hAnsi="Calibri" w:cs="Calibri" w:eastAsia="Calibri"/>
                 <w:b/>
-                <w:sz w:val="21"/>
+                <w:sz w:val="20"/>
+                <w:u w:val="none"/>
               </w:rPr>
               <w:t>PROTEINAS</w:t>
             </w:r>
@@ -733,76 +848,85 @@
         </w:tc>
         <w:tc>
           <w:tcPr>
-            <w:tcW w:type="dxa" w:w="3834"/>
+            <w:tcW w:type="dxa" w:w="2750"/>
+            <w:vAlign w:val="center"/>
             <w:tcMar>
-              <w:top w:w="2" w:type="dxa"/>
-              <w:start w:w="10" w:type="dxa"/>
-              <w:bottom w:w="2" w:type="dxa"/>
-              <w:end w:w="10" w:type="dxa"/>
+              <w:top w:type="dxa" w:w="0"/>
+              <w:start w:type="dxa" w:w="118"/>
+              <w:bottom w:type="dxa" w:w="0"/>
+              <w:end w:type="dxa" w:w="118"/>
             </w:tcMar>
           </w:tcPr>
           <w:p>
             <w:pPr>
-              <w:spacing w:after="0" w:before="0"/>
+              <w:spacing w:before="0" w:after="0" w:line="240" w:lineRule="auto"/>
               <w:jc w:val="left"/>
             </w:pPr>
             <w:r>
               <w:rPr>
-                <w:rFonts w:ascii="ADLaM Display" w:hAnsi="ADLaM Display" w:cs="ADLaM Display"/>
+                <w:rFonts w:ascii="Calibri" w:hAnsi="Calibri" w:cs="Calibri" w:eastAsia="Calibri"/>
                 <w:b/>
-                <w:sz w:val="21"/>
+                <w:sz w:val="20"/>
+                <w:u w:val="none"/>
               </w:rPr>
-              <w:t>NEGATIVO</w:t>
+              <w:t>{proteinas_resultado}</w:t>
             </w:r>
           </w:p>
         </w:tc>
         <w:tc>
           <w:tcPr>
-            <w:tcW w:type="dxa" w:w="3834"/>
+            <w:tcW w:type="dxa" w:w="6797"/>
+            <w:vAlign w:val="center"/>
             <w:tcMar>
-              <w:top w:w="2" w:type="dxa"/>
-              <w:start w:w="10" w:type="dxa"/>
-              <w:bottom w:w="2" w:type="dxa"/>
-              <w:end w:w="10" w:type="dxa"/>
+              <w:top w:type="dxa" w:w="0"/>
+              <w:start w:type="dxa" w:w="118"/>
+              <w:bottom w:type="dxa" w:w="0"/>
+              <w:end w:type="dxa" w:w="118"/>
             </w:tcMar>
           </w:tcPr>
           <w:p>
             <w:pPr>
-              <w:spacing w:after="0" w:before="0"/>
+              <w:spacing w:before="0" w:after="0" w:line="240" w:lineRule="auto"/>
               <w:jc w:val="left"/>
             </w:pPr>
             <w:r>
               <w:rPr>
-                <w:rFonts w:ascii="ADLaM Display" w:hAnsi="ADLaM Display" w:cs="ADLaM Display"/>
+                <w:rFonts w:ascii="Calibri" w:hAnsi="Calibri" w:cs="Calibri" w:eastAsia="Calibri"/>
                 <w:b/>
-                <w:sz w:val="21"/>
+                <w:sz w:val="20"/>
+                <w:u w:val="none"/>
               </w:rPr>
-              <w:t>NEGATIVO</w:t>
+              <w:t>{proteinas_referencia}</w:t>
             </w:r>
           </w:p>
         </w:tc>
       </w:tr>
       <w:tr>
+        <w:trPr>
+          <w:trHeight w:hRule="exact" w:val="207"/>
+        </w:trPr>
         <w:tc>
           <w:tcPr>
-            <w:tcW w:type="dxa" w:w="3834"/>
+            <w:tcW w:type="dxa" w:w="2693"/>
+            <w:vAlign w:val="center"/>
             <w:tcMar>
-              <w:top w:w="2" w:type="dxa"/>
-              <w:start w:w="10" w:type="dxa"/>
-              <w:bottom w:w="2" w:type="dxa"/>
-              <w:end w:w="10" w:type="dxa"/>
+              <w:top w:type="dxa" w:w="0"/>
+              <w:start w:type="dxa" w:w="118"/>
+              <w:bottom w:type="dxa" w:w="0"/>
+              <w:end w:type="dxa" w:w="118"/>
             </w:tcMar>
           </w:tcPr>
           <w:p>
             <w:pPr>
-              <w:spacing w:after="0" w:before="0"/>
+              <w:spacing w:before="0" w:after="0" w:line="240" w:lineRule="auto"/>
               <w:jc w:val="left"/>
             </w:pPr>
             <w:r>
               <w:rPr>
-                <w:rFonts w:ascii="ADLaM Display" w:hAnsi="ADLaM Display" w:cs="ADLaM Display"/>
+                <w:rFonts w:ascii="Calibri" w:hAnsi="Calibri" w:cs="Calibri" w:eastAsia="Calibri"/>
                 <w:b/>
-                <w:sz w:val="21"/>
+                <w:sz w:val="20"/>
+                <w:u w:val="none"/>
               </w:rPr>
               <w:t>GLUCOSA</w:t>
             </w:r>
@@ -810,76 +934,85 @@
         </w:tc>
         <w:tc>
           <w:tcPr>
-            <w:tcW w:type="dxa" w:w="3834"/>
+            <w:tcW w:type="dxa" w:w="2750"/>
+            <w:vAlign w:val="center"/>
             <w:tcMar>
-              <w:top w:w="2" w:type="dxa"/>
-              <w:start w:w="10" w:type="dxa"/>
-              <w:bottom w:w="2" w:type="dxa"/>
-              <w:end w:w="10" w:type="dxa"/>
+              <w:top w:type="dxa" w:w="0"/>
+              <w:start w:type="dxa" w:w="118"/>
+              <w:bottom w:type="dxa" w:w="0"/>
+              <w:end w:type="dxa" w:w="118"/>
             </w:tcMar>
           </w:tcPr>
           <w:p>
             <w:pPr>
-              <w:spacing w:after="0" w:before="0"/>
+              <w:spacing w:before="0" w:after="0" w:line="240" w:lineRule="auto"/>
               <w:jc w:val="left"/>
             </w:pPr>
             <w:r>
               <w:rPr>
-                <w:rFonts w:ascii="ADLaM Display" w:hAnsi="ADLaM Display" w:cs="ADLaM Display"/>
+                <w:rFonts w:ascii="Calibri" w:hAnsi="Calibri" w:cs="Calibri" w:eastAsia="Calibri"/>
                 <w:b/>
-                <w:sz w:val="21"/>
+                <w:sz w:val="20"/>
+                <w:u w:val="none"/>
               </w:rPr>
-              <w:t>NEGATIVO</w:t>
+              <w:t>{glucosa_resultado}</w:t>
             </w:r>
           </w:p>
         </w:tc>
         <w:tc>
           <w:tcPr>
-            <w:tcW w:type="dxa" w:w="3834"/>
+            <w:tcW w:type="dxa" w:w="6797"/>
+            <w:vAlign w:val="center"/>
             <w:tcMar>
-              <w:top w:w="2" w:type="dxa"/>
-              <w:start w:w="10" w:type="dxa"/>
-              <w:bottom w:w="2" w:type="dxa"/>
-              <w:end w:w="10" w:type="dxa"/>
+              <w:top w:type="dxa" w:w="0"/>
+              <w:start w:type="dxa" w:w="118"/>
+              <w:bottom w:type="dxa" w:w="0"/>
+              <w:end w:type="dxa" w:w="118"/>
             </w:tcMar>
           </w:tcPr>
           <w:p>
             <w:pPr>
-              <w:spacing w:after="0" w:before="0"/>
+              <w:spacing w:before="0" w:after="0" w:line="240" w:lineRule="auto"/>
               <w:jc w:val="left"/>
             </w:pPr>
             <w:r>
               <w:rPr>
-                <w:rFonts w:ascii="ADLaM Display" w:hAnsi="ADLaM Display" w:cs="ADLaM Display"/>
+                <w:rFonts w:ascii="Calibri" w:hAnsi="Calibri" w:cs="Calibri" w:eastAsia="Calibri"/>
                 <w:b/>
-                <w:sz w:val="21"/>
+                <w:sz w:val="20"/>
+                <w:u w:val="none"/>
               </w:rPr>
-              <w:t>NEGATIVO</w:t>
+              <w:t>{glucosa_referencia}</w:t>
             </w:r>
           </w:p>
         </w:tc>
       </w:tr>
       <w:tr>
+        <w:trPr>
+          <w:trHeight w:hRule="exact" w:val="207"/>
+        </w:trPr>
         <w:tc>
           <w:tcPr>
-            <w:tcW w:type="dxa" w:w="3834"/>
+            <w:tcW w:type="dxa" w:w="2693"/>
+            <w:vAlign w:val="center"/>
             <w:tcMar>
-              <w:top w:w="2" w:type="dxa"/>
-              <w:start w:w="10" w:type="dxa"/>
-              <w:bottom w:w="2" w:type="dxa"/>
-              <w:end w:w="10" w:type="dxa"/>
+              <w:top w:type="dxa" w:w="0"/>
+              <w:start w:type="dxa" w:w="118"/>
+              <w:bottom w:type="dxa" w:w="0"/>
+              <w:end w:type="dxa" w:w="118"/>
             </w:tcMar>
           </w:tcPr>
           <w:p>
             <w:pPr>
-              <w:spacing w:after="0" w:before="0"/>
+              <w:spacing w:before="0" w:after="0" w:line="240" w:lineRule="auto"/>
               <w:jc w:val="left"/>
             </w:pPr>
             <w:r>
               <w:rPr>
-                <w:rFonts w:ascii="ADLaM Display" w:hAnsi="ADLaM Display" w:cs="ADLaM Display"/>
+                <w:rFonts w:ascii="Calibri" w:hAnsi="Calibri" w:cs="Calibri" w:eastAsia="Calibri"/>
                 <w:b/>
-                <w:sz w:val="21"/>
+                <w:sz w:val="20"/>
+                <w:u w:val="none"/>
               </w:rPr>
               <w:t>CETONAS</w:t>
             </w:r>
@@ -887,76 +1020,85 @@
         </w:tc>
         <w:tc>
           <w:tcPr>
-            <w:tcW w:type="dxa" w:w="3834"/>
+            <w:tcW w:type="dxa" w:w="2750"/>
+            <w:vAlign w:val="center"/>
             <w:tcMar>
-              <w:top w:w="2" w:type="dxa"/>
-              <w:start w:w="10" w:type="dxa"/>
-              <w:bottom w:w="2" w:type="dxa"/>
-              <w:end w:w="10" w:type="dxa"/>
+              <w:top w:type="dxa" w:w="0"/>
+              <w:start w:type="dxa" w:w="118"/>
+              <w:bottom w:type="dxa" w:w="0"/>
+              <w:end w:type="dxa" w:w="118"/>
             </w:tcMar>
           </w:tcPr>
           <w:p>
             <w:pPr>
-              <w:spacing w:after="0" w:before="0"/>
+              <w:spacing w:before="0" w:after="0" w:line="240" w:lineRule="auto"/>
               <w:jc w:val="left"/>
             </w:pPr>
             <w:r>
               <w:rPr>
-                <w:rFonts w:ascii="ADLaM Display" w:hAnsi="ADLaM Display" w:cs="ADLaM Display"/>
+                <w:rFonts w:ascii="Calibri" w:hAnsi="Calibri" w:cs="Calibri" w:eastAsia="Calibri"/>
                 <w:b/>
-                <w:sz w:val="21"/>
+                <w:sz w:val="20"/>
+                <w:u w:val="none"/>
               </w:rPr>
-              <w:t>NEGATIVO</w:t>
+              <w:t>{cetonas_resultado}</w:t>
             </w:r>
           </w:p>
         </w:tc>
         <w:tc>
           <w:tcPr>
-            <w:tcW w:type="dxa" w:w="3834"/>
+            <w:tcW w:type="dxa" w:w="6797"/>
+            <w:vAlign w:val="center"/>
             <w:tcMar>
-              <w:top w:w="2" w:type="dxa"/>
-              <w:start w:w="10" w:type="dxa"/>
-              <w:bottom w:w="2" w:type="dxa"/>
-              <w:end w:w="10" w:type="dxa"/>
+              <w:top w:type="dxa" w:w="0"/>
+              <w:start w:type="dxa" w:w="118"/>
+              <w:bottom w:type="dxa" w:w="0"/>
+              <w:end w:type="dxa" w:w="118"/>
             </w:tcMar>
           </w:tcPr>
           <w:p>
             <w:pPr>
-              <w:spacing w:after="0" w:before="0"/>
+              <w:spacing w:before="0" w:after="0" w:line="240" w:lineRule="auto"/>
               <w:jc w:val="left"/>
             </w:pPr>
             <w:r>
               <w:rPr>
-                <w:rFonts w:ascii="ADLaM Display" w:hAnsi="ADLaM Display" w:cs="ADLaM Display"/>
+                <w:rFonts w:ascii="Calibri" w:hAnsi="Calibri" w:cs="Calibri" w:eastAsia="Calibri"/>
                 <w:b/>
-                <w:sz w:val="21"/>
+                <w:sz w:val="20"/>
+                <w:u w:val="none"/>
               </w:rPr>
-              <w:t>NEGATIVO</w:t>
+              <w:t>{cetonas_referencia}</w:t>
             </w:r>
           </w:p>
         </w:tc>
       </w:tr>
       <w:tr>
+        <w:trPr>
+          <w:trHeight w:hRule="exact" w:val="207"/>
+        </w:trPr>
         <w:tc>
           <w:tcPr>
-            <w:tcW w:type="dxa" w:w="3834"/>
+            <w:tcW w:type="dxa" w:w="2693"/>
+            <w:vAlign w:val="center"/>
             <w:tcMar>
-              <w:top w:w="2" w:type="dxa"/>
-              <w:start w:w="10" w:type="dxa"/>
-              <w:bottom w:w="2" w:type="dxa"/>
-              <w:end w:w="10" w:type="dxa"/>
+              <w:top w:type="dxa" w:w="0"/>
+              <w:start w:type="dxa" w:w="118"/>
+              <w:bottom w:type="dxa" w:w="0"/>
+              <w:end w:type="dxa" w:w="118"/>
             </w:tcMar>
           </w:tcPr>
           <w:p>
             <w:pPr>
-              <w:spacing w:after="0" w:before="0"/>
+              <w:spacing w:before="0" w:after="0" w:line="240" w:lineRule="auto"/>
               <w:jc w:val="left"/>
             </w:pPr>
             <w:r>
               <w:rPr>
-                <w:rFonts w:ascii="ADLaM Display" w:hAnsi="ADLaM Display" w:cs="ADLaM Display"/>
+                <w:rFonts w:ascii="Calibri" w:hAnsi="Calibri" w:cs="Calibri" w:eastAsia="Calibri"/>
                 <w:b/>
-                <w:sz w:val="21"/>
+                <w:sz w:val="20"/>
+                <w:u w:val="none"/>
               </w:rPr>
               <w:t>BILIRRUBINA</w:t>
             </w:r>
@@ -964,76 +1106,85 @@
         </w:tc>
         <w:tc>
           <w:tcPr>
-            <w:tcW w:type="dxa" w:w="3834"/>
+            <w:tcW w:type="dxa" w:w="2750"/>
+            <w:vAlign w:val="center"/>
             <w:tcMar>
-              <w:top w:w="2" w:type="dxa"/>
-              <w:start w:w="10" w:type="dxa"/>
-              <w:bottom w:w="2" w:type="dxa"/>
-              <w:end w:w="10" w:type="dxa"/>
+              <w:top w:type="dxa" w:w="0"/>
+              <w:start w:type="dxa" w:w="118"/>
+              <w:bottom w:type="dxa" w:w="0"/>
+              <w:end w:type="dxa" w:w="118"/>
             </w:tcMar>
           </w:tcPr>
           <w:p>
             <w:pPr>
-              <w:spacing w:after="0" w:before="0"/>
+              <w:spacing w:before="0" w:after="0" w:line="240" w:lineRule="auto"/>
               <w:jc w:val="left"/>
             </w:pPr>
             <w:r>
               <w:rPr>
-                <w:rFonts w:ascii="ADLaM Display" w:hAnsi="ADLaM Display" w:cs="ADLaM Display"/>
+                <w:rFonts w:ascii="Calibri" w:hAnsi="Calibri" w:cs="Calibri" w:eastAsia="Calibri"/>
                 <w:b/>
-                <w:sz w:val="21"/>
+                <w:sz w:val="20"/>
+                <w:u w:val="none"/>
               </w:rPr>
-              <w:t>NEGATIVO</w:t>
+              <w:t>{bilirrubina_resultado}</w:t>
             </w:r>
           </w:p>
         </w:tc>
         <w:tc>
           <w:tcPr>
-            <w:tcW w:type="dxa" w:w="3834"/>
+            <w:tcW w:type="dxa" w:w="6797"/>
+            <w:vAlign w:val="center"/>
             <w:tcMar>
-              <w:top w:w="2" w:type="dxa"/>
-              <w:start w:w="10" w:type="dxa"/>
-              <w:bottom w:w="2" w:type="dxa"/>
-              <w:end w:w="10" w:type="dxa"/>
+              <w:top w:type="dxa" w:w="0"/>
+              <w:start w:type="dxa" w:w="118"/>
+              <w:bottom w:type="dxa" w:w="0"/>
+              <w:end w:type="dxa" w:w="118"/>
             </w:tcMar>
           </w:tcPr>
           <w:p>
             <w:pPr>
-              <w:spacing w:after="0" w:before="0"/>
+              <w:spacing w:before="0" w:after="0" w:line="240" w:lineRule="auto"/>
               <w:jc w:val="left"/>
             </w:pPr>
             <w:r>
               <w:rPr>
-                <w:rFonts w:ascii="ADLaM Display" w:hAnsi="ADLaM Display" w:cs="ADLaM Display"/>
+                <w:rFonts w:ascii="Calibri" w:hAnsi="Calibri" w:cs="Calibri" w:eastAsia="Calibri"/>
                 <w:b/>
-                <w:sz w:val="21"/>
+                <w:sz w:val="20"/>
+                <w:u w:val="none"/>
               </w:rPr>
-              <w:t>NEGATIVO</w:t>
+              <w:t>{bilirrubina_referencia}</w:t>
             </w:r>
           </w:p>
         </w:tc>
       </w:tr>
       <w:tr>
+        <w:trPr>
+          <w:trHeight w:hRule="exact" w:val="207"/>
+        </w:trPr>
         <w:tc>
           <w:tcPr>
-            <w:tcW w:type="dxa" w:w="3834"/>
+            <w:tcW w:type="dxa" w:w="2693"/>
+            <w:vAlign w:val="center"/>
             <w:tcMar>
-              <w:top w:w="2" w:type="dxa"/>
-              <w:start w:w="10" w:type="dxa"/>
-              <w:bottom w:w="2" w:type="dxa"/>
-              <w:end w:w="10" w:type="dxa"/>
+              <w:top w:type="dxa" w:w="0"/>
+              <w:start w:type="dxa" w:w="118"/>
+              <w:bottom w:type="dxa" w:w="0"/>
+              <w:end w:type="dxa" w:w="118"/>
             </w:tcMar>
           </w:tcPr>
           <w:p>
             <w:pPr>
-              <w:spacing w:after="0" w:before="0"/>
+              <w:spacing w:before="0" w:after="0" w:line="240" w:lineRule="auto"/>
               <w:jc w:val="left"/>
             </w:pPr>
             <w:r>
               <w:rPr>
-                <w:rFonts w:ascii="ADLaM Display" w:hAnsi="ADLaM Display" w:cs="ADLaM Display"/>
+                <w:rFonts w:ascii="Calibri" w:hAnsi="Calibri" w:cs="Calibri" w:eastAsia="Calibri"/>
                 <w:b/>
-                <w:sz w:val="21"/>
+                <w:sz w:val="20"/>
+                <w:u w:val="none"/>
               </w:rPr>
               <w:t>HEMOGLOBINA</w:t>
             </w:r>
@@ -1041,76 +1192,85 @@
         </w:tc>
         <w:tc>
           <w:tcPr>
-            <w:tcW w:type="dxa" w:w="3834"/>
+            <w:tcW w:type="dxa" w:w="2750"/>
+            <w:vAlign w:val="center"/>
             <w:tcMar>
-              <w:top w:w="2" w:type="dxa"/>
-              <w:start w:w="10" w:type="dxa"/>
-              <w:bottom w:w="2" w:type="dxa"/>
-              <w:end w:w="10" w:type="dxa"/>
+              <w:top w:type="dxa" w:w="0"/>
+              <w:start w:type="dxa" w:w="118"/>
+              <w:bottom w:type="dxa" w:w="0"/>
+              <w:end w:type="dxa" w:w="118"/>
             </w:tcMar>
           </w:tcPr>
           <w:p>
             <w:pPr>
-              <w:spacing w:after="0" w:before="0"/>
+              <w:spacing w:before="0" w:after="0" w:line="240" w:lineRule="auto"/>
               <w:jc w:val="left"/>
             </w:pPr>
             <w:r>
               <w:rPr>
-                <w:rFonts w:ascii="ADLaM Display" w:hAnsi="ADLaM Display" w:cs="ADLaM Display"/>
+                <w:rFonts w:ascii="Calibri" w:hAnsi="Calibri" w:cs="Calibri" w:eastAsia="Calibri"/>
                 <w:b/>
-                <w:sz w:val="21"/>
+                <w:sz w:val="20"/>
+                <w:u w:val="none"/>
               </w:rPr>
-              <w:t>NEGATIVO</w:t>
+              <w:t>{hemoglobina_resultado}</w:t>
             </w:r>
           </w:p>
         </w:tc>
         <w:tc>
           <w:tcPr>
-            <w:tcW w:type="dxa" w:w="3834"/>
+            <w:tcW w:type="dxa" w:w="6797"/>
+            <w:vAlign w:val="center"/>
             <w:tcMar>
-              <w:top w:w="2" w:type="dxa"/>
-              <w:start w:w="10" w:type="dxa"/>
-              <w:bottom w:w="2" w:type="dxa"/>
-              <w:end w:w="10" w:type="dxa"/>
+              <w:top w:type="dxa" w:w="0"/>
+              <w:start w:type="dxa" w:w="118"/>
+              <w:bottom w:type="dxa" w:w="0"/>
+              <w:end w:type="dxa" w:w="118"/>
             </w:tcMar>
           </w:tcPr>
           <w:p>
             <w:pPr>
-              <w:spacing w:after="0" w:before="0"/>
+              <w:spacing w:before="0" w:after="0" w:line="240" w:lineRule="auto"/>
               <w:jc w:val="left"/>
             </w:pPr>
             <w:r>
               <w:rPr>
-                <w:rFonts w:ascii="ADLaM Display" w:hAnsi="ADLaM Display" w:cs="ADLaM Display"/>
+                <w:rFonts w:ascii="Calibri" w:hAnsi="Calibri" w:cs="Calibri" w:eastAsia="Calibri"/>
                 <w:b/>
-                <w:sz w:val="21"/>
+                <w:sz w:val="20"/>
+                <w:u w:val="none"/>
               </w:rPr>
-              <w:t>NEGATIVO</w:t>
+              <w:t>{hemoglobina_referencia}</w:t>
             </w:r>
           </w:p>
         </w:tc>
       </w:tr>
       <w:tr>
+        <w:trPr>
+          <w:trHeight w:hRule="exact" w:val="207"/>
+        </w:trPr>
         <w:tc>
           <w:tcPr>
-            <w:tcW w:type="dxa" w:w="3834"/>
+            <w:tcW w:type="dxa" w:w="2693"/>
+            <w:vAlign w:val="center"/>
             <w:tcMar>
-              <w:top w:w="2" w:type="dxa"/>
-              <w:start w:w="10" w:type="dxa"/>
-              <w:bottom w:w="2" w:type="dxa"/>
-              <w:end w:w="10" w:type="dxa"/>
+              <w:top w:type="dxa" w:w="0"/>
+              <w:start w:type="dxa" w:w="118"/>
+              <w:bottom w:type="dxa" w:w="0"/>
+              <w:end w:type="dxa" w:w="118"/>
             </w:tcMar>
           </w:tcPr>
           <w:p>
             <w:pPr>
-              <w:spacing w:after="0" w:before="0"/>
+              <w:spacing w:before="0" w:after="0" w:line="240" w:lineRule="auto"/>
               <w:jc w:val="left"/>
             </w:pPr>
             <w:r>
               <w:rPr>
-                <w:rFonts w:ascii="ADLaM Display" w:hAnsi="ADLaM Display" w:cs="ADLaM Display"/>
+                <w:rFonts w:ascii="Calibri" w:hAnsi="Calibri" w:cs="Calibri" w:eastAsia="Calibri"/>
                 <w:b/>
-                <w:sz w:val="21"/>
+                <w:sz w:val="20"/>
+                <w:u w:val="none"/>
               </w:rPr>
               <w:t>NITRITOS</w:t>
             </w:r>
@@ -1118,76 +1278,85 @@
         </w:tc>
         <w:tc>
           <w:tcPr>
-            <w:tcW w:type="dxa" w:w="3834"/>
+            <w:tcW w:type="dxa" w:w="2750"/>
+            <w:vAlign w:val="center"/>
             <w:tcMar>
-              <w:top w:w="2" w:type="dxa"/>
-              <w:start w:w="10" w:type="dxa"/>
-              <w:bottom w:w="2" w:type="dxa"/>
-              <w:end w:w="10" w:type="dxa"/>
+              <w:top w:type="dxa" w:w="0"/>
+              <w:start w:type="dxa" w:w="118"/>
+              <w:bottom w:type="dxa" w:w="0"/>
+              <w:end w:type="dxa" w:w="118"/>
             </w:tcMar>
           </w:tcPr>
           <w:p>
             <w:pPr>
-              <w:spacing w:after="0" w:before="0"/>
+              <w:spacing w:before="0" w:after="0" w:line="240" w:lineRule="auto"/>
               <w:jc w:val="left"/>
             </w:pPr>
             <w:r>
               <w:rPr>
-                <w:rFonts w:ascii="ADLaM Display" w:hAnsi="ADLaM Display" w:cs="ADLaM Display"/>
+                <w:rFonts w:ascii="Calibri" w:hAnsi="Calibri" w:cs="Calibri" w:eastAsia="Calibri"/>
                 <w:b/>
-                <w:sz w:val="21"/>
+                <w:sz w:val="20"/>
+                <w:u w:val="none"/>
               </w:rPr>
-              <w:t>NEGATIVO</w:t>
+              <w:t>{nitritos_resultado}</w:t>
             </w:r>
           </w:p>
         </w:tc>
         <w:tc>
           <w:tcPr>
-            <w:tcW w:type="dxa" w:w="3834"/>
+            <w:tcW w:type="dxa" w:w="6797"/>
+            <w:vAlign w:val="center"/>
             <w:tcMar>
-              <w:top w:w="2" w:type="dxa"/>
-              <w:start w:w="10" w:type="dxa"/>
-              <w:bottom w:w="2" w:type="dxa"/>
-              <w:end w:w="10" w:type="dxa"/>
+              <w:top w:type="dxa" w:w="0"/>
+              <w:start w:type="dxa" w:w="118"/>
+              <w:bottom w:type="dxa" w:w="0"/>
+              <w:end w:type="dxa" w:w="118"/>
             </w:tcMar>
           </w:tcPr>
           <w:p>
             <w:pPr>
-              <w:spacing w:after="0" w:before="0"/>
+              <w:spacing w:before="0" w:after="0" w:line="240" w:lineRule="auto"/>
               <w:jc w:val="left"/>
             </w:pPr>
             <w:r>
               <w:rPr>
-                <w:rFonts w:ascii="ADLaM Display" w:hAnsi="ADLaM Display" w:cs="ADLaM Display"/>
+                <w:rFonts w:ascii="Calibri" w:hAnsi="Calibri" w:cs="Calibri" w:eastAsia="Calibri"/>
                 <w:b/>
-                <w:sz w:val="21"/>
+                <w:sz w:val="20"/>
+                <w:u w:val="none"/>
               </w:rPr>
-              <w:t>NEGATIVO</w:t>
+              <w:t>{nitritos_referencia}</w:t>
             </w:r>
           </w:p>
         </w:tc>
       </w:tr>
       <w:tr>
+        <w:trPr>
+          <w:trHeight w:hRule="exact" w:val="207"/>
+        </w:trPr>
         <w:tc>
           <w:tcPr>
-            <w:tcW w:type="dxa" w:w="3834"/>
+            <w:tcW w:type="dxa" w:w="2693"/>
+            <w:vAlign w:val="center"/>
             <w:tcMar>
-              <w:top w:w="2" w:type="dxa"/>
-              <w:start w:w="10" w:type="dxa"/>
-              <w:bottom w:w="2" w:type="dxa"/>
-              <w:end w:w="10" w:type="dxa"/>
+              <w:top w:type="dxa" w:w="0"/>
+              <w:start w:type="dxa" w:w="118"/>
+              <w:bottom w:type="dxa" w:w="0"/>
+              <w:end w:type="dxa" w:w="118"/>
             </w:tcMar>
           </w:tcPr>
           <w:p>
             <w:pPr>
-              <w:spacing w:after="0" w:before="0"/>
+              <w:spacing w:before="0" w:after="0" w:line="240" w:lineRule="auto"/>
               <w:jc w:val="left"/>
             </w:pPr>
             <w:r>
               <w:rPr>
-                <w:rFonts w:ascii="ADLaM Display" w:hAnsi="ADLaM Display" w:cs="ADLaM Display"/>
+                <w:rFonts w:ascii="Calibri" w:hAnsi="Calibri" w:cs="Calibri" w:eastAsia="Calibri"/>
                 <w:b/>
-                <w:sz w:val="21"/>
+                <w:sz w:val="20"/>
+                <w:u w:val="none"/>
               </w:rPr>
               <w:t>UROBILINOGENO</w:t>
             </w:r>
@@ -1195,76 +1364,85 @@
         </w:tc>
         <w:tc>
           <w:tcPr>
-            <w:tcW w:type="dxa" w:w="3834"/>
+            <w:tcW w:type="dxa" w:w="2750"/>
+            <w:vAlign w:val="center"/>
             <w:tcMar>
-              <w:top w:w="2" w:type="dxa"/>
-              <w:start w:w="10" w:type="dxa"/>
-              <w:bottom w:w="2" w:type="dxa"/>
-              <w:end w:w="10" w:type="dxa"/>
+              <w:top w:type="dxa" w:w="0"/>
+              <w:start w:type="dxa" w:w="118"/>
+              <w:bottom w:type="dxa" w:w="0"/>
+              <w:end w:type="dxa" w:w="118"/>
             </w:tcMar>
           </w:tcPr>
           <w:p>
             <w:pPr>
-              <w:spacing w:after="0" w:before="0"/>
+              <w:spacing w:before="0" w:after="0" w:line="240" w:lineRule="auto"/>
               <w:jc w:val="left"/>
             </w:pPr>
             <w:r>
               <w:rPr>
-                <w:rFonts w:ascii="ADLaM Display" w:hAnsi="ADLaM Display" w:cs="ADLaM Display"/>
+                <w:rFonts w:ascii="Calibri" w:hAnsi="Calibri" w:cs="Calibri" w:eastAsia="Calibri"/>
                 <w:b/>
-                <w:sz w:val="21"/>
+                <w:sz w:val="20"/>
+                <w:u w:val="none"/>
               </w:rPr>
-              <w:t>NEGATIVO</w:t>
+              <w:t>{urobilinogeno_resultado}</w:t>
             </w:r>
           </w:p>
         </w:tc>
         <w:tc>
           <w:tcPr>
-            <w:tcW w:type="dxa" w:w="3834"/>
+            <w:tcW w:type="dxa" w:w="6797"/>
+            <w:vAlign w:val="center"/>
             <w:tcMar>
-              <w:top w:w="2" w:type="dxa"/>
-              <w:start w:w="10" w:type="dxa"/>
-              <w:bottom w:w="2" w:type="dxa"/>
-              <w:end w:w="10" w:type="dxa"/>
+              <w:top w:type="dxa" w:w="0"/>
+              <w:start w:type="dxa" w:w="118"/>
+              <w:bottom w:type="dxa" w:w="0"/>
+              <w:end w:type="dxa" w:w="118"/>
             </w:tcMar>
           </w:tcPr>
           <w:p>
             <w:pPr>
-              <w:spacing w:after="0" w:before="0"/>
+              <w:spacing w:before="0" w:after="0" w:line="240" w:lineRule="auto"/>
               <w:jc w:val="left"/>
             </w:pPr>
             <w:r>
               <w:rPr>
-                <w:rFonts w:ascii="ADLaM Display" w:hAnsi="ADLaM Display" w:cs="ADLaM Display"/>
+                <w:rFonts w:ascii="Calibri" w:hAnsi="Calibri" w:cs="Calibri" w:eastAsia="Calibri"/>
                 <w:b/>
-                <w:sz w:val="21"/>
+                <w:sz w:val="20"/>
+                <w:u w:val="none"/>
               </w:rPr>
-              <w:t>NEGATIVO</w:t>
+              <w:t>{urobilinogeno_referencia}</w:t>
             </w:r>
           </w:p>
         </w:tc>
       </w:tr>
       <w:tr>
+        <w:trPr>
+          <w:trHeight w:hRule="exact" w:val="207"/>
+        </w:trPr>
         <w:tc>
           <w:tcPr>
-            <w:tcW w:type="dxa" w:w="3834"/>
+            <w:tcW w:type="dxa" w:w="2693"/>
+            <w:vAlign w:val="center"/>
             <w:tcMar>
-              <w:top w:w="2" w:type="dxa"/>
-              <w:start w:w="10" w:type="dxa"/>
-              <w:bottom w:w="2" w:type="dxa"/>
-              <w:end w:w="10" w:type="dxa"/>
+              <w:top w:type="dxa" w:w="0"/>
+              <w:start w:type="dxa" w:w="118"/>
+              <w:bottom w:type="dxa" w:w="0"/>
+              <w:end w:type="dxa" w:w="118"/>
             </w:tcMar>
           </w:tcPr>
           <w:p>
             <w:pPr>
-              <w:spacing w:after="0" w:before="0"/>
+              <w:spacing w:before="0" w:after="0" w:line="240" w:lineRule="auto"/>
               <w:jc w:val="left"/>
             </w:pPr>
             <w:r>
               <w:rPr>
-                <w:rFonts w:ascii="ADLaM Display" w:hAnsi="ADLaM Display" w:cs="ADLaM Display"/>
+                <w:rFonts w:ascii="Calibri" w:hAnsi="Calibri" w:cs="Calibri" w:eastAsia="Calibri"/>
                 <w:b/>
-                <w:sz w:val="21"/>
+                <w:sz w:val="20"/>
+                <w:u w:val="none"/>
               </w:rPr>
               <w:t>ERITROCITOS</w:t>
             </w:r>
@@ -1272,76 +1450,85 @@
         </w:tc>
         <w:tc>
           <w:tcPr>
-            <w:tcW w:type="dxa" w:w="3834"/>
+            <w:tcW w:type="dxa" w:w="2750"/>
+            <w:vAlign w:val="center"/>
             <w:tcMar>
-              <w:top w:w="2" w:type="dxa"/>
-              <w:start w:w="10" w:type="dxa"/>
-              <w:bottom w:w="2" w:type="dxa"/>
-              <w:end w:w="10" w:type="dxa"/>
+              <w:top w:type="dxa" w:w="0"/>
+              <w:start w:type="dxa" w:w="118"/>
+              <w:bottom w:type="dxa" w:w="0"/>
+              <w:end w:type="dxa" w:w="118"/>
             </w:tcMar>
           </w:tcPr>
           <w:p>
             <w:pPr>
-              <w:spacing w:after="0" w:before="0"/>
+              <w:spacing w:before="0" w:after="0" w:line="240" w:lineRule="auto"/>
               <w:jc w:val="left"/>
             </w:pPr>
             <w:r>
               <w:rPr>
-                <w:rFonts w:ascii="ADLaM Display" w:hAnsi="ADLaM Display" w:cs="ADLaM Display"/>
+                <w:rFonts w:ascii="Calibri" w:hAnsi="Calibri" w:cs="Calibri" w:eastAsia="Calibri"/>
                 <w:b/>
-                <w:sz w:val="21"/>
+                <w:sz w:val="20"/>
+                <w:u w:val="none"/>
               </w:rPr>
-              <w:t>{eritrocitos}</w:t>
+              <w:t>{eritrocitos_resultado}</w:t>
             </w:r>
           </w:p>
         </w:tc>
         <w:tc>
           <w:tcPr>
-            <w:tcW w:type="dxa" w:w="3834"/>
+            <w:tcW w:type="dxa" w:w="6797"/>
+            <w:vAlign w:val="center"/>
             <w:tcMar>
-              <w:top w:w="2" w:type="dxa"/>
-              <w:start w:w="10" w:type="dxa"/>
-              <w:bottom w:w="2" w:type="dxa"/>
-              <w:end w:w="10" w:type="dxa"/>
+              <w:top w:type="dxa" w:w="0"/>
+              <w:start w:type="dxa" w:w="118"/>
+              <w:bottom w:type="dxa" w:w="0"/>
+              <w:end w:type="dxa" w:w="118"/>
             </w:tcMar>
           </w:tcPr>
           <w:p>
             <w:pPr>
-              <w:spacing w:after="0" w:before="0"/>
+              <w:spacing w:before="0" w:after="0" w:line="240" w:lineRule="auto"/>
               <w:jc w:val="left"/>
             </w:pPr>
             <w:r>
               <w:rPr>
-                <w:rFonts w:ascii="ADLaM Display" w:hAnsi="ADLaM Display" w:cs="ADLaM Display"/>
+                <w:rFonts w:ascii="Calibri" w:hAnsi="Calibri" w:cs="Calibri" w:eastAsia="Calibri"/>
                 <w:b/>
-                <w:sz w:val="21"/>
+                <w:sz w:val="20"/>
+                <w:u w:val="none"/>
               </w:rPr>
-              <w:t>0-3/C</w:t>
+              <w:t>{eritrocitos_referencia}</w:t>
             </w:r>
           </w:p>
         </w:tc>
       </w:tr>
       <w:tr>
+        <w:trPr>
+          <w:trHeight w:hRule="exact" w:val="207"/>
+        </w:trPr>
         <w:tc>
           <w:tcPr>
-            <w:tcW w:type="dxa" w:w="3834"/>
+            <w:tcW w:type="dxa" w:w="2693"/>
+            <w:vAlign w:val="center"/>
             <w:tcMar>
-              <w:top w:w="2" w:type="dxa"/>
-              <w:start w:w="10" w:type="dxa"/>
-              <w:bottom w:w="2" w:type="dxa"/>
-              <w:end w:w="10" w:type="dxa"/>
+              <w:top w:type="dxa" w:w="0"/>
+              <w:start w:type="dxa" w:w="118"/>
+              <w:bottom w:type="dxa" w:w="0"/>
+              <w:end w:type="dxa" w:w="118"/>
             </w:tcMar>
           </w:tcPr>
           <w:p>
             <w:pPr>
-              <w:spacing w:after="0" w:before="0"/>
+              <w:spacing w:before="0" w:after="0" w:line="240" w:lineRule="auto"/>
               <w:jc w:val="left"/>
             </w:pPr>
             <w:r>
               <w:rPr>
-                <w:rFonts w:ascii="ADLaM Display" w:hAnsi="ADLaM Display" w:cs="ADLaM Display"/>
+                <w:rFonts w:ascii="Calibri" w:hAnsi="Calibri" w:cs="Calibri" w:eastAsia="Calibri"/>
                 <w:b/>
-                <w:sz w:val="21"/>
+                <w:sz w:val="20"/>
+                <w:u w:val="none"/>
               </w:rPr>
               <w:t>LEUCOCITOS</w:t>
             </w:r>
@@ -1349,76 +1536,85 @@
         </w:tc>
         <w:tc>
           <w:tcPr>
-            <w:tcW w:type="dxa" w:w="3834"/>
+            <w:tcW w:type="dxa" w:w="2750"/>
+            <w:vAlign w:val="center"/>
             <w:tcMar>
-              <w:top w:w="2" w:type="dxa"/>
-              <w:start w:w="10" w:type="dxa"/>
-              <w:bottom w:w="2" w:type="dxa"/>
-              <w:end w:w="10" w:type="dxa"/>
+              <w:top w:type="dxa" w:w="0"/>
+              <w:start w:type="dxa" w:w="118"/>
+              <w:bottom w:type="dxa" w:w="0"/>
+              <w:end w:type="dxa" w:w="118"/>
             </w:tcMar>
           </w:tcPr>
           <w:p>
             <w:pPr>
-              <w:spacing w:after="0" w:before="0"/>
+              <w:spacing w:before="0" w:after="0" w:line="240" w:lineRule="auto"/>
               <w:jc w:val="left"/>
             </w:pPr>
             <w:r>
               <w:rPr>
-                <w:rFonts w:ascii="ADLaM Display" w:hAnsi="ADLaM Display" w:cs="ADLaM Display"/>
+                <w:rFonts w:ascii="Calibri" w:hAnsi="Calibri" w:cs="Calibri" w:eastAsia="Calibri"/>
                 <w:b/>
-                <w:sz w:val="21"/>
+                <w:sz w:val="20"/>
+                <w:u w:val="none"/>
               </w:rPr>
-              <w:t>{leucocitos}</w:t>
+              <w:t>{leucocitos_resultado}</w:t>
             </w:r>
           </w:p>
         </w:tc>
         <w:tc>
           <w:tcPr>
-            <w:tcW w:type="dxa" w:w="3834"/>
+            <w:tcW w:type="dxa" w:w="6797"/>
+            <w:vAlign w:val="center"/>
             <w:tcMar>
-              <w:top w:w="2" w:type="dxa"/>
-              <w:start w:w="10" w:type="dxa"/>
-              <w:bottom w:w="2" w:type="dxa"/>
-              <w:end w:w="10" w:type="dxa"/>
+              <w:top w:type="dxa" w:w="0"/>
+              <w:start w:type="dxa" w:w="118"/>
+              <w:bottom w:type="dxa" w:w="0"/>
+              <w:end w:type="dxa" w:w="118"/>
             </w:tcMar>
           </w:tcPr>
           <w:p>
             <w:pPr>
-              <w:spacing w:after="0" w:before="0"/>
+              <w:spacing w:before="0" w:after="0" w:line="240" w:lineRule="auto"/>
               <w:jc w:val="left"/>
             </w:pPr>
             <w:r>
               <w:rPr>
-                <w:rFonts w:ascii="ADLaM Display" w:hAnsi="ADLaM Display" w:cs="ADLaM Display"/>
+                <w:rFonts w:ascii="Calibri" w:hAnsi="Calibri" w:cs="Calibri" w:eastAsia="Calibri"/>
                 <w:b/>
-                <w:sz w:val="21"/>
+                <w:sz w:val="20"/>
+                <w:u w:val="none"/>
               </w:rPr>
-              <w:t>5/C</w:t>
+              <w:t>{leucocitos_referencia}</w:t>
             </w:r>
           </w:p>
         </w:tc>
       </w:tr>
       <w:tr>
+        <w:trPr>
+          <w:trHeight w:hRule="exact" w:val="207"/>
+        </w:trPr>
         <w:tc>
           <w:tcPr>
-            <w:tcW w:type="dxa" w:w="3834"/>
+            <w:tcW w:type="dxa" w:w="2693"/>
+            <w:vAlign w:val="center"/>
             <w:tcMar>
-              <w:top w:w="2" w:type="dxa"/>
-              <w:start w:w="10" w:type="dxa"/>
-              <w:bottom w:w="2" w:type="dxa"/>
-              <w:end w:w="10" w:type="dxa"/>
+              <w:top w:type="dxa" w:w="0"/>
+              <w:start w:type="dxa" w:w="118"/>
+              <w:bottom w:type="dxa" w:w="0"/>
+              <w:end w:type="dxa" w:w="118"/>
             </w:tcMar>
           </w:tcPr>
           <w:p>
             <w:pPr>
-              <w:spacing w:after="0" w:before="0"/>
+              <w:spacing w:before="0" w:after="0" w:line="240" w:lineRule="auto"/>
               <w:jc w:val="left"/>
             </w:pPr>
             <w:r>
               <w:rPr>
-                <w:rFonts w:ascii="ADLaM Display" w:hAnsi="ADLaM Display" w:cs="ADLaM Display"/>
+                <w:rFonts w:ascii="Calibri" w:hAnsi="Calibri" w:cs="Calibri" w:eastAsia="Calibri"/>
                 <w:b/>
-                <w:sz w:val="21"/>
+                <w:sz w:val="20"/>
+                <w:u w:val="none"/>
               </w:rPr>
               <w:t>CEL. EPITELIALES</w:t>
             </w:r>
@@ -1426,75 +1622,85 @@
         </w:tc>
         <w:tc>
           <w:tcPr>
-            <w:tcW w:type="dxa" w:w="3834"/>
+            <w:tcW w:type="dxa" w:w="2750"/>
+            <w:vAlign w:val="center"/>
             <w:tcMar>
-              <w:top w:w="2" w:type="dxa"/>
-              <w:start w:w="10" w:type="dxa"/>
-              <w:bottom w:w="2" w:type="dxa"/>
-              <w:end w:w="10" w:type="dxa"/>
+              <w:top w:type="dxa" w:w="0"/>
+              <w:start w:type="dxa" w:w="118"/>
+              <w:bottom w:type="dxa" w:w="0"/>
+              <w:end w:type="dxa" w:w="118"/>
             </w:tcMar>
           </w:tcPr>
           <w:p>
             <w:pPr>
-              <w:spacing w:after="0" w:before="0"/>
+              <w:spacing w:before="0" w:after="0" w:line="240" w:lineRule="auto"/>
               <w:jc w:val="left"/>
             </w:pPr>
             <w:r>
               <w:rPr>
-                <w:rFonts w:ascii="ADLaM Display" w:hAnsi="ADLaM Display" w:cs="ADLaM Display"/>
+                <w:rFonts w:ascii="Calibri" w:hAnsi="Calibri" w:cs="Calibri" w:eastAsia="Calibri"/>
                 <w:b/>
-                <w:sz w:val="21"/>
+                <w:sz w:val="20"/>
+                <w:u w:val="none"/>
               </w:rPr>
-              <w:t>ESCASAS</w:t>
+              <w:t>{cel_epiteliales_resultado}</w:t>
             </w:r>
           </w:p>
         </w:tc>
         <w:tc>
           <w:tcPr>
-            <w:tcW w:type="dxa" w:w="3834"/>
+            <w:tcW w:type="dxa" w:w="6797"/>
+            <w:vAlign w:val="center"/>
             <w:tcMar>
-              <w:top w:w="2" w:type="dxa"/>
-              <w:start w:w="10" w:type="dxa"/>
-              <w:bottom w:w="2" w:type="dxa"/>
-              <w:end w:w="10" w:type="dxa"/>
+              <w:top w:type="dxa" w:w="0"/>
+              <w:start w:type="dxa" w:w="118"/>
+              <w:bottom w:type="dxa" w:w="0"/>
+              <w:end w:type="dxa" w:w="118"/>
             </w:tcMar>
           </w:tcPr>
           <w:p>
             <w:pPr>
-              <w:spacing w:after="0" w:before="0"/>
+              <w:spacing w:before="0" w:after="0" w:line="240" w:lineRule="auto"/>
               <w:jc w:val="left"/>
             </w:pPr>
             <w:r>
               <w:rPr>
-                <w:rFonts w:ascii="ADLaM Display" w:hAnsi="ADLaM Display" w:cs="ADLaM Display"/>
+                <w:rFonts w:ascii="Calibri" w:hAnsi="Calibri" w:cs="Calibri" w:eastAsia="Calibri"/>
                 <w:b/>
-                <w:sz w:val="21"/>
+                <w:sz w:val="20"/>
+                <w:u w:val="none"/>
               </w:rPr>
+              <w:t>{cel_epiteliales_referencia}</w:t>
             </w:r>
           </w:p>
         </w:tc>
       </w:tr>
       <w:tr>
+        <w:trPr>
+          <w:trHeight w:hRule="exact" w:val="207"/>
+        </w:trPr>
         <w:tc>
           <w:tcPr>
-            <w:tcW w:type="dxa" w:w="3834"/>
+            <w:tcW w:type="dxa" w:w="2693"/>
+            <w:vAlign w:val="center"/>
             <w:tcMar>
-              <w:top w:w="2" w:type="dxa"/>
-              <w:start w:w="10" w:type="dxa"/>
-              <w:bottom w:w="2" w:type="dxa"/>
-              <w:end w:w="10" w:type="dxa"/>
+              <w:top w:type="dxa" w:w="0"/>
+              <w:start w:type="dxa" w:w="118"/>
+              <w:bottom w:type="dxa" w:w="0"/>
+              <w:end w:type="dxa" w:w="118"/>
             </w:tcMar>
           </w:tcPr>
           <w:p>
             <w:pPr>
-              <w:spacing w:after="0" w:before="0"/>
+              <w:spacing w:before="0" w:after="0" w:line="240" w:lineRule="auto"/>
               <w:jc w:val="left"/>
             </w:pPr>
             <w:r>
               <w:rPr>
-                <w:rFonts w:ascii="ADLaM Display" w:hAnsi="ADLaM Display" w:cs="ADLaM Display"/>
+                <w:rFonts w:ascii="Calibri" w:hAnsi="Calibri" w:cs="Calibri" w:eastAsia="Calibri"/>
                 <w:b/>
-                <w:sz w:val="21"/>
+                <w:sz w:val="20"/>
+                <w:u w:val="none"/>
               </w:rPr>
               <w:t>CILINDROS</w:t>
             </w:r>
@@ -1502,75 +1708,85 @@
         </w:tc>
         <w:tc>
           <w:tcPr>
-            <w:tcW w:type="dxa" w:w="3834"/>
+            <w:tcW w:type="dxa" w:w="2750"/>
+            <w:vAlign w:val="center"/>
             <w:tcMar>
-              <w:top w:w="2" w:type="dxa"/>
-              <w:start w:w="10" w:type="dxa"/>
-              <w:bottom w:w="2" w:type="dxa"/>
-              <w:end w:w="10" w:type="dxa"/>
+              <w:top w:type="dxa" w:w="0"/>
+              <w:start w:type="dxa" w:w="118"/>
+              <w:bottom w:type="dxa" w:w="0"/>
+              <w:end w:type="dxa" w:w="118"/>
             </w:tcMar>
           </w:tcPr>
           <w:p>
             <w:pPr>
-              <w:spacing w:after="0" w:before="0"/>
+              <w:spacing w:before="0" w:after="0" w:line="240" w:lineRule="auto"/>
               <w:jc w:val="left"/>
             </w:pPr>
             <w:r>
               <w:rPr>
-                <w:rFonts w:ascii="ADLaM Display" w:hAnsi="ADLaM Display" w:cs="ADLaM Display"/>
+                <w:rFonts w:ascii="Calibri" w:hAnsi="Calibri" w:cs="Calibri" w:eastAsia="Calibri"/>
                 <w:b/>
-                <w:sz w:val="21"/>
+                <w:sz w:val="20"/>
+                <w:u w:val="none"/>
               </w:rPr>
-              <w:t>ESCASAS</w:t>
+              <w:t>{cilindros_resultado}</w:t>
             </w:r>
           </w:p>
         </w:tc>
         <w:tc>
           <w:tcPr>
-            <w:tcW w:type="dxa" w:w="3834"/>
+            <w:tcW w:type="dxa" w:w="6797"/>
+            <w:vAlign w:val="center"/>
             <w:tcMar>
-              <w:top w:w="2" w:type="dxa"/>
-              <w:start w:w="10" w:type="dxa"/>
-              <w:bottom w:w="2" w:type="dxa"/>
-              <w:end w:w="10" w:type="dxa"/>
+              <w:top w:type="dxa" w:w="0"/>
+              <w:start w:type="dxa" w:w="118"/>
+              <w:bottom w:type="dxa" w:w="0"/>
+              <w:end w:type="dxa" w:w="118"/>
             </w:tcMar>
           </w:tcPr>
           <w:p>
             <w:pPr>
-              <w:spacing w:after="0" w:before="0"/>
+              <w:spacing w:before="0" w:after="0" w:line="240" w:lineRule="auto"/>
               <w:jc w:val="left"/>
             </w:pPr>
             <w:r>
               <w:rPr>
-                <w:rFonts w:ascii="ADLaM Display" w:hAnsi="ADLaM Display" w:cs="ADLaM Display"/>
+                <w:rFonts w:ascii="Calibri" w:hAnsi="Calibri" w:cs="Calibri" w:eastAsia="Calibri"/>
                 <w:b/>
-                <w:sz w:val="21"/>
+                <w:sz w:val="20"/>
+                <w:u w:val="none"/>
               </w:rPr>
+              <w:t>{cilindros_referencia}</w:t>
             </w:r>
           </w:p>
         </w:tc>
       </w:tr>
       <w:tr>
+        <w:trPr>
+          <w:trHeight w:hRule="exact" w:val="207"/>
+        </w:trPr>
         <w:tc>
           <w:tcPr>
-            <w:tcW w:type="dxa" w:w="3834"/>
+            <w:tcW w:type="dxa" w:w="2693"/>
+            <w:vAlign w:val="center"/>
             <w:tcMar>
-              <w:top w:w="2" w:type="dxa"/>
-              <w:start w:w="10" w:type="dxa"/>
-              <w:bottom w:w="2" w:type="dxa"/>
-              <w:end w:w="10" w:type="dxa"/>
+              <w:top w:type="dxa" w:w="0"/>
+              <w:start w:type="dxa" w:w="118"/>
+              <w:bottom w:type="dxa" w:w="0"/>
+              <w:end w:type="dxa" w:w="118"/>
             </w:tcMar>
           </w:tcPr>
           <w:p>
             <w:pPr>
-              <w:spacing w:after="0" w:before="0"/>
+              <w:spacing w:before="0" w:after="0" w:line="240" w:lineRule="auto"/>
               <w:jc w:val="left"/>
             </w:pPr>
             <w:r>
               <w:rPr>
-                <w:rFonts w:ascii="ADLaM Display" w:hAnsi="ADLaM Display" w:cs="ADLaM Display"/>
+                <w:rFonts w:ascii="Calibri" w:hAnsi="Calibri" w:cs="Calibri" w:eastAsia="Calibri"/>
                 <w:b/>
-                <w:sz w:val="21"/>
+                <w:sz w:val="20"/>
+                <w:u w:val="none"/>
               </w:rPr>
               <w:t>CRISTALES</w:t>
             </w:r>
@@ -1578,75 +1794,85 @@
         </w:tc>
         <w:tc>
           <w:tcPr>
-            <w:tcW w:type="dxa" w:w="3834"/>
+            <w:tcW w:type="dxa" w:w="2750"/>
+            <w:vAlign w:val="center"/>
             <w:tcMar>
-              <w:top w:w="2" w:type="dxa"/>
-              <w:start w:w="10" w:type="dxa"/>
-              <w:bottom w:w="2" w:type="dxa"/>
-              <w:end w:w="10" w:type="dxa"/>
+              <w:top w:type="dxa" w:w="0"/>
+              <w:start w:type="dxa" w:w="118"/>
+              <w:bottom w:type="dxa" w:w="0"/>
+              <w:end w:type="dxa" w:w="118"/>
             </w:tcMar>
           </w:tcPr>
           <w:p>
             <w:pPr>
-              <w:spacing w:after="0" w:before="0"/>
+              <w:spacing w:before="0" w:after="0" w:line="240" w:lineRule="auto"/>
               <w:jc w:val="left"/>
             </w:pPr>
             <w:r>
               <w:rPr>
-                <w:rFonts w:ascii="ADLaM Display" w:hAnsi="ADLaM Display" w:cs="ADLaM Display"/>
+                <w:rFonts w:ascii="Calibri" w:hAnsi="Calibri" w:cs="Calibri" w:eastAsia="Calibri"/>
                 <w:b/>
-                <w:sz w:val="21"/>
+                <w:sz w:val="20"/>
+                <w:u w:val="none"/>
               </w:rPr>
-              <w:t>ESCASAS</w:t>
+              <w:t>{cristales_resultado}</w:t>
             </w:r>
           </w:p>
         </w:tc>
         <w:tc>
           <w:tcPr>
-            <w:tcW w:type="dxa" w:w="3834"/>
+            <w:tcW w:type="dxa" w:w="6797"/>
+            <w:vAlign w:val="center"/>
             <w:tcMar>
-              <w:top w:w="2" w:type="dxa"/>
-              <w:start w:w="10" w:type="dxa"/>
-              <w:bottom w:w="2" w:type="dxa"/>
-              <w:end w:w="10" w:type="dxa"/>
+              <w:top w:type="dxa" w:w="0"/>
+              <w:start w:type="dxa" w:w="118"/>
+              <w:bottom w:type="dxa" w:w="0"/>
+              <w:end w:type="dxa" w:w="118"/>
             </w:tcMar>
           </w:tcPr>
           <w:p>
             <w:pPr>
-              <w:spacing w:after="0" w:before="0"/>
+              <w:spacing w:before="0" w:after="0" w:line="240" w:lineRule="auto"/>
               <w:jc w:val="left"/>
             </w:pPr>
             <w:r>
               <w:rPr>
-                <w:rFonts w:ascii="ADLaM Display" w:hAnsi="ADLaM Display" w:cs="ADLaM Display"/>
+                <w:rFonts w:ascii="Calibri" w:hAnsi="Calibri" w:cs="Calibri" w:eastAsia="Calibri"/>
                 <w:b/>
-                <w:sz w:val="21"/>
+                <w:sz w:val="20"/>
+                <w:u w:val="none"/>
               </w:rPr>
+              <w:t>{cristales_referencia}</w:t>
             </w:r>
           </w:p>
         </w:tc>
       </w:tr>
       <w:tr>
+        <w:trPr>
+          <w:trHeight w:hRule="exact" w:val="207"/>
+        </w:trPr>
         <w:tc>
           <w:tcPr>
-            <w:tcW w:type="dxa" w:w="3834"/>
+            <w:tcW w:type="dxa" w:w="2693"/>
+            <w:vAlign w:val="center"/>
             <w:tcMar>
-              <w:top w:w="2" w:type="dxa"/>
-              <w:start w:w="10" w:type="dxa"/>
-              <w:bottom w:w="2" w:type="dxa"/>
-              <w:end w:w="10" w:type="dxa"/>
+              <w:top w:type="dxa" w:w="0"/>
+              <w:start w:type="dxa" w:w="118"/>
+              <w:bottom w:type="dxa" w:w="0"/>
+              <w:end w:type="dxa" w:w="118"/>
             </w:tcMar>
           </w:tcPr>
           <w:p>
             <w:pPr>
-              <w:spacing w:after="0" w:before="0"/>
+              <w:spacing w:before="0" w:after="0" w:line="240" w:lineRule="auto"/>
               <w:jc w:val="left"/>
             </w:pPr>
             <w:r>
               <w:rPr>
-                <w:rFonts w:ascii="ADLaM Display" w:hAnsi="ADLaM Display" w:cs="ADLaM Display"/>
+                <w:rFonts w:ascii="Calibri" w:hAnsi="Calibri" w:cs="Calibri" w:eastAsia="Calibri"/>
                 <w:b/>
-                <w:sz w:val="21"/>
+                <w:sz w:val="20"/>
+                <w:u w:val="none"/>
               </w:rPr>
               <w:t>BACTERIAS</w:t>
             </w:r>
@@ -1654,76 +1880,85 @@
         </w:tc>
         <w:tc>
           <w:tcPr>
-            <w:tcW w:type="dxa" w:w="3834"/>
+            <w:tcW w:type="dxa" w:w="2750"/>
+            <w:vAlign w:val="center"/>
             <w:tcMar>
-              <w:top w:w="2" w:type="dxa"/>
-              <w:start w:w="10" w:type="dxa"/>
-              <w:bottom w:w="2" w:type="dxa"/>
-              <w:end w:w="10" w:type="dxa"/>
+              <w:top w:type="dxa" w:w="0"/>
+              <w:start w:type="dxa" w:w="118"/>
+              <w:bottom w:type="dxa" w:w="0"/>
+              <w:end w:type="dxa" w:w="118"/>
             </w:tcMar>
           </w:tcPr>
           <w:p>
             <w:pPr>
-              <w:spacing w:after="0" w:before="0"/>
+              <w:spacing w:before="0" w:after="0" w:line="240" w:lineRule="auto"/>
               <w:jc w:val="left"/>
             </w:pPr>
             <w:r>
               <w:rPr>
-                <w:rFonts w:ascii="ADLaM Display" w:hAnsi="ADLaM Display" w:cs="ADLaM Display"/>
+                <w:rFonts w:ascii="Calibri" w:hAnsi="Calibri" w:cs="Calibri" w:eastAsia="Calibri"/>
                 <w:b/>
-                <w:sz w:val="21"/>
+                <w:sz w:val="20"/>
+                <w:u w:val="none"/>
               </w:rPr>
-              <w:t>NEGATIVO</w:t>
+              <w:t>{bacterias_resultado}</w:t>
             </w:r>
           </w:p>
         </w:tc>
         <w:tc>
           <w:tcPr>
-            <w:tcW w:type="dxa" w:w="3834"/>
+            <w:tcW w:type="dxa" w:w="6797"/>
+            <w:vAlign w:val="center"/>
             <w:tcMar>
-              <w:top w:w="2" w:type="dxa"/>
-              <w:start w:w="10" w:type="dxa"/>
-              <w:bottom w:w="2" w:type="dxa"/>
-              <w:end w:w="10" w:type="dxa"/>
+              <w:top w:type="dxa" w:w="0"/>
+              <w:start w:type="dxa" w:w="118"/>
+              <w:bottom w:type="dxa" w:w="0"/>
+              <w:end w:type="dxa" w:w="118"/>
             </w:tcMar>
           </w:tcPr>
           <w:p>
             <w:pPr>
-              <w:spacing w:after="0" w:before="0"/>
+              <w:spacing w:before="0" w:after="0" w:line="240" w:lineRule="auto"/>
               <w:jc w:val="left"/>
             </w:pPr>
             <w:r>
               <w:rPr>
-                <w:rFonts w:ascii="ADLaM Display" w:hAnsi="ADLaM Display" w:cs="ADLaM Display"/>
+                <w:rFonts w:ascii="Calibri" w:hAnsi="Calibri" w:cs="Calibri" w:eastAsia="Calibri"/>
                 <w:b/>
-                <w:sz w:val="21"/>
+                <w:sz w:val="20"/>
+                <w:u w:val="none"/>
               </w:rPr>
-              <w:t>NEGATIVO</w:t>
+              <w:t>{bacterias_referencia}</w:t>
             </w:r>
           </w:p>
         </w:tc>
       </w:tr>
       <w:tr>
+        <w:trPr>
+          <w:trHeight w:hRule="exact" w:val="207"/>
+        </w:trPr>
         <w:tc>
           <w:tcPr>
-            <w:tcW w:type="dxa" w:w="3834"/>
+            <w:tcW w:type="dxa" w:w="2693"/>
+            <w:vAlign w:val="center"/>
             <w:tcMar>
-              <w:top w:w="2" w:type="dxa"/>
-              <w:start w:w="10" w:type="dxa"/>
-              <w:bottom w:w="2" w:type="dxa"/>
-              <w:end w:w="10" w:type="dxa"/>
+              <w:top w:type="dxa" w:w="0"/>
+              <w:start w:type="dxa" w:w="118"/>
+              <w:bottom w:type="dxa" w:w="0"/>
+              <w:end w:type="dxa" w:w="118"/>
             </w:tcMar>
           </w:tcPr>
           <w:p>
             <w:pPr>
-              <w:spacing w:after="0" w:before="0"/>
+              <w:spacing w:before="0" w:after="0" w:line="240" w:lineRule="auto"/>
               <w:jc w:val="left"/>
             </w:pPr>
             <w:r>
               <w:rPr>
-                <w:rFonts w:ascii="ADLaM Display" w:hAnsi="ADLaM Display" w:cs="ADLaM Display"/>
+                <w:rFonts w:ascii="Calibri" w:hAnsi="Calibri" w:cs="Calibri" w:eastAsia="Calibri"/>
                 <w:b/>
-                <w:sz w:val="21"/>
+                <w:sz w:val="20"/>
+                <w:u w:val="none"/>
               </w:rPr>
               <w:t>FILAMENTO MUCOSO</w:t>
             </w:r>
@@ -1731,76 +1966,85 @@
         </w:tc>
         <w:tc>
           <w:tcPr>
-            <w:tcW w:type="dxa" w:w="3834"/>
+            <w:tcW w:type="dxa" w:w="2750"/>
+            <w:vAlign w:val="center"/>
             <w:tcMar>
-              <w:top w:w="2" w:type="dxa"/>
-              <w:start w:w="10" w:type="dxa"/>
-              <w:bottom w:w="2" w:type="dxa"/>
-              <w:end w:w="10" w:type="dxa"/>
+              <w:top w:type="dxa" w:w="0"/>
+              <w:start w:type="dxa" w:w="118"/>
+              <w:bottom w:type="dxa" w:w="0"/>
+              <w:end w:type="dxa" w:w="118"/>
             </w:tcMar>
           </w:tcPr>
           <w:p>
             <w:pPr>
-              <w:spacing w:after="0" w:before="0"/>
+              <w:spacing w:before="0" w:after="0" w:line="240" w:lineRule="auto"/>
               <w:jc w:val="left"/>
             </w:pPr>
             <w:r>
               <w:rPr>
-                <w:rFonts w:ascii="ADLaM Display" w:hAnsi="ADLaM Display" w:cs="ADLaM Display"/>
+                <w:rFonts w:ascii="Calibri" w:hAnsi="Calibri" w:cs="Calibri" w:eastAsia="Calibri"/>
                 <w:b/>
-                <w:sz w:val="21"/>
+                <w:sz w:val="20"/>
+                <w:u w:val="none"/>
               </w:rPr>
-              <w:t>NEGATIVO</w:t>
+              <w:t>{filamento_mucoso_resultado}</w:t>
             </w:r>
           </w:p>
         </w:tc>
         <w:tc>
           <w:tcPr>
-            <w:tcW w:type="dxa" w:w="3834"/>
+            <w:tcW w:type="dxa" w:w="6797"/>
+            <w:vAlign w:val="center"/>
             <w:tcMar>
-              <w:top w:w="2" w:type="dxa"/>
-              <w:start w:w="10" w:type="dxa"/>
-              <w:bottom w:w="2" w:type="dxa"/>
-              <w:end w:w="10" w:type="dxa"/>
+              <w:top w:type="dxa" w:w="0"/>
+              <w:start w:type="dxa" w:w="118"/>
+              <w:bottom w:type="dxa" w:w="0"/>
+              <w:end w:type="dxa" w:w="118"/>
             </w:tcMar>
           </w:tcPr>
           <w:p>
             <w:pPr>
-              <w:spacing w:after="0" w:before="0"/>
+              <w:spacing w:before="0" w:after="0" w:line="240" w:lineRule="auto"/>
               <w:jc w:val="left"/>
             </w:pPr>
             <w:r>
               <w:rPr>
-                <w:rFonts w:ascii="ADLaM Display" w:hAnsi="ADLaM Display" w:cs="ADLaM Display"/>
+                <w:rFonts w:ascii="Calibri" w:hAnsi="Calibri" w:cs="Calibri" w:eastAsia="Calibri"/>
                 <w:b/>
-                <w:sz w:val="21"/>
+                <w:sz w:val="20"/>
+                <w:u w:val="none"/>
               </w:rPr>
-              <w:t>NEGATIVO</w:t>
+              <w:t>{filamento_mucoso_referencia}</w:t>
             </w:r>
           </w:p>
         </w:tc>
       </w:tr>
       <w:tr>
+        <w:trPr>
+          <w:trHeight w:hRule="exact" w:val="207"/>
+        </w:trPr>
         <w:tc>
           <w:tcPr>
-            <w:tcW w:type="dxa" w:w="3834"/>
+            <w:tcW w:type="dxa" w:w="2693"/>
+            <w:vAlign w:val="center"/>
             <w:tcMar>
-              <w:top w:w="2" w:type="dxa"/>
-              <w:start w:w="10" w:type="dxa"/>
-              <w:bottom w:w="2" w:type="dxa"/>
-              <w:end w:w="10" w:type="dxa"/>
+              <w:top w:type="dxa" w:w="0"/>
+              <w:start w:type="dxa" w:w="118"/>
+              <w:bottom w:type="dxa" w:w="0"/>
+              <w:end w:type="dxa" w:w="118"/>
             </w:tcMar>
           </w:tcPr>
           <w:p>
             <w:pPr>
-              <w:spacing w:after="0" w:before="0"/>
+              <w:spacing w:before="0" w:after="0" w:line="240" w:lineRule="auto"/>
               <w:jc w:val="left"/>
             </w:pPr>
             <w:r>
               <w:rPr>
-                <w:rFonts w:ascii="ADLaM Display" w:hAnsi="ADLaM Display" w:cs="ADLaM Display"/>
+                <w:rFonts w:ascii="Calibri" w:hAnsi="Calibri" w:cs="Calibri" w:eastAsia="Calibri"/>
                 <w:b/>
-                <w:sz w:val="21"/>
+                <w:sz w:val="20"/>
+                <w:u w:val="none"/>
               </w:rPr>
               <w:t>LEVADURAS</w:t>
             </w:r>
@@ -1808,92 +2052,116 @@
         </w:tc>
         <w:tc>
           <w:tcPr>
-            <w:tcW w:type="dxa" w:w="3834"/>
+            <w:tcW w:type="dxa" w:w="2750"/>
+            <w:vAlign w:val="center"/>
             <w:tcMar>
-              <w:top w:w="2" w:type="dxa"/>
-              <w:start w:w="10" w:type="dxa"/>
-              <w:bottom w:w="2" w:type="dxa"/>
-              <w:end w:w="10" w:type="dxa"/>
+              <w:top w:type="dxa" w:w="0"/>
+              <w:start w:type="dxa" w:w="118"/>
+              <w:bottom w:type="dxa" w:w="0"/>
+              <w:end w:type="dxa" w:w="118"/>
             </w:tcMar>
           </w:tcPr>
           <w:p>
             <w:pPr>
-              <w:spacing w:after="0" w:before="0"/>
+              <w:spacing w:before="0" w:after="0" w:line="240" w:lineRule="auto"/>
               <w:jc w:val="left"/>
             </w:pPr>
             <w:r>
               <w:rPr>
-                <w:rFonts w:ascii="ADLaM Display" w:hAnsi="ADLaM Display" w:cs="ADLaM Display"/>
+                <w:rFonts w:ascii="Calibri" w:hAnsi="Calibri" w:cs="Calibri" w:eastAsia="Calibri"/>
                 <w:b/>
-                <w:sz w:val="21"/>
+                <w:sz w:val="20"/>
+                <w:u w:val="none"/>
               </w:rPr>
-              <w:t>NEGATIVO</w:t>
+              <w:t>{levaduras_resultado}</w:t>
             </w:r>
           </w:p>
         </w:tc>
         <w:tc>
           <w:tcPr>
-            <w:tcW w:type="dxa" w:w="3834"/>
+            <w:tcW w:type="dxa" w:w="6797"/>
+            <w:vAlign w:val="center"/>
             <w:tcMar>
-              <w:top w:w="2" w:type="dxa"/>
-              <w:start w:w="10" w:type="dxa"/>
-              <w:bottom w:w="2" w:type="dxa"/>
-              <w:end w:w="10" w:type="dxa"/>
+              <w:top w:type="dxa" w:w="0"/>
+              <w:start w:type="dxa" w:w="118"/>
+              <w:bottom w:type="dxa" w:w="0"/>
+              <w:end w:type="dxa" w:w="118"/>
             </w:tcMar>
           </w:tcPr>
           <w:p>
             <w:pPr>
-              <w:spacing w:after="0" w:before="0"/>
+              <w:spacing w:before="0" w:after="0" w:line="240" w:lineRule="auto"/>
               <w:jc w:val="left"/>
             </w:pPr>
             <w:r>
               <w:rPr>
-                <w:rFonts w:ascii="ADLaM Display" w:hAnsi="ADLaM Display" w:cs="ADLaM Display"/>
+                <w:rFonts w:ascii="Calibri" w:hAnsi="Calibri" w:cs="Calibri" w:eastAsia="Calibri"/>
                 <w:b/>
-                <w:sz w:val="21"/>
+                <w:sz w:val="20"/>
+                <w:u w:val="none"/>
               </w:rPr>
-              <w:t>NEGATIVO</w:t>
+              <w:t>{levaduras_referencia}</w:t>
             </w:r>
           </w:p>
         </w:tc>
       </w:tr>
     </w:tbl>
+    <w:p>
+      <w:pPr>
+        <w:spacing w:before="840" w:after="0"/>
+      </w:pPr>
+    </w:p>
     <w:tbl>
       <w:tblPr>
-        <w:tblW w:type="auto" w:w="0"/>
+        <w:tblW w:type="dxa" w:w="12241"/>
         <w:jc w:val="center"/>
         <w:tblLayout w:type="fixed"/>
         <w:tblLook w:firstColumn="1" w:firstRow="1" w:lastColumn="0" w:lastRow="0" w:noHBand="0" w:noVBand="1" w:val="04A0"/>
+        <w:tblBorders>
+          <w:top w:val="nil"/>
+          <w:left w:val="nil"/>
+          <w:bottom w:val="nil"/>
+          <w:right w:val="nil"/>
+          <w:insideH w:val="nil"/>
+          <w:insideV w:val="nil"/>
+        </w:tblBorders>
       </w:tblPr>
       <w:tblGrid>
-        <w:gridCol w:w="8050"/>
-        <w:gridCol w:w="2381"/>
+        <w:gridCol w:w="7682"/>
+        <w:gridCol w:w="4558"/>
       </w:tblGrid>
       <w:tr>
         <w:tc>
           <w:tcPr>
-            <w:tcW w:type="dxa" w:w="5751"/>
+            <w:tcW w:type="dxa" w:w="7682"/>
+            <w:tcMar>
+              <w:top w:type="dxa" w:w="0"/>
+              <w:start w:type="dxa" w:w="0"/>
+              <w:bottom w:type="dxa" w:w="0"/>
+              <w:end w:type="dxa" w:w="0"/>
+            </w:tcMar>
           </w:tcPr>
           <w:p/>
         </w:tc>
         <w:tc>
           <w:tcPr>
-            <w:tcW w:type="dxa" w:w="5751"/>
+            <w:tcW w:type="dxa" w:w="4558"/>
             <w:tcMar>
-              <w:top w:w="2" w:type="dxa"/>
-              <w:start w:w="4" w:type="dxa"/>
-              <w:bottom w:w="2" w:type="dxa"/>
-              <w:end w:w="4" w:type="dxa"/>
+              <w:top w:type="dxa" w:w="0"/>
+              <w:start w:type="dxa" w:w="0"/>
+              <w:bottom w:type="dxa" w:w="0"/>
+              <w:end w:type="dxa" w:w="0"/>
             </w:tcMar>
           </w:tcPr>
           <w:p>
             <w:pPr>
+              <w:spacing w:before="0" w:after="0"/>
               <w:jc w:val="center"/>
             </w:pPr>
             <w:r>
               <w:drawing>
                 <wp:inline xmlns:a="http://schemas.openxmlformats.org/drawingml/2006/main" xmlns:pic="http://schemas.openxmlformats.org/drawingml/2006/picture">
-                  <wp:extent cx="1296000" cy="1296000"/>
+                  <wp:extent cx="1530000" cy="1530000"/>
                   <wp:docPr id="2" name="Picture 2"/>
                   <wp:cNvGraphicFramePr>
                     <a:graphicFrameLocks noChangeAspect="1"/>
@@ -1902,7 +2170,7 @@
                     <a:graphicData uri="http://schemas.openxmlformats.org/drawingml/2006/picture">
                       <pic:pic>
                         <pic:nvPicPr>
-                          <pic:cNvPr id="0" name="image2.png"/>
+                          <pic:cNvPr id="0" name="sign.png"/>
                           <pic:cNvPicPr/>
                         </pic:nvPicPr>
                         <pic:blipFill>
@@ -1914,7 +2182,7 @@
                         <pic:spPr>
                           <a:xfrm>
                             <a:off x="0" y="0"/>
-                            <a:ext cx="1296000" cy="1296000"/>
+                            <a:ext cx="1530000" cy="1530000"/>
                           </a:xfrm>
                           <a:prstGeom prst="rect"/>
                         </pic:spPr>
@@ -1928,35 +2196,48 @@
         </w:tc>
       </w:tr>
     </w:tbl>
+    <w:p>
+      <w:pPr>
+        <w:spacing w:before="420" w:after="0"/>
+      </w:pPr>
+    </w:p>
     <w:tbl>
       <w:tblPr>
-        <w:tblW w:type="auto" w:w="0"/>
+        <w:tblW w:type="dxa" w:w="12241"/>
         <w:jc w:val="center"/>
         <w:tblLayout w:type="fixed"/>
         <w:tblLook w:firstColumn="1" w:firstRow="1" w:lastColumn="0" w:lastRow="0" w:noHBand="0" w:noVBand="1" w:val="04A0"/>
+        <w:tblBorders>
+          <w:top w:val="nil"/>
+          <w:left w:val="nil"/>
+          <w:bottom w:val="nil"/>
+          <w:right w:val="nil"/>
+          <w:insideH w:val="nil"/>
+          <w:insideV w:val="nil"/>
+        </w:tblBorders>
       </w:tblPr>
       <w:tblGrid>
-        <w:gridCol w:w="10658"/>
+        <w:gridCol w:w="12241"/>
       </w:tblGrid>
       <w:tr>
         <w:tc>
           <w:tcPr>
-            <w:tcW w:type="dxa" w:w="11502"/>
-            <w:shd w:val="clear" w:fill="001A99"/>
+            <w:tcW w:type="dxa" w:w="12240"/>
+            <w:shd w:val="clear" w:fill="000066"/>
             <w:tcMar>
-              <w:top w:w="2" w:type="dxa"/>
-              <w:start w:w="2" w:type="dxa"/>
-              <w:bottom w:w="2" w:type="dxa"/>
-              <w:end w:w="2" w:type="dxa"/>
+              <w:top w:type="dxa" w:w="180"/>
+              <w:start w:type="dxa" w:w="0"/>
+              <w:bottom w:type="dxa" w:w="180"/>
+              <w:end w:type="dxa" w:w="0"/>
             </w:tcMar>
           </w:tcPr>
           <w:p>
             <w:r>
               <w:rPr>
-                <w:rFonts w:ascii="ADLaM Display" w:hAnsi="ADLaM Display" w:cs="ADLaM Display"/>
+                <w:rFonts w:ascii="Calibri" w:hAnsi="Calibri" w:cs="Calibri" w:eastAsia="Calibri"/>
                 <w:b w:val="0"/>
                 <w:color w:val="FFFFFF"/>
-                <w:sz w:val="5"/>
+                <w:sz w:val="2"/>
               </w:rPr>
               <w:t xml:space="preserve"> </w:t>
             </w:r>
@@ -1966,7 +2247,7 @@
     </w:tbl>
     <w:sectPr>
       <w:pgSz w:w="12240" w:h="15840"/>
-      <w:pgMar w:top="369" w:right="369" w:bottom="369" w:left="369" w:header="720" w:footer="720" w:gutter="0"/>
+      <w:pgMar w:top="0" w:right="0" w:bottom="0" w:left="0" w:header="720" w:footer="720" w:gutter="0"/>
       <w:cols w:space="720"/>
       <w:docGrid w:linePitch="360"/>
     </w:sectPr>

</xml_diff>

<commit_message>
fix(orina): preserve Calibri font and prevent lower block clipping
- Kept Calibri as the official urinalysis template font
- Adjusted page spacing and margins to keep the full exam on one page
- Removed unnecessary blank spacing affecting the lower document block
- Preserved the corrected table structure and placeholder mapping
- Fixed eritrocitos output to generate discrete values only: 0/C, 1/C, 2/C, or 3/C
- Kept eritrocitos reference fixed as 0-3/C
</commit_message>
<xml_diff>
--- a/examenes_medicos_templates/FORMATO EXAMEN DE ORINA.docx
+++ b/examenes_medicos_templates/FORMATO EXAMEN DE ORINA.docx
@@ -3,9 +3,12 @@
 <w:document xmlns:wpc="http://schemas.microsoft.com/office/word/2010/wordprocessingCanvas" xmlns:cx="http://schemas.microsoft.com/office/drawing/2014/chartex" xmlns:cx1="http://schemas.microsoft.com/office/drawing/2015/9/8/chartex" xmlns:cx2="http://schemas.microsoft.com/office/drawing/2015/10/21/chartex" xmlns:cx3="http://schemas.microsoft.com/office/drawing/2016/5/9/chartex" xmlns:cx4="http://schemas.microsoft.com/office/drawing/2016/5/10/chartex" xmlns:cx5="http://schemas.microsoft.com/office/drawing/2016/5/11/chartex" xmlns:cx6="http://schemas.microsoft.com/office/drawing/2016/5/12/chartex" xmlns:cx7="http://schemas.microsoft.com/office/drawing/2016/5/13/chartex" xmlns:cx8="http://schemas.microsoft.com/office/drawing/2016/5/14/chartex" xmlns:mc="http://schemas.openxmlformats.org/markup-compatibility/2006" xmlns:aink="http://schemas.microsoft.com/office/drawing/2016/ink" xmlns:am3d="http://schemas.microsoft.com/office/drawing/2017/model3d" xmlns:o="urn:schemas-microsoft-com:office:office" xmlns:oel="http://schemas.microsoft.com/office/2019/extlst" xmlns:r="http://schemas.openxmlformats.org/officeDocument/2006/relationships" xmlns:m="http://schemas.openxmlformats.org/officeDocument/2006/math" xmlns:v="urn:schemas-microsoft-com:vml" xmlns:wp14="http://schemas.microsoft.com/office/word/2010/wordprocessingDrawing" xmlns:wp="http://schemas.openxmlformats.org/drawingml/2006/wordprocessingDrawing" xmlns:w10="urn:schemas-microsoft-com:office:word" xmlns:w="http://schemas.openxmlformats.org/wordprocessingml/2006/main" xmlns:w14="http://schemas.microsoft.com/office/word/2010/wordml" xmlns:w15="http://schemas.microsoft.com/office/word/2012/wordml" xmlns:w16cex="http://schemas.microsoft.com/office/word/2018/wordml/cex" xmlns:w16cid="http://schemas.microsoft.com/office/word/2016/wordml/cid" xmlns:w16="http://schemas.microsoft.com/office/word/2018/wordml" xmlns:w16du="http://schemas.microsoft.com/office/word/2023/wordml/word16du" xmlns:w16sdtdh="http://schemas.microsoft.com/office/word/2020/wordml/sdtdatahash" xmlns:w16sdtfl="http://schemas.microsoft.com/office/word/2024/wordml/sdtformatlock" xmlns:w16se="http://schemas.microsoft.com/office/word/2015/wordml/symex" xmlns:wpg="http://schemas.microsoft.com/office/word/2010/wordprocessingGroup" xmlns:wpi="http://schemas.microsoft.com/office/word/2010/wordprocessingInk" xmlns:wne="http://schemas.microsoft.com/office/word/2006/wordml" xmlns:wps="http://schemas.microsoft.com/office/word/2010/wordprocessingShape" mc:Ignorable="w14 w15 w16se w16cid w16 w16cex w16sdtdh w16sdtfl w16du wp14">
   <w:body>
     <w:p>
+      <w:pPr>
+        <w:spacing w:before="0" w:after="0" w:line="240" w:lineRule="auto"/>
+      </w:pPr>
       <w:r>
         <w:rPr>
-          <w:rFonts w:ascii="Times New Roman"/>
+          <w:rFonts w:ascii="Calibri" w:hAnsi="Calibri"/>
           <w:noProof/>
           <w:sz w:val="20"/>
           <w:lang w:val="es-MX" w:eastAsia="es-MX"/>
@@ -108,7 +111,7 @@
                             <w:p>
                               <w:pPr>
                                 <w:rPr>
-                                  <w:rFonts w:ascii="ADLaM Display" w:hAnsi="ADLaM Display" w:cs="ADLaM Display"/>
+                                  <w:rFonts w:ascii="Calibri" w:hAnsi="Calibri" w:cs="Calibri"/>
                                   <w:sz w:val="96"/>
                                   <w:szCs w:val="96"/>
                                   <w:lang w:val="es-MX"/>
@@ -116,7 +119,7 @@
                               </w:pPr>
                               <w:r>
                                 <w:rPr>
-                                  <w:rFonts w:ascii="ADLaM Display" w:hAnsi="ADLaM Display" w:cs="ADLaM Display"/>
+                                  <w:rFonts w:ascii="Calibri" w:hAnsi="Calibri" w:cs="Calibri"/>
                                   <w:sz w:val="48"/>
                                   <w:szCs w:val="48"/>
                                 </w:rPr>
@@ -125,7 +128,7 @@
                               <w:proofErr w:type="spellStart"/>
                               <w:r>
                                 <w:rPr>
-                                  <w:rFonts w:ascii="ADLaM Display" w:hAnsi="ADLaM Display" w:cs="ADLaM Display"/>
+                                  <w:rFonts w:ascii="Calibri" w:hAnsi="Calibri" w:cs="Calibri"/>
                                   <w:sz w:val="48"/>
                                   <w:szCs w:val="48"/>
                                 </w:rPr>
@@ -169,7 +172,7 @@
                             <w:p>
                               <w:pPr>
                                 <w:rPr>
-                                  <w:rFonts w:ascii="ADLaM Display" w:hAnsi="ADLaM Display" w:cs="ADLaM Display"/>
+                                  <w:rFonts w:ascii="Calibri" w:hAnsi="Calibri" w:cs="Calibri"/>
                                   <w:sz w:val="44"/>
                                   <w:szCs w:val="44"/>
                                   <w:lang w:val="es-MX"/>
@@ -177,7 +180,7 @@
                               </w:pPr>
                               <w:r>
                                 <w:rPr>
-                                  <w:rFonts w:ascii="ADLaM Display" w:hAnsi="ADLaM Display" w:cs="ADLaM Display"/>
+                                  <w:rFonts w:ascii="Calibri" w:hAnsi="Calibri" w:cs="Calibri"/>
                                   <w:sz w:val="28"/>
                                   <w:szCs w:val="28"/>
                                   <w:lang w:val="es-MX"/>
@@ -221,14 +224,14 @@
                             <w:p>
                               <w:pPr>
                                 <w:rPr>
-                                  <w:rFonts w:ascii="ADLaM Display" w:hAnsi="ADLaM Display" w:cs="ADLaM Display"/>
+                                  <w:rFonts w:ascii="Calibri" w:hAnsi="Calibri" w:cs="Calibri"/>
                                   <w:sz w:val="32"/>
                                   <w:szCs w:val="32"/>
                                 </w:rPr>
                               </w:pPr>
                               <w:r>
                                 <w:rPr>
-                                  <w:rFonts w:ascii="ADLaM Display" w:hAnsi="ADLaM Display" w:cs="ADLaM Display"/>
+                                  <w:rFonts w:ascii="Calibri" w:hAnsi="Calibri" w:cs="Calibri"/>
                                   <w:sz w:val="20"/>
                                   <w:szCs w:val="20"/>
                                 </w:rPr>
@@ -364,7 +367,7 @@
                       <w:p>
                         <w:pPr>
                           <w:rPr>
-                            <w:rFonts w:ascii="ADLaM Display" w:hAnsi="ADLaM Display" w:cs="ADLaM Display"/>
+                            <w:rFonts w:ascii="Calibri" w:hAnsi="Calibri" w:cs="Calibri"/>
                             <w:sz w:val="96"/>
                             <w:szCs w:val="96"/>
                             <w:lang w:val="es-MX"/>
@@ -372,7 +375,7 @@
                         </w:pPr>
                         <w:r>
                           <w:rPr>
-                            <w:rFonts w:ascii="ADLaM Display" w:hAnsi="ADLaM Display" w:cs="ADLaM Display"/>
+                            <w:rFonts w:ascii="Calibri" w:hAnsi="Calibri" w:cs="Calibri"/>
                             <w:sz w:val="48"/>
                             <w:szCs w:val="48"/>
                           </w:rPr>
@@ -381,7 +384,7 @@
                         <w:proofErr w:type="spellStart"/>
                         <w:r>
                           <w:rPr>
-                            <w:rFonts w:ascii="ADLaM Display" w:hAnsi="ADLaM Display" w:cs="ADLaM Display"/>
+                            <w:rFonts w:ascii="Calibri" w:hAnsi="Calibri" w:cs="Calibri"/>
                             <w:sz w:val="48"/>
                             <w:szCs w:val="48"/>
                           </w:rPr>
@@ -398,7 +401,7 @@
                       <w:p>
                         <w:pPr>
                           <w:rPr>
-                            <w:rFonts w:ascii="ADLaM Display" w:hAnsi="ADLaM Display" w:cs="ADLaM Display"/>
+                            <w:rFonts w:ascii="Calibri" w:hAnsi="Calibri" w:cs="Calibri"/>
                             <w:sz w:val="44"/>
                             <w:szCs w:val="44"/>
                             <w:lang w:val="es-MX"/>
@@ -406,7 +409,7 @@
                         </w:pPr>
                         <w:r>
                           <w:rPr>
-                            <w:rFonts w:ascii="ADLaM Display" w:hAnsi="ADLaM Display" w:cs="ADLaM Display"/>
+                            <w:rFonts w:ascii="Calibri" w:hAnsi="Calibri" w:cs="Calibri"/>
                             <w:sz w:val="28"/>
                             <w:szCs w:val="28"/>
                             <w:lang w:val="es-MX"/>
@@ -423,14 +426,14 @@
                       <w:p>
                         <w:pPr>
                           <w:rPr>
-                            <w:rFonts w:ascii="ADLaM Display" w:hAnsi="ADLaM Display" w:cs="ADLaM Display"/>
+                            <w:rFonts w:ascii="Calibri" w:hAnsi="Calibri" w:cs="Calibri"/>
                             <w:sz w:val="32"/>
                             <w:szCs w:val="32"/>
                           </w:rPr>
                         </w:pPr>
                         <w:r>
                           <w:rPr>
-                            <w:rFonts w:ascii="ADLaM Display" w:hAnsi="ADLaM Display" w:cs="ADLaM Display"/>
+                            <w:rFonts w:ascii="Calibri" w:hAnsi="Calibri" w:cs="Calibri"/>
                             <w:sz w:val="20"/>
                             <w:szCs w:val="20"/>
                           </w:rPr>
@@ -507,13 +510,25 @@
         </mc:AlternateContent>
       </w:r>
     </w:p>
-    <w:p/>
-    <w:p/>
-    <w:p/>
+    <w:p>
+      <w:pPr>
+        <w:spacing w:before="0" w:after="0" w:line="240" w:lineRule="auto"/>
+      </w:pPr>
+    </w:p>
+    <w:p>
+      <w:pPr>
+        <w:spacing w:before="0" w:after="0" w:line="240" w:lineRule="auto"/>
+      </w:pPr>
+    </w:p>
+    <w:p>
+      <w:pPr>
+        <w:spacing w:before="0" w:after="0" w:line="240" w:lineRule="auto"/>
+      </w:pPr>
+    </w:p>
     <w:tbl>
       <w:tblPr>
         <w:tblpPr w:leftFromText="141" w:rightFromText="141" w:vertAnchor="text" w:horzAnchor="page" w:tblpX="43" w:tblpY="89"/>
-        <w:tblW w:w="11483" w:type="dxa"/>
+        <w:tblW w:w="11485" w:type="dxa"/>
         <w:tblCellMar>
           <w:left w:w="70" w:type="dxa"/>
           <w:right w:w="70" w:type="dxa"/>
@@ -521,10 +536,10 @@
         <w:tblLook w:val="04A0" w:firstRow="1" w:lastRow="0" w:firstColumn="1" w:lastColumn="0" w:noHBand="0" w:noVBand="1"/>
       </w:tblPr>
       <w:tblGrid>
-        <w:gridCol w:w="4323"/>
-        <w:gridCol w:w="1773"/>
-        <w:gridCol w:w="2747"/>
-        <w:gridCol w:w="1320"/>
+        <w:gridCol w:w="5938"/>
+        <w:gridCol w:w="160"/>
+        <w:gridCol w:w="3825"/>
+        <w:gridCol w:w="242"/>
         <w:gridCol w:w="1320"/>
       </w:tblGrid>
       <w:tr>
@@ -533,74 +548,67 @@
         </w:trPr>
         <w:tc>
           <w:tcPr>
-            <w:tcW w:w="4323" w:type="dxa"/>
-            <w:tcBorders>
-              <w:top w:val="nil"/>
-              <w:left w:val="nil"/>
-              <w:bottom w:val="nil"/>
-              <w:right w:val="nil"/>
-            </w:tcBorders>
-            <w:noWrap/>
-            <w:vAlign w:val="bottom"/>
-            <w:hideMark/>
-          </w:tcPr>
-          <w:p>
-            <w:pPr>
-              <w:widowControl/>
-              <w:autoSpaceDE/>
-              <w:autoSpaceDN/>
-              <w:rPr>
-                <w:rFonts w:ascii="ADLaM Display" w:eastAsia="Times New Roman" w:hAnsi="ADLaM Display" w:cs="ADLaM Display"/>
-                <w:color w:val="000000"/>
-                <w:lang w:val="es-MX" w:eastAsia="es-MX"/>
-              </w:rPr>
-            </w:pPr>
-            <w:r>
-              <w:rPr>
-                <w:rFonts w:ascii="ADLaM Display" w:eastAsia="Times New Roman" w:hAnsi="ADLaM Display" w:cs="ADLaM Display"/>
-                <w:color w:val="000000"/>
-                <w:lang w:val="es-MX" w:eastAsia="es-MX"/>
-              </w:rPr>
-              <w:t>PACIENTE:</w:t>
-            </w:r>
-            <w:r>
-              <w:rPr>
-                <w:rFonts w:ascii="ADLaM Display" w:eastAsia="Times New Roman" w:hAnsi="ADLaM Display" w:cs="ADLaM Display"/>
-                <w:color w:val="000000"/>
-                <w:lang w:val="es-MX" w:eastAsia="es-MX"/>
-              </w:rPr>
-              <w:t xml:space="preserve"> </w:t>
-            </w:r>
-            <w:r>
-              <w:rPr>
-                <w:rFonts w:ascii="ADLaM Display" w:eastAsia="Times New Roman" w:hAnsi="ADLaM Display" w:cs="ADLaM Display"/>
-                <w:color w:val="000000"/>
-                <w:lang w:val="es-MX" w:eastAsia="es-MX"/>
-              </w:rPr>
-              <w:t>{</w:t>
+            <w:tcW w:w="5938" w:type="dxa"/>
+            <w:tcBorders>
+              <w:top w:val="nil"/>
+              <w:left w:val="nil"/>
+              <w:bottom w:val="nil"/>
+              <w:right w:val="nil"/>
+            </w:tcBorders>
+            <w:noWrap/>
+            <w:vAlign w:val="bottom"/>
+            <w:hideMark/>
+          </w:tcPr>
+          <w:p>
+            <w:pPr>
+              <w:widowControl/>
+              <w:autoSpaceDE/>
+              <w:autoSpaceDN/>
+              <w:spacing w:before="0" w:after="0" w:line="240" w:lineRule="auto"/>
+              <w:rPr>
+                <w:rFonts w:ascii="Calibri" w:eastAsia="Times New Roman" w:hAnsi="Calibri" w:cs="Calibri"/>
+                <w:b/>
+                <w:bCs/>
+                <w:color w:val="000000" w:themeColor="text1"/>
+                <w:sz w:val="24"/>
+                <w:szCs w:val="24"/>
+                <w:lang w:val="es-MX" w:eastAsia="es-MX"/>
+              </w:rPr>
+            </w:pPr>
+            <w:r>
+              <w:rPr>
+                <w:rFonts w:ascii="Calibri" w:eastAsia="Times New Roman" w:hAnsi="Calibri" w:cs="Calibri"/>
+                <w:b/>
+                <w:bCs/>
+                <w:color w:val="000000" w:themeColor="text1"/>
+                <w:sz w:val="24"/>
+                <w:szCs w:val="24"/>
+                <w:lang w:val="es-MX" w:eastAsia="es-MX"/>
+              </w:rPr>
+              <w:t>PACIENTE: {</w:t>
             </w:r>
             <w:proofErr w:type="spellStart"/>
             <w:r>
               <w:rPr>
-                <w:rFonts w:ascii="ADLaM Display" w:eastAsia="Times New Roman" w:hAnsi="ADLaM Display" w:cs="ADLaM Display"/>
-                <w:color w:val="000000"/>
-                <w:lang w:val="es-MX" w:eastAsia="es-MX"/>
-              </w:rPr>
-              <w:t>p_</w:t>
-            </w:r>
-            <w:r>
-              <w:rPr>
-                <w:rFonts w:ascii="ADLaM Display" w:eastAsia="Times New Roman" w:hAnsi="ADLaM Display" w:cs="ADLaM Display"/>
-                <w:color w:val="000000"/>
-                <w:lang w:val="es-MX" w:eastAsia="es-MX"/>
-              </w:rPr>
-              <w:t>nombre_completo</w:t>
+                <w:rFonts w:ascii="Calibri" w:eastAsia="Times New Roman" w:hAnsi="Calibri" w:cs="Calibri"/>
+                <w:b/>
+                <w:bCs/>
+                <w:color w:val="000000" w:themeColor="text1"/>
+                <w:sz w:val="24"/>
+                <w:szCs w:val="24"/>
+                <w:lang w:val="es-MX" w:eastAsia="es-MX"/>
+              </w:rPr>
+              <w:t>p_nombre_completo</w:t>
             </w:r>
             <w:proofErr w:type="spellEnd"/>
             <w:r>
               <w:rPr>
-                <w:rFonts w:ascii="ADLaM Display" w:eastAsia="Times New Roman" w:hAnsi="ADLaM Display" w:cs="ADLaM Display"/>
-                <w:color w:val="000000"/>
+                <w:rFonts w:ascii="Calibri" w:eastAsia="Times New Roman" w:hAnsi="Calibri" w:cs="Calibri"/>
+                <w:b/>
+                <w:bCs/>
+                <w:color w:val="000000" w:themeColor="text1"/>
+                <w:sz w:val="24"/>
+                <w:szCs w:val="24"/>
                 <w:lang w:val="es-MX" w:eastAsia="es-MX"/>
               </w:rPr>
               <w:t>}</w:t>
@@ -609,78 +617,107 @@
         </w:tc>
         <w:tc>
           <w:tcPr>
-            <w:tcW w:w="1773" w:type="dxa"/>
-            <w:tcBorders>
-              <w:top w:val="nil"/>
-              <w:left w:val="nil"/>
-              <w:bottom w:val="nil"/>
-              <w:right w:val="nil"/>
-            </w:tcBorders>
-            <w:noWrap/>
-            <w:vAlign w:val="bottom"/>
-            <w:hideMark/>
-          </w:tcPr>
-          <w:p>
-            <w:pPr>
-              <w:widowControl/>
-              <w:autoSpaceDE/>
-              <w:autoSpaceDN/>
-              <w:rPr>
-                <w:rFonts w:ascii="ADLaM Display" w:eastAsia="Times New Roman" w:hAnsi="ADLaM Display" w:cs="ADLaM Display"/>
-                <w:color w:val="000000"/>
-                <w:lang w:val="es-MX" w:eastAsia="es-MX"/>
-              </w:rPr>
-            </w:pPr>
-          </w:p>
-        </w:tc>
-        <w:tc>
-          <w:tcPr>
-            <w:tcW w:w="2747" w:type="dxa"/>
-            <w:tcBorders>
-              <w:top w:val="nil"/>
-              <w:left w:val="nil"/>
-              <w:bottom w:val="nil"/>
-              <w:right w:val="nil"/>
-            </w:tcBorders>
-            <w:noWrap/>
-            <w:vAlign w:val="bottom"/>
-            <w:hideMark/>
-          </w:tcPr>
-          <w:p>
-            <w:pPr>
-              <w:widowControl/>
-              <w:autoSpaceDE/>
-              <w:autoSpaceDN/>
-              <w:rPr>
-                <w:rFonts w:ascii="ADLaM Display" w:eastAsia="Times New Roman" w:hAnsi="ADLaM Display" w:cs="ADLaM Display"/>
-                <w:color w:val="000000"/>
-                <w:lang w:val="es-MX" w:eastAsia="es-MX"/>
-              </w:rPr>
-            </w:pPr>
-            <w:r>
-              <w:rPr>
-                <w:rFonts w:ascii="ADLaM Display" w:eastAsia="Times New Roman" w:hAnsi="ADLaM Display" w:cs="ADLaM Display"/>
-                <w:color w:val="000000"/>
-                <w:lang w:val="es-MX" w:eastAsia="es-MX"/>
-              </w:rPr>
-              <w:t>EDAD:</w:t>
-            </w:r>
-            <w:r>
-              <w:rPr>
-                <w:rFonts w:ascii="ADLaM Display" w:eastAsia="Times New Roman" w:hAnsi="ADLaM Display" w:cs="ADLaM Display"/>
-                <w:color w:val="000000"/>
-                <w:lang w:val="es-MX" w:eastAsia="es-MX"/>
-              </w:rPr>
-              <w:t xml:space="preserve"> </w:t>
-            </w:r>
-            <w:r>
-              <w:rPr>
-                <w:rFonts w:ascii="ADLaM Display" w:eastAsia="Times New Roman" w:hAnsi="ADLaM Display" w:cs="ADLaM Display"/>
-                <w:color w:val="000000"/>
-                <w:lang w:val="es-MX" w:eastAsia="es-MX"/>
-              </w:rPr>
-              <w:t>{edad}</w:t>
-            </w:r>
+            <w:tcW w:w="160" w:type="dxa"/>
+            <w:tcBorders>
+              <w:top w:val="nil"/>
+              <w:left w:val="nil"/>
+              <w:bottom w:val="nil"/>
+              <w:right w:val="nil"/>
+            </w:tcBorders>
+            <w:noWrap/>
+            <w:vAlign w:val="bottom"/>
+            <w:hideMark/>
+          </w:tcPr>
+          <w:p>
+            <w:pPr>
+              <w:widowControl/>
+              <w:autoSpaceDE/>
+              <w:autoSpaceDN/>
+              <w:spacing w:before="0" w:after="0" w:line="240" w:lineRule="auto"/>
+              <w:rPr>
+                <w:rFonts w:ascii="Calibri" w:eastAsia="Times New Roman" w:hAnsi="Calibri" w:cs="Calibri"/>
+                <w:b/>
+                <w:bCs/>
+                <w:color w:val="000000" w:themeColor="text1"/>
+                <w:sz w:val="24"/>
+                <w:szCs w:val="24"/>
+                <w:lang w:val="es-MX" w:eastAsia="es-MX"/>
+              </w:rPr>
+            </w:pPr>
+          </w:p>
+        </w:tc>
+        <w:tc>
+          <w:tcPr>
+            <w:tcW w:w="3825" w:type="dxa"/>
+            <w:tcBorders>
+              <w:top w:val="nil"/>
+              <w:left w:val="nil"/>
+              <w:bottom w:val="nil"/>
+              <w:right w:val="nil"/>
+            </w:tcBorders>
+            <w:noWrap/>
+            <w:vAlign w:val="bottom"/>
+            <w:hideMark/>
+          </w:tcPr>
+          <w:p>
+            <w:pPr>
+              <w:widowControl/>
+              <w:autoSpaceDE/>
+              <w:autoSpaceDN/>
+              <w:spacing w:before="0" w:after="0" w:line="240" w:lineRule="auto"/>
+              <w:rPr>
+                <w:rFonts w:ascii="Calibri" w:eastAsia="Times New Roman" w:hAnsi="Calibri" w:cs="Calibri"/>
+                <w:b/>
+                <w:bCs/>
+                <w:color w:val="000000" w:themeColor="text1"/>
+                <w:sz w:val="24"/>
+                <w:szCs w:val="24"/>
+                <w:lang w:val="es-MX" w:eastAsia="es-MX"/>
+              </w:rPr>
+            </w:pPr>
+            <w:r>
+              <w:rPr>
+                <w:rFonts w:ascii="Calibri" w:eastAsia="Times New Roman" w:hAnsi="Calibri" w:cs="Calibri"/>
+                <w:b/>
+                <w:bCs/>
+                <w:color w:val="000000" w:themeColor="text1"/>
+                <w:sz w:val="24"/>
+                <w:szCs w:val="24"/>
+                <w:lang w:val="es-MX" w:eastAsia="es-MX"/>
+              </w:rPr>
+              <w:t>EDAD: {edad}</w:t>
+            </w:r>
+          </w:p>
+        </w:tc>
+        <w:tc>
+          <w:tcPr>
+            <w:tcW w:w="242" w:type="dxa"/>
+            <w:tcBorders>
+              <w:top w:val="nil"/>
+              <w:left w:val="nil"/>
+              <w:bottom w:val="nil"/>
+              <w:right w:val="nil"/>
+            </w:tcBorders>
+            <w:noWrap/>
+            <w:vAlign w:val="bottom"/>
+            <w:hideMark/>
+          </w:tcPr>
+          <w:p>
+            <w:pPr>
+              <w:widowControl/>
+              <w:autoSpaceDE/>
+              <w:autoSpaceDN/>
+              <w:spacing w:before="0" w:after="0" w:line="240" w:lineRule="auto"/>
+              <w:rPr>
+                <w:rFonts w:ascii="Calibri" w:eastAsia="Times New Roman" w:hAnsi="Calibri" w:cs="Calibri"/>
+                <w:b/>
+                <w:bCs/>
+                <w:color w:val="000000" w:themeColor="text1"/>
+                <w:sz w:val="24"/>
+                <w:szCs w:val="24"/>
+                <w:lang w:val="es-MX" w:eastAsia="es-MX"/>
+              </w:rPr>
+            </w:pPr>
           </w:p>
         </w:tc>
         <w:tc>
@@ -701,36 +738,14 @@
               <w:widowControl/>
               <w:autoSpaceDE/>
               <w:autoSpaceDN/>
-              <w:rPr>
-                <w:rFonts w:ascii="ADLaM Display" w:eastAsia="Times New Roman" w:hAnsi="ADLaM Display" w:cs="ADLaM Display"/>
-                <w:color w:val="000000"/>
-                <w:lang w:val="es-MX" w:eastAsia="es-MX"/>
-              </w:rPr>
-            </w:pPr>
-          </w:p>
-        </w:tc>
-        <w:tc>
-          <w:tcPr>
-            <w:tcW w:w="1320" w:type="dxa"/>
-            <w:tcBorders>
-              <w:top w:val="nil"/>
-              <w:left w:val="nil"/>
-              <w:bottom w:val="nil"/>
-              <w:right w:val="nil"/>
-            </w:tcBorders>
-            <w:noWrap/>
-            <w:vAlign w:val="bottom"/>
-            <w:hideMark/>
-          </w:tcPr>
-          <w:p>
-            <w:pPr>
-              <w:widowControl/>
-              <w:autoSpaceDE/>
-              <w:autoSpaceDN/>
-              <w:rPr>
-                <w:rFonts w:ascii="Times New Roman" w:eastAsia="Times New Roman" w:hAnsi="Times New Roman" w:cs="Times New Roman"/>
-                <w:sz w:val="20"/>
-                <w:szCs w:val="20"/>
+              <w:spacing w:before="0" w:after="0" w:line="240" w:lineRule="auto"/>
+              <w:rPr>
+                <w:rFonts w:ascii="Calibri" w:eastAsia="Times New Roman" w:hAnsi="Calibri" w:cs="Calibri"/>
+                <w:b/>
+                <w:bCs/>
+                <w:color w:val="000000" w:themeColor="text1"/>
+                <w:sz w:val="24"/>
+                <w:szCs w:val="24"/>
                 <w:lang w:val="es-MX" w:eastAsia="es-MX"/>
               </w:rPr>
             </w:pPr>
@@ -743,7 +758,7 @@
         </w:trPr>
         <w:tc>
           <w:tcPr>
-            <w:tcW w:w="6096" w:type="dxa"/>
+            <w:tcW w:w="6098" w:type="dxa"/>
             <w:gridSpan w:val="2"/>
             <w:tcBorders>
               <w:top w:val="nil"/>
@@ -760,16 +775,25 @@
               <w:widowControl/>
               <w:autoSpaceDE/>
               <w:autoSpaceDN/>
-              <w:rPr>
-                <w:rFonts w:ascii="ADLaM Display" w:eastAsia="Times New Roman" w:hAnsi="ADLaM Display" w:cs="ADLaM Display"/>
-                <w:color w:val="000000"/>
-                <w:lang w:val="es-MX" w:eastAsia="es-MX"/>
-              </w:rPr>
-            </w:pPr>
-            <w:r>
-              <w:rPr>
-                <w:rFonts w:ascii="ADLaM Display" w:eastAsia="Times New Roman" w:hAnsi="ADLaM Display" w:cs="ADLaM Display"/>
-                <w:color w:val="000000"/>
+              <w:spacing w:before="0" w:after="0" w:line="240" w:lineRule="auto"/>
+              <w:rPr>
+                <w:rFonts w:ascii="Calibri" w:eastAsia="Times New Roman" w:hAnsi="Calibri" w:cs="Calibri"/>
+                <w:b/>
+                <w:bCs/>
+                <w:color w:val="000000" w:themeColor="text1"/>
+                <w:sz w:val="24"/>
+                <w:szCs w:val="24"/>
+                <w:lang w:val="es-MX" w:eastAsia="es-MX"/>
+              </w:rPr>
+            </w:pPr>
+            <w:r>
+              <w:rPr>
+                <w:rFonts w:ascii="Calibri" w:eastAsia="Times New Roman" w:hAnsi="Calibri" w:cs="Calibri"/>
+                <w:b/>
+                <w:bCs/>
+                <w:color w:val="000000" w:themeColor="text1"/>
+                <w:sz w:val="24"/>
+                <w:szCs w:val="24"/>
                 <w:lang w:val="es-MX" w:eastAsia="es-MX"/>
               </w:rPr>
               <w:t>MEDICO: A quien Corresponda</w:t>
@@ -778,52 +802,76 @@
         </w:tc>
         <w:tc>
           <w:tcPr>
-            <w:tcW w:w="2747" w:type="dxa"/>
-            <w:tcBorders>
-              <w:top w:val="nil"/>
-              <w:left w:val="nil"/>
-              <w:bottom w:val="nil"/>
-              <w:right w:val="nil"/>
-            </w:tcBorders>
-            <w:noWrap/>
-            <w:vAlign w:val="bottom"/>
-            <w:hideMark/>
-          </w:tcPr>
-          <w:p>
-            <w:pPr>
-              <w:widowControl/>
-              <w:autoSpaceDE/>
-              <w:autoSpaceDN/>
-              <w:rPr>
-                <w:rFonts w:ascii="ADLaM Display" w:eastAsia="Times New Roman" w:hAnsi="ADLaM Display" w:cs="ADLaM Display"/>
-                <w:color w:val="000000"/>
-                <w:lang w:val="es-MX" w:eastAsia="es-MX"/>
-              </w:rPr>
-            </w:pPr>
-            <w:r>
-              <w:rPr>
-                <w:rFonts w:ascii="ADLaM Display" w:eastAsia="Times New Roman" w:hAnsi="ADLaM Display" w:cs="ADLaM Display"/>
-                <w:color w:val="000000"/>
-                <w:lang w:val="es-MX" w:eastAsia="es-MX"/>
-              </w:rPr>
-              <w:t>SEXO:</w:t>
-            </w:r>
-            <w:r>
-              <w:rPr>
-                <w:rFonts w:ascii="ADLaM Display" w:eastAsia="Times New Roman" w:hAnsi="ADLaM Display" w:cs="ADLaM Display"/>
-                <w:color w:val="000000"/>
-                <w:lang w:val="es-MX" w:eastAsia="es-MX"/>
-              </w:rPr>
-              <w:t xml:space="preserve"> </w:t>
-            </w:r>
-            <w:r>
-              <w:rPr>
-                <w:rFonts w:ascii="ADLaM Display" w:eastAsia="Times New Roman" w:hAnsi="ADLaM Display" w:cs="ADLaM Display"/>
-                <w:color w:val="000000"/>
-                <w:lang w:val="es-MX" w:eastAsia="es-MX"/>
-              </w:rPr>
-              <w:t>{sexo}</w:t>
-            </w:r>
+            <w:tcW w:w="3825" w:type="dxa"/>
+            <w:tcBorders>
+              <w:top w:val="nil"/>
+              <w:left w:val="nil"/>
+              <w:bottom w:val="nil"/>
+              <w:right w:val="nil"/>
+            </w:tcBorders>
+            <w:noWrap/>
+            <w:vAlign w:val="bottom"/>
+            <w:hideMark/>
+          </w:tcPr>
+          <w:p>
+            <w:pPr>
+              <w:widowControl/>
+              <w:autoSpaceDE/>
+              <w:autoSpaceDN/>
+              <w:spacing w:before="0" w:after="0" w:line="240" w:lineRule="auto"/>
+              <w:rPr>
+                <w:rFonts w:ascii="Calibri" w:eastAsia="Times New Roman" w:hAnsi="Calibri" w:cs="Calibri"/>
+                <w:b/>
+                <w:bCs/>
+                <w:color w:val="000000" w:themeColor="text1"/>
+                <w:sz w:val="24"/>
+                <w:szCs w:val="24"/>
+                <w:lang w:val="es-MX" w:eastAsia="es-MX"/>
+              </w:rPr>
+            </w:pPr>
+            <w:r>
+              <w:rPr>
+                <w:rFonts w:ascii="Calibri" w:eastAsia="Times New Roman" w:hAnsi="Calibri" w:cs="Calibri"/>
+                <w:b/>
+                <w:bCs/>
+                <w:color w:val="000000" w:themeColor="text1"/>
+                <w:sz w:val="24"/>
+                <w:szCs w:val="24"/>
+                <w:lang w:val="es-MX" w:eastAsia="es-MX"/>
+              </w:rPr>
+              <w:t>SEXO: {sexo}</w:t>
+            </w:r>
+          </w:p>
+        </w:tc>
+        <w:tc>
+          <w:tcPr>
+            <w:tcW w:w="242" w:type="dxa"/>
+            <w:tcBorders>
+              <w:top w:val="nil"/>
+              <w:left w:val="nil"/>
+              <w:bottom w:val="nil"/>
+              <w:right w:val="nil"/>
+            </w:tcBorders>
+            <w:noWrap/>
+            <w:vAlign w:val="bottom"/>
+            <w:hideMark/>
+          </w:tcPr>
+          <w:p>
+            <w:pPr>
+              <w:widowControl/>
+              <w:autoSpaceDE/>
+              <w:autoSpaceDN/>
+              <w:spacing w:before="0" w:after="0" w:line="240" w:lineRule="auto"/>
+              <w:rPr>
+                <w:rFonts w:ascii="Calibri" w:eastAsia="Times New Roman" w:hAnsi="Calibri" w:cs="Calibri"/>
+                <w:b/>
+                <w:bCs/>
+                <w:color w:val="000000" w:themeColor="text1"/>
+                <w:sz w:val="24"/>
+                <w:szCs w:val="24"/>
+                <w:lang w:val="es-MX" w:eastAsia="es-MX"/>
+              </w:rPr>
+            </w:pPr>
           </w:p>
         </w:tc>
         <w:tc>
@@ -844,36 +892,14 @@
               <w:widowControl/>
               <w:autoSpaceDE/>
               <w:autoSpaceDN/>
-              <w:rPr>
-                <w:rFonts w:ascii="ADLaM Display" w:eastAsia="Times New Roman" w:hAnsi="ADLaM Display" w:cs="ADLaM Display"/>
-                <w:color w:val="000000"/>
-                <w:lang w:val="es-MX" w:eastAsia="es-MX"/>
-              </w:rPr>
-            </w:pPr>
-          </w:p>
-        </w:tc>
-        <w:tc>
-          <w:tcPr>
-            <w:tcW w:w="1320" w:type="dxa"/>
-            <w:tcBorders>
-              <w:top w:val="nil"/>
-              <w:left w:val="nil"/>
-              <w:bottom w:val="nil"/>
-              <w:right w:val="nil"/>
-            </w:tcBorders>
-            <w:noWrap/>
-            <w:vAlign w:val="bottom"/>
-            <w:hideMark/>
-          </w:tcPr>
-          <w:p>
-            <w:pPr>
-              <w:widowControl/>
-              <w:autoSpaceDE/>
-              <w:autoSpaceDN/>
-              <w:rPr>
-                <w:rFonts w:ascii="Times New Roman" w:eastAsia="Times New Roman" w:hAnsi="Times New Roman" w:cs="Times New Roman"/>
-                <w:sz w:val="20"/>
-                <w:szCs w:val="20"/>
+              <w:spacing w:before="0" w:after="0" w:line="240" w:lineRule="auto"/>
+              <w:rPr>
+                <w:rFonts w:ascii="Calibri" w:eastAsia="Times New Roman" w:hAnsi="Calibri" w:cs="Calibri"/>
+                <w:b/>
+                <w:bCs/>
+                <w:color w:val="000000" w:themeColor="text1"/>
+                <w:sz w:val="24"/>
+                <w:szCs w:val="24"/>
                 <w:lang w:val="es-MX" w:eastAsia="es-MX"/>
               </w:rPr>
             </w:pPr>
@@ -886,57 +912,54 @@
         </w:trPr>
         <w:tc>
           <w:tcPr>
-            <w:tcW w:w="4323" w:type="dxa"/>
-            <w:tcBorders>
-              <w:top w:val="nil"/>
-              <w:left w:val="nil"/>
-              <w:bottom w:val="nil"/>
-              <w:right w:val="nil"/>
-            </w:tcBorders>
-            <w:noWrap/>
-            <w:vAlign w:val="bottom"/>
-            <w:hideMark/>
-          </w:tcPr>
-          <w:p>
-            <w:pPr>
-              <w:widowControl/>
-              <w:autoSpaceDE/>
-              <w:autoSpaceDN/>
-              <w:rPr>
-                <w:rFonts w:ascii="ADLaM Display" w:eastAsia="Times New Roman" w:hAnsi="ADLaM Display" w:cs="ADLaM Display"/>
-                <w:color w:val="000000"/>
-                <w:lang w:val="es-MX" w:eastAsia="es-MX"/>
-              </w:rPr>
-            </w:pPr>
-            <w:r>
-              <w:rPr>
-                <w:rFonts w:ascii="ADLaM Display" w:eastAsia="Times New Roman" w:hAnsi="ADLaM Display" w:cs="ADLaM Display"/>
-                <w:color w:val="000000"/>
-                <w:lang w:val="es-MX" w:eastAsia="es-MX"/>
-              </w:rPr>
-              <w:t>FECHA:</w:t>
-            </w:r>
-            <w:r>
-              <w:rPr>
-                <w:rFonts w:ascii="ADLaM Display" w:eastAsia="Times New Roman" w:hAnsi="ADLaM Display" w:cs="ADLaM Display"/>
-                <w:color w:val="000000"/>
-                <w:lang w:val="es-MX" w:eastAsia="es-MX"/>
-              </w:rPr>
-              <w:t xml:space="preserve"> </w:t>
-            </w:r>
-            <w:r>
-              <w:rPr>
-                <w:rFonts w:ascii="ADLaM Display" w:eastAsia="Times New Roman" w:hAnsi="ADLaM Display" w:cs="ADLaM Display"/>
-                <w:color w:val="000000"/>
-                <w:lang w:val="es-MX" w:eastAsia="es-MX"/>
-              </w:rPr>
-              <w:t>{</w:t>
+            <w:tcW w:w="5938" w:type="dxa"/>
+            <w:tcBorders>
+              <w:top w:val="nil"/>
+              <w:left w:val="nil"/>
+              <w:bottom w:val="nil"/>
+              <w:right w:val="nil"/>
+            </w:tcBorders>
+            <w:noWrap/>
+            <w:vAlign w:val="bottom"/>
+            <w:hideMark/>
+          </w:tcPr>
+          <w:p>
+            <w:pPr>
+              <w:widowControl/>
+              <w:autoSpaceDE/>
+              <w:autoSpaceDN/>
+              <w:spacing w:before="0" w:after="0" w:line="240" w:lineRule="auto"/>
+              <w:rPr>
+                <w:rFonts w:ascii="Calibri" w:eastAsia="Times New Roman" w:hAnsi="Calibri" w:cs="Calibri"/>
+                <w:b/>
+                <w:bCs/>
+                <w:color w:val="000000" w:themeColor="text1"/>
+                <w:sz w:val="24"/>
+                <w:szCs w:val="24"/>
+                <w:lang w:val="es-MX" w:eastAsia="es-MX"/>
+              </w:rPr>
+            </w:pPr>
+            <w:r>
+              <w:rPr>
+                <w:rFonts w:ascii="Calibri" w:eastAsia="Times New Roman" w:hAnsi="Calibri" w:cs="Calibri"/>
+                <w:b/>
+                <w:bCs/>
+                <w:color w:val="000000" w:themeColor="text1"/>
+                <w:sz w:val="24"/>
+                <w:szCs w:val="24"/>
+                <w:lang w:val="es-MX" w:eastAsia="es-MX"/>
+              </w:rPr>
+              <w:t>FECHA: {</w:t>
             </w:r>
             <w:proofErr w:type="spellStart"/>
             <w:r>
               <w:rPr>
-                <w:rFonts w:ascii="ADLaM Display" w:eastAsia="Times New Roman" w:hAnsi="ADLaM Display" w:cs="ADLaM Display"/>
-                <w:color w:val="000000"/>
+                <w:rFonts w:ascii="Calibri" w:eastAsia="Times New Roman" w:hAnsi="Calibri" w:cs="Calibri"/>
+                <w:b/>
+                <w:bCs/>
+                <w:color w:val="000000" w:themeColor="text1"/>
+                <w:sz w:val="24"/>
+                <w:szCs w:val="24"/>
                 <w:lang w:val="es-MX" w:eastAsia="es-MX"/>
               </w:rPr>
               <w:t>fecha_estudio</w:t>
@@ -944,8 +967,12 @@
             <w:proofErr w:type="spellEnd"/>
             <w:r>
               <w:rPr>
-                <w:rFonts w:ascii="ADLaM Display" w:eastAsia="Times New Roman" w:hAnsi="ADLaM Display" w:cs="ADLaM Display"/>
-                <w:color w:val="000000"/>
+                <w:rFonts w:ascii="Calibri" w:eastAsia="Times New Roman" w:hAnsi="Calibri" w:cs="Calibri"/>
+                <w:b/>
+                <w:bCs/>
+                <w:color w:val="000000" w:themeColor="text1"/>
+                <w:sz w:val="24"/>
+                <w:szCs w:val="24"/>
                 <w:lang w:val="es-MX" w:eastAsia="es-MX"/>
               </w:rPr>
               <w:t>}</w:t>
@@ -954,78 +981,107 @@
         </w:tc>
         <w:tc>
           <w:tcPr>
-            <w:tcW w:w="1773" w:type="dxa"/>
-            <w:tcBorders>
-              <w:top w:val="nil"/>
-              <w:left w:val="nil"/>
-              <w:bottom w:val="nil"/>
-              <w:right w:val="nil"/>
-            </w:tcBorders>
-            <w:noWrap/>
-            <w:vAlign w:val="bottom"/>
-            <w:hideMark/>
-          </w:tcPr>
-          <w:p>
-            <w:pPr>
-              <w:widowControl/>
-              <w:autoSpaceDE/>
-              <w:autoSpaceDN/>
-              <w:rPr>
-                <w:rFonts w:ascii="ADLaM Display" w:eastAsia="Times New Roman" w:hAnsi="ADLaM Display" w:cs="ADLaM Display"/>
-                <w:color w:val="000000"/>
-                <w:lang w:val="es-MX" w:eastAsia="es-MX"/>
-              </w:rPr>
-            </w:pPr>
-          </w:p>
-        </w:tc>
-        <w:tc>
-          <w:tcPr>
-            <w:tcW w:w="2747" w:type="dxa"/>
-            <w:tcBorders>
-              <w:top w:val="nil"/>
-              <w:left w:val="nil"/>
-              <w:bottom w:val="nil"/>
-              <w:right w:val="nil"/>
-            </w:tcBorders>
-            <w:noWrap/>
-            <w:vAlign w:val="bottom"/>
-            <w:hideMark/>
-          </w:tcPr>
-          <w:p>
-            <w:pPr>
-              <w:widowControl/>
-              <w:autoSpaceDE/>
-              <w:autoSpaceDN/>
-              <w:rPr>
-                <w:rFonts w:ascii="ADLaM Display" w:eastAsia="Times New Roman" w:hAnsi="ADLaM Display" w:cs="ADLaM Display"/>
-                <w:color w:val="000000"/>
-                <w:lang w:val="es-MX" w:eastAsia="es-MX"/>
-              </w:rPr>
-            </w:pPr>
-            <w:r>
-              <w:rPr>
-                <w:rFonts w:ascii="ADLaM Display" w:eastAsia="Times New Roman" w:hAnsi="ADLaM Display" w:cs="ADLaM Display"/>
-                <w:color w:val="000000"/>
-                <w:lang w:val="es-MX" w:eastAsia="es-MX"/>
-              </w:rPr>
-              <w:t>FOLIO:</w:t>
-            </w:r>
-            <w:r>
-              <w:rPr>
-                <w:rFonts w:ascii="ADLaM Display" w:eastAsia="Times New Roman" w:hAnsi="ADLaM Display" w:cs="ADLaM Display"/>
-                <w:color w:val="000000"/>
-                <w:lang w:val="es-MX" w:eastAsia="es-MX"/>
-              </w:rPr>
-              <w:t xml:space="preserve"> </w:t>
-            </w:r>
-            <w:r>
-              <w:rPr>
-                <w:rFonts w:ascii="ADLaM Display" w:eastAsia="Times New Roman" w:hAnsi="ADLaM Display" w:cs="ADLaM Display"/>
-                <w:color w:val="000000"/>
-                <w:lang w:val="es-MX" w:eastAsia="es-MX"/>
-              </w:rPr>
-              <w:t>{folio}</w:t>
-            </w:r>
+            <w:tcW w:w="160" w:type="dxa"/>
+            <w:tcBorders>
+              <w:top w:val="nil"/>
+              <w:left w:val="nil"/>
+              <w:bottom w:val="nil"/>
+              <w:right w:val="nil"/>
+            </w:tcBorders>
+            <w:noWrap/>
+            <w:vAlign w:val="bottom"/>
+            <w:hideMark/>
+          </w:tcPr>
+          <w:p>
+            <w:pPr>
+              <w:widowControl/>
+              <w:autoSpaceDE/>
+              <w:autoSpaceDN/>
+              <w:spacing w:before="0" w:after="0" w:line="240" w:lineRule="auto"/>
+              <w:rPr>
+                <w:rFonts w:ascii="Calibri" w:eastAsia="Times New Roman" w:hAnsi="Calibri" w:cs="Calibri"/>
+                <w:b/>
+                <w:bCs/>
+                <w:color w:val="000000" w:themeColor="text1"/>
+                <w:sz w:val="24"/>
+                <w:szCs w:val="24"/>
+                <w:lang w:val="es-MX" w:eastAsia="es-MX"/>
+              </w:rPr>
+            </w:pPr>
+          </w:p>
+        </w:tc>
+        <w:tc>
+          <w:tcPr>
+            <w:tcW w:w="3825" w:type="dxa"/>
+            <w:tcBorders>
+              <w:top w:val="nil"/>
+              <w:left w:val="nil"/>
+              <w:bottom w:val="nil"/>
+              <w:right w:val="nil"/>
+            </w:tcBorders>
+            <w:noWrap/>
+            <w:vAlign w:val="bottom"/>
+            <w:hideMark/>
+          </w:tcPr>
+          <w:p>
+            <w:pPr>
+              <w:widowControl/>
+              <w:autoSpaceDE/>
+              <w:autoSpaceDN/>
+              <w:spacing w:before="0" w:after="0" w:line="240" w:lineRule="auto"/>
+              <w:rPr>
+                <w:rFonts w:ascii="Calibri" w:eastAsia="Times New Roman" w:hAnsi="Calibri" w:cs="Calibri"/>
+                <w:b/>
+                <w:bCs/>
+                <w:color w:val="000000" w:themeColor="text1"/>
+                <w:sz w:val="24"/>
+                <w:szCs w:val="24"/>
+                <w:lang w:val="es-MX" w:eastAsia="es-MX"/>
+              </w:rPr>
+            </w:pPr>
+            <w:r>
+              <w:rPr>
+                <w:rFonts w:ascii="Calibri" w:eastAsia="Times New Roman" w:hAnsi="Calibri" w:cs="Calibri"/>
+                <w:b/>
+                <w:bCs/>
+                <w:color w:val="000000" w:themeColor="text1"/>
+                <w:sz w:val="24"/>
+                <w:szCs w:val="24"/>
+                <w:lang w:val="es-MX" w:eastAsia="es-MX"/>
+              </w:rPr>
+              <w:t>FOLIO: {folio}</w:t>
+            </w:r>
+          </w:p>
+        </w:tc>
+        <w:tc>
+          <w:tcPr>
+            <w:tcW w:w="242" w:type="dxa"/>
+            <w:tcBorders>
+              <w:top w:val="nil"/>
+              <w:left w:val="nil"/>
+              <w:bottom w:val="nil"/>
+              <w:right w:val="nil"/>
+            </w:tcBorders>
+            <w:noWrap/>
+            <w:vAlign w:val="bottom"/>
+            <w:hideMark/>
+          </w:tcPr>
+          <w:p>
+            <w:pPr>
+              <w:widowControl/>
+              <w:autoSpaceDE/>
+              <w:autoSpaceDN/>
+              <w:spacing w:before="0" w:after="0" w:line="240" w:lineRule="auto"/>
+              <w:rPr>
+                <w:rFonts w:ascii="Calibri" w:eastAsia="Times New Roman" w:hAnsi="Calibri" w:cs="Calibri"/>
+                <w:b/>
+                <w:bCs/>
+                <w:color w:val="000000" w:themeColor="text1"/>
+                <w:sz w:val="24"/>
+                <w:szCs w:val="24"/>
+                <w:lang w:val="es-MX" w:eastAsia="es-MX"/>
+              </w:rPr>
+            </w:pPr>
           </w:p>
         </w:tc>
         <w:tc>
@@ -1046,36 +1102,14 @@
               <w:widowControl/>
               <w:autoSpaceDE/>
               <w:autoSpaceDN/>
-              <w:rPr>
-                <w:rFonts w:ascii="ADLaM Display" w:eastAsia="Times New Roman" w:hAnsi="ADLaM Display" w:cs="ADLaM Display"/>
-                <w:color w:val="000000"/>
-                <w:lang w:val="es-MX" w:eastAsia="es-MX"/>
-              </w:rPr>
-            </w:pPr>
-          </w:p>
-        </w:tc>
-        <w:tc>
-          <w:tcPr>
-            <w:tcW w:w="1320" w:type="dxa"/>
-            <w:tcBorders>
-              <w:top w:val="nil"/>
-              <w:left w:val="nil"/>
-              <w:bottom w:val="nil"/>
-              <w:right w:val="nil"/>
-            </w:tcBorders>
-            <w:noWrap/>
-            <w:vAlign w:val="bottom"/>
-            <w:hideMark/>
-          </w:tcPr>
-          <w:p>
-            <w:pPr>
-              <w:widowControl/>
-              <w:autoSpaceDE/>
-              <w:autoSpaceDN/>
-              <w:rPr>
-                <w:rFonts w:ascii="Times New Roman" w:eastAsia="Times New Roman" w:hAnsi="Times New Roman" w:cs="Times New Roman"/>
-                <w:sz w:val="20"/>
-                <w:szCs w:val="20"/>
+              <w:spacing w:before="0" w:after="0" w:line="240" w:lineRule="auto"/>
+              <w:rPr>
+                <w:rFonts w:ascii="Calibri" w:eastAsia="Times New Roman" w:hAnsi="Calibri" w:cs="Calibri"/>
+                <w:b/>
+                <w:bCs/>
+                <w:color w:val="000000" w:themeColor="text1"/>
+                <w:sz w:val="24"/>
+                <w:szCs w:val="24"/>
                 <w:lang w:val="es-MX" w:eastAsia="es-MX"/>
               </w:rPr>
             </w:pPr>
@@ -1083,9 +1117,45 @@
         </w:tc>
       </w:tr>
     </w:tbl>
-    <w:p/>
-    <w:p/>
-    <w:p/>
+    <w:p>
+      <w:pPr>
+        <w:spacing w:before="0" w:after="0" w:line="240" w:lineRule="auto"/>
+        <w:rPr>
+          <w:rFonts w:ascii="Calibri" w:hAnsi="Calibri" w:cs="Calibri"/>
+          <w:b/>
+          <w:bCs/>
+          <w:color w:val="000000" w:themeColor="text1"/>
+          <w:sz w:val="24"/>
+          <w:szCs w:val="24"/>
+        </w:rPr>
+      </w:pPr>
+    </w:p>
+    <w:p>
+      <w:pPr>
+        <w:spacing w:before="0" w:after="0" w:line="240" w:lineRule="auto"/>
+        <w:rPr>
+          <w:rFonts w:ascii="Calibri" w:hAnsi="Calibri" w:cs="Calibri"/>
+          <w:b/>
+          <w:bCs/>
+          <w:color w:val="000000" w:themeColor="text1"/>
+          <w:sz w:val="24"/>
+          <w:szCs w:val="24"/>
+        </w:rPr>
+      </w:pPr>
+    </w:p>
+    <w:p>
+      <w:pPr>
+        <w:spacing w:before="0" w:after="0" w:line="240" w:lineRule="auto"/>
+        <w:rPr>
+          <w:rFonts w:ascii="Calibri" w:hAnsi="Calibri" w:cs="Calibri"/>
+          <w:b/>
+          <w:bCs/>
+          <w:color w:val="000000" w:themeColor="text1"/>
+          <w:sz w:val="24"/>
+          <w:szCs w:val="24"/>
+        </w:rPr>
+      </w:pPr>
+    </w:p>
     <w:tbl>
       <w:tblPr>
         <w:tblpPr w:leftFromText="141" w:rightFromText="141" w:vertAnchor="text" w:horzAnchor="page" w:tblpX="85" w:tblpY="-78"/>
@@ -1103,7 +1173,7 @@
       </w:tblGrid>
       <w:tr>
         <w:trPr>
-          <w:trHeight w:val="330"/>
+          <w:trHeight w:val="193" w:hRule="atLeast"/>
         </w:trPr>
         <w:tc>
           <w:tcPr>
@@ -1124,17 +1194,26 @@
               <w:widowControl/>
               <w:autoSpaceDE/>
               <w:autoSpaceDN/>
+              <w:spacing w:before="0" w:after="0" w:line="240" w:lineRule="auto"/>
               <w:jc w:val="center"/>
               <w:rPr>
-                <w:rFonts w:ascii="ADLaM Display" w:eastAsia="Times New Roman" w:hAnsi="ADLaM Display" w:cs="ADLaM Display"/>
-                <w:color w:val="000000"/>
-                <w:lang w:val="es-MX" w:eastAsia="es-MX"/>
-              </w:rPr>
-            </w:pPr>
-            <w:r>
-              <w:rPr>
-                <w:rFonts w:ascii="ADLaM Display" w:eastAsia="Times New Roman" w:hAnsi="ADLaM Display" w:cs="ADLaM Display"/>
-                <w:color w:val="000000"/>
+                <w:rFonts w:ascii="Calibri" w:eastAsia="Times New Roman" w:hAnsi="Calibri" w:cs="Calibri"/>
+                <w:b/>
+                <w:bCs/>
+                <w:color w:val="000000" w:themeColor="text1"/>
+                <w:sz w:val="24"/>
+                <w:szCs w:val="24"/>
+                <w:lang w:val="es-MX" w:eastAsia="es-MX"/>
+              </w:rPr>
+            </w:pPr>
+            <w:r>
+              <w:rPr>
+                <w:rFonts w:ascii="Calibri" w:eastAsia="Times New Roman" w:hAnsi="Calibri" w:cs="Calibri"/>
+                <w:b/>
+                <w:bCs/>
+                <w:color w:val="000000" w:themeColor="text1"/>
+                <w:sz w:val="24"/>
+                <w:szCs w:val="24"/>
                 <w:lang w:val="es-MX" w:eastAsia="es-MX"/>
               </w:rPr>
               <w:t>EXAMEN GENERAL DE ORINA</w:t>
@@ -1144,7 +1223,7 @@
       </w:tr>
       <w:tr>
         <w:trPr>
-          <w:trHeight w:val="87"/>
+          <w:trHeight w:val="193" w:hRule="atLeast"/>
         </w:trPr>
         <w:tc>
           <w:tcPr>
@@ -1164,10 +1243,15 @@
               <w:widowControl/>
               <w:autoSpaceDE/>
               <w:autoSpaceDN/>
+              <w:spacing w:before="0" w:after="0" w:line="240" w:lineRule="auto"/>
               <w:jc w:val="center"/>
               <w:rPr>
-                <w:rFonts w:ascii="ADLaM Display" w:eastAsia="Times New Roman" w:hAnsi="ADLaM Display" w:cs="ADLaM Display"/>
-                <w:color w:val="000000"/>
+                <w:rFonts w:ascii="Calibri" w:eastAsia="Times New Roman" w:hAnsi="Calibri" w:cs="Calibri"/>
+                <w:b/>
+                <w:bCs/>
+                <w:color w:val="000000" w:themeColor="text1"/>
+                <w:sz w:val="24"/>
+                <w:szCs w:val="24"/>
                 <w:lang w:val="es-MX" w:eastAsia="es-MX"/>
               </w:rPr>
             </w:pPr>
@@ -1191,10 +1275,14 @@
               <w:widowControl/>
               <w:autoSpaceDE/>
               <w:autoSpaceDN/>
-              <w:rPr>
-                <w:rFonts w:ascii="Times New Roman" w:eastAsia="Times New Roman" w:hAnsi="Times New Roman" w:cs="Times New Roman"/>
-                <w:sz w:val="20"/>
-                <w:szCs w:val="20"/>
+              <w:spacing w:before="0" w:after="0" w:line="240" w:lineRule="auto"/>
+              <w:rPr>
+                <w:rFonts w:ascii="Calibri" w:eastAsia="Times New Roman" w:hAnsi="Calibri" w:cs="Calibri"/>
+                <w:b/>
+                <w:bCs/>
+                <w:color w:val="000000" w:themeColor="text1"/>
+                <w:sz w:val="24"/>
+                <w:szCs w:val="24"/>
                 <w:lang w:val="es-MX" w:eastAsia="es-MX"/>
               </w:rPr>
             </w:pPr>
@@ -1218,10 +1306,14 @@
               <w:widowControl/>
               <w:autoSpaceDE/>
               <w:autoSpaceDN/>
-              <w:rPr>
-                <w:rFonts w:ascii="Times New Roman" w:eastAsia="Times New Roman" w:hAnsi="Times New Roman" w:cs="Times New Roman"/>
-                <w:sz w:val="20"/>
-                <w:szCs w:val="20"/>
+              <w:spacing w:before="0" w:after="0" w:line="240" w:lineRule="auto"/>
+              <w:rPr>
+                <w:rFonts w:ascii="Calibri" w:eastAsia="Times New Roman" w:hAnsi="Calibri" w:cs="Calibri"/>
+                <w:b/>
+                <w:bCs/>
+                <w:color w:val="000000" w:themeColor="text1"/>
+                <w:sz w:val="24"/>
+                <w:szCs w:val="24"/>
                 <w:lang w:val="es-MX" w:eastAsia="es-MX"/>
               </w:rPr>
             </w:pPr>
@@ -1230,7 +1322,7 @@
       </w:tr>
       <w:tr>
         <w:trPr>
-          <w:trHeight w:val="87"/>
+          <w:trHeight w:val="193" w:hRule="atLeast"/>
         </w:trPr>
         <w:tc>
           <w:tcPr>
@@ -1250,10 +1342,14 @@
               <w:widowControl/>
               <w:autoSpaceDE/>
               <w:autoSpaceDN/>
-              <w:rPr>
-                <w:rFonts w:ascii="Times New Roman" w:eastAsia="Times New Roman" w:hAnsi="Times New Roman" w:cs="Times New Roman"/>
-                <w:sz w:val="20"/>
-                <w:szCs w:val="20"/>
+              <w:spacing w:before="0" w:after="0" w:line="240" w:lineRule="auto"/>
+              <w:rPr>
+                <w:rFonts w:ascii="Calibri" w:eastAsia="Times New Roman" w:hAnsi="Calibri" w:cs="Calibri"/>
+                <w:b/>
+                <w:bCs/>
+                <w:color w:val="000000" w:themeColor="text1"/>
+                <w:sz w:val="24"/>
+                <w:szCs w:val="24"/>
                 <w:lang w:val="es-MX" w:eastAsia="es-MX"/>
               </w:rPr>
             </w:pPr>
@@ -1277,10 +1373,14 @@
               <w:widowControl/>
               <w:autoSpaceDE/>
               <w:autoSpaceDN/>
-              <w:rPr>
-                <w:rFonts w:ascii="Times New Roman" w:eastAsia="Times New Roman" w:hAnsi="Times New Roman" w:cs="Times New Roman"/>
-                <w:sz w:val="20"/>
-                <w:szCs w:val="20"/>
+              <w:spacing w:before="0" w:after="0" w:line="240" w:lineRule="auto"/>
+              <w:rPr>
+                <w:rFonts w:ascii="Calibri" w:eastAsia="Times New Roman" w:hAnsi="Calibri" w:cs="Calibri"/>
+                <w:b/>
+                <w:bCs/>
+                <w:color w:val="000000" w:themeColor="text1"/>
+                <w:sz w:val="24"/>
+                <w:szCs w:val="24"/>
                 <w:lang w:val="es-MX" w:eastAsia="es-MX"/>
               </w:rPr>
             </w:pPr>
@@ -1304,10 +1404,14 @@
               <w:widowControl/>
               <w:autoSpaceDE/>
               <w:autoSpaceDN/>
-              <w:rPr>
-                <w:rFonts w:ascii="Times New Roman" w:eastAsia="Times New Roman" w:hAnsi="Times New Roman" w:cs="Times New Roman"/>
-                <w:sz w:val="20"/>
-                <w:szCs w:val="20"/>
+              <w:spacing w:before="0" w:after="0" w:line="240" w:lineRule="auto"/>
+              <w:rPr>
+                <w:rFonts w:ascii="Calibri" w:eastAsia="Times New Roman" w:hAnsi="Calibri" w:cs="Calibri"/>
+                <w:b/>
+                <w:bCs/>
+                <w:color w:val="000000" w:themeColor="text1"/>
+                <w:sz w:val="24"/>
+                <w:szCs w:val="24"/>
                 <w:lang w:val="es-MX" w:eastAsia="es-MX"/>
               </w:rPr>
             </w:pPr>
@@ -1316,7 +1420,7 @@
       </w:tr>
       <w:tr>
         <w:trPr>
-          <w:trHeight w:val="330"/>
+          <w:trHeight w:val="193" w:hRule="atLeast"/>
         </w:trPr>
         <w:tc>
           <w:tcPr>
@@ -1336,17 +1440,26 @@
               <w:widowControl/>
               <w:autoSpaceDE/>
               <w:autoSpaceDN/>
-              <w:rPr>
-                <w:rFonts w:ascii="ADLaM Display" w:eastAsia="Times New Roman" w:hAnsi="ADLaM Display" w:cs="ADLaM Display"/>
-                <w:color w:val="000000"/>
+              <w:spacing w:before="0" w:after="0" w:line="240" w:lineRule="auto"/>
+              <w:rPr>
+                <w:rFonts w:ascii="Calibri" w:eastAsia="Times New Roman" w:hAnsi="Calibri" w:cs="Calibri"/>
+                <w:b/>
+                <w:bCs/>
+                <w:color w:val="000000" w:themeColor="text1"/>
+                <w:sz w:val="24"/>
+                <w:szCs w:val="24"/>
                 <w:u w:val="single"/>
                 <w:lang w:val="es-MX" w:eastAsia="es-MX"/>
               </w:rPr>
             </w:pPr>
             <w:r>
               <w:rPr>
-                <w:rFonts w:ascii="ADLaM Display" w:eastAsia="Times New Roman" w:hAnsi="ADLaM Display" w:cs="ADLaM Display"/>
-                <w:color w:val="000000"/>
+                <w:rFonts w:ascii="Calibri" w:eastAsia="Times New Roman" w:hAnsi="Calibri" w:cs="Calibri"/>
+                <w:b/>
+                <w:bCs/>
+                <w:color w:val="000000" w:themeColor="text1"/>
+                <w:sz w:val="24"/>
+                <w:szCs w:val="24"/>
                 <w:u w:val="single"/>
                 <w:lang w:val="es-MX" w:eastAsia="es-MX"/>
               </w:rPr>
@@ -1372,17 +1485,26 @@
               <w:widowControl/>
               <w:autoSpaceDE/>
               <w:autoSpaceDN/>
-              <w:rPr>
-                <w:rFonts w:ascii="ADLaM Display" w:eastAsia="Times New Roman" w:hAnsi="ADLaM Display" w:cs="ADLaM Display"/>
-                <w:color w:val="000000"/>
+              <w:spacing w:before="0" w:after="0" w:line="240" w:lineRule="auto"/>
+              <w:rPr>
+                <w:rFonts w:ascii="Calibri" w:eastAsia="Times New Roman" w:hAnsi="Calibri" w:cs="Calibri"/>
+                <w:b/>
+                <w:bCs/>
+                <w:color w:val="000000" w:themeColor="text1"/>
+                <w:sz w:val="24"/>
+                <w:szCs w:val="24"/>
                 <w:u w:val="single"/>
                 <w:lang w:val="es-MX" w:eastAsia="es-MX"/>
               </w:rPr>
             </w:pPr>
             <w:r>
               <w:rPr>
-                <w:rFonts w:ascii="ADLaM Display" w:eastAsia="Times New Roman" w:hAnsi="ADLaM Display" w:cs="ADLaM Display"/>
-                <w:color w:val="000000"/>
+                <w:rFonts w:ascii="Calibri" w:eastAsia="Times New Roman" w:hAnsi="Calibri" w:cs="Calibri"/>
+                <w:b/>
+                <w:bCs/>
+                <w:color w:val="000000" w:themeColor="text1"/>
+                <w:sz w:val="24"/>
+                <w:szCs w:val="24"/>
                 <w:u w:val="single"/>
                 <w:lang w:val="es-MX" w:eastAsia="es-MX"/>
               </w:rPr>
@@ -1408,17 +1530,26 @@
               <w:widowControl/>
               <w:autoSpaceDE/>
               <w:autoSpaceDN/>
-              <w:rPr>
-                <w:rFonts w:ascii="ADLaM Display" w:eastAsia="Times New Roman" w:hAnsi="ADLaM Display" w:cs="ADLaM Display"/>
-                <w:color w:val="000000"/>
+              <w:spacing w:before="0" w:after="0" w:line="240" w:lineRule="auto"/>
+              <w:rPr>
+                <w:rFonts w:ascii="Calibri" w:eastAsia="Times New Roman" w:hAnsi="Calibri" w:cs="Calibri"/>
+                <w:b/>
+                <w:bCs/>
+                <w:color w:val="000000" w:themeColor="text1"/>
+                <w:sz w:val="24"/>
+                <w:szCs w:val="24"/>
                 <w:u w:val="single"/>
                 <w:lang w:val="es-MX" w:eastAsia="es-MX"/>
               </w:rPr>
             </w:pPr>
             <w:r>
               <w:rPr>
-                <w:rFonts w:ascii="ADLaM Display" w:eastAsia="Times New Roman" w:hAnsi="ADLaM Display" w:cs="ADLaM Display"/>
-                <w:color w:val="000000"/>
+                <w:rFonts w:ascii="Calibri" w:eastAsia="Times New Roman" w:hAnsi="Calibri" w:cs="Calibri"/>
+                <w:b/>
+                <w:bCs/>
+                <w:color w:val="000000" w:themeColor="text1"/>
+                <w:sz w:val="24"/>
+                <w:szCs w:val="24"/>
                 <w:u w:val="single"/>
                 <w:lang w:val="es-MX" w:eastAsia="es-MX"/>
               </w:rPr>
@@ -1429,7 +1560,7 @@
       </w:tr>
       <w:tr>
         <w:trPr>
-          <w:trHeight w:val="330"/>
+          <w:trHeight w:val="193" w:hRule="atLeast"/>
         </w:trPr>
         <w:tc>
           <w:tcPr>
@@ -1449,9 +1580,14 @@
               <w:widowControl/>
               <w:autoSpaceDE/>
               <w:autoSpaceDN/>
-              <w:rPr>
-                <w:rFonts w:ascii="ADLaM Display" w:eastAsia="Times New Roman" w:hAnsi="ADLaM Display" w:cs="ADLaM Display"/>
-                <w:color w:val="000000"/>
+              <w:spacing w:before="0" w:after="0" w:line="240" w:lineRule="auto"/>
+              <w:rPr>
+                <w:rFonts w:ascii="Calibri" w:eastAsia="Times New Roman" w:hAnsi="Calibri" w:cs="Calibri"/>
+                <w:b/>
+                <w:bCs/>
+                <w:color w:val="000000" w:themeColor="text1"/>
+                <w:sz w:val="24"/>
+                <w:szCs w:val="24"/>
                 <w:u w:val="single"/>
                 <w:lang w:val="es-MX" w:eastAsia="es-MX"/>
               </w:rPr>
@@ -1476,10 +1612,14 @@
               <w:widowControl/>
               <w:autoSpaceDE/>
               <w:autoSpaceDN/>
-              <w:rPr>
-                <w:rFonts w:ascii="Times New Roman" w:eastAsia="Times New Roman" w:hAnsi="Times New Roman" w:cs="Times New Roman"/>
-                <w:sz w:val="20"/>
-                <w:szCs w:val="20"/>
+              <w:spacing w:before="0" w:after="0" w:line="240" w:lineRule="auto"/>
+              <w:rPr>
+                <w:rFonts w:ascii="Calibri" w:eastAsia="Times New Roman" w:hAnsi="Calibri" w:cs="Calibri"/>
+                <w:b/>
+                <w:bCs/>
+                <w:color w:val="000000" w:themeColor="text1"/>
+                <w:sz w:val="24"/>
+                <w:szCs w:val="24"/>
                 <w:lang w:val="es-MX" w:eastAsia="es-MX"/>
               </w:rPr>
             </w:pPr>
@@ -1503,10 +1643,14 @@
               <w:widowControl/>
               <w:autoSpaceDE/>
               <w:autoSpaceDN/>
-              <w:rPr>
-                <w:rFonts w:ascii="Times New Roman" w:eastAsia="Times New Roman" w:hAnsi="Times New Roman" w:cs="Times New Roman"/>
-                <w:sz w:val="20"/>
-                <w:szCs w:val="20"/>
+              <w:spacing w:before="0" w:after="0" w:line="240" w:lineRule="auto"/>
+              <w:rPr>
+                <w:rFonts w:ascii="Calibri" w:eastAsia="Times New Roman" w:hAnsi="Calibri" w:cs="Calibri"/>
+                <w:b/>
+                <w:bCs/>
+                <w:color w:val="000000" w:themeColor="text1"/>
+                <w:sz w:val="24"/>
+                <w:szCs w:val="24"/>
                 <w:lang w:val="es-MX" w:eastAsia="es-MX"/>
               </w:rPr>
             </w:pPr>
@@ -1515,7 +1659,7 @@
       </w:tr>
       <w:tr>
         <w:trPr>
-          <w:trHeight w:val="330"/>
+          <w:trHeight w:val="193" w:hRule="atLeast"/>
         </w:trPr>
         <w:tc>
           <w:tcPr>
@@ -1535,16 +1679,25 @@
               <w:widowControl/>
               <w:autoSpaceDE/>
               <w:autoSpaceDN/>
-              <w:rPr>
-                <w:rFonts w:ascii="ADLaM Display" w:eastAsia="Times New Roman" w:hAnsi="ADLaM Display" w:cs="ADLaM Display"/>
-                <w:color w:val="000000"/>
-                <w:lang w:val="es-MX" w:eastAsia="es-MX"/>
-              </w:rPr>
-            </w:pPr>
-            <w:r>
-              <w:rPr>
-                <w:rFonts w:ascii="ADLaM Display" w:eastAsia="Times New Roman" w:hAnsi="ADLaM Display" w:cs="ADLaM Display"/>
-                <w:color w:val="000000"/>
+              <w:spacing w:before="0" w:after="0" w:line="240" w:lineRule="auto"/>
+              <w:rPr>
+                <w:rFonts w:ascii="Calibri" w:eastAsia="Times New Roman" w:hAnsi="Calibri" w:cs="Calibri"/>
+                <w:b/>
+                <w:bCs/>
+                <w:color w:val="000000" w:themeColor="text1"/>
+                <w:sz w:val="24"/>
+                <w:szCs w:val="24"/>
+                <w:lang w:val="es-MX" w:eastAsia="es-MX"/>
+              </w:rPr>
+            </w:pPr>
+            <w:r>
+              <w:rPr>
+                <w:rFonts w:ascii="Calibri" w:eastAsia="Times New Roman" w:hAnsi="Calibri" w:cs="Calibri"/>
+                <w:b/>
+                <w:bCs/>
+                <w:color w:val="000000" w:themeColor="text1"/>
+                <w:sz w:val="24"/>
+                <w:szCs w:val="24"/>
                 <w:lang w:val="es-MX" w:eastAsia="es-MX"/>
               </w:rPr>
               <w:t>ASPECTO</w:t>
@@ -1569,16 +1722,25 @@
               <w:widowControl/>
               <w:autoSpaceDE/>
               <w:autoSpaceDN/>
-              <w:rPr>
-                <w:rFonts w:ascii="ADLaM Display" w:eastAsia="Times New Roman" w:hAnsi="ADLaM Display" w:cs="ADLaM Display"/>
-                <w:color w:val="000000"/>
-                <w:lang w:val="es-MX" w:eastAsia="es-MX"/>
-              </w:rPr>
-            </w:pPr>
-            <w:r>
-              <w:rPr>
-                <w:rFonts w:ascii="ADLaM Display" w:eastAsia="Times New Roman" w:hAnsi="ADLaM Display" w:cs="ADLaM Display"/>
-                <w:color w:val="000000"/>
+              <w:spacing w:before="0" w:after="0" w:line="240" w:lineRule="auto"/>
+              <w:rPr>
+                <w:rFonts w:ascii="Calibri" w:eastAsia="Times New Roman" w:hAnsi="Calibri" w:cs="Calibri"/>
+                <w:b/>
+                <w:bCs/>
+                <w:color w:val="000000" w:themeColor="text1"/>
+                <w:sz w:val="24"/>
+                <w:szCs w:val="24"/>
+                <w:lang w:val="es-MX" w:eastAsia="es-MX"/>
+              </w:rPr>
+            </w:pPr>
+            <w:r>
+              <w:rPr>
+                <w:rFonts w:ascii="Calibri" w:eastAsia="Times New Roman" w:hAnsi="Calibri" w:cs="Calibri"/>
+                <w:b/>
+                <w:bCs/>
+                <w:color w:val="000000" w:themeColor="text1"/>
+                <w:sz w:val="24"/>
+                <w:szCs w:val="24"/>
                 <w:lang w:val="es-MX" w:eastAsia="es-MX"/>
               </w:rPr>
               <w:t>{</w:t>
@@ -1586,8 +1748,12 @@
             <w:proofErr w:type="spellStart"/>
             <w:r>
               <w:rPr>
-                <w:rFonts w:ascii="ADLaM Display" w:eastAsia="Times New Roman" w:hAnsi="ADLaM Display" w:cs="ADLaM Display"/>
-                <w:color w:val="000000"/>
+                <w:rFonts w:ascii="Calibri" w:eastAsia="Times New Roman" w:hAnsi="Calibri" w:cs="Calibri"/>
+                <w:b/>
+                <w:bCs/>
+                <w:color w:val="000000" w:themeColor="text1"/>
+                <w:sz w:val="24"/>
+                <w:szCs w:val="24"/>
                 <w:lang w:val="es-MX" w:eastAsia="es-MX"/>
               </w:rPr>
               <w:t>aspecto_resultado</w:t>
@@ -1595,8 +1761,12 @@
             <w:proofErr w:type="spellEnd"/>
             <w:r>
               <w:rPr>
-                <w:rFonts w:ascii="ADLaM Display" w:eastAsia="Times New Roman" w:hAnsi="ADLaM Display" w:cs="ADLaM Display"/>
-                <w:color w:val="000000"/>
+                <w:rFonts w:ascii="Calibri" w:eastAsia="Times New Roman" w:hAnsi="Calibri" w:cs="Calibri"/>
+                <w:b/>
+                <w:bCs/>
+                <w:color w:val="000000" w:themeColor="text1"/>
+                <w:sz w:val="24"/>
+                <w:szCs w:val="24"/>
                 <w:lang w:val="es-MX" w:eastAsia="es-MX"/>
               </w:rPr>
               <w:t>}</w:t>
@@ -1621,16 +1791,25 @@
               <w:widowControl/>
               <w:autoSpaceDE/>
               <w:autoSpaceDN/>
-              <w:rPr>
-                <w:rFonts w:ascii="ADLaM Display" w:eastAsia="Times New Roman" w:hAnsi="ADLaM Display" w:cs="ADLaM Display"/>
-                <w:color w:val="000000"/>
-                <w:lang w:val="es-MX" w:eastAsia="es-MX"/>
-              </w:rPr>
-            </w:pPr>
-            <w:r>
-              <w:rPr>
-                <w:rFonts w:ascii="ADLaM Display" w:eastAsia="Times New Roman" w:hAnsi="ADLaM Display" w:cs="ADLaM Display"/>
-                <w:color w:val="000000"/>
+              <w:spacing w:before="0" w:after="0" w:line="240" w:lineRule="auto"/>
+              <w:rPr>
+                <w:rFonts w:ascii="Calibri" w:eastAsia="Times New Roman" w:hAnsi="Calibri" w:cs="Calibri"/>
+                <w:b/>
+                <w:bCs/>
+                <w:color w:val="000000" w:themeColor="text1"/>
+                <w:sz w:val="24"/>
+                <w:szCs w:val="24"/>
+                <w:lang w:val="es-MX" w:eastAsia="es-MX"/>
+              </w:rPr>
+            </w:pPr>
+            <w:r>
+              <w:rPr>
+                <w:rFonts w:ascii="Calibri" w:eastAsia="Times New Roman" w:hAnsi="Calibri" w:cs="Calibri"/>
+                <w:b/>
+                <w:bCs/>
+                <w:color w:val="000000" w:themeColor="text1"/>
+                <w:sz w:val="24"/>
+                <w:szCs w:val="24"/>
                 <w:lang w:val="es-MX" w:eastAsia="es-MX"/>
               </w:rPr>
               <w:t>CLARO</w:t>
@@ -1640,7 +1819,7 @@
       </w:tr>
       <w:tr>
         <w:trPr>
-          <w:trHeight w:val="330"/>
+          <w:trHeight w:val="193" w:hRule="atLeast"/>
         </w:trPr>
         <w:tc>
           <w:tcPr>
@@ -1660,16 +1839,25 @@
               <w:widowControl/>
               <w:autoSpaceDE/>
               <w:autoSpaceDN/>
-              <w:rPr>
-                <w:rFonts w:ascii="ADLaM Display" w:eastAsia="Times New Roman" w:hAnsi="ADLaM Display" w:cs="ADLaM Display"/>
-                <w:color w:val="000000"/>
-                <w:lang w:val="es-MX" w:eastAsia="es-MX"/>
-              </w:rPr>
-            </w:pPr>
-            <w:r>
-              <w:rPr>
-                <w:rFonts w:ascii="ADLaM Display" w:eastAsia="Times New Roman" w:hAnsi="ADLaM Display" w:cs="ADLaM Display"/>
-                <w:color w:val="000000"/>
+              <w:spacing w:before="0" w:after="0" w:line="240" w:lineRule="auto"/>
+              <w:rPr>
+                <w:rFonts w:ascii="Calibri" w:eastAsia="Times New Roman" w:hAnsi="Calibri" w:cs="Calibri"/>
+                <w:b/>
+                <w:bCs/>
+                <w:color w:val="000000" w:themeColor="text1"/>
+                <w:sz w:val="24"/>
+                <w:szCs w:val="24"/>
+                <w:lang w:val="es-MX" w:eastAsia="es-MX"/>
+              </w:rPr>
+            </w:pPr>
+            <w:r>
+              <w:rPr>
+                <w:rFonts w:ascii="Calibri" w:eastAsia="Times New Roman" w:hAnsi="Calibri" w:cs="Calibri"/>
+                <w:b/>
+                <w:bCs/>
+                <w:color w:val="000000" w:themeColor="text1"/>
+                <w:sz w:val="24"/>
+                <w:szCs w:val="24"/>
                 <w:lang w:val="es-MX" w:eastAsia="es-MX"/>
               </w:rPr>
               <w:t>COLOR</w:t>
@@ -1694,16 +1882,25 @@
               <w:widowControl/>
               <w:autoSpaceDE/>
               <w:autoSpaceDN/>
-              <w:rPr>
-                <w:rFonts w:ascii="ADLaM Display" w:eastAsia="Times New Roman" w:hAnsi="ADLaM Display" w:cs="ADLaM Display"/>
-                <w:color w:val="000000"/>
-                <w:lang w:val="es-MX" w:eastAsia="es-MX"/>
-              </w:rPr>
-            </w:pPr>
-            <w:r>
-              <w:rPr>
-                <w:rFonts w:ascii="ADLaM Display" w:eastAsia="Times New Roman" w:hAnsi="ADLaM Display" w:cs="ADLaM Display"/>
-                <w:color w:val="000000"/>
+              <w:spacing w:before="0" w:after="0" w:line="240" w:lineRule="auto"/>
+              <w:rPr>
+                <w:rFonts w:ascii="Calibri" w:eastAsia="Times New Roman" w:hAnsi="Calibri" w:cs="Calibri"/>
+                <w:b/>
+                <w:bCs/>
+                <w:color w:val="000000" w:themeColor="text1"/>
+                <w:sz w:val="24"/>
+                <w:szCs w:val="24"/>
+                <w:lang w:val="es-MX" w:eastAsia="es-MX"/>
+              </w:rPr>
+            </w:pPr>
+            <w:r>
+              <w:rPr>
+                <w:rFonts w:ascii="Calibri" w:eastAsia="Times New Roman" w:hAnsi="Calibri" w:cs="Calibri"/>
+                <w:b/>
+                <w:bCs/>
+                <w:color w:val="000000" w:themeColor="text1"/>
+                <w:sz w:val="24"/>
+                <w:szCs w:val="24"/>
                 <w:lang w:val="es-MX" w:eastAsia="es-MX"/>
               </w:rPr>
               <w:t>{</w:t>
@@ -1711,8 +1908,12 @@
             <w:proofErr w:type="spellStart"/>
             <w:r>
               <w:rPr>
-                <w:rFonts w:ascii="ADLaM Display" w:eastAsia="Times New Roman" w:hAnsi="ADLaM Display" w:cs="ADLaM Display"/>
-                <w:color w:val="000000"/>
+                <w:rFonts w:ascii="Calibri" w:eastAsia="Times New Roman" w:hAnsi="Calibri" w:cs="Calibri"/>
+                <w:b/>
+                <w:bCs/>
+                <w:color w:val="000000" w:themeColor="text1"/>
+                <w:sz w:val="24"/>
+                <w:szCs w:val="24"/>
                 <w:lang w:val="es-MX" w:eastAsia="es-MX"/>
               </w:rPr>
               <w:t>color_resultado</w:t>
@@ -1720,8 +1921,12 @@
             <w:proofErr w:type="spellEnd"/>
             <w:r>
               <w:rPr>
-                <w:rFonts w:ascii="ADLaM Display" w:eastAsia="Times New Roman" w:hAnsi="ADLaM Display" w:cs="ADLaM Display"/>
-                <w:color w:val="000000"/>
+                <w:rFonts w:ascii="Calibri" w:eastAsia="Times New Roman" w:hAnsi="Calibri" w:cs="Calibri"/>
+                <w:b/>
+                <w:bCs/>
+                <w:color w:val="000000" w:themeColor="text1"/>
+                <w:sz w:val="24"/>
+                <w:szCs w:val="24"/>
                 <w:lang w:val="es-MX" w:eastAsia="es-MX"/>
               </w:rPr>
               <w:t>}</w:t>
@@ -1746,9 +1951,14 @@
               <w:widowControl/>
               <w:autoSpaceDE/>
               <w:autoSpaceDN/>
-              <w:rPr>
-                <w:rFonts w:ascii="ADLaM Display" w:eastAsia="Times New Roman" w:hAnsi="ADLaM Display" w:cs="ADLaM Display"/>
-                <w:color w:val="000000"/>
+              <w:spacing w:before="0" w:after="0" w:line="240" w:lineRule="auto"/>
+              <w:rPr>
+                <w:rFonts w:ascii="Calibri" w:eastAsia="Times New Roman" w:hAnsi="Calibri" w:cs="Calibri"/>
+                <w:b/>
+                <w:bCs/>
+                <w:color w:val="000000" w:themeColor="text1"/>
+                <w:sz w:val="24"/>
+                <w:szCs w:val="24"/>
                 <w:lang w:val="es-MX" w:eastAsia="es-MX"/>
               </w:rPr>
             </w:pPr>
@@ -1757,7 +1967,7 @@
       </w:tr>
       <w:tr>
         <w:trPr>
-          <w:trHeight w:val="330"/>
+          <w:trHeight w:val="193" w:hRule="atLeast"/>
         </w:trPr>
         <w:tc>
           <w:tcPr>
@@ -1777,16 +1987,25 @@
               <w:widowControl/>
               <w:autoSpaceDE/>
               <w:autoSpaceDN/>
-              <w:rPr>
-                <w:rFonts w:ascii="ADLaM Display" w:eastAsia="Times New Roman" w:hAnsi="ADLaM Display" w:cs="ADLaM Display"/>
-                <w:color w:val="000000"/>
-                <w:lang w:val="es-MX" w:eastAsia="es-MX"/>
-              </w:rPr>
-            </w:pPr>
-            <w:r>
-              <w:rPr>
-                <w:rFonts w:ascii="ADLaM Display" w:eastAsia="Times New Roman" w:hAnsi="ADLaM Display" w:cs="ADLaM Display"/>
-                <w:color w:val="000000"/>
+              <w:spacing w:before="0" w:after="0" w:line="240" w:lineRule="auto"/>
+              <w:rPr>
+                <w:rFonts w:ascii="Calibri" w:eastAsia="Times New Roman" w:hAnsi="Calibri" w:cs="Calibri"/>
+                <w:b/>
+                <w:bCs/>
+                <w:color w:val="000000" w:themeColor="text1"/>
+                <w:sz w:val="24"/>
+                <w:szCs w:val="24"/>
+                <w:lang w:val="es-MX" w:eastAsia="es-MX"/>
+              </w:rPr>
+            </w:pPr>
+            <w:r>
+              <w:rPr>
+                <w:rFonts w:ascii="Calibri" w:eastAsia="Times New Roman" w:hAnsi="Calibri" w:cs="Calibri"/>
+                <w:b/>
+                <w:bCs/>
+                <w:color w:val="000000" w:themeColor="text1"/>
+                <w:sz w:val="24"/>
+                <w:szCs w:val="24"/>
                 <w:lang w:val="es-MX" w:eastAsia="es-MX"/>
               </w:rPr>
               <w:t>DENSIDAD</w:t>
@@ -1811,16 +2030,25 @@
               <w:widowControl/>
               <w:autoSpaceDE/>
               <w:autoSpaceDN/>
-              <w:rPr>
-                <w:rFonts w:ascii="ADLaM Display" w:eastAsia="Times New Roman" w:hAnsi="ADLaM Display" w:cs="ADLaM Display"/>
-                <w:color w:val="000000"/>
-                <w:lang w:val="es-MX" w:eastAsia="es-MX"/>
-              </w:rPr>
-            </w:pPr>
-            <w:r>
-              <w:rPr>
-                <w:rFonts w:ascii="ADLaM Display" w:eastAsia="Times New Roman" w:hAnsi="ADLaM Display" w:cs="ADLaM Display"/>
-                <w:color w:val="000000"/>
+              <w:spacing w:before="0" w:after="0" w:line="240" w:lineRule="auto"/>
+              <w:rPr>
+                <w:rFonts w:ascii="Calibri" w:eastAsia="Times New Roman" w:hAnsi="Calibri" w:cs="Calibri"/>
+                <w:b/>
+                <w:bCs/>
+                <w:color w:val="000000" w:themeColor="text1"/>
+                <w:sz w:val="24"/>
+                <w:szCs w:val="24"/>
+                <w:lang w:val="es-MX" w:eastAsia="es-MX"/>
+              </w:rPr>
+            </w:pPr>
+            <w:r>
+              <w:rPr>
+                <w:rFonts w:ascii="Calibri" w:eastAsia="Times New Roman" w:hAnsi="Calibri" w:cs="Calibri"/>
+                <w:b/>
+                <w:bCs/>
+                <w:color w:val="000000" w:themeColor="text1"/>
+                <w:sz w:val="24"/>
+                <w:szCs w:val="24"/>
                 <w:lang w:val="es-MX" w:eastAsia="es-MX"/>
               </w:rPr>
               <w:t>{</w:t>
@@ -1828,8 +2056,12 @@
             <w:proofErr w:type="spellStart"/>
             <w:r>
               <w:rPr>
-                <w:rFonts w:ascii="ADLaM Display" w:eastAsia="Times New Roman" w:hAnsi="ADLaM Display" w:cs="ADLaM Display"/>
-                <w:color w:val="000000"/>
+                <w:rFonts w:ascii="Calibri" w:eastAsia="Times New Roman" w:hAnsi="Calibri" w:cs="Calibri"/>
+                <w:b/>
+                <w:bCs/>
+                <w:color w:val="000000" w:themeColor="text1"/>
+                <w:sz w:val="24"/>
+                <w:szCs w:val="24"/>
                 <w:lang w:val="es-MX" w:eastAsia="es-MX"/>
               </w:rPr>
               <w:t>densidad_resultado</w:t>
@@ -1837,8 +2069,12 @@
             <w:proofErr w:type="spellEnd"/>
             <w:r>
               <w:rPr>
-                <w:rFonts w:ascii="ADLaM Display" w:eastAsia="Times New Roman" w:hAnsi="ADLaM Display" w:cs="ADLaM Display"/>
-                <w:color w:val="000000"/>
+                <w:rFonts w:ascii="Calibri" w:eastAsia="Times New Roman" w:hAnsi="Calibri" w:cs="Calibri"/>
+                <w:b/>
+                <w:bCs/>
+                <w:color w:val="000000" w:themeColor="text1"/>
+                <w:sz w:val="24"/>
+                <w:szCs w:val="24"/>
                 <w:lang w:val="es-MX" w:eastAsia="es-MX"/>
               </w:rPr>
               <w:t>}</w:t>
@@ -1863,16 +2099,25 @@
               <w:widowControl/>
               <w:autoSpaceDE/>
               <w:autoSpaceDN/>
-              <w:rPr>
-                <w:rFonts w:ascii="ADLaM Display" w:eastAsia="Times New Roman" w:hAnsi="ADLaM Display" w:cs="ADLaM Display"/>
-                <w:color w:val="000000"/>
-                <w:lang w:val="es-MX" w:eastAsia="es-MX"/>
-              </w:rPr>
-            </w:pPr>
-            <w:r>
-              <w:rPr>
-                <w:rFonts w:ascii="ADLaM Display" w:eastAsia="Times New Roman" w:hAnsi="ADLaM Display" w:cs="ADLaM Display"/>
-                <w:color w:val="000000"/>
+              <w:spacing w:before="0" w:after="0" w:line="240" w:lineRule="auto"/>
+              <w:rPr>
+                <w:rFonts w:ascii="Calibri" w:eastAsia="Times New Roman" w:hAnsi="Calibri" w:cs="Calibri"/>
+                <w:b/>
+                <w:bCs/>
+                <w:color w:val="000000" w:themeColor="text1"/>
+                <w:sz w:val="24"/>
+                <w:szCs w:val="24"/>
+                <w:lang w:val="es-MX" w:eastAsia="es-MX"/>
+              </w:rPr>
+            </w:pPr>
+            <w:r>
+              <w:rPr>
+                <w:rFonts w:ascii="Calibri" w:eastAsia="Times New Roman" w:hAnsi="Calibri" w:cs="Calibri"/>
+                <w:b/>
+                <w:bCs/>
+                <w:color w:val="000000" w:themeColor="text1"/>
+                <w:sz w:val="24"/>
+                <w:szCs w:val="24"/>
                 <w:lang w:val="es-MX" w:eastAsia="es-MX"/>
               </w:rPr>
               <w:t>1.002 a 1.030</w:t>
@@ -1882,7 +2127,7 @@
       </w:tr>
       <w:tr>
         <w:trPr>
-          <w:trHeight w:val="330"/>
+          <w:trHeight w:val="193" w:hRule="atLeast"/>
         </w:trPr>
         <w:tc>
           <w:tcPr>
@@ -1902,16 +2147,25 @@
               <w:widowControl/>
               <w:autoSpaceDE/>
               <w:autoSpaceDN/>
-              <w:rPr>
-                <w:rFonts w:ascii="ADLaM Display" w:eastAsia="Times New Roman" w:hAnsi="ADLaM Display" w:cs="ADLaM Display"/>
-                <w:color w:val="000000"/>
-                <w:lang w:val="es-MX" w:eastAsia="es-MX"/>
-              </w:rPr>
-            </w:pPr>
-            <w:r>
-              <w:rPr>
-                <w:rFonts w:ascii="ADLaM Display" w:eastAsia="Times New Roman" w:hAnsi="ADLaM Display" w:cs="ADLaM Display"/>
-                <w:color w:val="000000"/>
+              <w:spacing w:before="0" w:after="0" w:line="240" w:lineRule="auto"/>
+              <w:rPr>
+                <w:rFonts w:ascii="Calibri" w:eastAsia="Times New Roman" w:hAnsi="Calibri" w:cs="Calibri"/>
+                <w:b/>
+                <w:bCs/>
+                <w:color w:val="000000" w:themeColor="text1"/>
+                <w:sz w:val="24"/>
+                <w:szCs w:val="24"/>
+                <w:lang w:val="es-MX" w:eastAsia="es-MX"/>
+              </w:rPr>
+            </w:pPr>
+            <w:r>
+              <w:rPr>
+                <w:rFonts w:ascii="Calibri" w:eastAsia="Times New Roman" w:hAnsi="Calibri" w:cs="Calibri"/>
+                <w:b/>
+                <w:bCs/>
+                <w:color w:val="000000" w:themeColor="text1"/>
+                <w:sz w:val="24"/>
+                <w:szCs w:val="24"/>
                 <w:lang w:val="es-MX" w:eastAsia="es-MX"/>
               </w:rPr>
               <w:t>PH EN ORINA</w:t>
@@ -1936,16 +2190,25 @@
               <w:widowControl/>
               <w:autoSpaceDE/>
               <w:autoSpaceDN/>
-              <w:rPr>
-                <w:rFonts w:ascii="ADLaM Display" w:eastAsia="Times New Roman" w:hAnsi="ADLaM Display" w:cs="ADLaM Display"/>
-                <w:color w:val="000000"/>
-                <w:lang w:val="es-MX" w:eastAsia="es-MX"/>
-              </w:rPr>
-            </w:pPr>
-            <w:r>
-              <w:rPr>
-                <w:rFonts w:ascii="ADLaM Display" w:eastAsia="Times New Roman" w:hAnsi="ADLaM Display" w:cs="ADLaM Display"/>
-                <w:color w:val="000000"/>
+              <w:spacing w:before="0" w:after="0" w:line="240" w:lineRule="auto"/>
+              <w:rPr>
+                <w:rFonts w:ascii="Calibri" w:eastAsia="Times New Roman" w:hAnsi="Calibri" w:cs="Calibri"/>
+                <w:b/>
+                <w:bCs/>
+                <w:color w:val="000000" w:themeColor="text1"/>
+                <w:sz w:val="24"/>
+                <w:szCs w:val="24"/>
+                <w:lang w:val="es-MX" w:eastAsia="es-MX"/>
+              </w:rPr>
+            </w:pPr>
+            <w:r>
+              <w:rPr>
+                <w:rFonts w:ascii="Calibri" w:eastAsia="Times New Roman" w:hAnsi="Calibri" w:cs="Calibri"/>
+                <w:b/>
+                <w:bCs/>
+                <w:color w:val="000000" w:themeColor="text1"/>
+                <w:sz w:val="24"/>
+                <w:szCs w:val="24"/>
                 <w:lang w:val="es-MX" w:eastAsia="es-MX"/>
               </w:rPr>
               <w:t>{</w:t>
@@ -1953,8 +2216,12 @@
             <w:proofErr w:type="spellStart"/>
             <w:r>
               <w:rPr>
-                <w:rFonts w:ascii="ADLaM Display" w:eastAsia="Times New Roman" w:hAnsi="ADLaM Display" w:cs="ADLaM Display"/>
-                <w:color w:val="000000"/>
+                <w:rFonts w:ascii="Calibri" w:eastAsia="Times New Roman" w:hAnsi="Calibri" w:cs="Calibri"/>
+                <w:b/>
+                <w:bCs/>
+                <w:color w:val="000000" w:themeColor="text1"/>
+                <w:sz w:val="24"/>
+                <w:szCs w:val="24"/>
                 <w:lang w:val="es-MX" w:eastAsia="es-MX"/>
               </w:rPr>
               <w:t>ph_orina_resultado</w:t>
@@ -1962,8 +2229,12 @@
             <w:proofErr w:type="spellEnd"/>
             <w:r>
               <w:rPr>
-                <w:rFonts w:ascii="ADLaM Display" w:eastAsia="Times New Roman" w:hAnsi="ADLaM Display" w:cs="ADLaM Display"/>
-                <w:color w:val="000000"/>
+                <w:rFonts w:ascii="Calibri" w:eastAsia="Times New Roman" w:hAnsi="Calibri" w:cs="Calibri"/>
+                <w:b/>
+                <w:bCs/>
+                <w:color w:val="000000" w:themeColor="text1"/>
+                <w:sz w:val="24"/>
+                <w:szCs w:val="24"/>
                 <w:lang w:val="es-MX" w:eastAsia="es-MX"/>
               </w:rPr>
               <w:t>}</w:t>
@@ -1988,16 +2259,25 @@
               <w:widowControl/>
               <w:autoSpaceDE/>
               <w:autoSpaceDN/>
-              <w:rPr>
-                <w:rFonts w:ascii="ADLaM Display" w:eastAsia="Times New Roman" w:hAnsi="ADLaM Display" w:cs="ADLaM Display"/>
-                <w:color w:val="000000"/>
-                <w:lang w:val="es-MX" w:eastAsia="es-MX"/>
-              </w:rPr>
-            </w:pPr>
-            <w:r>
-              <w:rPr>
-                <w:rFonts w:ascii="ADLaM Display" w:eastAsia="Times New Roman" w:hAnsi="ADLaM Display" w:cs="ADLaM Display"/>
-                <w:color w:val="000000"/>
+              <w:spacing w:before="0" w:after="0" w:line="240" w:lineRule="auto"/>
+              <w:rPr>
+                <w:rFonts w:ascii="Calibri" w:eastAsia="Times New Roman" w:hAnsi="Calibri" w:cs="Calibri"/>
+                <w:b/>
+                <w:bCs/>
+                <w:color w:val="000000" w:themeColor="text1"/>
+                <w:sz w:val="24"/>
+                <w:szCs w:val="24"/>
+                <w:lang w:val="es-MX" w:eastAsia="es-MX"/>
+              </w:rPr>
+            </w:pPr>
+            <w:r>
+              <w:rPr>
+                <w:rFonts w:ascii="Calibri" w:eastAsia="Times New Roman" w:hAnsi="Calibri" w:cs="Calibri"/>
+                <w:b/>
+                <w:bCs/>
+                <w:color w:val="000000" w:themeColor="text1"/>
+                <w:sz w:val="24"/>
+                <w:szCs w:val="24"/>
                 <w:lang w:val="es-MX" w:eastAsia="es-MX"/>
               </w:rPr>
               <w:t>ACIDO (4.5-8.0)</w:t>
@@ -2007,7 +2287,7 @@
       </w:tr>
       <w:tr>
         <w:trPr>
-          <w:trHeight w:val="330"/>
+          <w:trHeight w:val="193" w:hRule="atLeast"/>
         </w:trPr>
         <w:tc>
           <w:tcPr>
@@ -2027,16 +2307,25 @@
               <w:widowControl/>
               <w:autoSpaceDE/>
               <w:autoSpaceDN/>
-              <w:rPr>
-                <w:rFonts w:ascii="ADLaM Display" w:eastAsia="Times New Roman" w:hAnsi="ADLaM Display" w:cs="ADLaM Display"/>
-                <w:color w:val="000000"/>
-                <w:lang w:val="es-MX" w:eastAsia="es-MX"/>
-              </w:rPr>
-            </w:pPr>
-            <w:r>
-              <w:rPr>
-                <w:rFonts w:ascii="ADLaM Display" w:eastAsia="Times New Roman" w:hAnsi="ADLaM Display" w:cs="ADLaM Display"/>
-                <w:color w:val="000000"/>
+              <w:spacing w:before="0" w:after="0" w:line="240" w:lineRule="auto"/>
+              <w:rPr>
+                <w:rFonts w:ascii="Calibri" w:eastAsia="Times New Roman" w:hAnsi="Calibri" w:cs="Calibri"/>
+                <w:b/>
+                <w:bCs/>
+                <w:color w:val="000000" w:themeColor="text1"/>
+                <w:sz w:val="24"/>
+                <w:szCs w:val="24"/>
+                <w:lang w:val="es-MX" w:eastAsia="es-MX"/>
+              </w:rPr>
+            </w:pPr>
+            <w:r>
+              <w:rPr>
+                <w:rFonts w:ascii="Calibri" w:eastAsia="Times New Roman" w:hAnsi="Calibri" w:cs="Calibri"/>
+                <w:b/>
+                <w:bCs/>
+                <w:color w:val="000000" w:themeColor="text1"/>
+                <w:sz w:val="24"/>
+                <w:szCs w:val="24"/>
                 <w:lang w:val="es-MX" w:eastAsia="es-MX"/>
               </w:rPr>
               <w:t>PROTEINAS</w:t>
@@ -2061,16 +2350,25 @@
               <w:widowControl/>
               <w:autoSpaceDE/>
               <w:autoSpaceDN/>
-              <w:rPr>
-                <w:rFonts w:ascii="ADLaM Display" w:eastAsia="Times New Roman" w:hAnsi="ADLaM Display" w:cs="ADLaM Display"/>
-                <w:color w:val="000000"/>
-                <w:lang w:val="es-MX" w:eastAsia="es-MX"/>
-              </w:rPr>
-            </w:pPr>
-            <w:r>
-              <w:rPr>
-                <w:rFonts w:ascii="ADLaM Display" w:eastAsia="Times New Roman" w:hAnsi="ADLaM Display" w:cs="ADLaM Display"/>
-                <w:color w:val="000000"/>
+              <w:spacing w:before="0" w:after="0" w:line="240" w:lineRule="auto"/>
+              <w:rPr>
+                <w:rFonts w:ascii="Calibri" w:eastAsia="Times New Roman" w:hAnsi="Calibri" w:cs="Calibri"/>
+                <w:b/>
+                <w:bCs/>
+                <w:color w:val="000000" w:themeColor="text1"/>
+                <w:sz w:val="24"/>
+                <w:szCs w:val="24"/>
+                <w:lang w:val="es-MX" w:eastAsia="es-MX"/>
+              </w:rPr>
+            </w:pPr>
+            <w:r>
+              <w:rPr>
+                <w:rFonts w:ascii="Calibri" w:eastAsia="Times New Roman" w:hAnsi="Calibri" w:cs="Calibri"/>
+                <w:b/>
+                <w:bCs/>
+                <w:color w:val="000000" w:themeColor="text1"/>
+                <w:sz w:val="24"/>
+                <w:szCs w:val="24"/>
                 <w:lang w:val="es-MX" w:eastAsia="es-MX"/>
               </w:rPr>
               <w:t>NEGATIVO</w:t>
@@ -2095,16 +2393,25 @@
               <w:widowControl/>
               <w:autoSpaceDE/>
               <w:autoSpaceDN/>
-              <w:rPr>
-                <w:rFonts w:ascii="ADLaM Display" w:eastAsia="Times New Roman" w:hAnsi="ADLaM Display" w:cs="ADLaM Display"/>
-                <w:color w:val="000000"/>
-                <w:lang w:val="es-MX" w:eastAsia="es-MX"/>
-              </w:rPr>
-            </w:pPr>
-            <w:r>
-              <w:rPr>
-                <w:rFonts w:ascii="ADLaM Display" w:eastAsia="Times New Roman" w:hAnsi="ADLaM Display" w:cs="ADLaM Display"/>
-                <w:color w:val="000000"/>
+              <w:spacing w:before="0" w:after="0" w:line="240" w:lineRule="auto"/>
+              <w:rPr>
+                <w:rFonts w:ascii="Calibri" w:eastAsia="Times New Roman" w:hAnsi="Calibri" w:cs="Calibri"/>
+                <w:b/>
+                <w:bCs/>
+                <w:color w:val="000000" w:themeColor="text1"/>
+                <w:sz w:val="24"/>
+                <w:szCs w:val="24"/>
+                <w:lang w:val="es-MX" w:eastAsia="es-MX"/>
+              </w:rPr>
+            </w:pPr>
+            <w:r>
+              <w:rPr>
+                <w:rFonts w:ascii="Calibri" w:eastAsia="Times New Roman" w:hAnsi="Calibri" w:cs="Calibri"/>
+                <w:b/>
+                <w:bCs/>
+                <w:color w:val="000000" w:themeColor="text1"/>
+                <w:sz w:val="24"/>
+                <w:szCs w:val="24"/>
                 <w:lang w:val="es-MX" w:eastAsia="es-MX"/>
               </w:rPr>
               <w:t>NEGATIVO</w:t>
@@ -2114,7 +2421,7 @@
       </w:tr>
       <w:tr>
         <w:trPr>
-          <w:trHeight w:val="330"/>
+          <w:trHeight w:val="193" w:hRule="atLeast"/>
         </w:trPr>
         <w:tc>
           <w:tcPr>
@@ -2134,16 +2441,25 @@
               <w:widowControl/>
               <w:autoSpaceDE/>
               <w:autoSpaceDN/>
-              <w:rPr>
-                <w:rFonts w:ascii="ADLaM Display" w:eastAsia="Times New Roman" w:hAnsi="ADLaM Display" w:cs="ADLaM Display"/>
-                <w:color w:val="000000"/>
-                <w:lang w:val="es-MX" w:eastAsia="es-MX"/>
-              </w:rPr>
-            </w:pPr>
-            <w:r>
-              <w:rPr>
-                <w:rFonts w:ascii="ADLaM Display" w:eastAsia="Times New Roman" w:hAnsi="ADLaM Display" w:cs="ADLaM Display"/>
-                <w:color w:val="000000"/>
+              <w:spacing w:before="0" w:after="0" w:line="240" w:lineRule="auto"/>
+              <w:rPr>
+                <w:rFonts w:ascii="Calibri" w:eastAsia="Times New Roman" w:hAnsi="Calibri" w:cs="Calibri"/>
+                <w:b/>
+                <w:bCs/>
+                <w:color w:val="000000" w:themeColor="text1"/>
+                <w:sz w:val="24"/>
+                <w:szCs w:val="24"/>
+                <w:lang w:val="es-MX" w:eastAsia="es-MX"/>
+              </w:rPr>
+            </w:pPr>
+            <w:r>
+              <w:rPr>
+                <w:rFonts w:ascii="Calibri" w:eastAsia="Times New Roman" w:hAnsi="Calibri" w:cs="Calibri"/>
+                <w:b/>
+                <w:bCs/>
+                <w:color w:val="000000" w:themeColor="text1"/>
+                <w:sz w:val="24"/>
+                <w:szCs w:val="24"/>
                 <w:lang w:val="es-MX" w:eastAsia="es-MX"/>
               </w:rPr>
               <w:t>GLUCOSA</w:t>
@@ -2168,16 +2484,25 @@
               <w:widowControl/>
               <w:autoSpaceDE/>
               <w:autoSpaceDN/>
-              <w:rPr>
-                <w:rFonts w:ascii="ADLaM Display" w:eastAsia="Times New Roman" w:hAnsi="ADLaM Display" w:cs="ADLaM Display"/>
-                <w:color w:val="000000"/>
-                <w:lang w:val="es-MX" w:eastAsia="es-MX"/>
-              </w:rPr>
-            </w:pPr>
-            <w:r>
-              <w:rPr>
-                <w:rFonts w:ascii="ADLaM Display" w:eastAsia="Times New Roman" w:hAnsi="ADLaM Display" w:cs="ADLaM Display"/>
-                <w:color w:val="000000"/>
+              <w:spacing w:before="0" w:after="0" w:line="240" w:lineRule="auto"/>
+              <w:rPr>
+                <w:rFonts w:ascii="Calibri" w:eastAsia="Times New Roman" w:hAnsi="Calibri" w:cs="Calibri"/>
+                <w:b/>
+                <w:bCs/>
+                <w:color w:val="000000" w:themeColor="text1"/>
+                <w:sz w:val="24"/>
+                <w:szCs w:val="24"/>
+                <w:lang w:val="es-MX" w:eastAsia="es-MX"/>
+              </w:rPr>
+            </w:pPr>
+            <w:r>
+              <w:rPr>
+                <w:rFonts w:ascii="Calibri" w:eastAsia="Times New Roman" w:hAnsi="Calibri" w:cs="Calibri"/>
+                <w:b/>
+                <w:bCs/>
+                <w:color w:val="000000" w:themeColor="text1"/>
+                <w:sz w:val="24"/>
+                <w:szCs w:val="24"/>
                 <w:lang w:val="es-MX" w:eastAsia="es-MX"/>
               </w:rPr>
               <w:t>NEGATIVO</w:t>
@@ -2202,16 +2527,25 @@
               <w:widowControl/>
               <w:autoSpaceDE/>
               <w:autoSpaceDN/>
-              <w:rPr>
-                <w:rFonts w:ascii="ADLaM Display" w:eastAsia="Times New Roman" w:hAnsi="ADLaM Display" w:cs="ADLaM Display"/>
-                <w:color w:val="000000"/>
-                <w:lang w:val="es-MX" w:eastAsia="es-MX"/>
-              </w:rPr>
-            </w:pPr>
-            <w:r>
-              <w:rPr>
-                <w:rFonts w:ascii="ADLaM Display" w:eastAsia="Times New Roman" w:hAnsi="ADLaM Display" w:cs="ADLaM Display"/>
-                <w:color w:val="000000"/>
+              <w:spacing w:before="0" w:after="0" w:line="240" w:lineRule="auto"/>
+              <w:rPr>
+                <w:rFonts w:ascii="Calibri" w:eastAsia="Times New Roman" w:hAnsi="Calibri" w:cs="Calibri"/>
+                <w:b/>
+                <w:bCs/>
+                <w:color w:val="000000" w:themeColor="text1"/>
+                <w:sz w:val="24"/>
+                <w:szCs w:val="24"/>
+                <w:lang w:val="es-MX" w:eastAsia="es-MX"/>
+              </w:rPr>
+            </w:pPr>
+            <w:r>
+              <w:rPr>
+                <w:rFonts w:ascii="Calibri" w:eastAsia="Times New Roman" w:hAnsi="Calibri" w:cs="Calibri"/>
+                <w:b/>
+                <w:bCs/>
+                <w:color w:val="000000" w:themeColor="text1"/>
+                <w:sz w:val="24"/>
+                <w:szCs w:val="24"/>
                 <w:lang w:val="es-MX" w:eastAsia="es-MX"/>
               </w:rPr>
               <w:t>NEGATIVO</w:t>
@@ -2221,7 +2555,7 @@
       </w:tr>
       <w:tr>
         <w:trPr>
-          <w:trHeight w:val="330"/>
+          <w:trHeight w:val="193" w:hRule="atLeast"/>
         </w:trPr>
         <w:tc>
           <w:tcPr>
@@ -2241,16 +2575,25 @@
               <w:widowControl/>
               <w:autoSpaceDE/>
               <w:autoSpaceDN/>
-              <w:rPr>
-                <w:rFonts w:ascii="ADLaM Display" w:eastAsia="Times New Roman" w:hAnsi="ADLaM Display" w:cs="ADLaM Display"/>
-                <w:color w:val="000000"/>
-                <w:lang w:val="es-MX" w:eastAsia="es-MX"/>
-              </w:rPr>
-            </w:pPr>
-            <w:r>
-              <w:rPr>
-                <w:rFonts w:ascii="ADLaM Display" w:eastAsia="Times New Roman" w:hAnsi="ADLaM Display" w:cs="ADLaM Display"/>
-                <w:color w:val="000000"/>
+              <w:spacing w:before="0" w:after="0" w:line="240" w:lineRule="auto"/>
+              <w:rPr>
+                <w:rFonts w:ascii="Calibri" w:eastAsia="Times New Roman" w:hAnsi="Calibri" w:cs="Calibri"/>
+                <w:b/>
+                <w:bCs/>
+                <w:color w:val="000000" w:themeColor="text1"/>
+                <w:sz w:val="24"/>
+                <w:szCs w:val="24"/>
+                <w:lang w:val="es-MX" w:eastAsia="es-MX"/>
+              </w:rPr>
+            </w:pPr>
+            <w:r>
+              <w:rPr>
+                <w:rFonts w:ascii="Calibri" w:eastAsia="Times New Roman" w:hAnsi="Calibri" w:cs="Calibri"/>
+                <w:b/>
+                <w:bCs/>
+                <w:color w:val="000000" w:themeColor="text1"/>
+                <w:sz w:val="24"/>
+                <w:szCs w:val="24"/>
                 <w:lang w:val="es-MX" w:eastAsia="es-MX"/>
               </w:rPr>
               <w:t>CETONAS</w:t>
@@ -2275,16 +2618,25 @@
               <w:widowControl/>
               <w:autoSpaceDE/>
               <w:autoSpaceDN/>
-              <w:rPr>
-                <w:rFonts w:ascii="ADLaM Display" w:eastAsia="Times New Roman" w:hAnsi="ADLaM Display" w:cs="ADLaM Display"/>
-                <w:color w:val="000000"/>
-                <w:lang w:val="es-MX" w:eastAsia="es-MX"/>
-              </w:rPr>
-            </w:pPr>
-            <w:r>
-              <w:rPr>
-                <w:rFonts w:ascii="ADLaM Display" w:eastAsia="Times New Roman" w:hAnsi="ADLaM Display" w:cs="ADLaM Display"/>
-                <w:color w:val="000000"/>
+              <w:spacing w:before="0" w:after="0" w:line="240" w:lineRule="auto"/>
+              <w:rPr>
+                <w:rFonts w:ascii="Calibri" w:eastAsia="Times New Roman" w:hAnsi="Calibri" w:cs="Calibri"/>
+                <w:b/>
+                <w:bCs/>
+                <w:color w:val="000000" w:themeColor="text1"/>
+                <w:sz w:val="24"/>
+                <w:szCs w:val="24"/>
+                <w:lang w:val="es-MX" w:eastAsia="es-MX"/>
+              </w:rPr>
+            </w:pPr>
+            <w:r>
+              <w:rPr>
+                <w:rFonts w:ascii="Calibri" w:eastAsia="Times New Roman" w:hAnsi="Calibri" w:cs="Calibri"/>
+                <w:b/>
+                <w:bCs/>
+                <w:color w:val="000000" w:themeColor="text1"/>
+                <w:sz w:val="24"/>
+                <w:szCs w:val="24"/>
                 <w:lang w:val="es-MX" w:eastAsia="es-MX"/>
               </w:rPr>
               <w:t>NEGATIVO</w:t>
@@ -2309,16 +2661,25 @@
               <w:widowControl/>
               <w:autoSpaceDE/>
               <w:autoSpaceDN/>
-              <w:rPr>
-                <w:rFonts w:ascii="ADLaM Display" w:eastAsia="Times New Roman" w:hAnsi="ADLaM Display" w:cs="ADLaM Display"/>
-                <w:color w:val="000000"/>
-                <w:lang w:val="es-MX" w:eastAsia="es-MX"/>
-              </w:rPr>
-            </w:pPr>
-            <w:r>
-              <w:rPr>
-                <w:rFonts w:ascii="ADLaM Display" w:eastAsia="Times New Roman" w:hAnsi="ADLaM Display" w:cs="ADLaM Display"/>
-                <w:color w:val="000000"/>
+              <w:spacing w:before="0" w:after="0" w:line="240" w:lineRule="auto"/>
+              <w:rPr>
+                <w:rFonts w:ascii="Calibri" w:eastAsia="Times New Roman" w:hAnsi="Calibri" w:cs="Calibri"/>
+                <w:b/>
+                <w:bCs/>
+                <w:color w:val="000000" w:themeColor="text1"/>
+                <w:sz w:val="24"/>
+                <w:szCs w:val="24"/>
+                <w:lang w:val="es-MX" w:eastAsia="es-MX"/>
+              </w:rPr>
+            </w:pPr>
+            <w:r>
+              <w:rPr>
+                <w:rFonts w:ascii="Calibri" w:eastAsia="Times New Roman" w:hAnsi="Calibri" w:cs="Calibri"/>
+                <w:b/>
+                <w:bCs/>
+                <w:color w:val="000000" w:themeColor="text1"/>
+                <w:sz w:val="24"/>
+                <w:szCs w:val="24"/>
                 <w:lang w:val="es-MX" w:eastAsia="es-MX"/>
               </w:rPr>
               <w:t>NEGATIVO</w:t>
@@ -2328,7 +2689,7 @@
       </w:tr>
       <w:tr>
         <w:trPr>
-          <w:trHeight w:val="330"/>
+          <w:trHeight w:val="193" w:hRule="atLeast"/>
         </w:trPr>
         <w:tc>
           <w:tcPr>
@@ -2348,16 +2709,25 @@
               <w:widowControl/>
               <w:autoSpaceDE/>
               <w:autoSpaceDN/>
-              <w:rPr>
-                <w:rFonts w:ascii="ADLaM Display" w:eastAsia="Times New Roman" w:hAnsi="ADLaM Display" w:cs="ADLaM Display"/>
-                <w:color w:val="000000"/>
-                <w:lang w:val="es-MX" w:eastAsia="es-MX"/>
-              </w:rPr>
-            </w:pPr>
-            <w:r>
-              <w:rPr>
-                <w:rFonts w:ascii="ADLaM Display" w:eastAsia="Times New Roman" w:hAnsi="ADLaM Display" w:cs="ADLaM Display"/>
-                <w:color w:val="000000"/>
+              <w:spacing w:before="0" w:after="0" w:line="240" w:lineRule="auto"/>
+              <w:rPr>
+                <w:rFonts w:ascii="Calibri" w:eastAsia="Times New Roman" w:hAnsi="Calibri" w:cs="Calibri"/>
+                <w:b/>
+                <w:bCs/>
+                <w:color w:val="000000" w:themeColor="text1"/>
+                <w:sz w:val="24"/>
+                <w:szCs w:val="24"/>
+                <w:lang w:val="es-MX" w:eastAsia="es-MX"/>
+              </w:rPr>
+            </w:pPr>
+            <w:r>
+              <w:rPr>
+                <w:rFonts w:ascii="Calibri" w:eastAsia="Times New Roman" w:hAnsi="Calibri" w:cs="Calibri"/>
+                <w:b/>
+                <w:bCs/>
+                <w:color w:val="000000" w:themeColor="text1"/>
+                <w:sz w:val="24"/>
+                <w:szCs w:val="24"/>
                 <w:lang w:val="es-MX" w:eastAsia="es-MX"/>
               </w:rPr>
               <w:t>BILIRRUBINA</w:t>
@@ -2382,16 +2752,25 @@
               <w:widowControl/>
               <w:autoSpaceDE/>
               <w:autoSpaceDN/>
-              <w:rPr>
-                <w:rFonts w:ascii="ADLaM Display" w:eastAsia="Times New Roman" w:hAnsi="ADLaM Display" w:cs="ADLaM Display"/>
-                <w:color w:val="000000"/>
-                <w:lang w:val="es-MX" w:eastAsia="es-MX"/>
-              </w:rPr>
-            </w:pPr>
-            <w:r>
-              <w:rPr>
-                <w:rFonts w:ascii="ADLaM Display" w:eastAsia="Times New Roman" w:hAnsi="ADLaM Display" w:cs="ADLaM Display"/>
-                <w:color w:val="000000"/>
+              <w:spacing w:before="0" w:after="0" w:line="240" w:lineRule="auto"/>
+              <w:rPr>
+                <w:rFonts w:ascii="Calibri" w:eastAsia="Times New Roman" w:hAnsi="Calibri" w:cs="Calibri"/>
+                <w:b/>
+                <w:bCs/>
+                <w:color w:val="000000" w:themeColor="text1"/>
+                <w:sz w:val="24"/>
+                <w:szCs w:val="24"/>
+                <w:lang w:val="es-MX" w:eastAsia="es-MX"/>
+              </w:rPr>
+            </w:pPr>
+            <w:r>
+              <w:rPr>
+                <w:rFonts w:ascii="Calibri" w:eastAsia="Times New Roman" w:hAnsi="Calibri" w:cs="Calibri"/>
+                <w:b/>
+                <w:bCs/>
+                <w:color w:val="000000" w:themeColor="text1"/>
+                <w:sz w:val="24"/>
+                <w:szCs w:val="24"/>
                 <w:lang w:val="es-MX" w:eastAsia="es-MX"/>
               </w:rPr>
               <w:t>NEGATIVO</w:t>
@@ -2416,16 +2795,25 @@
               <w:widowControl/>
               <w:autoSpaceDE/>
               <w:autoSpaceDN/>
-              <w:rPr>
-                <w:rFonts w:ascii="ADLaM Display" w:eastAsia="Times New Roman" w:hAnsi="ADLaM Display" w:cs="ADLaM Display"/>
-                <w:color w:val="000000"/>
-                <w:lang w:val="es-MX" w:eastAsia="es-MX"/>
-              </w:rPr>
-            </w:pPr>
-            <w:r>
-              <w:rPr>
-                <w:rFonts w:ascii="ADLaM Display" w:eastAsia="Times New Roman" w:hAnsi="ADLaM Display" w:cs="ADLaM Display"/>
-                <w:color w:val="000000"/>
+              <w:spacing w:before="0" w:after="0" w:line="240" w:lineRule="auto"/>
+              <w:rPr>
+                <w:rFonts w:ascii="Calibri" w:eastAsia="Times New Roman" w:hAnsi="Calibri" w:cs="Calibri"/>
+                <w:b/>
+                <w:bCs/>
+                <w:color w:val="000000" w:themeColor="text1"/>
+                <w:sz w:val="24"/>
+                <w:szCs w:val="24"/>
+                <w:lang w:val="es-MX" w:eastAsia="es-MX"/>
+              </w:rPr>
+            </w:pPr>
+            <w:r>
+              <w:rPr>
+                <w:rFonts w:ascii="Calibri" w:eastAsia="Times New Roman" w:hAnsi="Calibri" w:cs="Calibri"/>
+                <w:b/>
+                <w:bCs/>
+                <w:color w:val="000000" w:themeColor="text1"/>
+                <w:sz w:val="24"/>
+                <w:szCs w:val="24"/>
                 <w:lang w:val="es-MX" w:eastAsia="es-MX"/>
               </w:rPr>
               <w:t>NEGATIVO</w:t>
@@ -2435,7 +2823,7 @@
       </w:tr>
       <w:tr>
         <w:trPr>
-          <w:trHeight w:val="330"/>
+          <w:trHeight w:val="193" w:hRule="atLeast"/>
         </w:trPr>
         <w:tc>
           <w:tcPr>
@@ -2455,16 +2843,25 @@
               <w:widowControl/>
               <w:autoSpaceDE/>
               <w:autoSpaceDN/>
-              <w:rPr>
-                <w:rFonts w:ascii="ADLaM Display" w:eastAsia="Times New Roman" w:hAnsi="ADLaM Display" w:cs="ADLaM Display"/>
-                <w:color w:val="000000"/>
-                <w:lang w:val="es-MX" w:eastAsia="es-MX"/>
-              </w:rPr>
-            </w:pPr>
-            <w:r>
-              <w:rPr>
-                <w:rFonts w:ascii="ADLaM Display" w:eastAsia="Times New Roman" w:hAnsi="ADLaM Display" w:cs="ADLaM Display"/>
-                <w:color w:val="000000"/>
+              <w:spacing w:before="0" w:after="0" w:line="240" w:lineRule="auto"/>
+              <w:rPr>
+                <w:rFonts w:ascii="Calibri" w:eastAsia="Times New Roman" w:hAnsi="Calibri" w:cs="Calibri"/>
+                <w:b/>
+                <w:bCs/>
+                <w:color w:val="000000" w:themeColor="text1"/>
+                <w:sz w:val="24"/>
+                <w:szCs w:val="24"/>
+                <w:lang w:val="es-MX" w:eastAsia="es-MX"/>
+              </w:rPr>
+            </w:pPr>
+            <w:r>
+              <w:rPr>
+                <w:rFonts w:ascii="Calibri" w:eastAsia="Times New Roman" w:hAnsi="Calibri" w:cs="Calibri"/>
+                <w:b/>
+                <w:bCs/>
+                <w:color w:val="000000" w:themeColor="text1"/>
+                <w:sz w:val="24"/>
+                <w:szCs w:val="24"/>
                 <w:lang w:val="es-MX" w:eastAsia="es-MX"/>
               </w:rPr>
               <w:t>HEMOGLOBINA</w:t>
@@ -2489,16 +2886,25 @@
               <w:widowControl/>
               <w:autoSpaceDE/>
               <w:autoSpaceDN/>
-              <w:rPr>
-                <w:rFonts w:ascii="ADLaM Display" w:eastAsia="Times New Roman" w:hAnsi="ADLaM Display" w:cs="ADLaM Display"/>
-                <w:color w:val="000000"/>
-                <w:lang w:val="es-MX" w:eastAsia="es-MX"/>
-              </w:rPr>
-            </w:pPr>
-            <w:r>
-              <w:rPr>
-                <w:rFonts w:ascii="ADLaM Display" w:eastAsia="Times New Roman" w:hAnsi="ADLaM Display" w:cs="ADLaM Display"/>
-                <w:color w:val="000000"/>
+              <w:spacing w:before="0" w:after="0" w:line="240" w:lineRule="auto"/>
+              <w:rPr>
+                <w:rFonts w:ascii="Calibri" w:eastAsia="Times New Roman" w:hAnsi="Calibri" w:cs="Calibri"/>
+                <w:b/>
+                <w:bCs/>
+                <w:color w:val="000000" w:themeColor="text1"/>
+                <w:sz w:val="24"/>
+                <w:szCs w:val="24"/>
+                <w:lang w:val="es-MX" w:eastAsia="es-MX"/>
+              </w:rPr>
+            </w:pPr>
+            <w:r>
+              <w:rPr>
+                <w:rFonts w:ascii="Calibri" w:eastAsia="Times New Roman" w:hAnsi="Calibri" w:cs="Calibri"/>
+                <w:b/>
+                <w:bCs/>
+                <w:color w:val="000000" w:themeColor="text1"/>
+                <w:sz w:val="24"/>
+                <w:szCs w:val="24"/>
                 <w:lang w:val="es-MX" w:eastAsia="es-MX"/>
               </w:rPr>
               <w:t>NEGATIVO</w:t>
@@ -2523,16 +2929,25 @@
               <w:widowControl/>
               <w:autoSpaceDE/>
               <w:autoSpaceDN/>
-              <w:rPr>
-                <w:rFonts w:ascii="ADLaM Display" w:eastAsia="Times New Roman" w:hAnsi="ADLaM Display" w:cs="ADLaM Display"/>
-                <w:color w:val="000000"/>
-                <w:lang w:val="es-MX" w:eastAsia="es-MX"/>
-              </w:rPr>
-            </w:pPr>
-            <w:r>
-              <w:rPr>
-                <w:rFonts w:ascii="ADLaM Display" w:eastAsia="Times New Roman" w:hAnsi="ADLaM Display" w:cs="ADLaM Display"/>
-                <w:color w:val="000000"/>
+              <w:spacing w:before="0" w:after="0" w:line="240" w:lineRule="auto"/>
+              <w:rPr>
+                <w:rFonts w:ascii="Calibri" w:eastAsia="Times New Roman" w:hAnsi="Calibri" w:cs="Calibri"/>
+                <w:b/>
+                <w:bCs/>
+                <w:color w:val="000000" w:themeColor="text1"/>
+                <w:sz w:val="24"/>
+                <w:szCs w:val="24"/>
+                <w:lang w:val="es-MX" w:eastAsia="es-MX"/>
+              </w:rPr>
+            </w:pPr>
+            <w:r>
+              <w:rPr>
+                <w:rFonts w:ascii="Calibri" w:eastAsia="Times New Roman" w:hAnsi="Calibri" w:cs="Calibri"/>
+                <w:b/>
+                <w:bCs/>
+                <w:color w:val="000000" w:themeColor="text1"/>
+                <w:sz w:val="24"/>
+                <w:szCs w:val="24"/>
                 <w:lang w:val="es-MX" w:eastAsia="es-MX"/>
               </w:rPr>
               <w:t>NEGATIVO</w:t>
@@ -2542,7 +2957,7 @@
       </w:tr>
       <w:tr>
         <w:trPr>
-          <w:trHeight w:val="330"/>
+          <w:trHeight w:val="193" w:hRule="atLeast"/>
         </w:trPr>
         <w:tc>
           <w:tcPr>
@@ -2562,16 +2977,25 @@
               <w:widowControl/>
               <w:autoSpaceDE/>
               <w:autoSpaceDN/>
-              <w:rPr>
-                <w:rFonts w:ascii="ADLaM Display" w:eastAsia="Times New Roman" w:hAnsi="ADLaM Display" w:cs="ADLaM Display"/>
-                <w:color w:val="000000"/>
-                <w:lang w:val="es-MX" w:eastAsia="es-MX"/>
-              </w:rPr>
-            </w:pPr>
-            <w:r>
-              <w:rPr>
-                <w:rFonts w:ascii="ADLaM Display" w:eastAsia="Times New Roman" w:hAnsi="ADLaM Display" w:cs="ADLaM Display"/>
-                <w:color w:val="000000"/>
+              <w:spacing w:before="0" w:after="0" w:line="240" w:lineRule="auto"/>
+              <w:rPr>
+                <w:rFonts w:ascii="Calibri" w:eastAsia="Times New Roman" w:hAnsi="Calibri" w:cs="Calibri"/>
+                <w:b/>
+                <w:bCs/>
+                <w:color w:val="000000" w:themeColor="text1"/>
+                <w:sz w:val="24"/>
+                <w:szCs w:val="24"/>
+                <w:lang w:val="es-MX" w:eastAsia="es-MX"/>
+              </w:rPr>
+            </w:pPr>
+            <w:r>
+              <w:rPr>
+                <w:rFonts w:ascii="Calibri" w:eastAsia="Times New Roman" w:hAnsi="Calibri" w:cs="Calibri"/>
+                <w:b/>
+                <w:bCs/>
+                <w:color w:val="000000" w:themeColor="text1"/>
+                <w:sz w:val="24"/>
+                <w:szCs w:val="24"/>
                 <w:lang w:val="es-MX" w:eastAsia="es-MX"/>
               </w:rPr>
               <w:t>NITRITOS</w:t>
@@ -2596,16 +3020,25 @@
               <w:widowControl/>
               <w:autoSpaceDE/>
               <w:autoSpaceDN/>
-              <w:rPr>
-                <w:rFonts w:ascii="ADLaM Display" w:eastAsia="Times New Roman" w:hAnsi="ADLaM Display" w:cs="ADLaM Display"/>
-                <w:color w:val="000000"/>
-                <w:lang w:val="es-MX" w:eastAsia="es-MX"/>
-              </w:rPr>
-            </w:pPr>
-            <w:r>
-              <w:rPr>
-                <w:rFonts w:ascii="ADLaM Display" w:eastAsia="Times New Roman" w:hAnsi="ADLaM Display" w:cs="ADLaM Display"/>
-                <w:color w:val="000000"/>
+              <w:spacing w:before="0" w:after="0" w:line="240" w:lineRule="auto"/>
+              <w:rPr>
+                <w:rFonts w:ascii="Calibri" w:eastAsia="Times New Roman" w:hAnsi="Calibri" w:cs="Calibri"/>
+                <w:b/>
+                <w:bCs/>
+                <w:color w:val="000000" w:themeColor="text1"/>
+                <w:sz w:val="24"/>
+                <w:szCs w:val="24"/>
+                <w:lang w:val="es-MX" w:eastAsia="es-MX"/>
+              </w:rPr>
+            </w:pPr>
+            <w:r>
+              <w:rPr>
+                <w:rFonts w:ascii="Calibri" w:eastAsia="Times New Roman" w:hAnsi="Calibri" w:cs="Calibri"/>
+                <w:b/>
+                <w:bCs/>
+                <w:color w:val="000000" w:themeColor="text1"/>
+                <w:sz w:val="24"/>
+                <w:szCs w:val="24"/>
                 <w:lang w:val="es-MX" w:eastAsia="es-MX"/>
               </w:rPr>
               <w:t>NEGATIVO</w:t>
@@ -2630,16 +3063,25 @@
               <w:widowControl/>
               <w:autoSpaceDE/>
               <w:autoSpaceDN/>
-              <w:rPr>
-                <w:rFonts w:ascii="ADLaM Display" w:eastAsia="Times New Roman" w:hAnsi="ADLaM Display" w:cs="ADLaM Display"/>
-                <w:color w:val="000000"/>
-                <w:lang w:val="es-MX" w:eastAsia="es-MX"/>
-              </w:rPr>
-            </w:pPr>
-            <w:r>
-              <w:rPr>
-                <w:rFonts w:ascii="ADLaM Display" w:eastAsia="Times New Roman" w:hAnsi="ADLaM Display" w:cs="ADLaM Display"/>
-                <w:color w:val="000000"/>
+              <w:spacing w:before="0" w:after="0" w:line="240" w:lineRule="auto"/>
+              <w:rPr>
+                <w:rFonts w:ascii="Calibri" w:eastAsia="Times New Roman" w:hAnsi="Calibri" w:cs="Calibri"/>
+                <w:b/>
+                <w:bCs/>
+                <w:color w:val="000000" w:themeColor="text1"/>
+                <w:sz w:val="24"/>
+                <w:szCs w:val="24"/>
+                <w:lang w:val="es-MX" w:eastAsia="es-MX"/>
+              </w:rPr>
+            </w:pPr>
+            <w:r>
+              <w:rPr>
+                <w:rFonts w:ascii="Calibri" w:eastAsia="Times New Roman" w:hAnsi="Calibri" w:cs="Calibri"/>
+                <w:b/>
+                <w:bCs/>
+                <w:color w:val="000000" w:themeColor="text1"/>
+                <w:sz w:val="24"/>
+                <w:szCs w:val="24"/>
                 <w:lang w:val="es-MX" w:eastAsia="es-MX"/>
               </w:rPr>
               <w:t>NEGATIVO</w:t>
@@ -2649,7 +3091,7 @@
       </w:tr>
       <w:tr>
         <w:trPr>
-          <w:trHeight w:val="330"/>
+          <w:trHeight w:val="193" w:hRule="atLeast"/>
         </w:trPr>
         <w:tc>
           <w:tcPr>
@@ -2669,16 +3111,25 @@
               <w:widowControl/>
               <w:autoSpaceDE/>
               <w:autoSpaceDN/>
-              <w:rPr>
-                <w:rFonts w:ascii="ADLaM Display" w:eastAsia="Times New Roman" w:hAnsi="ADLaM Display" w:cs="ADLaM Display"/>
-                <w:color w:val="000000"/>
-                <w:lang w:val="es-MX" w:eastAsia="es-MX"/>
-              </w:rPr>
-            </w:pPr>
-            <w:r>
-              <w:rPr>
-                <w:rFonts w:ascii="ADLaM Display" w:eastAsia="Times New Roman" w:hAnsi="ADLaM Display" w:cs="ADLaM Display"/>
-                <w:color w:val="000000"/>
+              <w:spacing w:before="0" w:after="0" w:line="240" w:lineRule="auto"/>
+              <w:rPr>
+                <w:rFonts w:ascii="Calibri" w:eastAsia="Times New Roman" w:hAnsi="Calibri" w:cs="Calibri"/>
+                <w:b/>
+                <w:bCs/>
+                <w:color w:val="000000" w:themeColor="text1"/>
+                <w:sz w:val="24"/>
+                <w:szCs w:val="24"/>
+                <w:lang w:val="es-MX" w:eastAsia="es-MX"/>
+              </w:rPr>
+            </w:pPr>
+            <w:r>
+              <w:rPr>
+                <w:rFonts w:ascii="Calibri" w:eastAsia="Times New Roman" w:hAnsi="Calibri" w:cs="Calibri"/>
+                <w:b/>
+                <w:bCs/>
+                <w:color w:val="000000" w:themeColor="text1"/>
+                <w:sz w:val="24"/>
+                <w:szCs w:val="24"/>
                 <w:lang w:val="es-MX" w:eastAsia="es-MX"/>
               </w:rPr>
               <w:t>UROBILINOGENO</w:t>
@@ -2703,16 +3154,25 @@
               <w:widowControl/>
               <w:autoSpaceDE/>
               <w:autoSpaceDN/>
-              <w:rPr>
-                <w:rFonts w:ascii="ADLaM Display" w:eastAsia="Times New Roman" w:hAnsi="ADLaM Display" w:cs="ADLaM Display"/>
-                <w:color w:val="000000"/>
-                <w:lang w:val="es-MX" w:eastAsia="es-MX"/>
-              </w:rPr>
-            </w:pPr>
-            <w:r>
-              <w:rPr>
-                <w:rFonts w:ascii="ADLaM Display" w:eastAsia="Times New Roman" w:hAnsi="ADLaM Display" w:cs="ADLaM Display"/>
-                <w:color w:val="000000"/>
+              <w:spacing w:before="0" w:after="0" w:line="240" w:lineRule="auto"/>
+              <w:rPr>
+                <w:rFonts w:ascii="Calibri" w:eastAsia="Times New Roman" w:hAnsi="Calibri" w:cs="Calibri"/>
+                <w:b/>
+                <w:bCs/>
+                <w:color w:val="000000" w:themeColor="text1"/>
+                <w:sz w:val="24"/>
+                <w:szCs w:val="24"/>
+                <w:lang w:val="es-MX" w:eastAsia="es-MX"/>
+              </w:rPr>
+            </w:pPr>
+            <w:r>
+              <w:rPr>
+                <w:rFonts w:ascii="Calibri" w:eastAsia="Times New Roman" w:hAnsi="Calibri" w:cs="Calibri"/>
+                <w:b/>
+                <w:bCs/>
+                <w:color w:val="000000" w:themeColor="text1"/>
+                <w:sz w:val="24"/>
+                <w:szCs w:val="24"/>
                 <w:lang w:val="es-MX" w:eastAsia="es-MX"/>
               </w:rPr>
               <w:t>NEGATIVO</w:t>
@@ -2737,16 +3197,25 @@
               <w:widowControl/>
               <w:autoSpaceDE/>
               <w:autoSpaceDN/>
-              <w:rPr>
-                <w:rFonts w:ascii="ADLaM Display" w:eastAsia="Times New Roman" w:hAnsi="ADLaM Display" w:cs="ADLaM Display"/>
-                <w:color w:val="000000"/>
-                <w:lang w:val="es-MX" w:eastAsia="es-MX"/>
-              </w:rPr>
-            </w:pPr>
-            <w:r>
-              <w:rPr>
-                <w:rFonts w:ascii="ADLaM Display" w:eastAsia="Times New Roman" w:hAnsi="ADLaM Display" w:cs="ADLaM Display"/>
-                <w:color w:val="000000"/>
+              <w:spacing w:before="0" w:after="0" w:line="240" w:lineRule="auto"/>
+              <w:rPr>
+                <w:rFonts w:ascii="Calibri" w:eastAsia="Times New Roman" w:hAnsi="Calibri" w:cs="Calibri"/>
+                <w:b/>
+                <w:bCs/>
+                <w:color w:val="000000" w:themeColor="text1"/>
+                <w:sz w:val="24"/>
+                <w:szCs w:val="24"/>
+                <w:lang w:val="es-MX" w:eastAsia="es-MX"/>
+              </w:rPr>
+            </w:pPr>
+            <w:r>
+              <w:rPr>
+                <w:rFonts w:ascii="Calibri" w:eastAsia="Times New Roman" w:hAnsi="Calibri" w:cs="Calibri"/>
+                <w:b/>
+                <w:bCs/>
+                <w:color w:val="000000" w:themeColor="text1"/>
+                <w:sz w:val="24"/>
+                <w:szCs w:val="24"/>
                 <w:lang w:val="es-MX" w:eastAsia="es-MX"/>
               </w:rPr>
               <w:t>NEGATIVO</w:t>
@@ -2756,7 +3225,7 @@
       </w:tr>
       <w:tr>
         <w:trPr>
-          <w:trHeight w:val="330"/>
+          <w:trHeight w:val="193" w:hRule="atLeast"/>
         </w:trPr>
         <w:tc>
           <w:tcPr>
@@ -2776,16 +3245,25 @@
               <w:widowControl/>
               <w:autoSpaceDE/>
               <w:autoSpaceDN/>
-              <w:rPr>
-                <w:rFonts w:ascii="ADLaM Display" w:eastAsia="Times New Roman" w:hAnsi="ADLaM Display" w:cs="ADLaM Display"/>
-                <w:color w:val="000000"/>
-                <w:lang w:val="es-MX" w:eastAsia="es-MX"/>
-              </w:rPr>
-            </w:pPr>
-            <w:r>
-              <w:rPr>
-                <w:rFonts w:ascii="ADLaM Display" w:eastAsia="Times New Roman" w:hAnsi="ADLaM Display" w:cs="ADLaM Display"/>
-                <w:color w:val="000000"/>
+              <w:spacing w:before="0" w:after="0" w:line="240" w:lineRule="auto"/>
+              <w:rPr>
+                <w:rFonts w:ascii="Calibri" w:eastAsia="Times New Roman" w:hAnsi="Calibri" w:cs="Calibri"/>
+                <w:b/>
+                <w:bCs/>
+                <w:color w:val="000000" w:themeColor="text1"/>
+                <w:sz w:val="24"/>
+                <w:szCs w:val="24"/>
+                <w:lang w:val="es-MX" w:eastAsia="es-MX"/>
+              </w:rPr>
+            </w:pPr>
+            <w:r>
+              <w:rPr>
+                <w:rFonts w:ascii="Calibri" w:eastAsia="Times New Roman" w:hAnsi="Calibri" w:cs="Calibri"/>
+                <w:b/>
+                <w:bCs/>
+                <w:color w:val="000000" w:themeColor="text1"/>
+                <w:sz w:val="24"/>
+                <w:szCs w:val="24"/>
                 <w:lang w:val="es-MX" w:eastAsia="es-MX"/>
               </w:rPr>
               <w:t>ERITROCITOS</w:t>
@@ -2810,16 +3288,25 @@
               <w:widowControl/>
               <w:autoSpaceDE/>
               <w:autoSpaceDN/>
-              <w:rPr>
-                <w:rFonts w:ascii="ADLaM Display" w:eastAsia="Times New Roman" w:hAnsi="ADLaM Display" w:cs="ADLaM Display"/>
-                <w:color w:val="000000"/>
-                <w:lang w:val="es-MX" w:eastAsia="es-MX"/>
-              </w:rPr>
-            </w:pPr>
-            <w:r>
-              <w:rPr>
-                <w:rFonts w:ascii="ADLaM Display" w:eastAsia="Times New Roman" w:hAnsi="ADLaM Display" w:cs="ADLaM Display"/>
-                <w:color w:val="000000"/>
+              <w:spacing w:before="0" w:after="0" w:line="240" w:lineRule="auto"/>
+              <w:rPr>
+                <w:rFonts w:ascii="Calibri" w:eastAsia="Times New Roman" w:hAnsi="Calibri" w:cs="Calibri"/>
+                <w:b/>
+                <w:bCs/>
+                <w:color w:val="000000" w:themeColor="text1"/>
+                <w:sz w:val="24"/>
+                <w:szCs w:val="24"/>
+                <w:lang w:val="es-MX" w:eastAsia="es-MX"/>
+              </w:rPr>
+            </w:pPr>
+            <w:r>
+              <w:rPr>
+                <w:rFonts w:ascii="Calibri" w:eastAsia="Times New Roman" w:hAnsi="Calibri" w:cs="Calibri"/>
+                <w:b/>
+                <w:bCs/>
+                <w:color w:val="000000" w:themeColor="text1"/>
+                <w:sz w:val="24"/>
+                <w:szCs w:val="24"/>
                 <w:lang w:val="es-MX" w:eastAsia="es-MX"/>
               </w:rPr>
               <w:t>{</w:t>
@@ -2827,8 +3314,12 @@
             <w:proofErr w:type="spellStart"/>
             <w:r>
               <w:rPr>
-                <w:rFonts w:ascii="ADLaM Display" w:eastAsia="Times New Roman" w:hAnsi="ADLaM Display" w:cs="ADLaM Display"/>
-                <w:color w:val="000000"/>
+                <w:rFonts w:ascii="Calibri" w:eastAsia="Times New Roman" w:hAnsi="Calibri" w:cs="Calibri"/>
+                <w:b/>
+                <w:bCs/>
+                <w:color w:val="000000" w:themeColor="text1"/>
+                <w:sz w:val="24"/>
+                <w:szCs w:val="24"/>
                 <w:lang w:val="es-MX" w:eastAsia="es-MX"/>
               </w:rPr>
               <w:t>eritrocitos_resultado</w:t>
@@ -2836,8 +3327,12 @@
             <w:proofErr w:type="spellEnd"/>
             <w:r>
               <w:rPr>
-                <w:rFonts w:ascii="ADLaM Display" w:eastAsia="Times New Roman" w:hAnsi="ADLaM Display" w:cs="ADLaM Display"/>
-                <w:color w:val="000000"/>
+                <w:rFonts w:ascii="Calibri" w:eastAsia="Times New Roman" w:hAnsi="Calibri" w:cs="Calibri"/>
+                <w:b/>
+                <w:bCs/>
+                <w:color w:val="000000" w:themeColor="text1"/>
+                <w:sz w:val="24"/>
+                <w:szCs w:val="24"/>
                 <w:lang w:val="es-MX" w:eastAsia="es-MX"/>
               </w:rPr>
               <w:t>}</w:t>
@@ -2862,16 +3357,25 @@
               <w:widowControl/>
               <w:autoSpaceDE/>
               <w:autoSpaceDN/>
-              <w:rPr>
-                <w:rFonts w:ascii="ADLaM Display" w:eastAsia="Times New Roman" w:hAnsi="ADLaM Display" w:cs="ADLaM Display"/>
-                <w:color w:val="000000"/>
-                <w:lang w:val="es-MX" w:eastAsia="es-MX"/>
-              </w:rPr>
-            </w:pPr>
-            <w:r>
-              <w:rPr>
-                <w:rFonts w:ascii="ADLaM Display" w:eastAsia="Times New Roman" w:hAnsi="ADLaM Display" w:cs="ADLaM Display"/>
-                <w:color w:val="000000"/>
+              <w:spacing w:before="0" w:after="0" w:line="240" w:lineRule="auto"/>
+              <w:rPr>
+                <w:rFonts w:ascii="Calibri" w:eastAsia="Times New Roman" w:hAnsi="Calibri" w:cs="Calibri"/>
+                <w:b/>
+                <w:bCs/>
+                <w:color w:val="000000" w:themeColor="text1"/>
+                <w:sz w:val="24"/>
+                <w:szCs w:val="24"/>
+                <w:lang w:val="es-MX" w:eastAsia="es-MX"/>
+              </w:rPr>
+            </w:pPr>
+            <w:r>
+              <w:rPr>
+                <w:rFonts w:ascii="Calibri" w:eastAsia="Times New Roman" w:hAnsi="Calibri" w:cs="Calibri"/>
+                <w:b/>
+                <w:bCs/>
+                <w:color w:val="000000" w:themeColor="text1"/>
+                <w:sz w:val="24"/>
+                <w:szCs w:val="24"/>
                 <w:lang w:val="es-MX" w:eastAsia="es-MX"/>
               </w:rPr>
               <w:t>0-3/C</w:t>
@@ -2881,7 +3385,7 @@
       </w:tr>
       <w:tr>
         <w:trPr>
-          <w:trHeight w:val="330"/>
+          <w:trHeight w:val="193" w:hRule="atLeast"/>
         </w:trPr>
         <w:tc>
           <w:tcPr>
@@ -2901,16 +3405,25 @@
               <w:widowControl/>
               <w:autoSpaceDE/>
               <w:autoSpaceDN/>
-              <w:rPr>
-                <w:rFonts w:ascii="ADLaM Display" w:eastAsia="Times New Roman" w:hAnsi="ADLaM Display" w:cs="ADLaM Display"/>
-                <w:color w:val="000000"/>
-                <w:lang w:val="es-MX" w:eastAsia="es-MX"/>
-              </w:rPr>
-            </w:pPr>
-            <w:r>
-              <w:rPr>
-                <w:rFonts w:ascii="ADLaM Display" w:eastAsia="Times New Roman" w:hAnsi="ADLaM Display" w:cs="ADLaM Display"/>
-                <w:color w:val="000000"/>
+              <w:spacing w:before="0" w:after="0" w:line="240" w:lineRule="auto"/>
+              <w:rPr>
+                <w:rFonts w:ascii="Calibri" w:eastAsia="Times New Roman" w:hAnsi="Calibri" w:cs="Calibri"/>
+                <w:b/>
+                <w:bCs/>
+                <w:color w:val="000000" w:themeColor="text1"/>
+                <w:sz w:val="24"/>
+                <w:szCs w:val="24"/>
+                <w:lang w:val="es-MX" w:eastAsia="es-MX"/>
+              </w:rPr>
+            </w:pPr>
+            <w:r>
+              <w:rPr>
+                <w:rFonts w:ascii="Calibri" w:eastAsia="Times New Roman" w:hAnsi="Calibri" w:cs="Calibri"/>
+                <w:b/>
+                <w:bCs/>
+                <w:color w:val="000000" w:themeColor="text1"/>
+                <w:sz w:val="24"/>
+                <w:szCs w:val="24"/>
                 <w:lang w:val="es-MX" w:eastAsia="es-MX"/>
               </w:rPr>
               <w:t>LEUCOCITOS</w:t>
@@ -2935,16 +3448,25 @@
               <w:widowControl/>
               <w:autoSpaceDE/>
               <w:autoSpaceDN/>
-              <w:rPr>
-                <w:rFonts w:ascii="ADLaM Display" w:eastAsia="Times New Roman" w:hAnsi="ADLaM Display" w:cs="ADLaM Display"/>
-                <w:color w:val="000000"/>
-                <w:lang w:val="es-MX" w:eastAsia="es-MX"/>
-              </w:rPr>
-            </w:pPr>
-            <w:r>
-              <w:rPr>
-                <w:rFonts w:ascii="ADLaM Display" w:eastAsia="Times New Roman" w:hAnsi="ADLaM Display" w:cs="ADLaM Display"/>
-                <w:color w:val="000000"/>
+              <w:spacing w:before="0" w:after="0" w:line="240" w:lineRule="auto"/>
+              <w:rPr>
+                <w:rFonts w:ascii="Calibri" w:eastAsia="Times New Roman" w:hAnsi="Calibri" w:cs="Calibri"/>
+                <w:b/>
+                <w:bCs/>
+                <w:color w:val="000000" w:themeColor="text1"/>
+                <w:sz w:val="24"/>
+                <w:szCs w:val="24"/>
+                <w:lang w:val="es-MX" w:eastAsia="es-MX"/>
+              </w:rPr>
+            </w:pPr>
+            <w:r>
+              <w:rPr>
+                <w:rFonts w:ascii="Calibri" w:eastAsia="Times New Roman" w:hAnsi="Calibri" w:cs="Calibri"/>
+                <w:b/>
+                <w:bCs/>
+                <w:color w:val="000000" w:themeColor="text1"/>
+                <w:sz w:val="24"/>
+                <w:szCs w:val="24"/>
                 <w:lang w:val="es-MX" w:eastAsia="es-MX"/>
               </w:rPr>
               <w:t>5/C</w:t>
@@ -2969,16 +3491,25 @@
               <w:widowControl/>
               <w:autoSpaceDE/>
               <w:autoSpaceDN/>
-              <w:rPr>
-                <w:rFonts w:ascii="ADLaM Display" w:eastAsia="Times New Roman" w:hAnsi="ADLaM Display" w:cs="ADLaM Display"/>
-                <w:color w:val="000000"/>
-                <w:lang w:val="es-MX" w:eastAsia="es-MX"/>
-              </w:rPr>
-            </w:pPr>
-            <w:r>
-              <w:rPr>
-                <w:rFonts w:ascii="ADLaM Display" w:eastAsia="Times New Roman" w:hAnsi="ADLaM Display" w:cs="ADLaM Display"/>
-                <w:color w:val="000000"/>
+              <w:spacing w:before="0" w:after="0" w:line="240" w:lineRule="auto"/>
+              <w:rPr>
+                <w:rFonts w:ascii="Calibri" w:eastAsia="Times New Roman" w:hAnsi="Calibri" w:cs="Calibri"/>
+                <w:b/>
+                <w:bCs/>
+                <w:color w:val="000000" w:themeColor="text1"/>
+                <w:sz w:val="24"/>
+                <w:szCs w:val="24"/>
+                <w:lang w:val="es-MX" w:eastAsia="es-MX"/>
+              </w:rPr>
+            </w:pPr>
+            <w:r>
+              <w:rPr>
+                <w:rFonts w:ascii="Calibri" w:eastAsia="Times New Roman" w:hAnsi="Calibri" w:cs="Calibri"/>
+                <w:b/>
+                <w:bCs/>
+                <w:color w:val="000000" w:themeColor="text1"/>
+                <w:sz w:val="24"/>
+                <w:szCs w:val="24"/>
                 <w:lang w:val="es-MX" w:eastAsia="es-MX"/>
               </w:rPr>
               <w:t>5/C</w:t>
@@ -2988,7 +3519,7 @@
       </w:tr>
       <w:tr>
         <w:trPr>
-          <w:trHeight w:val="330"/>
+          <w:trHeight w:val="193" w:hRule="atLeast"/>
         </w:trPr>
         <w:tc>
           <w:tcPr>
@@ -3008,16 +3539,25 @@
               <w:widowControl/>
               <w:autoSpaceDE/>
               <w:autoSpaceDN/>
-              <w:rPr>
-                <w:rFonts w:ascii="ADLaM Display" w:eastAsia="Times New Roman" w:hAnsi="ADLaM Display" w:cs="ADLaM Display"/>
-                <w:color w:val="000000"/>
-                <w:lang w:val="es-MX" w:eastAsia="es-MX"/>
-              </w:rPr>
-            </w:pPr>
-            <w:r>
-              <w:rPr>
-                <w:rFonts w:ascii="ADLaM Display" w:eastAsia="Times New Roman" w:hAnsi="ADLaM Display" w:cs="ADLaM Display"/>
-                <w:color w:val="000000"/>
+              <w:spacing w:before="0" w:after="0" w:line="240" w:lineRule="auto"/>
+              <w:rPr>
+                <w:rFonts w:ascii="Calibri" w:eastAsia="Times New Roman" w:hAnsi="Calibri" w:cs="Calibri"/>
+                <w:b/>
+                <w:bCs/>
+                <w:color w:val="000000" w:themeColor="text1"/>
+                <w:sz w:val="24"/>
+                <w:szCs w:val="24"/>
+                <w:lang w:val="es-MX" w:eastAsia="es-MX"/>
+              </w:rPr>
+            </w:pPr>
+            <w:r>
+              <w:rPr>
+                <w:rFonts w:ascii="Calibri" w:eastAsia="Times New Roman" w:hAnsi="Calibri" w:cs="Calibri"/>
+                <w:b/>
+                <w:bCs/>
+                <w:color w:val="000000" w:themeColor="text1"/>
+                <w:sz w:val="24"/>
+                <w:szCs w:val="24"/>
                 <w:lang w:val="es-MX" w:eastAsia="es-MX"/>
               </w:rPr>
               <w:t>CEL. EPITELIALES</w:t>
@@ -3042,16 +3582,25 @@
               <w:widowControl/>
               <w:autoSpaceDE/>
               <w:autoSpaceDN/>
-              <w:rPr>
-                <w:rFonts w:ascii="ADLaM Display" w:eastAsia="Times New Roman" w:hAnsi="ADLaM Display" w:cs="ADLaM Display"/>
-                <w:color w:val="000000"/>
-                <w:lang w:val="es-MX" w:eastAsia="es-MX"/>
-              </w:rPr>
-            </w:pPr>
-            <w:r>
-              <w:rPr>
-                <w:rFonts w:ascii="ADLaM Display" w:eastAsia="Times New Roman" w:hAnsi="ADLaM Display" w:cs="ADLaM Display"/>
-                <w:color w:val="000000"/>
+              <w:spacing w:before="0" w:after="0" w:line="240" w:lineRule="auto"/>
+              <w:rPr>
+                <w:rFonts w:ascii="Calibri" w:eastAsia="Times New Roman" w:hAnsi="Calibri" w:cs="Calibri"/>
+                <w:b/>
+                <w:bCs/>
+                <w:color w:val="000000" w:themeColor="text1"/>
+                <w:sz w:val="24"/>
+                <w:szCs w:val="24"/>
+                <w:lang w:val="es-MX" w:eastAsia="es-MX"/>
+              </w:rPr>
+            </w:pPr>
+            <w:r>
+              <w:rPr>
+                <w:rFonts w:ascii="Calibri" w:eastAsia="Times New Roman" w:hAnsi="Calibri" w:cs="Calibri"/>
+                <w:b/>
+                <w:bCs/>
+                <w:color w:val="000000" w:themeColor="text1"/>
+                <w:sz w:val="24"/>
+                <w:szCs w:val="24"/>
                 <w:lang w:val="es-MX" w:eastAsia="es-MX"/>
               </w:rPr>
               <w:t>{</w:t>
@@ -3059,41 +3608,49 @@
             <w:proofErr w:type="spellStart"/>
             <w:r>
               <w:rPr>
-                <w:rFonts w:ascii="ADLaM Display" w:eastAsia="Times New Roman" w:hAnsi="ADLaM Display" w:cs="ADLaM Display"/>
-                <w:color w:val="000000"/>
+                <w:rFonts w:ascii="Calibri" w:eastAsia="Times New Roman" w:hAnsi="Calibri" w:cs="Calibri"/>
+                <w:b/>
+                <w:bCs/>
+                <w:color w:val="000000" w:themeColor="text1"/>
+                <w:sz w:val="24"/>
+                <w:szCs w:val="24"/>
                 <w:lang w:val="es-MX" w:eastAsia="es-MX"/>
               </w:rPr>
               <w:t>cel</w:t>
             </w:r>
             <w:r>
               <w:rPr>
-                <w:rFonts w:ascii="ADLaM Display" w:eastAsia="Times New Roman" w:hAnsi="ADLaM Display" w:cs="ADLaM Display"/>
-                <w:color w:val="000000"/>
+                <w:rFonts w:ascii="Calibri" w:eastAsia="Times New Roman" w:hAnsi="Calibri" w:cs="Calibri"/>
+                <w:b/>
+                <w:bCs/>
+                <w:color w:val="000000" w:themeColor="text1"/>
+                <w:sz w:val="24"/>
+                <w:szCs w:val="24"/>
                 <w:lang w:val="es-MX" w:eastAsia="es-MX"/>
               </w:rPr>
               <w:t>_</w:t>
             </w:r>
             <w:r>
               <w:rPr>
-                <w:rFonts w:ascii="ADLaM Display" w:eastAsia="Times New Roman" w:hAnsi="ADLaM Display" w:cs="ADLaM Display"/>
-                <w:color w:val="000000"/>
-                <w:lang w:val="es-MX" w:eastAsia="es-MX"/>
-              </w:rPr>
-              <w:t>epit</w:t>
-            </w:r>
-            <w:r>
-              <w:rPr>
-                <w:rFonts w:ascii="ADLaM Display" w:eastAsia="Times New Roman" w:hAnsi="ADLaM Display" w:cs="ADLaM Display"/>
-                <w:color w:val="000000"/>
-                <w:lang w:val="es-MX" w:eastAsia="es-MX"/>
-              </w:rPr>
-              <w:t>_resultado</w:t>
+                <w:rFonts w:ascii="Calibri" w:eastAsia="Times New Roman" w:hAnsi="Calibri" w:cs="Calibri"/>
+                <w:b/>
+                <w:bCs/>
+                <w:color w:val="000000" w:themeColor="text1"/>
+                <w:sz w:val="24"/>
+                <w:szCs w:val="24"/>
+                <w:lang w:val="es-MX" w:eastAsia="es-MX"/>
+              </w:rPr>
+              <w:t>epit_resultado</w:t>
             </w:r>
             <w:proofErr w:type="spellEnd"/>
             <w:r>
               <w:rPr>
-                <w:rFonts w:ascii="ADLaM Display" w:eastAsia="Times New Roman" w:hAnsi="ADLaM Display" w:cs="ADLaM Display"/>
-                <w:color w:val="000000"/>
+                <w:rFonts w:ascii="Calibri" w:eastAsia="Times New Roman" w:hAnsi="Calibri" w:cs="Calibri"/>
+                <w:b/>
+                <w:bCs/>
+                <w:color w:val="000000" w:themeColor="text1"/>
+                <w:sz w:val="24"/>
+                <w:szCs w:val="24"/>
                 <w:lang w:val="es-MX" w:eastAsia="es-MX"/>
               </w:rPr>
               <w:t>}</w:t>
@@ -3118,9 +3675,14 @@
               <w:widowControl/>
               <w:autoSpaceDE/>
               <w:autoSpaceDN/>
-              <w:rPr>
-                <w:rFonts w:ascii="ADLaM Display" w:eastAsia="Times New Roman" w:hAnsi="ADLaM Display" w:cs="ADLaM Display"/>
-                <w:color w:val="000000"/>
+              <w:spacing w:before="0" w:after="0" w:line="240" w:lineRule="auto"/>
+              <w:rPr>
+                <w:rFonts w:ascii="Calibri" w:eastAsia="Times New Roman" w:hAnsi="Calibri" w:cs="Calibri"/>
+                <w:b/>
+                <w:bCs/>
+                <w:color w:val="000000" w:themeColor="text1"/>
+                <w:sz w:val="24"/>
+                <w:szCs w:val="24"/>
                 <w:lang w:val="es-MX" w:eastAsia="es-MX"/>
               </w:rPr>
             </w:pPr>
@@ -3129,7 +3691,7 @@
       </w:tr>
       <w:tr>
         <w:trPr>
-          <w:trHeight w:val="330"/>
+          <w:trHeight w:val="193" w:hRule="atLeast"/>
         </w:trPr>
         <w:tc>
           <w:tcPr>
@@ -3149,16 +3711,25 @@
               <w:widowControl/>
               <w:autoSpaceDE/>
               <w:autoSpaceDN/>
-              <w:rPr>
-                <w:rFonts w:ascii="ADLaM Display" w:eastAsia="Times New Roman" w:hAnsi="ADLaM Display" w:cs="ADLaM Display"/>
-                <w:color w:val="000000"/>
-                <w:lang w:val="es-MX" w:eastAsia="es-MX"/>
-              </w:rPr>
-            </w:pPr>
-            <w:r>
-              <w:rPr>
-                <w:rFonts w:ascii="ADLaM Display" w:eastAsia="Times New Roman" w:hAnsi="ADLaM Display" w:cs="ADLaM Display"/>
-                <w:color w:val="000000"/>
+              <w:spacing w:before="0" w:after="0" w:line="240" w:lineRule="auto"/>
+              <w:rPr>
+                <w:rFonts w:ascii="Calibri" w:eastAsia="Times New Roman" w:hAnsi="Calibri" w:cs="Calibri"/>
+                <w:b/>
+                <w:bCs/>
+                <w:color w:val="000000" w:themeColor="text1"/>
+                <w:sz w:val="24"/>
+                <w:szCs w:val="24"/>
+                <w:lang w:val="es-MX" w:eastAsia="es-MX"/>
+              </w:rPr>
+            </w:pPr>
+            <w:r>
+              <w:rPr>
+                <w:rFonts w:ascii="Calibri" w:eastAsia="Times New Roman" w:hAnsi="Calibri" w:cs="Calibri"/>
+                <w:b/>
+                <w:bCs/>
+                <w:color w:val="000000" w:themeColor="text1"/>
+                <w:sz w:val="24"/>
+                <w:szCs w:val="24"/>
                 <w:lang w:val="es-MX" w:eastAsia="es-MX"/>
               </w:rPr>
               <w:t>CILINDROS</w:t>
@@ -3183,16 +3754,25 @@
               <w:widowControl/>
               <w:autoSpaceDE/>
               <w:autoSpaceDN/>
-              <w:rPr>
-                <w:rFonts w:ascii="ADLaM Display" w:eastAsia="Times New Roman" w:hAnsi="ADLaM Display" w:cs="ADLaM Display"/>
-                <w:color w:val="000000"/>
-                <w:lang w:val="es-MX" w:eastAsia="es-MX"/>
-              </w:rPr>
-            </w:pPr>
-            <w:r>
-              <w:rPr>
-                <w:rFonts w:ascii="ADLaM Display" w:eastAsia="Times New Roman" w:hAnsi="ADLaM Display" w:cs="ADLaM Display"/>
-                <w:color w:val="000000"/>
+              <w:spacing w:before="0" w:after="0" w:line="240" w:lineRule="auto"/>
+              <w:rPr>
+                <w:rFonts w:ascii="Calibri" w:eastAsia="Times New Roman" w:hAnsi="Calibri" w:cs="Calibri"/>
+                <w:b/>
+                <w:bCs/>
+                <w:color w:val="000000" w:themeColor="text1"/>
+                <w:sz w:val="24"/>
+                <w:szCs w:val="24"/>
+                <w:lang w:val="es-MX" w:eastAsia="es-MX"/>
+              </w:rPr>
+            </w:pPr>
+            <w:r>
+              <w:rPr>
+                <w:rFonts w:ascii="Calibri" w:eastAsia="Times New Roman" w:hAnsi="Calibri" w:cs="Calibri"/>
+                <w:b/>
+                <w:bCs/>
+                <w:color w:val="000000" w:themeColor="text1"/>
+                <w:sz w:val="24"/>
+                <w:szCs w:val="24"/>
                 <w:lang w:val="es-MX" w:eastAsia="es-MX"/>
               </w:rPr>
               <w:t>{</w:t>
@@ -3200,25 +3780,25 @@
             <w:proofErr w:type="spellStart"/>
             <w:r>
               <w:rPr>
-                <w:rFonts w:ascii="ADLaM Display" w:eastAsia="Times New Roman" w:hAnsi="ADLaM Display" w:cs="ADLaM Display"/>
-                <w:color w:val="000000"/>
-                <w:lang w:val="es-MX" w:eastAsia="es-MX"/>
-              </w:rPr>
-              <w:t>cilindros</w:t>
-            </w:r>
-            <w:r>
-              <w:rPr>
-                <w:rFonts w:ascii="ADLaM Display" w:eastAsia="Times New Roman" w:hAnsi="ADLaM Display" w:cs="ADLaM Display"/>
-                <w:color w:val="000000"/>
-                <w:lang w:val="es-MX" w:eastAsia="es-MX"/>
-              </w:rPr>
-              <w:t>_resultado</w:t>
+                <w:rFonts w:ascii="Calibri" w:eastAsia="Times New Roman" w:hAnsi="Calibri" w:cs="Calibri"/>
+                <w:b/>
+                <w:bCs/>
+                <w:color w:val="000000" w:themeColor="text1"/>
+                <w:sz w:val="24"/>
+                <w:szCs w:val="24"/>
+                <w:lang w:val="es-MX" w:eastAsia="es-MX"/>
+              </w:rPr>
+              <w:t>cilindros_resultado</w:t>
             </w:r>
             <w:proofErr w:type="spellEnd"/>
             <w:r>
               <w:rPr>
-                <w:rFonts w:ascii="ADLaM Display" w:eastAsia="Times New Roman" w:hAnsi="ADLaM Display" w:cs="ADLaM Display"/>
-                <w:color w:val="000000"/>
+                <w:rFonts w:ascii="Calibri" w:eastAsia="Times New Roman" w:hAnsi="Calibri" w:cs="Calibri"/>
+                <w:b/>
+                <w:bCs/>
+                <w:color w:val="000000" w:themeColor="text1"/>
+                <w:sz w:val="24"/>
+                <w:szCs w:val="24"/>
                 <w:lang w:val="es-MX" w:eastAsia="es-MX"/>
               </w:rPr>
               <w:t>}</w:t>
@@ -3243,9 +3823,14 @@
               <w:widowControl/>
               <w:autoSpaceDE/>
               <w:autoSpaceDN/>
-              <w:rPr>
-                <w:rFonts w:ascii="ADLaM Display" w:eastAsia="Times New Roman" w:hAnsi="ADLaM Display" w:cs="ADLaM Display"/>
-                <w:color w:val="000000"/>
+              <w:spacing w:before="0" w:after="0" w:line="240" w:lineRule="auto"/>
+              <w:rPr>
+                <w:rFonts w:ascii="Calibri" w:eastAsia="Times New Roman" w:hAnsi="Calibri" w:cs="Calibri"/>
+                <w:b/>
+                <w:bCs/>
+                <w:color w:val="000000" w:themeColor="text1"/>
+                <w:sz w:val="24"/>
+                <w:szCs w:val="24"/>
                 <w:lang w:val="es-MX" w:eastAsia="es-MX"/>
               </w:rPr>
             </w:pPr>
@@ -3254,7 +3839,7 @@
       </w:tr>
       <w:tr>
         <w:trPr>
-          <w:trHeight w:val="330"/>
+          <w:trHeight w:val="193" w:hRule="atLeast"/>
         </w:trPr>
         <w:tc>
           <w:tcPr>
@@ -3274,16 +3859,25 @@
               <w:widowControl/>
               <w:autoSpaceDE/>
               <w:autoSpaceDN/>
-              <w:rPr>
-                <w:rFonts w:ascii="ADLaM Display" w:eastAsia="Times New Roman" w:hAnsi="ADLaM Display" w:cs="ADLaM Display"/>
-                <w:color w:val="000000"/>
-                <w:lang w:val="es-MX" w:eastAsia="es-MX"/>
-              </w:rPr>
-            </w:pPr>
-            <w:r>
-              <w:rPr>
-                <w:rFonts w:ascii="ADLaM Display" w:eastAsia="Times New Roman" w:hAnsi="ADLaM Display" w:cs="ADLaM Display"/>
-                <w:color w:val="000000"/>
+              <w:spacing w:before="0" w:after="0" w:line="240" w:lineRule="auto"/>
+              <w:rPr>
+                <w:rFonts w:ascii="Calibri" w:eastAsia="Times New Roman" w:hAnsi="Calibri" w:cs="Calibri"/>
+                <w:b/>
+                <w:bCs/>
+                <w:color w:val="000000" w:themeColor="text1"/>
+                <w:sz w:val="24"/>
+                <w:szCs w:val="24"/>
+                <w:lang w:val="es-MX" w:eastAsia="es-MX"/>
+              </w:rPr>
+            </w:pPr>
+            <w:r>
+              <w:rPr>
+                <w:rFonts w:ascii="Calibri" w:eastAsia="Times New Roman" w:hAnsi="Calibri" w:cs="Calibri"/>
+                <w:b/>
+                <w:bCs/>
+                <w:color w:val="000000" w:themeColor="text1"/>
+                <w:sz w:val="24"/>
+                <w:szCs w:val="24"/>
                 <w:lang w:val="es-MX" w:eastAsia="es-MX"/>
               </w:rPr>
               <w:t>CRISTALES</w:t>
@@ -3308,16 +3902,25 @@
               <w:widowControl/>
               <w:autoSpaceDE/>
               <w:autoSpaceDN/>
-              <w:rPr>
-                <w:rFonts w:ascii="ADLaM Display" w:eastAsia="Times New Roman" w:hAnsi="ADLaM Display" w:cs="ADLaM Display"/>
-                <w:color w:val="000000"/>
-                <w:lang w:val="es-MX" w:eastAsia="es-MX"/>
-              </w:rPr>
-            </w:pPr>
-            <w:r>
-              <w:rPr>
-                <w:rFonts w:ascii="ADLaM Display" w:eastAsia="Times New Roman" w:hAnsi="ADLaM Display" w:cs="ADLaM Display"/>
-                <w:color w:val="000000"/>
+              <w:spacing w:before="0" w:after="0" w:line="240" w:lineRule="auto"/>
+              <w:rPr>
+                <w:rFonts w:ascii="Calibri" w:eastAsia="Times New Roman" w:hAnsi="Calibri" w:cs="Calibri"/>
+                <w:b/>
+                <w:bCs/>
+                <w:color w:val="000000" w:themeColor="text1"/>
+                <w:sz w:val="24"/>
+                <w:szCs w:val="24"/>
+                <w:lang w:val="es-MX" w:eastAsia="es-MX"/>
+              </w:rPr>
+            </w:pPr>
+            <w:r>
+              <w:rPr>
+                <w:rFonts w:ascii="Calibri" w:eastAsia="Times New Roman" w:hAnsi="Calibri" w:cs="Calibri"/>
+                <w:b/>
+                <w:bCs/>
+                <w:color w:val="000000" w:themeColor="text1"/>
+                <w:sz w:val="24"/>
+                <w:szCs w:val="24"/>
                 <w:lang w:val="es-MX" w:eastAsia="es-MX"/>
               </w:rPr>
               <w:t>{</w:t>
@@ -3325,25 +3928,25 @@
             <w:proofErr w:type="spellStart"/>
             <w:r>
               <w:rPr>
-                <w:rFonts w:ascii="ADLaM Display" w:eastAsia="Times New Roman" w:hAnsi="ADLaM Display" w:cs="ADLaM Display"/>
-                <w:color w:val="000000"/>
-                <w:lang w:val="es-MX" w:eastAsia="es-MX"/>
-              </w:rPr>
-              <w:t>cristales</w:t>
-            </w:r>
-            <w:r>
-              <w:rPr>
-                <w:rFonts w:ascii="ADLaM Display" w:eastAsia="Times New Roman" w:hAnsi="ADLaM Display" w:cs="ADLaM Display"/>
-                <w:color w:val="000000"/>
-                <w:lang w:val="es-MX" w:eastAsia="es-MX"/>
-              </w:rPr>
-              <w:t>_resultado</w:t>
+                <w:rFonts w:ascii="Calibri" w:eastAsia="Times New Roman" w:hAnsi="Calibri" w:cs="Calibri"/>
+                <w:b/>
+                <w:bCs/>
+                <w:color w:val="000000" w:themeColor="text1"/>
+                <w:sz w:val="24"/>
+                <w:szCs w:val="24"/>
+                <w:lang w:val="es-MX" w:eastAsia="es-MX"/>
+              </w:rPr>
+              <w:t>cristales_resultado</w:t>
             </w:r>
             <w:proofErr w:type="spellEnd"/>
             <w:r>
               <w:rPr>
-                <w:rFonts w:ascii="ADLaM Display" w:eastAsia="Times New Roman" w:hAnsi="ADLaM Display" w:cs="ADLaM Display"/>
-                <w:color w:val="000000"/>
+                <w:rFonts w:ascii="Calibri" w:eastAsia="Times New Roman" w:hAnsi="Calibri" w:cs="Calibri"/>
+                <w:b/>
+                <w:bCs/>
+                <w:color w:val="000000" w:themeColor="text1"/>
+                <w:sz w:val="24"/>
+                <w:szCs w:val="24"/>
                 <w:lang w:val="es-MX" w:eastAsia="es-MX"/>
               </w:rPr>
               <w:t>}</w:t>
@@ -3368,9 +3971,14 @@
               <w:widowControl/>
               <w:autoSpaceDE/>
               <w:autoSpaceDN/>
-              <w:rPr>
-                <w:rFonts w:ascii="ADLaM Display" w:eastAsia="Times New Roman" w:hAnsi="ADLaM Display" w:cs="ADLaM Display"/>
-                <w:color w:val="000000"/>
+              <w:spacing w:before="0" w:after="0" w:line="240" w:lineRule="auto"/>
+              <w:rPr>
+                <w:rFonts w:ascii="Calibri" w:eastAsia="Times New Roman" w:hAnsi="Calibri" w:cs="Calibri"/>
+                <w:b/>
+                <w:bCs/>
+                <w:color w:val="000000" w:themeColor="text1"/>
+                <w:sz w:val="24"/>
+                <w:szCs w:val="24"/>
                 <w:lang w:val="es-MX" w:eastAsia="es-MX"/>
               </w:rPr>
             </w:pPr>
@@ -3379,7 +3987,7 @@
       </w:tr>
       <w:tr>
         <w:trPr>
-          <w:trHeight w:val="330"/>
+          <w:trHeight w:val="193" w:hRule="atLeast"/>
         </w:trPr>
         <w:tc>
           <w:tcPr>
@@ -3399,16 +4007,25 @@
               <w:widowControl/>
               <w:autoSpaceDE/>
               <w:autoSpaceDN/>
-              <w:rPr>
-                <w:rFonts w:ascii="ADLaM Display" w:eastAsia="Times New Roman" w:hAnsi="ADLaM Display" w:cs="ADLaM Display"/>
-                <w:color w:val="000000"/>
-                <w:lang w:val="es-MX" w:eastAsia="es-MX"/>
-              </w:rPr>
-            </w:pPr>
-            <w:r>
-              <w:rPr>
-                <w:rFonts w:ascii="ADLaM Display" w:eastAsia="Times New Roman" w:hAnsi="ADLaM Display" w:cs="ADLaM Display"/>
-                <w:color w:val="000000"/>
+              <w:spacing w:before="0" w:after="0" w:line="240" w:lineRule="auto"/>
+              <w:rPr>
+                <w:rFonts w:ascii="Calibri" w:eastAsia="Times New Roman" w:hAnsi="Calibri" w:cs="Calibri"/>
+                <w:b/>
+                <w:bCs/>
+                <w:color w:val="000000" w:themeColor="text1"/>
+                <w:sz w:val="24"/>
+                <w:szCs w:val="24"/>
+                <w:lang w:val="es-MX" w:eastAsia="es-MX"/>
+              </w:rPr>
+            </w:pPr>
+            <w:r>
+              <w:rPr>
+                <w:rFonts w:ascii="Calibri" w:eastAsia="Times New Roman" w:hAnsi="Calibri" w:cs="Calibri"/>
+                <w:b/>
+                <w:bCs/>
+                <w:color w:val="000000" w:themeColor="text1"/>
+                <w:sz w:val="24"/>
+                <w:szCs w:val="24"/>
                 <w:lang w:val="es-MX" w:eastAsia="es-MX"/>
               </w:rPr>
               <w:t>BACTERIAS</w:t>
@@ -3433,16 +4050,25 @@
               <w:widowControl/>
               <w:autoSpaceDE/>
               <w:autoSpaceDN/>
-              <w:rPr>
-                <w:rFonts w:ascii="ADLaM Display" w:eastAsia="Times New Roman" w:hAnsi="ADLaM Display" w:cs="ADLaM Display"/>
-                <w:color w:val="000000"/>
-                <w:lang w:val="es-MX" w:eastAsia="es-MX"/>
-              </w:rPr>
-            </w:pPr>
-            <w:r>
-              <w:rPr>
-                <w:rFonts w:ascii="ADLaM Display" w:eastAsia="Times New Roman" w:hAnsi="ADLaM Display" w:cs="ADLaM Display"/>
-                <w:color w:val="000000"/>
+              <w:spacing w:before="0" w:after="0" w:line="240" w:lineRule="auto"/>
+              <w:rPr>
+                <w:rFonts w:ascii="Calibri" w:eastAsia="Times New Roman" w:hAnsi="Calibri" w:cs="Calibri"/>
+                <w:b/>
+                <w:bCs/>
+                <w:color w:val="000000" w:themeColor="text1"/>
+                <w:sz w:val="24"/>
+                <w:szCs w:val="24"/>
+                <w:lang w:val="es-MX" w:eastAsia="es-MX"/>
+              </w:rPr>
+            </w:pPr>
+            <w:r>
+              <w:rPr>
+                <w:rFonts w:ascii="Calibri" w:eastAsia="Times New Roman" w:hAnsi="Calibri" w:cs="Calibri"/>
+                <w:b/>
+                <w:bCs/>
+                <w:color w:val="000000" w:themeColor="text1"/>
+                <w:sz w:val="24"/>
+                <w:szCs w:val="24"/>
                 <w:lang w:val="es-MX" w:eastAsia="es-MX"/>
               </w:rPr>
               <w:t>NEGATIVO</w:t>
@@ -3467,16 +4093,25 @@
               <w:widowControl/>
               <w:autoSpaceDE/>
               <w:autoSpaceDN/>
-              <w:rPr>
-                <w:rFonts w:ascii="ADLaM Display" w:eastAsia="Times New Roman" w:hAnsi="ADLaM Display" w:cs="ADLaM Display"/>
-                <w:color w:val="000000"/>
-                <w:lang w:val="es-MX" w:eastAsia="es-MX"/>
-              </w:rPr>
-            </w:pPr>
-            <w:r>
-              <w:rPr>
-                <w:rFonts w:ascii="ADLaM Display" w:eastAsia="Times New Roman" w:hAnsi="ADLaM Display" w:cs="ADLaM Display"/>
-                <w:color w:val="000000"/>
+              <w:spacing w:before="0" w:after="0" w:line="240" w:lineRule="auto"/>
+              <w:rPr>
+                <w:rFonts w:ascii="Calibri" w:eastAsia="Times New Roman" w:hAnsi="Calibri" w:cs="Calibri"/>
+                <w:b/>
+                <w:bCs/>
+                <w:color w:val="000000" w:themeColor="text1"/>
+                <w:sz w:val="24"/>
+                <w:szCs w:val="24"/>
+                <w:lang w:val="es-MX" w:eastAsia="es-MX"/>
+              </w:rPr>
+            </w:pPr>
+            <w:r>
+              <w:rPr>
+                <w:rFonts w:ascii="Calibri" w:eastAsia="Times New Roman" w:hAnsi="Calibri" w:cs="Calibri"/>
+                <w:b/>
+                <w:bCs/>
+                <w:color w:val="000000" w:themeColor="text1"/>
+                <w:sz w:val="24"/>
+                <w:szCs w:val="24"/>
                 <w:lang w:val="es-MX" w:eastAsia="es-MX"/>
               </w:rPr>
               <w:t>NEGATIVO</w:t>
@@ -3486,7 +4121,7 @@
       </w:tr>
       <w:tr>
         <w:trPr>
-          <w:trHeight w:val="330"/>
+          <w:trHeight w:val="193" w:hRule="atLeast"/>
         </w:trPr>
         <w:tc>
           <w:tcPr>
@@ -3506,16 +4141,25 @@
               <w:widowControl/>
               <w:autoSpaceDE/>
               <w:autoSpaceDN/>
-              <w:rPr>
-                <w:rFonts w:ascii="ADLaM Display" w:eastAsia="Times New Roman" w:hAnsi="ADLaM Display" w:cs="ADLaM Display"/>
-                <w:color w:val="000000"/>
-                <w:lang w:val="es-MX" w:eastAsia="es-MX"/>
-              </w:rPr>
-            </w:pPr>
-            <w:r>
-              <w:rPr>
-                <w:rFonts w:ascii="ADLaM Display" w:eastAsia="Times New Roman" w:hAnsi="ADLaM Display" w:cs="ADLaM Display"/>
-                <w:color w:val="000000"/>
+              <w:spacing w:before="0" w:after="0" w:line="240" w:lineRule="auto"/>
+              <w:rPr>
+                <w:rFonts w:ascii="Calibri" w:eastAsia="Times New Roman" w:hAnsi="Calibri" w:cs="Calibri"/>
+                <w:b/>
+                <w:bCs/>
+                <w:color w:val="000000" w:themeColor="text1"/>
+                <w:sz w:val="24"/>
+                <w:szCs w:val="24"/>
+                <w:lang w:val="es-MX" w:eastAsia="es-MX"/>
+              </w:rPr>
+            </w:pPr>
+            <w:r>
+              <w:rPr>
+                <w:rFonts w:ascii="Calibri" w:eastAsia="Times New Roman" w:hAnsi="Calibri" w:cs="Calibri"/>
+                <w:b/>
+                <w:bCs/>
+                <w:color w:val="000000" w:themeColor="text1"/>
+                <w:sz w:val="24"/>
+                <w:szCs w:val="24"/>
                 <w:lang w:val="es-MX" w:eastAsia="es-MX"/>
               </w:rPr>
               <w:t>FILAMENTO MUCOSO</w:t>
@@ -3540,16 +4184,25 @@
               <w:widowControl/>
               <w:autoSpaceDE/>
               <w:autoSpaceDN/>
-              <w:rPr>
-                <w:rFonts w:ascii="ADLaM Display" w:eastAsia="Times New Roman" w:hAnsi="ADLaM Display" w:cs="ADLaM Display"/>
-                <w:color w:val="000000"/>
-                <w:lang w:val="es-MX" w:eastAsia="es-MX"/>
-              </w:rPr>
-            </w:pPr>
-            <w:r>
-              <w:rPr>
-                <w:rFonts w:ascii="ADLaM Display" w:eastAsia="Times New Roman" w:hAnsi="ADLaM Display" w:cs="ADLaM Display"/>
-                <w:color w:val="000000"/>
+              <w:spacing w:before="0" w:after="0" w:line="240" w:lineRule="auto"/>
+              <w:rPr>
+                <w:rFonts w:ascii="Calibri" w:eastAsia="Times New Roman" w:hAnsi="Calibri" w:cs="Calibri"/>
+                <w:b/>
+                <w:bCs/>
+                <w:color w:val="000000" w:themeColor="text1"/>
+                <w:sz w:val="24"/>
+                <w:szCs w:val="24"/>
+                <w:lang w:val="es-MX" w:eastAsia="es-MX"/>
+              </w:rPr>
+            </w:pPr>
+            <w:r>
+              <w:rPr>
+                <w:rFonts w:ascii="Calibri" w:eastAsia="Times New Roman" w:hAnsi="Calibri" w:cs="Calibri"/>
+                <w:b/>
+                <w:bCs/>
+                <w:color w:val="000000" w:themeColor="text1"/>
+                <w:sz w:val="24"/>
+                <w:szCs w:val="24"/>
                 <w:lang w:val="es-MX" w:eastAsia="es-MX"/>
               </w:rPr>
               <w:t>NEGATIVO</w:t>
@@ -3574,16 +4227,25 @@
               <w:widowControl/>
               <w:autoSpaceDE/>
               <w:autoSpaceDN/>
-              <w:rPr>
-                <w:rFonts w:ascii="ADLaM Display" w:eastAsia="Times New Roman" w:hAnsi="ADLaM Display" w:cs="ADLaM Display"/>
-                <w:color w:val="000000"/>
-                <w:lang w:val="es-MX" w:eastAsia="es-MX"/>
-              </w:rPr>
-            </w:pPr>
-            <w:r>
-              <w:rPr>
-                <w:rFonts w:ascii="ADLaM Display" w:eastAsia="Times New Roman" w:hAnsi="ADLaM Display" w:cs="ADLaM Display"/>
-                <w:color w:val="000000"/>
+              <w:spacing w:before="0" w:after="0" w:line="240" w:lineRule="auto"/>
+              <w:rPr>
+                <w:rFonts w:ascii="Calibri" w:eastAsia="Times New Roman" w:hAnsi="Calibri" w:cs="Calibri"/>
+                <w:b/>
+                <w:bCs/>
+                <w:color w:val="000000" w:themeColor="text1"/>
+                <w:sz w:val="24"/>
+                <w:szCs w:val="24"/>
+                <w:lang w:val="es-MX" w:eastAsia="es-MX"/>
+              </w:rPr>
+            </w:pPr>
+            <w:r>
+              <w:rPr>
+                <w:rFonts w:ascii="Calibri" w:eastAsia="Times New Roman" w:hAnsi="Calibri" w:cs="Calibri"/>
+                <w:b/>
+                <w:bCs/>
+                <w:color w:val="000000" w:themeColor="text1"/>
+                <w:sz w:val="24"/>
+                <w:szCs w:val="24"/>
                 <w:lang w:val="es-MX" w:eastAsia="es-MX"/>
               </w:rPr>
               <w:t>NEGATIVO</w:t>
@@ -3593,7 +4255,7 @@
       </w:tr>
       <w:tr>
         <w:trPr>
-          <w:trHeight w:val="330"/>
+          <w:trHeight w:val="193" w:hRule="atLeast"/>
         </w:trPr>
         <w:tc>
           <w:tcPr>
@@ -3613,16 +4275,25 @@
               <w:widowControl/>
               <w:autoSpaceDE/>
               <w:autoSpaceDN/>
-              <w:rPr>
-                <w:rFonts w:ascii="ADLaM Display" w:eastAsia="Times New Roman" w:hAnsi="ADLaM Display" w:cs="ADLaM Display"/>
-                <w:color w:val="000000"/>
-                <w:lang w:val="es-MX" w:eastAsia="es-MX"/>
-              </w:rPr>
-            </w:pPr>
-            <w:r>
-              <w:rPr>
-                <w:rFonts w:ascii="ADLaM Display" w:eastAsia="Times New Roman" w:hAnsi="ADLaM Display" w:cs="ADLaM Display"/>
-                <w:color w:val="000000"/>
+              <w:spacing w:before="0" w:after="0" w:line="240" w:lineRule="auto"/>
+              <w:rPr>
+                <w:rFonts w:ascii="Calibri" w:eastAsia="Times New Roman" w:hAnsi="Calibri" w:cs="Calibri"/>
+                <w:b/>
+                <w:bCs/>
+                <w:color w:val="000000" w:themeColor="text1"/>
+                <w:sz w:val="24"/>
+                <w:szCs w:val="24"/>
+                <w:lang w:val="es-MX" w:eastAsia="es-MX"/>
+              </w:rPr>
+            </w:pPr>
+            <w:r>
+              <w:rPr>
+                <w:rFonts w:ascii="Calibri" w:eastAsia="Times New Roman" w:hAnsi="Calibri" w:cs="Calibri"/>
+                <w:b/>
+                <w:bCs/>
+                <w:color w:val="000000" w:themeColor="text1"/>
+                <w:sz w:val="24"/>
+                <w:szCs w:val="24"/>
                 <w:lang w:val="es-MX" w:eastAsia="es-MX"/>
               </w:rPr>
               <w:t>LEVADURAS</w:t>
@@ -3647,16 +4318,25 @@
               <w:widowControl/>
               <w:autoSpaceDE/>
               <w:autoSpaceDN/>
-              <w:rPr>
-                <w:rFonts w:ascii="ADLaM Display" w:eastAsia="Times New Roman" w:hAnsi="ADLaM Display" w:cs="ADLaM Display"/>
-                <w:color w:val="000000"/>
-                <w:lang w:val="es-MX" w:eastAsia="es-MX"/>
-              </w:rPr>
-            </w:pPr>
-            <w:r>
-              <w:rPr>
-                <w:rFonts w:ascii="ADLaM Display" w:eastAsia="Times New Roman" w:hAnsi="ADLaM Display" w:cs="ADLaM Display"/>
-                <w:color w:val="000000"/>
+              <w:spacing w:before="0" w:after="0" w:line="240" w:lineRule="auto"/>
+              <w:rPr>
+                <w:rFonts w:ascii="Calibri" w:eastAsia="Times New Roman" w:hAnsi="Calibri" w:cs="Calibri"/>
+                <w:b/>
+                <w:bCs/>
+                <w:color w:val="000000" w:themeColor="text1"/>
+                <w:sz w:val="24"/>
+                <w:szCs w:val="24"/>
+                <w:lang w:val="es-MX" w:eastAsia="es-MX"/>
+              </w:rPr>
+            </w:pPr>
+            <w:r>
+              <w:rPr>
+                <w:rFonts w:ascii="Calibri" w:eastAsia="Times New Roman" w:hAnsi="Calibri" w:cs="Calibri"/>
+                <w:b/>
+                <w:bCs/>
+                <w:color w:val="000000" w:themeColor="text1"/>
+                <w:sz w:val="24"/>
+                <w:szCs w:val="24"/>
                 <w:lang w:val="es-MX" w:eastAsia="es-MX"/>
               </w:rPr>
               <w:t>NEGATIVO</w:t>
@@ -3681,16 +4361,25 @@
               <w:widowControl/>
               <w:autoSpaceDE/>
               <w:autoSpaceDN/>
-              <w:rPr>
-                <w:rFonts w:ascii="ADLaM Display" w:eastAsia="Times New Roman" w:hAnsi="ADLaM Display" w:cs="ADLaM Display"/>
-                <w:color w:val="000000"/>
-                <w:lang w:val="es-MX" w:eastAsia="es-MX"/>
-              </w:rPr>
-            </w:pPr>
-            <w:r>
-              <w:rPr>
-                <w:rFonts w:ascii="ADLaM Display" w:eastAsia="Times New Roman" w:hAnsi="ADLaM Display" w:cs="ADLaM Display"/>
-                <w:color w:val="000000"/>
+              <w:spacing w:before="0" w:after="0" w:line="240" w:lineRule="auto"/>
+              <w:rPr>
+                <w:rFonts w:ascii="Calibri" w:eastAsia="Times New Roman" w:hAnsi="Calibri" w:cs="Calibri"/>
+                <w:b/>
+                <w:bCs/>
+                <w:color w:val="000000" w:themeColor="text1"/>
+                <w:sz w:val="24"/>
+                <w:szCs w:val="24"/>
+                <w:lang w:val="es-MX" w:eastAsia="es-MX"/>
+              </w:rPr>
+            </w:pPr>
+            <w:r>
+              <w:rPr>
+                <w:rFonts w:ascii="Calibri" w:eastAsia="Times New Roman" w:hAnsi="Calibri" w:cs="Calibri"/>
+                <w:b/>
+                <w:bCs/>
+                <w:color w:val="000000" w:themeColor="text1"/>
+                <w:sz w:val="24"/>
+                <w:szCs w:val="24"/>
                 <w:lang w:val="es-MX" w:eastAsia="es-MX"/>
               </w:rPr>
               <w:t>NEGATIVO</w:t>
@@ -3699,35 +4388,267 @@
         </w:tc>
       </w:tr>
     </w:tbl>
-    <w:p/>
-    <w:p/>
-    <w:p/>
-    <w:p/>
-    <w:p/>
-    <w:p/>
-    <w:p/>
-    <w:p/>
-    <w:p/>
-    <w:p/>
-    <w:p/>
-    <w:p/>
-    <w:p/>
-    <w:p/>
-    <w:p/>
-    <w:p/>
-    <w:p/>
-    <w:p/>
-    <w:p/>
-    <w:p/>
-    <w:p/>
-    <w:p/>
-    <w:p/>
     <w:p>
       <w:pPr>
+        <w:spacing w:before="0" w:after="0" w:line="240" w:lineRule="auto"/>
+        <w:rPr>
+          <w:rFonts w:ascii="Calibri" w:hAnsi="Calibri" w:cs="Calibri"/>
+          <w:b/>
+          <w:bCs/>
+          <w:color w:val="000000" w:themeColor="text1"/>
+        </w:rPr>
+      </w:pPr>
+    </w:p>
+    <w:p>
+      <w:pPr>
+        <w:spacing w:before="0" w:after="0" w:line="240" w:lineRule="auto"/>
+        <w:rPr>
+          <w:rFonts w:ascii="Calibri" w:hAnsi="Calibri" w:cs="Calibri"/>
+          <w:b/>
+          <w:bCs/>
+          <w:color w:val="000000" w:themeColor="text1"/>
+        </w:rPr>
+      </w:pPr>
+    </w:p>
+    <w:p>
+      <w:pPr>
+        <w:spacing w:before="0" w:after="0" w:line="240" w:lineRule="auto"/>
+        <w:rPr>
+          <w:rFonts w:ascii="Calibri" w:hAnsi="Calibri" w:cs="Calibri"/>
+          <w:b/>
+          <w:bCs/>
+          <w:color w:val="000000" w:themeColor="text1"/>
+        </w:rPr>
+      </w:pPr>
+    </w:p>
+    <w:p>
+      <w:pPr>
+        <w:spacing w:before="0" w:after="0" w:line="240" w:lineRule="auto"/>
+        <w:rPr>
+          <w:rFonts w:ascii="Calibri" w:hAnsi="Calibri" w:cs="Calibri"/>
+          <w:b/>
+          <w:bCs/>
+          <w:color w:val="000000" w:themeColor="text1"/>
+        </w:rPr>
+      </w:pPr>
+    </w:p>
+    <w:p>
+      <w:pPr>
+        <w:spacing w:before="0" w:after="0" w:line="240" w:lineRule="auto"/>
+        <w:rPr>
+          <w:rFonts w:ascii="Calibri" w:hAnsi="Calibri" w:cs="Calibri"/>
+          <w:b/>
+          <w:bCs/>
+          <w:color w:val="000000" w:themeColor="text1"/>
+        </w:rPr>
+      </w:pPr>
+    </w:p>
+    <w:p>
+      <w:pPr>
+        <w:spacing w:before="0" w:after="0" w:line="240" w:lineRule="auto"/>
+        <w:rPr>
+          <w:rFonts w:ascii="Calibri" w:hAnsi="Calibri" w:cs="Calibri"/>
+          <w:b/>
+          <w:bCs/>
+          <w:color w:val="000000" w:themeColor="text1"/>
+        </w:rPr>
+      </w:pPr>
+    </w:p>
+    <w:p>
+      <w:pPr>
+        <w:spacing w:before="0" w:after="0" w:line="240" w:lineRule="auto"/>
+        <w:rPr>
+          <w:rFonts w:ascii="Calibri" w:hAnsi="Calibri" w:cs="Calibri"/>
+          <w:b/>
+          <w:bCs/>
+          <w:color w:val="000000" w:themeColor="text1"/>
+        </w:rPr>
+      </w:pPr>
+    </w:p>
+    <w:p>
+      <w:pPr>
+        <w:spacing w:before="0" w:after="0" w:line="240" w:lineRule="auto"/>
+        <w:rPr>
+          <w:rFonts w:ascii="Calibri" w:hAnsi="Calibri" w:cs="Calibri"/>
+          <w:b/>
+          <w:bCs/>
+          <w:color w:val="000000" w:themeColor="text1"/>
+        </w:rPr>
+      </w:pPr>
+    </w:p>
+    <w:p>
+      <w:pPr>
+        <w:spacing w:before="0" w:after="0" w:line="240" w:lineRule="auto"/>
+        <w:rPr>
+          <w:rFonts w:ascii="Calibri" w:hAnsi="Calibri" w:cs="Calibri"/>
+          <w:b/>
+          <w:bCs/>
+          <w:color w:val="000000" w:themeColor="text1"/>
+        </w:rPr>
+      </w:pPr>
+    </w:p>
+    <w:p>
+      <w:pPr>
+        <w:spacing w:before="0" w:after="0" w:line="240" w:lineRule="auto"/>
+        <w:rPr>
+          <w:rFonts w:ascii="Calibri" w:hAnsi="Calibri" w:cs="Calibri"/>
+          <w:b/>
+          <w:bCs/>
+          <w:color w:val="000000" w:themeColor="text1"/>
+        </w:rPr>
+      </w:pPr>
+    </w:p>
+    <w:p>
+      <w:pPr>
+        <w:spacing w:before="0" w:after="0" w:line="240" w:lineRule="auto"/>
+        <w:rPr>
+          <w:rFonts w:ascii="Calibri" w:hAnsi="Calibri" w:cs="Calibri"/>
+          <w:b/>
+          <w:bCs/>
+          <w:color w:val="000000" w:themeColor="text1"/>
+        </w:rPr>
+      </w:pPr>
+    </w:p>
+    <w:p>
+      <w:pPr>
+        <w:spacing w:before="0" w:after="0" w:line="240" w:lineRule="auto"/>
+        <w:rPr>
+          <w:rFonts w:ascii="Calibri" w:hAnsi="Calibri" w:cs="Calibri"/>
+          <w:b/>
+          <w:bCs/>
+          <w:color w:val="000000" w:themeColor="text1"/>
+        </w:rPr>
+      </w:pPr>
+    </w:p>
+    <w:p>
+      <w:pPr>
+        <w:spacing w:before="0" w:after="0" w:line="240" w:lineRule="auto"/>
+        <w:rPr>
+          <w:rFonts w:ascii="Calibri" w:hAnsi="Calibri" w:cs="Calibri"/>
+          <w:b/>
+          <w:bCs/>
+          <w:color w:val="000000" w:themeColor="text1"/>
+        </w:rPr>
+      </w:pPr>
+    </w:p>
+    <w:p>
+      <w:pPr>
+        <w:spacing w:before="0" w:after="0" w:line="240" w:lineRule="auto"/>
+        <w:rPr>
+          <w:rFonts w:ascii="Calibri" w:hAnsi="Calibri" w:cs="Calibri"/>
+          <w:b/>
+          <w:bCs/>
+          <w:color w:val="000000" w:themeColor="text1"/>
+        </w:rPr>
+      </w:pPr>
+    </w:p>
+    <w:p>
+      <w:pPr>
+        <w:spacing w:before="0" w:after="0" w:line="240" w:lineRule="auto"/>
+        <w:rPr>
+          <w:rFonts w:ascii="Calibri" w:hAnsi="Calibri" w:cs="Calibri"/>
+          <w:b/>
+          <w:bCs/>
+          <w:color w:val="000000" w:themeColor="text1"/>
+        </w:rPr>
+      </w:pPr>
+    </w:p>
+    <w:p>
+      <w:pPr>
+        <w:spacing w:before="0" w:after="0" w:line="240" w:lineRule="auto"/>
+        <w:rPr>
+          <w:rFonts w:ascii="Calibri" w:hAnsi="Calibri" w:cs="Calibri"/>
+          <w:b/>
+          <w:bCs/>
+          <w:color w:val="000000" w:themeColor="text1"/>
+        </w:rPr>
+      </w:pPr>
+    </w:p>
+    <w:p>
+      <w:pPr>
+        <w:spacing w:before="0" w:after="0" w:line="240" w:lineRule="auto"/>
+        <w:rPr>
+          <w:rFonts w:ascii="Calibri" w:hAnsi="Calibri" w:cs="Calibri"/>
+          <w:b/>
+          <w:bCs/>
+          <w:color w:val="000000" w:themeColor="text1"/>
+        </w:rPr>
+      </w:pPr>
+    </w:p>
+    <w:p>
+      <w:pPr>
+        <w:spacing w:before="0" w:after="0" w:line="240" w:lineRule="auto"/>
+        <w:rPr>
+          <w:rFonts w:ascii="Calibri" w:hAnsi="Calibri" w:cs="Calibri"/>
+          <w:b/>
+          <w:bCs/>
+          <w:color w:val="000000" w:themeColor="text1"/>
+        </w:rPr>
+      </w:pPr>
+    </w:p>
+    <w:p>
+      <w:pPr>
+        <w:spacing w:before="0" w:after="0" w:line="240" w:lineRule="auto"/>
+        <w:rPr>
+          <w:rFonts w:ascii="Calibri" w:hAnsi="Calibri" w:cs="Calibri"/>
+          <w:b/>
+          <w:bCs/>
+          <w:color w:val="000000" w:themeColor="text1"/>
+        </w:rPr>
+      </w:pPr>
+    </w:p>
+    <w:p>
+      <w:pPr>
+        <w:spacing w:before="0" w:after="0" w:line="240" w:lineRule="auto"/>
+        <w:rPr>
+          <w:rFonts w:ascii="Calibri" w:hAnsi="Calibri" w:cs="Calibri"/>
+          <w:b/>
+          <w:bCs/>
+          <w:color w:val="000000" w:themeColor="text1"/>
+        </w:rPr>
+      </w:pPr>
+    </w:p>
+    <w:p>
+      <w:pPr>
+        <w:spacing w:before="0" w:after="0" w:line="240" w:lineRule="auto"/>
+        <w:rPr>
+          <w:rFonts w:ascii="Calibri" w:hAnsi="Calibri" w:cs="Calibri"/>
+          <w:b/>
+          <w:bCs/>
+          <w:color w:val="000000" w:themeColor="text1"/>
+        </w:rPr>
+      </w:pPr>
+    </w:p>
+    <w:p>
+      <w:pPr>
+        <w:spacing w:before="0" w:after="0" w:line="240" w:lineRule="auto"/>
+        <w:rPr>
+          <w:rFonts w:ascii="Calibri" w:hAnsi="Calibri" w:cs="Calibri"/>
+          <w:b/>
+          <w:bCs/>
+          <w:color w:val="000000" w:themeColor="text1"/>
+        </w:rPr>
+      </w:pPr>
+    </w:p>
+    <w:p>
+      <w:pPr>
+        <w:spacing w:before="0" w:after="0" w:line="240" w:lineRule="auto"/>
+        <w:rPr>
+          <w:rFonts w:ascii="Calibri" w:hAnsi="Calibri" w:cs="Calibri"/>
+          <w:b/>
+          <w:bCs/>
+          <w:color w:val="000000" w:themeColor="text1"/>
+        </w:rPr>
+      </w:pPr>
+    </w:p>
+    <w:p>
+      <w:pPr>
+        <w:spacing w:before="0" w:after="0" w:line="240" w:lineRule="auto"/>
         <w:jc w:val="right"/>
       </w:pPr>
       <w:r>
         <w:rPr>
+          <w:rFonts w:ascii="Calibri" w:hAnsi="Calibri"/>
           <w:noProof/>
           <w:lang w:val="es-MX" w:eastAsia="es-MX"/>
         </w:rPr>
@@ -3783,7 +4704,7 @@
       </w:r>
       <w:r>
         <w:rPr>
-          <w:rFonts w:ascii="Times New Roman"/>
+          <w:rFonts w:ascii="Calibri" w:hAnsi="Calibri"/>
           <w:noProof/>
           <w:sz w:val="20"/>
           <w:lang w:val="es-MX" w:eastAsia="es-MX"/>
@@ -3881,7 +4802,7 @@
     </w:p>
     <w:sectPr>
       <w:pgSz w:w="12240" w:h="15840"/>
-      <w:pgMar w:top="1417" w:right="1701" w:bottom="1417" w:left="1701" w:header="708" w:footer="708" w:gutter="0"/>
+      <w:pgMar w:top="397" w:right="1701" w:bottom="397" w:left="1701" w:header="708" w:footer="708" w:gutter="0"/>
       <w:cols w:space="708"/>
       <w:docGrid w:linePitch="360"/>
     </w:sectPr>

</xml_diff>

<commit_message>
fix(orina): restore upper header spacing without touching exam table
- Corrected clipped/compressed upper block in urinalysis PDF export
- Restored visual spacing for lab header and patient metadata
- Preserved Calibri font and existing DOCX layout distribution
- Kept exam table, lower block, placeholders, and result logic unchanged
- Maintained eritrocitos discrete output and one-page PDF layout
</commit_message>
<xml_diff>
--- a/examenes_medicos_templates/FORMATO EXAMEN DE ORINA.docx
+++ b/examenes_medicos_templates/FORMATO EXAMEN DE ORINA.docx
@@ -544,7 +544,7 @@
       </w:tblGrid>
       <w:tr>
         <w:trPr>
-          <w:trHeight w:val="87"/>
+          <w:trHeight w:val="410" w:hRule="atLeast"/>
         </w:trPr>
         <w:tc>
           <w:tcPr>
@@ -556,15 +556,21 @@
               <w:right w:val="nil"/>
             </w:tcBorders>
             <w:noWrap/>
-            <w:vAlign w:val="bottom"/>
-            <w:hideMark/>
-          </w:tcPr>
-          <w:p>
-            <w:pPr>
-              <w:widowControl/>
-              <w:autoSpaceDE/>
-              <w:autoSpaceDN/>
-              <w:spacing w:before="0" w:after="0" w:line="240" w:lineRule="auto"/>
+            <w:vAlign w:val="center"/>
+            <w:hideMark/>
+            <w:tcMar>
+              <w:top w:w="20" w:type="dxa"/>
+              <w:bottom w:w="20" w:type="dxa"/>
+              <w:start w:w="85" w:type="dxa"/>
+              <w:end w:w="85" w:type="dxa"/>
+            </w:tcMar>
+          </w:tcPr>
+          <w:p>
+            <w:pPr>
+              <w:widowControl/>
+              <w:autoSpaceDE/>
+              <w:autoSpaceDN/>
+              <w:spacing w:before="0" w:after="60" w:line="240" w:lineRule="auto"/>
               <w:rPr>
                 <w:rFonts w:ascii="Calibri" w:eastAsia="Times New Roman" w:hAnsi="Calibri" w:cs="Calibri"/>
                 <w:b/>
@@ -625,15 +631,21 @@
               <w:right w:val="nil"/>
             </w:tcBorders>
             <w:noWrap/>
-            <w:vAlign w:val="bottom"/>
-            <w:hideMark/>
-          </w:tcPr>
-          <w:p>
-            <w:pPr>
-              <w:widowControl/>
-              <w:autoSpaceDE/>
-              <w:autoSpaceDN/>
-              <w:spacing w:before="0" w:after="0" w:line="240" w:lineRule="auto"/>
+            <w:vAlign w:val="center"/>
+            <w:hideMark/>
+            <w:tcMar>
+              <w:top w:w="20" w:type="dxa"/>
+              <w:bottom w:w="20" w:type="dxa"/>
+              <w:start w:w="85" w:type="dxa"/>
+              <w:end w:w="85" w:type="dxa"/>
+            </w:tcMar>
+          </w:tcPr>
+          <w:p>
+            <w:pPr>
+              <w:widowControl/>
+              <w:autoSpaceDE/>
+              <w:autoSpaceDN/>
+              <w:spacing w:before="0" w:after="60" w:line="240" w:lineRule="auto"/>
               <w:rPr>
                 <w:rFonts w:ascii="Calibri" w:eastAsia="Times New Roman" w:hAnsi="Calibri" w:cs="Calibri"/>
                 <w:b/>
@@ -656,15 +668,21 @@
               <w:right w:val="nil"/>
             </w:tcBorders>
             <w:noWrap/>
-            <w:vAlign w:val="bottom"/>
-            <w:hideMark/>
-          </w:tcPr>
-          <w:p>
-            <w:pPr>
-              <w:widowControl/>
-              <w:autoSpaceDE/>
-              <w:autoSpaceDN/>
-              <w:spacing w:before="0" w:after="0" w:line="240" w:lineRule="auto"/>
+            <w:vAlign w:val="center"/>
+            <w:hideMark/>
+            <w:tcMar>
+              <w:top w:w="20" w:type="dxa"/>
+              <w:bottom w:w="20" w:type="dxa"/>
+              <w:start w:w="85" w:type="dxa"/>
+              <w:end w:w="85" w:type="dxa"/>
+            </w:tcMar>
+          </w:tcPr>
+          <w:p>
+            <w:pPr>
+              <w:widowControl/>
+              <w:autoSpaceDE/>
+              <w:autoSpaceDN/>
+              <w:spacing w:before="0" w:after="60" w:line="240" w:lineRule="auto"/>
               <w:rPr>
                 <w:rFonts w:ascii="Calibri" w:eastAsia="Times New Roman" w:hAnsi="Calibri" w:cs="Calibri"/>
                 <w:b/>
@@ -699,15 +717,21 @@
               <w:right w:val="nil"/>
             </w:tcBorders>
             <w:noWrap/>
-            <w:vAlign w:val="bottom"/>
-            <w:hideMark/>
-          </w:tcPr>
-          <w:p>
-            <w:pPr>
-              <w:widowControl/>
-              <w:autoSpaceDE/>
-              <w:autoSpaceDN/>
-              <w:spacing w:before="0" w:after="0" w:line="240" w:lineRule="auto"/>
+            <w:vAlign w:val="center"/>
+            <w:hideMark/>
+            <w:tcMar>
+              <w:top w:w="20" w:type="dxa"/>
+              <w:bottom w:w="20" w:type="dxa"/>
+              <w:start w:w="85" w:type="dxa"/>
+              <w:end w:w="85" w:type="dxa"/>
+            </w:tcMar>
+          </w:tcPr>
+          <w:p>
+            <w:pPr>
+              <w:widowControl/>
+              <w:autoSpaceDE/>
+              <w:autoSpaceDN/>
+              <w:spacing w:before="0" w:after="60" w:line="240" w:lineRule="auto"/>
               <w:rPr>
                 <w:rFonts w:ascii="Calibri" w:eastAsia="Times New Roman" w:hAnsi="Calibri" w:cs="Calibri"/>
                 <w:b/>
@@ -730,15 +754,21 @@
               <w:right w:val="nil"/>
             </w:tcBorders>
             <w:noWrap/>
-            <w:vAlign w:val="bottom"/>
-            <w:hideMark/>
-          </w:tcPr>
-          <w:p>
-            <w:pPr>
-              <w:widowControl/>
-              <w:autoSpaceDE/>
-              <w:autoSpaceDN/>
-              <w:spacing w:before="0" w:after="0" w:line="240" w:lineRule="auto"/>
+            <w:vAlign w:val="center"/>
+            <w:hideMark/>
+            <w:tcMar>
+              <w:top w:w="20" w:type="dxa"/>
+              <w:bottom w:w="20" w:type="dxa"/>
+              <w:start w:w="85" w:type="dxa"/>
+              <w:end w:w="85" w:type="dxa"/>
+            </w:tcMar>
+          </w:tcPr>
+          <w:p>
+            <w:pPr>
+              <w:widowControl/>
+              <w:autoSpaceDE/>
+              <w:autoSpaceDN/>
+              <w:spacing w:before="0" w:after="60" w:line="240" w:lineRule="auto"/>
               <w:rPr>
                 <w:rFonts w:ascii="Calibri" w:eastAsia="Times New Roman" w:hAnsi="Calibri" w:cs="Calibri"/>
                 <w:b/>
@@ -754,7 +784,7 @@
       </w:tr>
       <w:tr>
         <w:trPr>
-          <w:trHeight w:val="330"/>
+          <w:trHeight w:val="410" w:hRule="atLeast"/>
         </w:trPr>
         <w:tc>
           <w:tcPr>
@@ -767,15 +797,21 @@
               <w:right w:val="nil"/>
             </w:tcBorders>
             <w:noWrap/>
-            <w:vAlign w:val="bottom"/>
-            <w:hideMark/>
-          </w:tcPr>
-          <w:p>
-            <w:pPr>
-              <w:widowControl/>
-              <w:autoSpaceDE/>
-              <w:autoSpaceDN/>
-              <w:spacing w:before="0" w:after="0" w:line="240" w:lineRule="auto"/>
+            <w:vAlign w:val="center"/>
+            <w:hideMark/>
+            <w:tcMar>
+              <w:top w:w="20" w:type="dxa"/>
+              <w:bottom w:w="20" w:type="dxa"/>
+              <w:start w:w="85" w:type="dxa"/>
+              <w:end w:w="85" w:type="dxa"/>
+            </w:tcMar>
+          </w:tcPr>
+          <w:p>
+            <w:pPr>
+              <w:widowControl/>
+              <w:autoSpaceDE/>
+              <w:autoSpaceDN/>
+              <w:spacing w:before="0" w:after="60" w:line="240" w:lineRule="auto"/>
               <w:rPr>
                 <w:rFonts w:ascii="Calibri" w:eastAsia="Times New Roman" w:hAnsi="Calibri" w:cs="Calibri"/>
                 <w:b/>
@@ -810,15 +846,21 @@
               <w:right w:val="nil"/>
             </w:tcBorders>
             <w:noWrap/>
-            <w:vAlign w:val="bottom"/>
-            <w:hideMark/>
-          </w:tcPr>
-          <w:p>
-            <w:pPr>
-              <w:widowControl/>
-              <w:autoSpaceDE/>
-              <w:autoSpaceDN/>
-              <w:spacing w:before="0" w:after="0" w:line="240" w:lineRule="auto"/>
+            <w:vAlign w:val="center"/>
+            <w:hideMark/>
+            <w:tcMar>
+              <w:top w:w="20" w:type="dxa"/>
+              <w:bottom w:w="20" w:type="dxa"/>
+              <w:start w:w="85" w:type="dxa"/>
+              <w:end w:w="85" w:type="dxa"/>
+            </w:tcMar>
+          </w:tcPr>
+          <w:p>
+            <w:pPr>
+              <w:widowControl/>
+              <w:autoSpaceDE/>
+              <w:autoSpaceDN/>
+              <w:spacing w:before="0" w:after="60" w:line="240" w:lineRule="auto"/>
               <w:rPr>
                 <w:rFonts w:ascii="Calibri" w:eastAsia="Times New Roman" w:hAnsi="Calibri" w:cs="Calibri"/>
                 <w:b/>
@@ -853,15 +895,21 @@
               <w:right w:val="nil"/>
             </w:tcBorders>
             <w:noWrap/>
-            <w:vAlign w:val="bottom"/>
-            <w:hideMark/>
-          </w:tcPr>
-          <w:p>
-            <w:pPr>
-              <w:widowControl/>
-              <w:autoSpaceDE/>
-              <w:autoSpaceDN/>
-              <w:spacing w:before="0" w:after="0" w:line="240" w:lineRule="auto"/>
+            <w:vAlign w:val="center"/>
+            <w:hideMark/>
+            <w:tcMar>
+              <w:top w:w="20" w:type="dxa"/>
+              <w:bottom w:w="20" w:type="dxa"/>
+              <w:start w:w="85" w:type="dxa"/>
+              <w:end w:w="85" w:type="dxa"/>
+            </w:tcMar>
+          </w:tcPr>
+          <w:p>
+            <w:pPr>
+              <w:widowControl/>
+              <w:autoSpaceDE/>
+              <w:autoSpaceDN/>
+              <w:spacing w:before="0" w:after="60" w:line="240" w:lineRule="auto"/>
               <w:rPr>
                 <w:rFonts w:ascii="Calibri" w:eastAsia="Times New Roman" w:hAnsi="Calibri" w:cs="Calibri"/>
                 <w:b/>
@@ -884,15 +932,21 @@
               <w:right w:val="nil"/>
             </w:tcBorders>
             <w:noWrap/>
-            <w:vAlign w:val="bottom"/>
-            <w:hideMark/>
-          </w:tcPr>
-          <w:p>
-            <w:pPr>
-              <w:widowControl/>
-              <w:autoSpaceDE/>
-              <w:autoSpaceDN/>
-              <w:spacing w:before="0" w:after="0" w:line="240" w:lineRule="auto"/>
+            <w:vAlign w:val="center"/>
+            <w:hideMark/>
+            <w:tcMar>
+              <w:top w:w="20" w:type="dxa"/>
+              <w:bottom w:w="20" w:type="dxa"/>
+              <w:start w:w="85" w:type="dxa"/>
+              <w:end w:w="85" w:type="dxa"/>
+            </w:tcMar>
+          </w:tcPr>
+          <w:p>
+            <w:pPr>
+              <w:widowControl/>
+              <w:autoSpaceDE/>
+              <w:autoSpaceDN/>
+              <w:spacing w:before="0" w:after="60" w:line="240" w:lineRule="auto"/>
               <w:rPr>
                 <w:rFonts w:ascii="Calibri" w:eastAsia="Times New Roman" w:hAnsi="Calibri" w:cs="Calibri"/>
                 <w:b/>
@@ -908,7 +962,7 @@
       </w:tr>
       <w:tr>
         <w:trPr>
-          <w:trHeight w:val="330"/>
+          <w:trHeight w:val="410" w:hRule="atLeast"/>
         </w:trPr>
         <w:tc>
           <w:tcPr>
@@ -920,15 +974,21 @@
               <w:right w:val="nil"/>
             </w:tcBorders>
             <w:noWrap/>
-            <w:vAlign w:val="bottom"/>
-            <w:hideMark/>
-          </w:tcPr>
-          <w:p>
-            <w:pPr>
-              <w:widowControl/>
-              <w:autoSpaceDE/>
-              <w:autoSpaceDN/>
-              <w:spacing w:before="0" w:after="0" w:line="240" w:lineRule="auto"/>
+            <w:vAlign w:val="center"/>
+            <w:hideMark/>
+            <w:tcMar>
+              <w:top w:w="20" w:type="dxa"/>
+              <w:bottom w:w="20" w:type="dxa"/>
+              <w:start w:w="85" w:type="dxa"/>
+              <w:end w:w="85" w:type="dxa"/>
+            </w:tcMar>
+          </w:tcPr>
+          <w:p>
+            <w:pPr>
+              <w:widowControl/>
+              <w:autoSpaceDE/>
+              <w:autoSpaceDN/>
+              <w:spacing w:before="0" w:after="60" w:line="240" w:lineRule="auto"/>
               <w:rPr>
                 <w:rFonts w:ascii="Calibri" w:eastAsia="Times New Roman" w:hAnsi="Calibri" w:cs="Calibri"/>
                 <w:b/>
@@ -989,15 +1049,21 @@
               <w:right w:val="nil"/>
             </w:tcBorders>
             <w:noWrap/>
-            <w:vAlign w:val="bottom"/>
-            <w:hideMark/>
-          </w:tcPr>
-          <w:p>
-            <w:pPr>
-              <w:widowControl/>
-              <w:autoSpaceDE/>
-              <w:autoSpaceDN/>
-              <w:spacing w:before="0" w:after="0" w:line="240" w:lineRule="auto"/>
+            <w:vAlign w:val="center"/>
+            <w:hideMark/>
+            <w:tcMar>
+              <w:top w:w="20" w:type="dxa"/>
+              <w:bottom w:w="20" w:type="dxa"/>
+              <w:start w:w="85" w:type="dxa"/>
+              <w:end w:w="85" w:type="dxa"/>
+            </w:tcMar>
+          </w:tcPr>
+          <w:p>
+            <w:pPr>
+              <w:widowControl/>
+              <w:autoSpaceDE/>
+              <w:autoSpaceDN/>
+              <w:spacing w:before="0" w:after="60" w:line="240" w:lineRule="auto"/>
               <w:rPr>
                 <w:rFonts w:ascii="Calibri" w:eastAsia="Times New Roman" w:hAnsi="Calibri" w:cs="Calibri"/>
                 <w:b/>
@@ -1020,15 +1086,21 @@
               <w:right w:val="nil"/>
             </w:tcBorders>
             <w:noWrap/>
-            <w:vAlign w:val="bottom"/>
-            <w:hideMark/>
-          </w:tcPr>
-          <w:p>
-            <w:pPr>
-              <w:widowControl/>
-              <w:autoSpaceDE/>
-              <w:autoSpaceDN/>
-              <w:spacing w:before="0" w:after="0" w:line="240" w:lineRule="auto"/>
+            <w:vAlign w:val="center"/>
+            <w:hideMark/>
+            <w:tcMar>
+              <w:top w:w="20" w:type="dxa"/>
+              <w:bottom w:w="20" w:type="dxa"/>
+              <w:start w:w="85" w:type="dxa"/>
+              <w:end w:w="85" w:type="dxa"/>
+            </w:tcMar>
+          </w:tcPr>
+          <w:p>
+            <w:pPr>
+              <w:widowControl/>
+              <w:autoSpaceDE/>
+              <w:autoSpaceDN/>
+              <w:spacing w:before="0" w:after="60" w:line="240" w:lineRule="auto"/>
               <w:rPr>
                 <w:rFonts w:ascii="Calibri" w:eastAsia="Times New Roman" w:hAnsi="Calibri" w:cs="Calibri"/>
                 <w:b/>
@@ -1063,15 +1135,21 @@
               <w:right w:val="nil"/>
             </w:tcBorders>
             <w:noWrap/>
-            <w:vAlign w:val="bottom"/>
-            <w:hideMark/>
-          </w:tcPr>
-          <w:p>
-            <w:pPr>
-              <w:widowControl/>
-              <w:autoSpaceDE/>
-              <w:autoSpaceDN/>
-              <w:spacing w:before="0" w:after="0" w:line="240" w:lineRule="auto"/>
+            <w:vAlign w:val="center"/>
+            <w:hideMark/>
+            <w:tcMar>
+              <w:top w:w="20" w:type="dxa"/>
+              <w:bottom w:w="20" w:type="dxa"/>
+              <w:start w:w="85" w:type="dxa"/>
+              <w:end w:w="85" w:type="dxa"/>
+            </w:tcMar>
+          </w:tcPr>
+          <w:p>
+            <w:pPr>
+              <w:widowControl/>
+              <w:autoSpaceDE/>
+              <w:autoSpaceDN/>
+              <w:spacing w:before="0" w:after="60" w:line="240" w:lineRule="auto"/>
               <w:rPr>
                 <w:rFonts w:ascii="Calibri" w:eastAsia="Times New Roman" w:hAnsi="Calibri" w:cs="Calibri"/>
                 <w:b/>
@@ -1094,15 +1172,21 @@
               <w:right w:val="nil"/>
             </w:tcBorders>
             <w:noWrap/>
-            <w:vAlign w:val="bottom"/>
-            <w:hideMark/>
-          </w:tcPr>
-          <w:p>
-            <w:pPr>
-              <w:widowControl/>
-              <w:autoSpaceDE/>
-              <w:autoSpaceDN/>
-              <w:spacing w:before="0" w:after="0" w:line="240" w:lineRule="auto"/>
+            <w:vAlign w:val="center"/>
+            <w:hideMark/>
+            <w:tcMar>
+              <w:top w:w="20" w:type="dxa"/>
+              <w:bottom w:w="20" w:type="dxa"/>
+              <w:start w:w="85" w:type="dxa"/>
+              <w:end w:w="85" w:type="dxa"/>
+            </w:tcMar>
+          </w:tcPr>
+          <w:p>
+            <w:pPr>
+              <w:widowControl/>
+              <w:autoSpaceDE/>
+              <w:autoSpaceDN/>
+              <w:spacing w:before="0" w:after="60" w:line="240" w:lineRule="auto"/>
               <w:rPr>
                 <w:rFonts w:ascii="Calibri" w:eastAsia="Times New Roman" w:hAnsi="Calibri" w:cs="Calibri"/>
                 <w:b/>
@@ -1173,7 +1257,7 @@
       </w:tblGrid>
       <w:tr>
         <w:trPr>
-          <w:trHeight w:val="193" w:hRule="atLeast"/>
+          <w:trHeight w:val="346" w:hRule="atLeast"/>
         </w:trPr>
         <w:tc>
           <w:tcPr>
@@ -1194,7 +1278,7 @@
               <w:widowControl/>
               <w:autoSpaceDE/>
               <w:autoSpaceDN/>
-              <w:spacing w:before="0" w:after="0" w:line="240" w:lineRule="auto"/>
+              <w:spacing w:before="120" w:after="0" w:line="240" w:lineRule="auto"/>
               <w:jc w:val="center"/>
               <w:rPr>
                 <w:rFonts w:ascii="Calibri" w:eastAsia="Times New Roman" w:hAnsi="Calibri" w:cs="Calibri"/>
@@ -1223,7 +1307,7 @@
       </w:tr>
       <w:tr>
         <w:trPr>
-          <w:trHeight w:val="193" w:hRule="atLeast"/>
+          <w:trHeight w:val="202" w:hRule="atLeast"/>
         </w:trPr>
         <w:tc>
           <w:tcPr>
@@ -1322,7 +1406,7 @@
       </w:tr>
       <w:tr>
         <w:trPr>
-          <w:trHeight w:val="193" w:hRule="atLeast"/>
+          <w:trHeight w:val="202" w:hRule="atLeast"/>
         </w:trPr>
         <w:tc>
           <w:tcPr>
@@ -1420,7 +1504,7 @@
       </w:tr>
       <w:tr>
         <w:trPr>
-          <w:trHeight w:val="193" w:hRule="atLeast"/>
+          <w:trHeight w:val="288" w:hRule="atLeast"/>
         </w:trPr>
         <w:tc>
           <w:tcPr>
@@ -1560,7 +1644,7 @@
       </w:tr>
       <w:tr>
         <w:trPr>
-          <w:trHeight w:val="193" w:hRule="atLeast"/>
+          <w:trHeight w:val="144" w:hRule="atLeast"/>
         </w:trPr>
         <w:tc>
           <w:tcPr>
@@ -4802,7 +4886,7 @@
     </w:p>
     <w:sectPr>
       <w:pgSz w:w="12240" w:h="15840"/>
-      <w:pgMar w:top="397" w:right="1701" w:bottom="397" w:left="1701" w:header="708" w:footer="708" w:gutter="0"/>
+      <w:pgMar w:top="709" w:right="1701" w:bottom="397" w:left="1701" w:header="708" w:footer="708" w:gutter="0"/>
       <w:cols w:space="708"/>
       <w:docGrid w:linePitch="360"/>
     </w:sectPr>

</xml_diff>

<commit_message>
fix(orina): freeze template layout and restrict generation to placeholders only
- Stopped modifying DOCX layout during urinalysis generation
- Preserved existing Calibri font, margins, spacing, tables, and header distribution
- Restricted generation pipeline to placeholder replacement only
- Ensured the base template remains unchanged and only temporary output copies are written
- Kept eritrocitos output limited to discrete values: 0/C, 1/C, 2/C, or 3/C
- Prevented visual reformatting during DOCX to PDF export
</commit_message>
<xml_diff>
--- a/examenes_medicos_templates/FORMATO EXAMEN DE ORINA.docx
+++ b/examenes_medicos_templates/FORMATO EXAMEN DE ORINA.docx
@@ -3,9 +3,6 @@
 <w:document xmlns:wpc="http://schemas.microsoft.com/office/word/2010/wordprocessingCanvas" xmlns:cx="http://schemas.microsoft.com/office/drawing/2014/chartex" xmlns:cx1="http://schemas.microsoft.com/office/drawing/2015/9/8/chartex" xmlns:cx2="http://schemas.microsoft.com/office/drawing/2015/10/21/chartex" xmlns:cx3="http://schemas.microsoft.com/office/drawing/2016/5/9/chartex" xmlns:cx4="http://schemas.microsoft.com/office/drawing/2016/5/10/chartex" xmlns:cx5="http://schemas.microsoft.com/office/drawing/2016/5/11/chartex" xmlns:cx6="http://schemas.microsoft.com/office/drawing/2016/5/12/chartex" xmlns:cx7="http://schemas.microsoft.com/office/drawing/2016/5/13/chartex" xmlns:cx8="http://schemas.microsoft.com/office/drawing/2016/5/14/chartex" xmlns:mc="http://schemas.openxmlformats.org/markup-compatibility/2006" xmlns:aink="http://schemas.microsoft.com/office/drawing/2016/ink" xmlns:am3d="http://schemas.microsoft.com/office/drawing/2017/model3d" xmlns:o="urn:schemas-microsoft-com:office:office" xmlns:oel="http://schemas.microsoft.com/office/2019/extlst" xmlns:r="http://schemas.openxmlformats.org/officeDocument/2006/relationships" xmlns:m="http://schemas.openxmlformats.org/officeDocument/2006/math" xmlns:v="urn:schemas-microsoft-com:vml" xmlns:wp14="http://schemas.microsoft.com/office/word/2010/wordprocessingDrawing" xmlns:wp="http://schemas.openxmlformats.org/drawingml/2006/wordprocessingDrawing" xmlns:w10="urn:schemas-microsoft-com:office:word" xmlns:w="http://schemas.openxmlformats.org/wordprocessingml/2006/main" xmlns:w14="http://schemas.microsoft.com/office/word/2010/wordml" xmlns:w15="http://schemas.microsoft.com/office/word/2012/wordml" xmlns:w16cex="http://schemas.microsoft.com/office/word/2018/wordml/cex" xmlns:w16cid="http://schemas.microsoft.com/office/word/2016/wordml/cid" xmlns:w16="http://schemas.microsoft.com/office/word/2018/wordml" xmlns:w16du="http://schemas.microsoft.com/office/word/2023/wordml/word16du" xmlns:w16sdtdh="http://schemas.microsoft.com/office/word/2020/wordml/sdtdatahash" xmlns:w16sdtfl="http://schemas.microsoft.com/office/word/2024/wordml/sdtformatlock" xmlns:w16se="http://schemas.microsoft.com/office/word/2015/wordml/symex" xmlns:wpg="http://schemas.microsoft.com/office/word/2010/wordprocessingGroup" xmlns:wpi="http://schemas.microsoft.com/office/word/2010/wordprocessingInk" xmlns:wne="http://schemas.microsoft.com/office/word/2006/wordml" xmlns:wps="http://schemas.microsoft.com/office/word/2010/wordprocessingShape" mc:Ignorable="w14 w15 w16se w16cid w16 w16cex w16sdtdh w16sdtfl w16du wp14">
   <w:body>
     <w:p>
-      <w:pPr>
-        <w:spacing w:before="0" w:after="0" w:line="240" w:lineRule="auto"/>
-      </w:pPr>
       <w:r>
         <w:rPr>
           <w:rFonts w:ascii="Calibri" w:hAnsi="Calibri"/>
@@ -16,13 +13,13 @@
         <mc:AlternateContent>
           <mc:Choice Requires="wpg">
             <w:drawing>
-              <wp:anchor distT="0" distB="0" distL="114300" distR="114300" simplePos="0" relativeHeight="251662336" behindDoc="0" locked="0" layoutInCell="1" allowOverlap="1" wp14:anchorId="21E7EAE1" wp14:editId="413C630F">
+              <wp:anchor distT="0" distB="0" distL="114300" distR="114300" simplePos="0" relativeHeight="251662336" behindDoc="0" locked="0" layoutInCell="1" allowOverlap="1" wp14:anchorId="21E7EAE1" wp14:editId="32EFBDA4">
                 <wp:simplePos x="0" y="0"/>
                 <wp:positionH relativeFrom="page">
-                  <wp:posOffset>0</wp:posOffset>
+                  <wp:align>left</wp:align>
                 </wp:positionH>
                 <wp:positionV relativeFrom="paragraph">
-                  <wp:posOffset>-639283</wp:posOffset>
+                  <wp:posOffset>-273050</wp:posOffset>
                 </wp:positionV>
                 <wp:extent cx="7750810" cy="1162050"/>
                 <wp:effectExtent l="0" t="0" r="21590" b="19050"/>
@@ -343,7 +340,7 @@
           </mc:Choice>
           <mc:Fallback>
             <w:pict>
-              <v:group w14:anchorId="21E7EAE1" id="Grupo 17" o:spid="_x0000_s1026" style="position:absolute;margin-left:0;margin-top:-50.35pt;width:610.3pt;height:91.5pt;z-index:251662336;mso-position-horizontal-relative:page;mso-width-relative:margin;mso-height-relative:margin" coordsize="76104,11620" o:gfxdata="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">
+              <v:group w14:anchorId="21E7EAE1" id="Grupo 17" o:spid="_x0000_s1026" style="position:absolute;margin-left:0;margin-top:-21.5pt;width:610.3pt;height:91.5pt;z-index:251662336;mso-position-horizontal:left;mso-position-horizontal-relative:page;mso-width-relative:margin;mso-height-relative:margin" coordsize="76104,11620" o:gfxdata="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">
                 <v:shapetype id="_x0000_t202" coordsize="21600,21600" o:spt="202" path="m,l,21600r21600,l21600,xe">
                   <v:stroke joinstyle="miter"/>
                   <v:path gradientshapeok="t" o:connecttype="rect"/>
@@ -510,25 +507,14 @@
         </mc:AlternateContent>
       </w:r>
     </w:p>
-    <w:p>
-      <w:pPr>
-        <w:spacing w:before="0" w:after="0" w:line="240" w:lineRule="auto"/>
-      </w:pPr>
-    </w:p>
-    <w:p>
-      <w:pPr>
-        <w:spacing w:before="0" w:after="0" w:line="240" w:lineRule="auto"/>
-      </w:pPr>
-    </w:p>
-    <w:p>
-      <w:pPr>
-        <w:spacing w:before="0" w:after="0" w:line="240" w:lineRule="auto"/>
-      </w:pPr>
-    </w:p>
+    <w:p/>
+    <w:p/>
+    <w:p/>
     <w:tbl>
       <w:tblPr>
-        <w:tblpPr w:leftFromText="141" w:rightFromText="141" w:vertAnchor="text" w:horzAnchor="page" w:tblpX="43" w:tblpY="89"/>
-        <w:tblW w:w="11485" w:type="dxa"/>
+        <w:tblpPr w:leftFromText="141" w:rightFromText="141" w:vertAnchor="text" w:horzAnchor="page" w:tblpX="43" w:tblpY="549"/>
+        <w:tblW w:w="11515" w:type="dxa"/>
+        <w:tblLayout w:type="fixed"/>
         <w:tblCellMar>
           <w:left w:w="70" w:type="dxa"/>
           <w:right w:w="70" w:type="dxa"/>
@@ -537,14 +523,14 @@
       </w:tblPr>
       <w:tblGrid>
         <w:gridCol w:w="5938"/>
-        <w:gridCol w:w="160"/>
+        <w:gridCol w:w="190"/>
         <w:gridCol w:w="3825"/>
         <w:gridCol w:w="242"/>
         <w:gridCol w:w="1320"/>
       </w:tblGrid>
       <w:tr>
         <w:trPr>
-          <w:trHeight w:val="410" w:hRule="atLeast"/>
+          <w:trHeight w:val="122"/>
         </w:trPr>
         <w:tc>
           <w:tcPr>
@@ -556,21 +542,21 @@
               <w:right w:val="nil"/>
             </w:tcBorders>
             <w:noWrap/>
-            <w:vAlign w:val="center"/>
-            <w:hideMark/>
             <w:tcMar>
               <w:top w:w="20" w:type="dxa"/>
+              <w:left w:w="85" w:type="dxa"/>
               <w:bottom w:w="20" w:type="dxa"/>
-              <w:start w:w="85" w:type="dxa"/>
-              <w:end w:w="85" w:type="dxa"/>
+              <w:right w:w="85" w:type="dxa"/>
             </w:tcMar>
-          </w:tcPr>
-          <w:p>
-            <w:pPr>
-              <w:widowControl/>
-              <w:autoSpaceDE/>
-              <w:autoSpaceDN/>
-              <w:spacing w:before="0" w:after="60" w:line="240" w:lineRule="auto"/>
+            <w:vAlign w:val="center"/>
+            <w:hideMark/>
+          </w:tcPr>
+          <w:p>
+            <w:pPr>
+              <w:widowControl/>
+              <w:autoSpaceDE/>
+              <w:autoSpaceDN/>
+              <w:spacing w:after="60"/>
               <w:rPr>
                 <w:rFonts w:ascii="Calibri" w:eastAsia="Times New Roman" w:hAnsi="Calibri" w:cs="Calibri"/>
                 <w:b/>
@@ -623,29 +609,29 @@
         </w:tc>
         <w:tc>
           <w:tcPr>
-            <w:tcW w:w="160" w:type="dxa"/>
-            <w:tcBorders>
-              <w:top w:val="nil"/>
-              <w:left w:val="nil"/>
-              <w:bottom w:val="nil"/>
-              <w:right w:val="nil"/>
-            </w:tcBorders>
-            <w:noWrap/>
-            <w:vAlign w:val="center"/>
-            <w:hideMark/>
+            <w:tcW w:w="190" w:type="dxa"/>
+            <w:tcBorders>
+              <w:top w:val="nil"/>
+              <w:left w:val="nil"/>
+              <w:bottom w:val="nil"/>
+              <w:right w:val="nil"/>
+            </w:tcBorders>
+            <w:noWrap/>
             <w:tcMar>
               <w:top w:w="20" w:type="dxa"/>
+              <w:left w:w="85" w:type="dxa"/>
               <w:bottom w:w="20" w:type="dxa"/>
-              <w:start w:w="85" w:type="dxa"/>
-              <w:end w:w="85" w:type="dxa"/>
+              <w:right w:w="85" w:type="dxa"/>
             </w:tcMar>
-          </w:tcPr>
-          <w:p>
-            <w:pPr>
-              <w:widowControl/>
-              <w:autoSpaceDE/>
-              <w:autoSpaceDN/>
-              <w:spacing w:before="0" w:after="60" w:line="240" w:lineRule="auto"/>
+            <w:vAlign w:val="center"/>
+            <w:hideMark/>
+          </w:tcPr>
+          <w:p>
+            <w:pPr>
+              <w:widowControl/>
+              <w:autoSpaceDE/>
+              <w:autoSpaceDN/>
+              <w:spacing w:after="60"/>
               <w:rPr>
                 <w:rFonts w:ascii="Calibri" w:eastAsia="Times New Roman" w:hAnsi="Calibri" w:cs="Calibri"/>
                 <w:b/>
@@ -668,21 +654,21 @@
               <w:right w:val="nil"/>
             </w:tcBorders>
             <w:noWrap/>
-            <w:vAlign w:val="center"/>
-            <w:hideMark/>
             <w:tcMar>
               <w:top w:w="20" w:type="dxa"/>
+              <w:left w:w="85" w:type="dxa"/>
               <w:bottom w:w="20" w:type="dxa"/>
-              <w:start w:w="85" w:type="dxa"/>
-              <w:end w:w="85" w:type="dxa"/>
+              <w:right w:w="85" w:type="dxa"/>
             </w:tcMar>
-          </w:tcPr>
-          <w:p>
-            <w:pPr>
-              <w:widowControl/>
-              <w:autoSpaceDE/>
-              <w:autoSpaceDN/>
-              <w:spacing w:before="0" w:after="60" w:line="240" w:lineRule="auto"/>
+            <w:vAlign w:val="center"/>
+            <w:hideMark/>
+          </w:tcPr>
+          <w:p>
+            <w:pPr>
+              <w:widowControl/>
+              <w:autoSpaceDE/>
+              <w:autoSpaceDN/>
+              <w:spacing w:after="60"/>
               <w:rPr>
                 <w:rFonts w:ascii="Calibri" w:eastAsia="Times New Roman" w:hAnsi="Calibri" w:cs="Calibri"/>
                 <w:b/>
@@ -717,21 +703,21 @@
               <w:right w:val="nil"/>
             </w:tcBorders>
             <w:noWrap/>
-            <w:vAlign w:val="center"/>
-            <w:hideMark/>
             <w:tcMar>
               <w:top w:w="20" w:type="dxa"/>
+              <w:left w:w="85" w:type="dxa"/>
               <w:bottom w:w="20" w:type="dxa"/>
-              <w:start w:w="85" w:type="dxa"/>
-              <w:end w:w="85" w:type="dxa"/>
+              <w:right w:w="85" w:type="dxa"/>
             </w:tcMar>
-          </w:tcPr>
-          <w:p>
-            <w:pPr>
-              <w:widowControl/>
-              <w:autoSpaceDE/>
-              <w:autoSpaceDN/>
-              <w:spacing w:before="0" w:after="60" w:line="240" w:lineRule="auto"/>
+            <w:vAlign w:val="center"/>
+            <w:hideMark/>
+          </w:tcPr>
+          <w:p>
+            <w:pPr>
+              <w:widowControl/>
+              <w:autoSpaceDE/>
+              <w:autoSpaceDN/>
+              <w:spacing w:after="60"/>
               <w:rPr>
                 <w:rFonts w:ascii="Calibri" w:eastAsia="Times New Roman" w:hAnsi="Calibri" w:cs="Calibri"/>
                 <w:b/>
@@ -754,21 +740,21 @@
               <w:right w:val="nil"/>
             </w:tcBorders>
             <w:noWrap/>
-            <w:vAlign w:val="center"/>
-            <w:hideMark/>
             <w:tcMar>
               <w:top w:w="20" w:type="dxa"/>
+              <w:left w:w="85" w:type="dxa"/>
               <w:bottom w:w="20" w:type="dxa"/>
-              <w:start w:w="85" w:type="dxa"/>
-              <w:end w:w="85" w:type="dxa"/>
+              <w:right w:w="85" w:type="dxa"/>
             </w:tcMar>
-          </w:tcPr>
-          <w:p>
-            <w:pPr>
-              <w:widowControl/>
-              <w:autoSpaceDE/>
-              <w:autoSpaceDN/>
-              <w:spacing w:before="0" w:after="60" w:line="240" w:lineRule="auto"/>
+            <w:vAlign w:val="center"/>
+            <w:hideMark/>
+          </w:tcPr>
+          <w:p>
+            <w:pPr>
+              <w:widowControl/>
+              <w:autoSpaceDE/>
+              <w:autoSpaceDN/>
+              <w:spacing w:after="60"/>
               <w:rPr>
                 <w:rFonts w:ascii="Calibri" w:eastAsia="Times New Roman" w:hAnsi="Calibri" w:cs="Calibri"/>
                 <w:b/>
@@ -784,11 +770,11 @@
       </w:tr>
       <w:tr>
         <w:trPr>
-          <w:trHeight w:val="410" w:hRule="atLeast"/>
+          <w:trHeight w:val="46"/>
         </w:trPr>
         <w:tc>
           <w:tcPr>
-            <w:tcW w:w="6098" w:type="dxa"/>
+            <w:tcW w:w="6128" w:type="dxa"/>
             <w:gridSpan w:val="2"/>
             <w:tcBorders>
               <w:top w:val="nil"/>
@@ -797,21 +783,21 @@
               <w:right w:val="nil"/>
             </w:tcBorders>
             <w:noWrap/>
-            <w:vAlign w:val="center"/>
-            <w:hideMark/>
             <w:tcMar>
               <w:top w:w="20" w:type="dxa"/>
+              <w:left w:w="85" w:type="dxa"/>
               <w:bottom w:w="20" w:type="dxa"/>
-              <w:start w:w="85" w:type="dxa"/>
-              <w:end w:w="85" w:type="dxa"/>
+              <w:right w:w="85" w:type="dxa"/>
             </w:tcMar>
-          </w:tcPr>
-          <w:p>
-            <w:pPr>
-              <w:widowControl/>
-              <w:autoSpaceDE/>
-              <w:autoSpaceDN/>
-              <w:spacing w:before="0" w:after="60" w:line="240" w:lineRule="auto"/>
+            <w:vAlign w:val="center"/>
+            <w:hideMark/>
+          </w:tcPr>
+          <w:p>
+            <w:pPr>
+              <w:widowControl/>
+              <w:autoSpaceDE/>
+              <w:autoSpaceDN/>
+              <w:spacing w:after="60"/>
               <w:rPr>
                 <w:rFonts w:ascii="Calibri" w:eastAsia="Times New Roman" w:hAnsi="Calibri" w:cs="Calibri"/>
                 <w:b/>
@@ -846,21 +832,21 @@
               <w:right w:val="nil"/>
             </w:tcBorders>
             <w:noWrap/>
-            <w:vAlign w:val="center"/>
-            <w:hideMark/>
             <w:tcMar>
               <w:top w:w="20" w:type="dxa"/>
+              <w:left w:w="85" w:type="dxa"/>
               <w:bottom w:w="20" w:type="dxa"/>
-              <w:start w:w="85" w:type="dxa"/>
-              <w:end w:w="85" w:type="dxa"/>
+              <w:right w:w="85" w:type="dxa"/>
             </w:tcMar>
-          </w:tcPr>
-          <w:p>
-            <w:pPr>
-              <w:widowControl/>
-              <w:autoSpaceDE/>
-              <w:autoSpaceDN/>
-              <w:spacing w:before="0" w:after="60" w:line="240" w:lineRule="auto"/>
+            <w:vAlign w:val="center"/>
+            <w:hideMark/>
+          </w:tcPr>
+          <w:p>
+            <w:pPr>
+              <w:widowControl/>
+              <w:autoSpaceDE/>
+              <w:autoSpaceDN/>
+              <w:spacing w:after="60"/>
               <w:rPr>
                 <w:rFonts w:ascii="Calibri" w:eastAsia="Times New Roman" w:hAnsi="Calibri" w:cs="Calibri"/>
                 <w:b/>
@@ -895,21 +881,21 @@
               <w:right w:val="nil"/>
             </w:tcBorders>
             <w:noWrap/>
-            <w:vAlign w:val="center"/>
-            <w:hideMark/>
             <w:tcMar>
               <w:top w:w="20" w:type="dxa"/>
+              <w:left w:w="85" w:type="dxa"/>
               <w:bottom w:w="20" w:type="dxa"/>
-              <w:start w:w="85" w:type="dxa"/>
-              <w:end w:w="85" w:type="dxa"/>
+              <w:right w:w="85" w:type="dxa"/>
             </w:tcMar>
-          </w:tcPr>
-          <w:p>
-            <w:pPr>
-              <w:widowControl/>
-              <w:autoSpaceDE/>
-              <w:autoSpaceDN/>
-              <w:spacing w:before="0" w:after="60" w:line="240" w:lineRule="auto"/>
+            <w:vAlign w:val="center"/>
+            <w:hideMark/>
+          </w:tcPr>
+          <w:p>
+            <w:pPr>
+              <w:widowControl/>
+              <w:autoSpaceDE/>
+              <w:autoSpaceDN/>
+              <w:spacing w:after="60"/>
               <w:rPr>
                 <w:rFonts w:ascii="Calibri" w:eastAsia="Times New Roman" w:hAnsi="Calibri" w:cs="Calibri"/>
                 <w:b/>
@@ -932,21 +918,21 @@
               <w:right w:val="nil"/>
             </w:tcBorders>
             <w:noWrap/>
-            <w:vAlign w:val="center"/>
-            <w:hideMark/>
             <w:tcMar>
               <w:top w:w="20" w:type="dxa"/>
+              <w:left w:w="85" w:type="dxa"/>
               <w:bottom w:w="20" w:type="dxa"/>
-              <w:start w:w="85" w:type="dxa"/>
-              <w:end w:w="85" w:type="dxa"/>
+              <w:right w:w="85" w:type="dxa"/>
             </w:tcMar>
-          </w:tcPr>
-          <w:p>
-            <w:pPr>
-              <w:widowControl/>
-              <w:autoSpaceDE/>
-              <w:autoSpaceDN/>
-              <w:spacing w:before="0" w:after="60" w:line="240" w:lineRule="auto"/>
+            <w:vAlign w:val="center"/>
+            <w:hideMark/>
+          </w:tcPr>
+          <w:p>
+            <w:pPr>
+              <w:widowControl/>
+              <w:autoSpaceDE/>
+              <w:autoSpaceDN/>
+              <w:spacing w:after="60"/>
               <w:rPr>
                 <w:rFonts w:ascii="Calibri" w:eastAsia="Times New Roman" w:hAnsi="Calibri" w:cs="Calibri"/>
                 <w:b/>
@@ -962,7 +948,7 @@
       </w:tr>
       <w:tr>
         <w:trPr>
-          <w:trHeight w:val="410" w:hRule="atLeast"/>
+          <w:trHeight w:val="46"/>
         </w:trPr>
         <w:tc>
           <w:tcPr>
@@ -974,21 +960,21 @@
               <w:right w:val="nil"/>
             </w:tcBorders>
             <w:noWrap/>
-            <w:vAlign w:val="center"/>
-            <w:hideMark/>
             <w:tcMar>
               <w:top w:w="20" w:type="dxa"/>
+              <w:left w:w="85" w:type="dxa"/>
               <w:bottom w:w="20" w:type="dxa"/>
-              <w:start w:w="85" w:type="dxa"/>
-              <w:end w:w="85" w:type="dxa"/>
+              <w:right w:w="85" w:type="dxa"/>
             </w:tcMar>
-          </w:tcPr>
-          <w:p>
-            <w:pPr>
-              <w:widowControl/>
-              <w:autoSpaceDE/>
-              <w:autoSpaceDN/>
-              <w:spacing w:before="0" w:after="60" w:line="240" w:lineRule="auto"/>
+            <w:vAlign w:val="center"/>
+            <w:hideMark/>
+          </w:tcPr>
+          <w:p>
+            <w:pPr>
+              <w:widowControl/>
+              <w:autoSpaceDE/>
+              <w:autoSpaceDN/>
+              <w:spacing w:after="60"/>
               <w:rPr>
                 <w:rFonts w:ascii="Calibri" w:eastAsia="Times New Roman" w:hAnsi="Calibri" w:cs="Calibri"/>
                 <w:b/>
@@ -1041,29 +1027,29 @@
         </w:tc>
         <w:tc>
           <w:tcPr>
-            <w:tcW w:w="160" w:type="dxa"/>
-            <w:tcBorders>
-              <w:top w:val="nil"/>
-              <w:left w:val="nil"/>
-              <w:bottom w:val="nil"/>
-              <w:right w:val="nil"/>
-            </w:tcBorders>
-            <w:noWrap/>
-            <w:vAlign w:val="center"/>
-            <w:hideMark/>
+            <w:tcW w:w="190" w:type="dxa"/>
+            <w:tcBorders>
+              <w:top w:val="nil"/>
+              <w:left w:val="nil"/>
+              <w:bottom w:val="nil"/>
+              <w:right w:val="nil"/>
+            </w:tcBorders>
+            <w:noWrap/>
             <w:tcMar>
               <w:top w:w="20" w:type="dxa"/>
+              <w:left w:w="85" w:type="dxa"/>
               <w:bottom w:w="20" w:type="dxa"/>
-              <w:start w:w="85" w:type="dxa"/>
-              <w:end w:w="85" w:type="dxa"/>
+              <w:right w:w="85" w:type="dxa"/>
             </w:tcMar>
-          </w:tcPr>
-          <w:p>
-            <w:pPr>
-              <w:widowControl/>
-              <w:autoSpaceDE/>
-              <w:autoSpaceDN/>
-              <w:spacing w:before="0" w:after="60" w:line="240" w:lineRule="auto"/>
+            <w:vAlign w:val="center"/>
+            <w:hideMark/>
+          </w:tcPr>
+          <w:p>
+            <w:pPr>
+              <w:widowControl/>
+              <w:autoSpaceDE/>
+              <w:autoSpaceDN/>
+              <w:spacing w:after="60"/>
               <w:rPr>
                 <w:rFonts w:ascii="Calibri" w:eastAsia="Times New Roman" w:hAnsi="Calibri" w:cs="Calibri"/>
                 <w:b/>
@@ -1086,21 +1072,21 @@
               <w:right w:val="nil"/>
             </w:tcBorders>
             <w:noWrap/>
-            <w:vAlign w:val="center"/>
-            <w:hideMark/>
             <w:tcMar>
               <w:top w:w="20" w:type="dxa"/>
+              <w:left w:w="85" w:type="dxa"/>
               <w:bottom w:w="20" w:type="dxa"/>
-              <w:start w:w="85" w:type="dxa"/>
-              <w:end w:w="85" w:type="dxa"/>
+              <w:right w:w="85" w:type="dxa"/>
             </w:tcMar>
-          </w:tcPr>
-          <w:p>
-            <w:pPr>
-              <w:widowControl/>
-              <w:autoSpaceDE/>
-              <w:autoSpaceDN/>
-              <w:spacing w:before="0" w:after="60" w:line="240" w:lineRule="auto"/>
+            <w:vAlign w:val="center"/>
+            <w:hideMark/>
+          </w:tcPr>
+          <w:p>
+            <w:pPr>
+              <w:widowControl/>
+              <w:autoSpaceDE/>
+              <w:autoSpaceDN/>
+              <w:spacing w:after="60"/>
               <w:rPr>
                 <w:rFonts w:ascii="Calibri" w:eastAsia="Times New Roman" w:hAnsi="Calibri" w:cs="Calibri"/>
                 <w:b/>
@@ -1135,21 +1121,21 @@
               <w:right w:val="nil"/>
             </w:tcBorders>
             <w:noWrap/>
-            <w:vAlign w:val="center"/>
-            <w:hideMark/>
             <w:tcMar>
               <w:top w:w="20" w:type="dxa"/>
+              <w:left w:w="85" w:type="dxa"/>
               <w:bottom w:w="20" w:type="dxa"/>
-              <w:start w:w="85" w:type="dxa"/>
-              <w:end w:w="85" w:type="dxa"/>
+              <w:right w:w="85" w:type="dxa"/>
             </w:tcMar>
-          </w:tcPr>
-          <w:p>
-            <w:pPr>
-              <w:widowControl/>
-              <w:autoSpaceDE/>
-              <w:autoSpaceDN/>
-              <w:spacing w:before="0" w:after="60" w:line="240" w:lineRule="auto"/>
+            <w:vAlign w:val="center"/>
+            <w:hideMark/>
+          </w:tcPr>
+          <w:p>
+            <w:pPr>
+              <w:widowControl/>
+              <w:autoSpaceDE/>
+              <w:autoSpaceDN/>
+              <w:spacing w:after="60"/>
               <w:rPr>
                 <w:rFonts w:ascii="Calibri" w:eastAsia="Times New Roman" w:hAnsi="Calibri" w:cs="Calibri"/>
                 <w:b/>
@@ -1172,21 +1158,21 @@
               <w:right w:val="nil"/>
             </w:tcBorders>
             <w:noWrap/>
-            <w:vAlign w:val="center"/>
-            <w:hideMark/>
             <w:tcMar>
               <w:top w:w="20" w:type="dxa"/>
+              <w:left w:w="85" w:type="dxa"/>
               <w:bottom w:w="20" w:type="dxa"/>
-              <w:start w:w="85" w:type="dxa"/>
-              <w:end w:w="85" w:type="dxa"/>
+              <w:right w:w="85" w:type="dxa"/>
             </w:tcMar>
-          </w:tcPr>
-          <w:p>
-            <w:pPr>
-              <w:widowControl/>
-              <w:autoSpaceDE/>
-              <w:autoSpaceDN/>
-              <w:spacing w:before="0" w:after="60" w:line="240" w:lineRule="auto"/>
+            <w:vAlign w:val="center"/>
+            <w:hideMark/>
+          </w:tcPr>
+          <w:p>
+            <w:pPr>
+              <w:widowControl/>
+              <w:autoSpaceDE/>
+              <w:autoSpaceDN/>
+              <w:spacing w:after="60"/>
               <w:rPr>
                 <w:rFonts w:ascii="Calibri" w:eastAsia="Times New Roman" w:hAnsi="Calibri" w:cs="Calibri"/>
                 <w:b/>
@@ -1203,7 +1189,6 @@
     </w:tbl>
     <w:p>
       <w:pPr>
-        <w:spacing w:before="0" w:after="0" w:line="240" w:lineRule="auto"/>
         <w:rPr>
           <w:rFonts w:ascii="Calibri" w:hAnsi="Calibri" w:cs="Calibri"/>
           <w:b/>
@@ -1216,7 +1201,6 @@
     </w:p>
     <w:p>
       <w:pPr>
-        <w:spacing w:before="0" w:after="0" w:line="240" w:lineRule="auto"/>
         <w:rPr>
           <w:rFonts w:ascii="Calibri" w:hAnsi="Calibri" w:cs="Calibri"/>
           <w:b/>
@@ -1229,7 +1213,6 @@
     </w:p>
     <w:p>
       <w:pPr>
-        <w:spacing w:before="0" w:after="0" w:line="240" w:lineRule="auto"/>
         <w:rPr>
           <w:rFonts w:ascii="Calibri" w:hAnsi="Calibri" w:cs="Calibri"/>
           <w:b/>
@@ -1257,7 +1240,7 @@
       </w:tblGrid>
       <w:tr>
         <w:trPr>
-          <w:trHeight w:val="346" w:hRule="atLeast"/>
+          <w:trHeight w:val="346"/>
         </w:trPr>
         <w:tc>
           <w:tcPr>
@@ -1278,7 +1261,7 @@
               <w:widowControl/>
               <w:autoSpaceDE/>
               <w:autoSpaceDN/>
-              <w:spacing w:before="120" w:after="0" w:line="240" w:lineRule="auto"/>
+              <w:spacing w:before="120"/>
               <w:jc w:val="center"/>
               <w:rPr>
                 <w:rFonts w:ascii="Calibri" w:eastAsia="Times New Roman" w:hAnsi="Calibri" w:cs="Calibri"/>
@@ -1307,7 +1290,7 @@
       </w:tr>
       <w:tr>
         <w:trPr>
-          <w:trHeight w:val="202" w:hRule="atLeast"/>
+          <w:trHeight w:val="202"/>
         </w:trPr>
         <w:tc>
           <w:tcPr>
@@ -1327,7 +1310,6 @@
               <w:widowControl/>
               <w:autoSpaceDE/>
               <w:autoSpaceDN/>
-              <w:spacing w:before="0" w:after="0" w:line="240" w:lineRule="auto"/>
               <w:jc w:val="center"/>
               <w:rPr>
                 <w:rFonts w:ascii="Calibri" w:eastAsia="Times New Roman" w:hAnsi="Calibri" w:cs="Calibri"/>
@@ -1359,7 +1341,6 @@
               <w:widowControl/>
               <w:autoSpaceDE/>
               <w:autoSpaceDN/>
-              <w:spacing w:before="0" w:after="0" w:line="240" w:lineRule="auto"/>
               <w:rPr>
                 <w:rFonts w:ascii="Calibri" w:eastAsia="Times New Roman" w:hAnsi="Calibri" w:cs="Calibri"/>
                 <w:b/>
@@ -1390,7 +1371,6 @@
               <w:widowControl/>
               <w:autoSpaceDE/>
               <w:autoSpaceDN/>
-              <w:spacing w:before="0" w:after="0" w:line="240" w:lineRule="auto"/>
               <w:rPr>
                 <w:rFonts w:ascii="Calibri" w:eastAsia="Times New Roman" w:hAnsi="Calibri" w:cs="Calibri"/>
                 <w:b/>
@@ -1406,7 +1386,7 @@
       </w:tr>
       <w:tr>
         <w:trPr>
-          <w:trHeight w:val="202" w:hRule="atLeast"/>
+          <w:trHeight w:val="202"/>
         </w:trPr>
         <w:tc>
           <w:tcPr>
@@ -1426,7 +1406,6 @@
               <w:widowControl/>
               <w:autoSpaceDE/>
               <w:autoSpaceDN/>
-              <w:spacing w:before="0" w:after="0" w:line="240" w:lineRule="auto"/>
               <w:rPr>
                 <w:rFonts w:ascii="Calibri" w:eastAsia="Times New Roman" w:hAnsi="Calibri" w:cs="Calibri"/>
                 <w:b/>
@@ -1457,7 +1436,6 @@
               <w:widowControl/>
               <w:autoSpaceDE/>
               <w:autoSpaceDN/>
-              <w:spacing w:before="0" w:after="0" w:line="240" w:lineRule="auto"/>
               <w:rPr>
                 <w:rFonts w:ascii="Calibri" w:eastAsia="Times New Roman" w:hAnsi="Calibri" w:cs="Calibri"/>
                 <w:b/>
@@ -1488,7 +1466,6 @@
               <w:widowControl/>
               <w:autoSpaceDE/>
               <w:autoSpaceDN/>
-              <w:spacing w:before="0" w:after="0" w:line="240" w:lineRule="auto"/>
               <w:rPr>
                 <w:rFonts w:ascii="Calibri" w:eastAsia="Times New Roman" w:hAnsi="Calibri" w:cs="Calibri"/>
                 <w:b/>
@@ -1504,7 +1481,7 @@
       </w:tr>
       <w:tr>
         <w:trPr>
-          <w:trHeight w:val="288" w:hRule="atLeast"/>
+          <w:trHeight w:val="288"/>
         </w:trPr>
         <w:tc>
           <w:tcPr>
@@ -1524,7 +1501,6 @@
               <w:widowControl/>
               <w:autoSpaceDE/>
               <w:autoSpaceDN/>
-              <w:spacing w:before="0" w:after="0" w:line="240" w:lineRule="auto"/>
               <w:rPr>
                 <w:rFonts w:ascii="Calibri" w:eastAsia="Times New Roman" w:hAnsi="Calibri" w:cs="Calibri"/>
                 <w:b/>
@@ -1569,7 +1545,6 @@
               <w:widowControl/>
               <w:autoSpaceDE/>
               <w:autoSpaceDN/>
-              <w:spacing w:before="0" w:after="0" w:line="240" w:lineRule="auto"/>
               <w:rPr>
                 <w:rFonts w:ascii="Calibri" w:eastAsia="Times New Roman" w:hAnsi="Calibri" w:cs="Calibri"/>
                 <w:b/>
@@ -1614,7 +1589,6 @@
               <w:widowControl/>
               <w:autoSpaceDE/>
               <w:autoSpaceDN/>
-              <w:spacing w:before="0" w:after="0" w:line="240" w:lineRule="auto"/>
               <w:rPr>
                 <w:rFonts w:ascii="Calibri" w:eastAsia="Times New Roman" w:hAnsi="Calibri" w:cs="Calibri"/>
                 <w:b/>
@@ -1644,7 +1618,7 @@
       </w:tr>
       <w:tr>
         <w:trPr>
-          <w:trHeight w:val="144" w:hRule="atLeast"/>
+          <w:trHeight w:val="144"/>
         </w:trPr>
         <w:tc>
           <w:tcPr>
@@ -1664,7 +1638,6 @@
               <w:widowControl/>
               <w:autoSpaceDE/>
               <w:autoSpaceDN/>
-              <w:spacing w:before="0" w:after="0" w:line="240" w:lineRule="auto"/>
               <w:rPr>
                 <w:rFonts w:ascii="Calibri" w:eastAsia="Times New Roman" w:hAnsi="Calibri" w:cs="Calibri"/>
                 <w:b/>
@@ -1696,7 +1669,6 @@
               <w:widowControl/>
               <w:autoSpaceDE/>
               <w:autoSpaceDN/>
-              <w:spacing w:before="0" w:after="0" w:line="240" w:lineRule="auto"/>
               <w:rPr>
                 <w:rFonts w:ascii="Calibri" w:eastAsia="Times New Roman" w:hAnsi="Calibri" w:cs="Calibri"/>
                 <w:b/>
@@ -1727,7 +1699,6 @@
               <w:widowControl/>
               <w:autoSpaceDE/>
               <w:autoSpaceDN/>
-              <w:spacing w:before="0" w:after="0" w:line="240" w:lineRule="auto"/>
               <w:rPr>
                 <w:rFonts w:ascii="Calibri" w:eastAsia="Times New Roman" w:hAnsi="Calibri" w:cs="Calibri"/>
                 <w:b/>
@@ -1743,7 +1714,7 @@
       </w:tr>
       <w:tr>
         <w:trPr>
-          <w:trHeight w:val="193" w:hRule="atLeast"/>
+          <w:trHeight w:val="193"/>
         </w:trPr>
         <w:tc>
           <w:tcPr>
@@ -1763,7 +1734,6 @@
               <w:widowControl/>
               <w:autoSpaceDE/>
               <w:autoSpaceDN/>
-              <w:spacing w:before="0" w:after="0" w:line="240" w:lineRule="auto"/>
               <w:rPr>
                 <w:rFonts w:ascii="Calibri" w:eastAsia="Times New Roman" w:hAnsi="Calibri" w:cs="Calibri"/>
                 <w:b/>
@@ -1806,7 +1776,6 @@
               <w:widowControl/>
               <w:autoSpaceDE/>
               <w:autoSpaceDN/>
-              <w:spacing w:before="0" w:after="0" w:line="240" w:lineRule="auto"/>
               <w:rPr>
                 <w:rFonts w:ascii="Calibri" w:eastAsia="Times New Roman" w:hAnsi="Calibri" w:cs="Calibri"/>
                 <w:b/>
@@ -1875,7 +1844,6 @@
               <w:widowControl/>
               <w:autoSpaceDE/>
               <w:autoSpaceDN/>
-              <w:spacing w:before="0" w:after="0" w:line="240" w:lineRule="auto"/>
               <w:rPr>
                 <w:rFonts w:ascii="Calibri" w:eastAsia="Times New Roman" w:hAnsi="Calibri" w:cs="Calibri"/>
                 <w:b/>
@@ -1903,7 +1871,7 @@
       </w:tr>
       <w:tr>
         <w:trPr>
-          <w:trHeight w:val="193" w:hRule="atLeast"/>
+          <w:trHeight w:val="193"/>
         </w:trPr>
         <w:tc>
           <w:tcPr>
@@ -1923,7 +1891,6 @@
               <w:widowControl/>
               <w:autoSpaceDE/>
               <w:autoSpaceDN/>
-              <w:spacing w:before="0" w:after="0" w:line="240" w:lineRule="auto"/>
               <w:rPr>
                 <w:rFonts w:ascii="Calibri" w:eastAsia="Times New Roman" w:hAnsi="Calibri" w:cs="Calibri"/>
                 <w:b/>
@@ -1966,7 +1933,6 @@
               <w:widowControl/>
               <w:autoSpaceDE/>
               <w:autoSpaceDN/>
-              <w:spacing w:before="0" w:after="0" w:line="240" w:lineRule="auto"/>
               <w:rPr>
                 <w:rFonts w:ascii="Calibri" w:eastAsia="Times New Roman" w:hAnsi="Calibri" w:cs="Calibri"/>
                 <w:b/>
@@ -2035,7 +2001,6 @@
               <w:widowControl/>
               <w:autoSpaceDE/>
               <w:autoSpaceDN/>
-              <w:spacing w:before="0" w:after="0" w:line="240" w:lineRule="auto"/>
               <w:rPr>
                 <w:rFonts w:ascii="Calibri" w:eastAsia="Times New Roman" w:hAnsi="Calibri" w:cs="Calibri"/>
                 <w:b/>
@@ -2051,7 +2016,7 @@
       </w:tr>
       <w:tr>
         <w:trPr>
-          <w:trHeight w:val="193" w:hRule="atLeast"/>
+          <w:trHeight w:val="193"/>
         </w:trPr>
         <w:tc>
           <w:tcPr>
@@ -2071,7 +2036,6 @@
               <w:widowControl/>
               <w:autoSpaceDE/>
               <w:autoSpaceDN/>
-              <w:spacing w:before="0" w:after="0" w:line="240" w:lineRule="auto"/>
               <w:rPr>
                 <w:rFonts w:ascii="Calibri" w:eastAsia="Times New Roman" w:hAnsi="Calibri" w:cs="Calibri"/>
                 <w:b/>
@@ -2114,7 +2078,6 @@
               <w:widowControl/>
               <w:autoSpaceDE/>
               <w:autoSpaceDN/>
-              <w:spacing w:before="0" w:after="0" w:line="240" w:lineRule="auto"/>
               <w:rPr>
                 <w:rFonts w:ascii="Calibri" w:eastAsia="Times New Roman" w:hAnsi="Calibri" w:cs="Calibri"/>
                 <w:b/>
@@ -2183,7 +2146,6 @@
               <w:widowControl/>
               <w:autoSpaceDE/>
               <w:autoSpaceDN/>
-              <w:spacing w:before="0" w:after="0" w:line="240" w:lineRule="auto"/>
               <w:rPr>
                 <w:rFonts w:ascii="Calibri" w:eastAsia="Times New Roman" w:hAnsi="Calibri" w:cs="Calibri"/>
                 <w:b/>
@@ -2211,7 +2173,7 @@
       </w:tr>
       <w:tr>
         <w:trPr>
-          <w:trHeight w:val="193" w:hRule="atLeast"/>
+          <w:trHeight w:val="193"/>
         </w:trPr>
         <w:tc>
           <w:tcPr>
@@ -2231,7 +2193,6 @@
               <w:widowControl/>
               <w:autoSpaceDE/>
               <w:autoSpaceDN/>
-              <w:spacing w:before="0" w:after="0" w:line="240" w:lineRule="auto"/>
               <w:rPr>
                 <w:rFonts w:ascii="Calibri" w:eastAsia="Times New Roman" w:hAnsi="Calibri" w:cs="Calibri"/>
                 <w:b/>
@@ -2274,7 +2235,6 @@
               <w:widowControl/>
               <w:autoSpaceDE/>
               <w:autoSpaceDN/>
-              <w:spacing w:before="0" w:after="0" w:line="240" w:lineRule="auto"/>
               <w:rPr>
                 <w:rFonts w:ascii="Calibri" w:eastAsia="Times New Roman" w:hAnsi="Calibri" w:cs="Calibri"/>
                 <w:b/>
@@ -2343,7 +2303,6 @@
               <w:widowControl/>
               <w:autoSpaceDE/>
               <w:autoSpaceDN/>
-              <w:spacing w:before="0" w:after="0" w:line="240" w:lineRule="auto"/>
               <w:rPr>
                 <w:rFonts w:ascii="Calibri" w:eastAsia="Times New Roman" w:hAnsi="Calibri" w:cs="Calibri"/>
                 <w:b/>
@@ -2371,7 +2330,7 @@
       </w:tr>
       <w:tr>
         <w:trPr>
-          <w:trHeight w:val="193" w:hRule="atLeast"/>
+          <w:trHeight w:val="193"/>
         </w:trPr>
         <w:tc>
           <w:tcPr>
@@ -2391,7 +2350,6 @@
               <w:widowControl/>
               <w:autoSpaceDE/>
               <w:autoSpaceDN/>
-              <w:spacing w:before="0" w:after="0" w:line="240" w:lineRule="auto"/>
               <w:rPr>
                 <w:rFonts w:ascii="Calibri" w:eastAsia="Times New Roman" w:hAnsi="Calibri" w:cs="Calibri"/>
                 <w:b/>
@@ -2434,7 +2392,6 @@
               <w:widowControl/>
               <w:autoSpaceDE/>
               <w:autoSpaceDN/>
-              <w:spacing w:before="0" w:after="0" w:line="240" w:lineRule="auto"/>
               <w:rPr>
                 <w:rFonts w:ascii="Calibri" w:eastAsia="Times New Roman" w:hAnsi="Calibri" w:cs="Calibri"/>
                 <w:b/>
@@ -2477,7 +2434,6 @@
               <w:widowControl/>
               <w:autoSpaceDE/>
               <w:autoSpaceDN/>
-              <w:spacing w:before="0" w:after="0" w:line="240" w:lineRule="auto"/>
               <w:rPr>
                 <w:rFonts w:ascii="Calibri" w:eastAsia="Times New Roman" w:hAnsi="Calibri" w:cs="Calibri"/>
                 <w:b/>
@@ -2505,7 +2461,7 @@
       </w:tr>
       <w:tr>
         <w:trPr>
-          <w:trHeight w:val="193" w:hRule="atLeast"/>
+          <w:trHeight w:val="193"/>
         </w:trPr>
         <w:tc>
           <w:tcPr>
@@ -2525,7 +2481,6 @@
               <w:widowControl/>
               <w:autoSpaceDE/>
               <w:autoSpaceDN/>
-              <w:spacing w:before="0" w:after="0" w:line="240" w:lineRule="auto"/>
               <w:rPr>
                 <w:rFonts w:ascii="Calibri" w:eastAsia="Times New Roman" w:hAnsi="Calibri" w:cs="Calibri"/>
                 <w:b/>
@@ -2568,7 +2523,6 @@
               <w:widowControl/>
               <w:autoSpaceDE/>
               <w:autoSpaceDN/>
-              <w:spacing w:before="0" w:after="0" w:line="240" w:lineRule="auto"/>
               <w:rPr>
                 <w:rFonts w:ascii="Calibri" w:eastAsia="Times New Roman" w:hAnsi="Calibri" w:cs="Calibri"/>
                 <w:b/>
@@ -2611,7 +2565,6 @@
               <w:widowControl/>
               <w:autoSpaceDE/>
               <w:autoSpaceDN/>
-              <w:spacing w:before="0" w:after="0" w:line="240" w:lineRule="auto"/>
               <w:rPr>
                 <w:rFonts w:ascii="Calibri" w:eastAsia="Times New Roman" w:hAnsi="Calibri" w:cs="Calibri"/>
                 <w:b/>
@@ -2639,7 +2592,7 @@
       </w:tr>
       <w:tr>
         <w:trPr>
-          <w:trHeight w:val="193" w:hRule="atLeast"/>
+          <w:trHeight w:val="193"/>
         </w:trPr>
         <w:tc>
           <w:tcPr>
@@ -2659,7 +2612,6 @@
               <w:widowControl/>
               <w:autoSpaceDE/>
               <w:autoSpaceDN/>
-              <w:spacing w:before="0" w:after="0" w:line="240" w:lineRule="auto"/>
               <w:rPr>
                 <w:rFonts w:ascii="Calibri" w:eastAsia="Times New Roman" w:hAnsi="Calibri" w:cs="Calibri"/>
                 <w:b/>
@@ -2702,7 +2654,6 @@
               <w:widowControl/>
               <w:autoSpaceDE/>
               <w:autoSpaceDN/>
-              <w:spacing w:before="0" w:after="0" w:line="240" w:lineRule="auto"/>
               <w:rPr>
                 <w:rFonts w:ascii="Calibri" w:eastAsia="Times New Roman" w:hAnsi="Calibri" w:cs="Calibri"/>
                 <w:b/>
@@ -2745,7 +2696,6 @@
               <w:widowControl/>
               <w:autoSpaceDE/>
               <w:autoSpaceDN/>
-              <w:spacing w:before="0" w:after="0" w:line="240" w:lineRule="auto"/>
               <w:rPr>
                 <w:rFonts w:ascii="Calibri" w:eastAsia="Times New Roman" w:hAnsi="Calibri" w:cs="Calibri"/>
                 <w:b/>
@@ -2773,7 +2723,7 @@
       </w:tr>
       <w:tr>
         <w:trPr>
-          <w:trHeight w:val="193" w:hRule="atLeast"/>
+          <w:trHeight w:val="193"/>
         </w:trPr>
         <w:tc>
           <w:tcPr>
@@ -2793,7 +2743,6 @@
               <w:widowControl/>
               <w:autoSpaceDE/>
               <w:autoSpaceDN/>
-              <w:spacing w:before="0" w:after="0" w:line="240" w:lineRule="auto"/>
               <w:rPr>
                 <w:rFonts w:ascii="Calibri" w:eastAsia="Times New Roman" w:hAnsi="Calibri" w:cs="Calibri"/>
                 <w:b/>
@@ -2836,7 +2785,6 @@
               <w:widowControl/>
               <w:autoSpaceDE/>
               <w:autoSpaceDN/>
-              <w:spacing w:before="0" w:after="0" w:line="240" w:lineRule="auto"/>
               <w:rPr>
                 <w:rFonts w:ascii="Calibri" w:eastAsia="Times New Roman" w:hAnsi="Calibri" w:cs="Calibri"/>
                 <w:b/>
@@ -2879,7 +2827,6 @@
               <w:widowControl/>
               <w:autoSpaceDE/>
               <w:autoSpaceDN/>
-              <w:spacing w:before="0" w:after="0" w:line="240" w:lineRule="auto"/>
               <w:rPr>
                 <w:rFonts w:ascii="Calibri" w:eastAsia="Times New Roman" w:hAnsi="Calibri" w:cs="Calibri"/>
                 <w:b/>
@@ -2907,7 +2854,7 @@
       </w:tr>
       <w:tr>
         <w:trPr>
-          <w:trHeight w:val="193" w:hRule="atLeast"/>
+          <w:trHeight w:val="193"/>
         </w:trPr>
         <w:tc>
           <w:tcPr>
@@ -2927,7 +2874,6 @@
               <w:widowControl/>
               <w:autoSpaceDE/>
               <w:autoSpaceDN/>
-              <w:spacing w:before="0" w:after="0" w:line="240" w:lineRule="auto"/>
               <w:rPr>
                 <w:rFonts w:ascii="Calibri" w:eastAsia="Times New Roman" w:hAnsi="Calibri" w:cs="Calibri"/>
                 <w:b/>
@@ -2970,7 +2916,6 @@
               <w:widowControl/>
               <w:autoSpaceDE/>
               <w:autoSpaceDN/>
-              <w:spacing w:before="0" w:after="0" w:line="240" w:lineRule="auto"/>
               <w:rPr>
                 <w:rFonts w:ascii="Calibri" w:eastAsia="Times New Roman" w:hAnsi="Calibri" w:cs="Calibri"/>
                 <w:b/>
@@ -3013,7 +2958,6 @@
               <w:widowControl/>
               <w:autoSpaceDE/>
               <w:autoSpaceDN/>
-              <w:spacing w:before="0" w:after="0" w:line="240" w:lineRule="auto"/>
               <w:rPr>
                 <w:rFonts w:ascii="Calibri" w:eastAsia="Times New Roman" w:hAnsi="Calibri" w:cs="Calibri"/>
                 <w:b/>
@@ -3041,7 +2985,7 @@
       </w:tr>
       <w:tr>
         <w:trPr>
-          <w:trHeight w:val="193" w:hRule="atLeast"/>
+          <w:trHeight w:val="193"/>
         </w:trPr>
         <w:tc>
           <w:tcPr>
@@ -3061,7 +3005,6 @@
               <w:widowControl/>
               <w:autoSpaceDE/>
               <w:autoSpaceDN/>
-              <w:spacing w:before="0" w:after="0" w:line="240" w:lineRule="auto"/>
               <w:rPr>
                 <w:rFonts w:ascii="Calibri" w:eastAsia="Times New Roman" w:hAnsi="Calibri" w:cs="Calibri"/>
                 <w:b/>
@@ -3104,7 +3047,6 @@
               <w:widowControl/>
               <w:autoSpaceDE/>
               <w:autoSpaceDN/>
-              <w:spacing w:before="0" w:after="0" w:line="240" w:lineRule="auto"/>
               <w:rPr>
                 <w:rFonts w:ascii="Calibri" w:eastAsia="Times New Roman" w:hAnsi="Calibri" w:cs="Calibri"/>
                 <w:b/>
@@ -3147,7 +3089,6 @@
               <w:widowControl/>
               <w:autoSpaceDE/>
               <w:autoSpaceDN/>
-              <w:spacing w:before="0" w:after="0" w:line="240" w:lineRule="auto"/>
               <w:rPr>
                 <w:rFonts w:ascii="Calibri" w:eastAsia="Times New Roman" w:hAnsi="Calibri" w:cs="Calibri"/>
                 <w:b/>
@@ -3175,7 +3116,7 @@
       </w:tr>
       <w:tr>
         <w:trPr>
-          <w:trHeight w:val="193" w:hRule="atLeast"/>
+          <w:trHeight w:val="193"/>
         </w:trPr>
         <w:tc>
           <w:tcPr>
@@ -3195,7 +3136,6 @@
               <w:widowControl/>
               <w:autoSpaceDE/>
               <w:autoSpaceDN/>
-              <w:spacing w:before="0" w:after="0" w:line="240" w:lineRule="auto"/>
               <w:rPr>
                 <w:rFonts w:ascii="Calibri" w:eastAsia="Times New Roman" w:hAnsi="Calibri" w:cs="Calibri"/>
                 <w:b/>
@@ -3238,7 +3178,6 @@
               <w:widowControl/>
               <w:autoSpaceDE/>
               <w:autoSpaceDN/>
-              <w:spacing w:before="0" w:after="0" w:line="240" w:lineRule="auto"/>
               <w:rPr>
                 <w:rFonts w:ascii="Calibri" w:eastAsia="Times New Roman" w:hAnsi="Calibri" w:cs="Calibri"/>
                 <w:b/>
@@ -3281,7 +3220,6 @@
               <w:widowControl/>
               <w:autoSpaceDE/>
               <w:autoSpaceDN/>
-              <w:spacing w:before="0" w:after="0" w:line="240" w:lineRule="auto"/>
               <w:rPr>
                 <w:rFonts w:ascii="Calibri" w:eastAsia="Times New Roman" w:hAnsi="Calibri" w:cs="Calibri"/>
                 <w:b/>
@@ -3309,7 +3247,7 @@
       </w:tr>
       <w:tr>
         <w:trPr>
-          <w:trHeight w:val="193" w:hRule="atLeast"/>
+          <w:trHeight w:val="193"/>
         </w:trPr>
         <w:tc>
           <w:tcPr>
@@ -3329,7 +3267,6 @@
               <w:widowControl/>
               <w:autoSpaceDE/>
               <w:autoSpaceDN/>
-              <w:spacing w:before="0" w:after="0" w:line="240" w:lineRule="auto"/>
               <w:rPr>
                 <w:rFonts w:ascii="Calibri" w:eastAsia="Times New Roman" w:hAnsi="Calibri" w:cs="Calibri"/>
                 <w:b/>
@@ -3372,7 +3309,6 @@
               <w:widowControl/>
               <w:autoSpaceDE/>
               <w:autoSpaceDN/>
-              <w:spacing w:before="0" w:after="0" w:line="240" w:lineRule="auto"/>
               <w:rPr>
                 <w:rFonts w:ascii="Calibri" w:eastAsia="Times New Roman" w:hAnsi="Calibri" w:cs="Calibri"/>
                 <w:b/>
@@ -3441,7 +3377,6 @@
               <w:widowControl/>
               <w:autoSpaceDE/>
               <w:autoSpaceDN/>
-              <w:spacing w:before="0" w:after="0" w:line="240" w:lineRule="auto"/>
               <w:rPr>
                 <w:rFonts w:ascii="Calibri" w:eastAsia="Times New Roman" w:hAnsi="Calibri" w:cs="Calibri"/>
                 <w:b/>
@@ -3469,7 +3404,7 @@
       </w:tr>
       <w:tr>
         <w:trPr>
-          <w:trHeight w:val="193" w:hRule="atLeast"/>
+          <w:trHeight w:val="193"/>
         </w:trPr>
         <w:tc>
           <w:tcPr>
@@ -3489,7 +3424,6 @@
               <w:widowControl/>
               <w:autoSpaceDE/>
               <w:autoSpaceDN/>
-              <w:spacing w:before="0" w:after="0" w:line="240" w:lineRule="auto"/>
               <w:rPr>
                 <w:rFonts w:ascii="Calibri" w:eastAsia="Times New Roman" w:hAnsi="Calibri" w:cs="Calibri"/>
                 <w:b/>
@@ -3532,7 +3466,6 @@
               <w:widowControl/>
               <w:autoSpaceDE/>
               <w:autoSpaceDN/>
-              <w:spacing w:before="0" w:after="0" w:line="240" w:lineRule="auto"/>
               <w:rPr>
                 <w:rFonts w:ascii="Calibri" w:eastAsia="Times New Roman" w:hAnsi="Calibri" w:cs="Calibri"/>
                 <w:b/>
@@ -3575,7 +3508,6 @@
               <w:widowControl/>
               <w:autoSpaceDE/>
               <w:autoSpaceDN/>
-              <w:spacing w:before="0" w:after="0" w:line="240" w:lineRule="auto"/>
               <w:rPr>
                 <w:rFonts w:ascii="Calibri" w:eastAsia="Times New Roman" w:hAnsi="Calibri" w:cs="Calibri"/>
                 <w:b/>
@@ -3603,7 +3535,7 @@
       </w:tr>
       <w:tr>
         <w:trPr>
-          <w:trHeight w:val="193" w:hRule="atLeast"/>
+          <w:trHeight w:val="193"/>
         </w:trPr>
         <w:tc>
           <w:tcPr>
@@ -3623,7 +3555,6 @@
               <w:widowControl/>
               <w:autoSpaceDE/>
               <w:autoSpaceDN/>
-              <w:spacing w:before="0" w:after="0" w:line="240" w:lineRule="auto"/>
               <w:rPr>
                 <w:rFonts w:ascii="Calibri" w:eastAsia="Times New Roman" w:hAnsi="Calibri" w:cs="Calibri"/>
                 <w:b/>
@@ -3666,7 +3597,6 @@
               <w:widowControl/>
               <w:autoSpaceDE/>
               <w:autoSpaceDN/>
-              <w:spacing w:before="0" w:after="0" w:line="240" w:lineRule="auto"/>
               <w:rPr>
                 <w:rFonts w:ascii="Calibri" w:eastAsia="Times New Roman" w:hAnsi="Calibri" w:cs="Calibri"/>
                 <w:b/>
@@ -3759,7 +3689,6 @@
               <w:widowControl/>
               <w:autoSpaceDE/>
               <w:autoSpaceDN/>
-              <w:spacing w:before="0" w:after="0" w:line="240" w:lineRule="auto"/>
               <w:rPr>
                 <w:rFonts w:ascii="Calibri" w:eastAsia="Times New Roman" w:hAnsi="Calibri" w:cs="Calibri"/>
                 <w:b/>
@@ -3775,7 +3704,7 @@
       </w:tr>
       <w:tr>
         <w:trPr>
-          <w:trHeight w:val="193" w:hRule="atLeast"/>
+          <w:trHeight w:val="193"/>
         </w:trPr>
         <w:tc>
           <w:tcPr>
@@ -3795,7 +3724,6 @@
               <w:widowControl/>
               <w:autoSpaceDE/>
               <w:autoSpaceDN/>
-              <w:spacing w:before="0" w:after="0" w:line="240" w:lineRule="auto"/>
               <w:rPr>
                 <w:rFonts w:ascii="Calibri" w:eastAsia="Times New Roman" w:hAnsi="Calibri" w:cs="Calibri"/>
                 <w:b/>
@@ -3838,7 +3766,6 @@
               <w:widowControl/>
               <w:autoSpaceDE/>
               <w:autoSpaceDN/>
-              <w:spacing w:before="0" w:after="0" w:line="240" w:lineRule="auto"/>
               <w:rPr>
                 <w:rFonts w:ascii="Calibri" w:eastAsia="Times New Roman" w:hAnsi="Calibri" w:cs="Calibri"/>
                 <w:b/>
@@ -3907,7 +3834,6 @@
               <w:widowControl/>
               <w:autoSpaceDE/>
               <w:autoSpaceDN/>
-              <w:spacing w:before="0" w:after="0" w:line="240" w:lineRule="auto"/>
               <w:rPr>
                 <w:rFonts w:ascii="Calibri" w:eastAsia="Times New Roman" w:hAnsi="Calibri" w:cs="Calibri"/>
                 <w:b/>
@@ -3923,7 +3849,7 @@
       </w:tr>
       <w:tr>
         <w:trPr>
-          <w:trHeight w:val="193" w:hRule="atLeast"/>
+          <w:trHeight w:val="193"/>
         </w:trPr>
         <w:tc>
           <w:tcPr>
@@ -3943,7 +3869,6 @@
               <w:widowControl/>
               <w:autoSpaceDE/>
               <w:autoSpaceDN/>
-              <w:spacing w:before="0" w:after="0" w:line="240" w:lineRule="auto"/>
               <w:rPr>
                 <w:rFonts w:ascii="Calibri" w:eastAsia="Times New Roman" w:hAnsi="Calibri" w:cs="Calibri"/>
                 <w:b/>
@@ -3986,7 +3911,6 @@
               <w:widowControl/>
               <w:autoSpaceDE/>
               <w:autoSpaceDN/>
-              <w:spacing w:before="0" w:after="0" w:line="240" w:lineRule="auto"/>
               <w:rPr>
                 <w:rFonts w:ascii="Calibri" w:eastAsia="Times New Roman" w:hAnsi="Calibri" w:cs="Calibri"/>
                 <w:b/>
@@ -4055,7 +3979,6 @@
               <w:widowControl/>
               <w:autoSpaceDE/>
               <w:autoSpaceDN/>
-              <w:spacing w:before="0" w:after="0" w:line="240" w:lineRule="auto"/>
               <w:rPr>
                 <w:rFonts w:ascii="Calibri" w:eastAsia="Times New Roman" w:hAnsi="Calibri" w:cs="Calibri"/>
                 <w:b/>
@@ -4071,7 +3994,7 @@
       </w:tr>
       <w:tr>
         <w:trPr>
-          <w:trHeight w:val="193" w:hRule="atLeast"/>
+          <w:trHeight w:val="193"/>
         </w:trPr>
         <w:tc>
           <w:tcPr>
@@ -4091,7 +4014,6 @@
               <w:widowControl/>
               <w:autoSpaceDE/>
               <w:autoSpaceDN/>
-              <w:spacing w:before="0" w:after="0" w:line="240" w:lineRule="auto"/>
               <w:rPr>
                 <w:rFonts w:ascii="Calibri" w:eastAsia="Times New Roman" w:hAnsi="Calibri" w:cs="Calibri"/>
                 <w:b/>
@@ -4134,7 +4056,6 @@
               <w:widowControl/>
               <w:autoSpaceDE/>
               <w:autoSpaceDN/>
-              <w:spacing w:before="0" w:after="0" w:line="240" w:lineRule="auto"/>
               <w:rPr>
                 <w:rFonts w:ascii="Calibri" w:eastAsia="Times New Roman" w:hAnsi="Calibri" w:cs="Calibri"/>
                 <w:b/>
@@ -4177,7 +4098,6 @@
               <w:widowControl/>
               <w:autoSpaceDE/>
               <w:autoSpaceDN/>
-              <w:spacing w:before="0" w:after="0" w:line="240" w:lineRule="auto"/>
               <w:rPr>
                 <w:rFonts w:ascii="Calibri" w:eastAsia="Times New Roman" w:hAnsi="Calibri" w:cs="Calibri"/>
                 <w:b/>
@@ -4205,7 +4125,7 @@
       </w:tr>
       <w:tr>
         <w:trPr>
-          <w:trHeight w:val="193" w:hRule="atLeast"/>
+          <w:trHeight w:val="193"/>
         </w:trPr>
         <w:tc>
           <w:tcPr>
@@ -4225,7 +4145,6 @@
               <w:widowControl/>
               <w:autoSpaceDE/>
               <w:autoSpaceDN/>
-              <w:spacing w:before="0" w:after="0" w:line="240" w:lineRule="auto"/>
               <w:rPr>
                 <w:rFonts w:ascii="Calibri" w:eastAsia="Times New Roman" w:hAnsi="Calibri" w:cs="Calibri"/>
                 <w:b/>
@@ -4268,7 +4187,6 @@
               <w:widowControl/>
               <w:autoSpaceDE/>
               <w:autoSpaceDN/>
-              <w:spacing w:before="0" w:after="0" w:line="240" w:lineRule="auto"/>
               <w:rPr>
                 <w:rFonts w:ascii="Calibri" w:eastAsia="Times New Roman" w:hAnsi="Calibri" w:cs="Calibri"/>
                 <w:b/>
@@ -4311,7 +4229,6 @@
               <w:widowControl/>
               <w:autoSpaceDE/>
               <w:autoSpaceDN/>
-              <w:spacing w:before="0" w:after="0" w:line="240" w:lineRule="auto"/>
               <w:rPr>
                 <w:rFonts w:ascii="Calibri" w:eastAsia="Times New Roman" w:hAnsi="Calibri" w:cs="Calibri"/>
                 <w:b/>
@@ -4339,7 +4256,7 @@
       </w:tr>
       <w:tr>
         <w:trPr>
-          <w:trHeight w:val="193" w:hRule="atLeast"/>
+          <w:trHeight w:val="193"/>
         </w:trPr>
         <w:tc>
           <w:tcPr>
@@ -4359,7 +4276,6 @@
               <w:widowControl/>
               <w:autoSpaceDE/>
               <w:autoSpaceDN/>
-              <w:spacing w:before="0" w:after="0" w:line="240" w:lineRule="auto"/>
               <w:rPr>
                 <w:rFonts w:ascii="Calibri" w:eastAsia="Times New Roman" w:hAnsi="Calibri" w:cs="Calibri"/>
                 <w:b/>
@@ -4402,7 +4318,6 @@
               <w:widowControl/>
               <w:autoSpaceDE/>
               <w:autoSpaceDN/>
-              <w:spacing w:before="0" w:after="0" w:line="240" w:lineRule="auto"/>
               <w:rPr>
                 <w:rFonts w:ascii="Calibri" w:eastAsia="Times New Roman" w:hAnsi="Calibri" w:cs="Calibri"/>
                 <w:b/>
@@ -4445,7 +4360,6 @@
               <w:widowControl/>
               <w:autoSpaceDE/>
               <w:autoSpaceDN/>
-              <w:spacing w:before="0" w:after="0" w:line="240" w:lineRule="auto"/>
               <w:rPr>
                 <w:rFonts w:ascii="Calibri" w:eastAsia="Times New Roman" w:hAnsi="Calibri" w:cs="Calibri"/>
                 <w:b/>
@@ -4474,7 +4388,6 @@
     </w:tbl>
     <w:p>
       <w:pPr>
-        <w:spacing w:before="0" w:after="0" w:line="240" w:lineRule="auto"/>
         <w:rPr>
           <w:rFonts w:ascii="Calibri" w:hAnsi="Calibri" w:cs="Calibri"/>
           <w:b/>
@@ -4485,7 +4398,6 @@
     </w:p>
     <w:p>
       <w:pPr>
-        <w:spacing w:before="0" w:after="0" w:line="240" w:lineRule="auto"/>
         <w:rPr>
           <w:rFonts w:ascii="Calibri" w:hAnsi="Calibri" w:cs="Calibri"/>
           <w:b/>
@@ -4496,7 +4408,6 @@
     </w:p>
     <w:p>
       <w:pPr>
-        <w:spacing w:before="0" w:after="0" w:line="240" w:lineRule="auto"/>
         <w:rPr>
           <w:rFonts w:ascii="Calibri" w:hAnsi="Calibri" w:cs="Calibri"/>
           <w:b/>
@@ -4507,7 +4418,6 @@
     </w:p>
     <w:p>
       <w:pPr>
-        <w:spacing w:before="0" w:after="0" w:line="240" w:lineRule="auto"/>
         <w:rPr>
           <w:rFonts w:ascii="Calibri" w:hAnsi="Calibri" w:cs="Calibri"/>
           <w:b/>
@@ -4518,7 +4428,6 @@
     </w:p>
     <w:p>
       <w:pPr>
-        <w:spacing w:before="0" w:after="0" w:line="240" w:lineRule="auto"/>
         <w:rPr>
           <w:rFonts w:ascii="Calibri" w:hAnsi="Calibri" w:cs="Calibri"/>
           <w:b/>
@@ -4529,7 +4438,6 @@
     </w:p>
     <w:p>
       <w:pPr>
-        <w:spacing w:before="0" w:after="0" w:line="240" w:lineRule="auto"/>
         <w:rPr>
           <w:rFonts w:ascii="Calibri" w:hAnsi="Calibri" w:cs="Calibri"/>
           <w:b/>
@@ -4540,7 +4448,6 @@
     </w:p>
     <w:p>
       <w:pPr>
-        <w:spacing w:before="0" w:after="0" w:line="240" w:lineRule="auto"/>
         <w:rPr>
           <w:rFonts w:ascii="Calibri" w:hAnsi="Calibri" w:cs="Calibri"/>
           <w:b/>
@@ -4551,7 +4458,6 @@
     </w:p>
     <w:p>
       <w:pPr>
-        <w:spacing w:before="0" w:after="0" w:line="240" w:lineRule="auto"/>
         <w:rPr>
           <w:rFonts w:ascii="Calibri" w:hAnsi="Calibri" w:cs="Calibri"/>
           <w:b/>
@@ -4562,7 +4468,6 @@
     </w:p>
     <w:p>
       <w:pPr>
-        <w:spacing w:before="0" w:after="0" w:line="240" w:lineRule="auto"/>
         <w:rPr>
           <w:rFonts w:ascii="Calibri" w:hAnsi="Calibri" w:cs="Calibri"/>
           <w:b/>
@@ -4573,7 +4478,6 @@
     </w:p>
     <w:p>
       <w:pPr>
-        <w:spacing w:before="0" w:after="0" w:line="240" w:lineRule="auto"/>
         <w:rPr>
           <w:rFonts w:ascii="Calibri" w:hAnsi="Calibri" w:cs="Calibri"/>
           <w:b/>
@@ -4584,7 +4488,6 @@
     </w:p>
     <w:p>
       <w:pPr>
-        <w:spacing w:before="0" w:after="0" w:line="240" w:lineRule="auto"/>
         <w:rPr>
           <w:rFonts w:ascii="Calibri" w:hAnsi="Calibri" w:cs="Calibri"/>
           <w:b/>
@@ -4595,7 +4498,6 @@
     </w:p>
     <w:p>
       <w:pPr>
-        <w:spacing w:before="0" w:after="0" w:line="240" w:lineRule="auto"/>
         <w:rPr>
           <w:rFonts w:ascii="Calibri" w:hAnsi="Calibri" w:cs="Calibri"/>
           <w:b/>
@@ -4606,7 +4508,6 @@
     </w:p>
     <w:p>
       <w:pPr>
-        <w:spacing w:before="0" w:after="0" w:line="240" w:lineRule="auto"/>
         <w:rPr>
           <w:rFonts w:ascii="Calibri" w:hAnsi="Calibri" w:cs="Calibri"/>
           <w:b/>
@@ -4617,7 +4518,6 @@
     </w:p>
     <w:p>
       <w:pPr>
-        <w:spacing w:before="0" w:after="0" w:line="240" w:lineRule="auto"/>
         <w:rPr>
           <w:rFonts w:ascii="Calibri" w:hAnsi="Calibri" w:cs="Calibri"/>
           <w:b/>
@@ -4628,7 +4528,6 @@
     </w:p>
     <w:p>
       <w:pPr>
-        <w:spacing w:before="0" w:after="0" w:line="240" w:lineRule="auto"/>
         <w:rPr>
           <w:rFonts w:ascii="Calibri" w:hAnsi="Calibri" w:cs="Calibri"/>
           <w:b/>
@@ -4639,7 +4538,6 @@
     </w:p>
     <w:p>
       <w:pPr>
-        <w:spacing w:before="0" w:after="0" w:line="240" w:lineRule="auto"/>
         <w:rPr>
           <w:rFonts w:ascii="Calibri" w:hAnsi="Calibri" w:cs="Calibri"/>
           <w:b/>
@@ -4650,7 +4548,6 @@
     </w:p>
     <w:p>
       <w:pPr>
-        <w:spacing w:before="0" w:after="0" w:line="240" w:lineRule="auto"/>
         <w:rPr>
           <w:rFonts w:ascii="Calibri" w:hAnsi="Calibri" w:cs="Calibri"/>
           <w:b/>
@@ -4661,7 +4558,6 @@
     </w:p>
     <w:p>
       <w:pPr>
-        <w:spacing w:before="0" w:after="0" w:line="240" w:lineRule="auto"/>
         <w:rPr>
           <w:rFonts w:ascii="Calibri" w:hAnsi="Calibri" w:cs="Calibri"/>
           <w:b/>
@@ -4672,7 +4568,6 @@
     </w:p>
     <w:p>
       <w:pPr>
-        <w:spacing w:before="0" w:after="0" w:line="240" w:lineRule="auto"/>
         <w:rPr>
           <w:rFonts w:ascii="Calibri" w:hAnsi="Calibri" w:cs="Calibri"/>
           <w:b/>
@@ -4683,7 +4578,6 @@
     </w:p>
     <w:p>
       <w:pPr>
-        <w:spacing w:before="0" w:after="0" w:line="240" w:lineRule="auto"/>
         <w:rPr>
           <w:rFonts w:ascii="Calibri" w:hAnsi="Calibri" w:cs="Calibri"/>
           <w:b/>
@@ -4694,7 +4588,6 @@
     </w:p>
     <w:p>
       <w:pPr>
-        <w:spacing w:before="0" w:after="0" w:line="240" w:lineRule="auto"/>
         <w:rPr>
           <w:rFonts w:ascii="Calibri" w:hAnsi="Calibri" w:cs="Calibri"/>
           <w:b/>
@@ -4705,7 +4598,6 @@
     </w:p>
     <w:p>
       <w:pPr>
-        <w:spacing w:before="0" w:after="0" w:line="240" w:lineRule="auto"/>
         <w:rPr>
           <w:rFonts w:ascii="Calibri" w:hAnsi="Calibri" w:cs="Calibri"/>
           <w:b/>
@@ -4716,7 +4608,6 @@
     </w:p>
     <w:p>
       <w:pPr>
-        <w:spacing w:before="0" w:after="0" w:line="240" w:lineRule="auto"/>
         <w:rPr>
           <w:rFonts w:ascii="Calibri" w:hAnsi="Calibri" w:cs="Calibri"/>
           <w:b/>
@@ -4727,7 +4618,6 @@
     </w:p>
     <w:p>
       <w:pPr>
-        <w:spacing w:before="0" w:after="0" w:line="240" w:lineRule="auto"/>
         <w:jc w:val="right"/>
       </w:pPr>
       <w:r>
@@ -4737,13 +4627,13 @@
           <w:lang w:val="es-MX" w:eastAsia="es-MX"/>
         </w:rPr>
         <w:drawing>
-          <wp:anchor distT="0" distB="0" distL="114300" distR="114300" simplePos="0" relativeHeight="251660288" behindDoc="0" locked="0" layoutInCell="1" allowOverlap="1" wp14:anchorId="26B0DA92" wp14:editId="657F9CC3">
+          <wp:anchor distT="0" distB="0" distL="114300" distR="114300" simplePos="0" relativeHeight="251660288" behindDoc="0" locked="0" layoutInCell="1" allowOverlap="1" wp14:anchorId="26B0DA92" wp14:editId="02A88B92">
             <wp:simplePos x="0" y="0"/>
             <wp:positionH relativeFrom="margin">
-              <wp:posOffset>4544237</wp:posOffset>
+              <wp:posOffset>4544060</wp:posOffset>
             </wp:positionH>
             <wp:positionV relativeFrom="paragraph">
-              <wp:posOffset>761365</wp:posOffset>
+              <wp:posOffset>1027100</wp:posOffset>
             </wp:positionV>
             <wp:extent cx="1704975" cy="1704975"/>
             <wp:effectExtent l="0" t="0" r="9525" b="9525"/>
@@ -4761,6 +4651,16 @@
                   </pic:nvPicPr>
                   <pic:blipFill>
                     <a:blip r:embed="rId5" cstate="print">
+                      <a:clrChange>
+                        <a:clrFrom>
+                          <a:srgbClr val="FCFCFC"/>
+                        </a:clrFrom>
+                        <a:clrTo>
+                          <a:srgbClr val="FCFCFC">
+                            <a:alpha val="0"/>
+                          </a:srgbClr>
+                        </a:clrTo>
+                      </a:clrChange>
                       <a:extLst>
                         <a:ext uri="{28A0092B-C50C-407E-A947-70E740481C1C}">
                           <a14:useLocalDpi xmlns:a14="http://schemas.microsoft.com/office/drawing/2010/main" val="0"/>
@@ -4796,13 +4696,13 @@
         <mc:AlternateContent>
           <mc:Choice Requires="wps">
             <w:drawing>
-              <wp:anchor distT="45720" distB="45720" distL="114300" distR="114300" simplePos="0" relativeHeight="251659264" behindDoc="0" locked="0" layoutInCell="1" allowOverlap="1" wp14:anchorId="125CAC15" wp14:editId="1F75DD6A">
+              <wp:anchor distT="45720" distB="45720" distL="114300" distR="114300" simplePos="0" relativeHeight="251659264" behindDoc="0" locked="0" layoutInCell="1" allowOverlap="1" wp14:anchorId="125CAC15" wp14:editId="5649F125">
                 <wp:simplePos x="0" y="0"/>
                 <wp:positionH relativeFrom="page">
-                  <wp:align>right</wp:align>
+                  <wp:posOffset>0</wp:posOffset>
                 </wp:positionH>
                 <wp:positionV relativeFrom="paragraph">
-                  <wp:posOffset>2466340</wp:posOffset>
+                  <wp:posOffset>2617191</wp:posOffset>
                 </wp:positionV>
                 <wp:extent cx="7750810" cy="638175"/>
                 <wp:effectExtent l="0" t="0" r="21590" b="28575"/>
@@ -4865,7 +4765,7 @@
           </mc:Choice>
           <mc:Fallback>
             <w:pict>
-              <v:shape w14:anchorId="125CAC15" id="Cuadro de texto 2" o:spid="_x0000_s1032" type="#_x0000_t202" style="position:absolute;left:0;text-align:left;margin-left:559.1pt;margin-top:194.2pt;width:610.3pt;height:50.25pt;z-index:251659264;visibility:visible;mso-wrap-style:square;mso-width-percent:0;mso-height-percent:0;mso-wrap-distance-left:9pt;mso-wrap-distance-top:3.6pt;mso-wrap-distance-right:9pt;mso-wrap-distance-bottom:3.6pt;mso-position-horizontal:right;mso-position-horizontal-relative:page;mso-position-vertical:absolute;mso-position-vertical-relative:text;mso-width-percent:0;mso-height-percent:0;mso-width-relative:margin;mso-height-relative:margin;v-text-anchor:top" o:gfxdata="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" fillcolor="#006">
+              <v:shape w14:anchorId="125CAC15" id="Cuadro de texto 2" o:spid="_x0000_s1032" type="#_x0000_t202" style="position:absolute;left:0;text-align:left;margin-left:0;margin-top:206.1pt;width:610.3pt;height:50.25pt;z-index:251659264;visibility:visible;mso-wrap-style:square;mso-width-percent:0;mso-height-percent:0;mso-wrap-distance-left:9pt;mso-wrap-distance-top:3.6pt;mso-wrap-distance-right:9pt;mso-wrap-distance-bottom:3.6pt;mso-position-horizontal:absolute;mso-position-horizontal-relative:page;mso-position-vertical:absolute;mso-position-vertical-relative:text;mso-width-percent:0;mso-height-percent:0;mso-width-relative:margin;mso-height-relative:margin;v-text-anchor:top" o:gfxdata="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" fillcolor="#006">
                 <v:textbox>
                   <w:txbxContent>
                     <w:p>

</xml_diff>